<commit_message>
School at a glance for school admins: pupils, classes and records needing attention
The overview for staff who don't see money: pupils on roll, placed, joined and
left this term, parents, pupils per class and arm, and pupils missing a class,
parent, consent or account number, each linking to a filtered student list
(GET /students?missing=). Three queries whatever the size of the school. The
demo school gains last session's placements and a few realistic loose ends.
</commit_message>
<xml_diff>
--- a/docs/product/ParentPay - what it does.docx
+++ b/docs/product/ParentPay - what it does.docx
@@ -1979,6 +1979,65 @@
                 <w:sz w:val="20"/>
                 <w:szCs w:val="20"/>
               </w:rPr>
+              <w:t xml:space="preserve">The school at a glance when they sign in: pupils on roll, who joined or left this term, pupils per class and arm, and which pupils still need a class, a parent, consent or an account number (one click shows who)</w:t>
+            </w:r>
+          </w:p>
+        </w:tc>
+        <w:tc>
+          <w:tcPr>
+            <w:tcW w:type="dxa" w:w="4238"/>
+            <w:tcBorders>
+              <w:top w:val="single" w:color="D0D7D3" w:sz="4"/>
+              <w:left w:val="single" w:color="D0D7D3" w:sz="4"/>
+              <w:bottom w:val="single" w:color="D0D7D3" w:sz="4"/>
+              <w:right w:val="single" w:color="D0D7D3" w:sz="4"/>
+            </w:tcBorders>
+            <w:tcMar>
+              <w:top w:type="dxa" w:w="80"/>
+              <w:left w:type="dxa" w:w="120"/>
+              <w:bottom w:type="dxa" w:w="80"/>
+              <w:right w:type="dxa" w:w="120"/>
+            </w:tcMar>
+          </w:tcPr>
+          <w:p>
+            <w:r>
+              <w:rPr>
+                <w:b w:val="false"/>
+                <w:bCs w:val="false"/>
+                <w:sz w:val="20"/>
+                <w:szCs w:val="20"/>
+              </w:rPr>
+              <w:t xml:space="preserve">Gaps are fixed before bills go out, without the admin seeing any money figures</w:t>
+            </w:r>
+          </w:p>
+        </w:tc>
+      </w:tr>
+      <w:tr>
+        <w:tc>
+          <w:tcPr>
+            <w:tcW w:type="dxa" w:w="5400"/>
+            <w:tcBorders>
+              <w:top w:val="single" w:color="D0D7D3" w:sz="4"/>
+              <w:left w:val="single" w:color="D0D7D3" w:sz="4"/>
+              <w:bottom w:val="single" w:color="D0D7D3" w:sz="4"/>
+              <w:right w:val="single" w:color="D0D7D3" w:sz="4"/>
+            </w:tcBorders>
+            <w:shd w:fill="F6F8F7" w:color="auto" w:val="clear"/>
+            <w:tcMar>
+              <w:top w:type="dxa" w:w="80"/>
+              <w:left w:type="dxa" w:w="120"/>
+              <w:bottom w:type="dxa" w:w="80"/>
+              <w:right w:type="dxa" w:w="120"/>
+            </w:tcMar>
+          </w:tcPr>
+          <w:p>
+            <w:r>
+              <w:rPr>
+                <w:b w:val="false"/>
+                <w:bCs w:val="false"/>
+                <w:sz w:val="20"/>
+                <w:szCs w:val="20"/>
+              </w:rPr>
               <w:t xml:space="preserve">Give a parent a copy of their data, and erase a former pupil’s or parent’s details when asked</w:t>
             </w:r>
           </w:p>
@@ -1992,6 +2051,7 @@
               <w:bottom w:val="single" w:color="D0D7D3" w:sz="4"/>
               <w:right w:val="single" w:color="D0D7D3" w:sz="4"/>
             </w:tcBorders>
+            <w:shd w:fill="F6F8F7" w:color="auto" w:val="clear"/>
             <w:tcMar>
               <w:top w:type="dxa" w:w="80"/>
               <w:left w:type="dxa" w:w="120"/>
@@ -4099,6 +4159,66 @@
                 <w:sz w:val="20"/>
                 <w:szCs w:val="20"/>
               </w:rPr>
+              <w:t xml:space="preserve">School at a glance for school admins: pupils, classes and records that need attention</w:t>
+            </w:r>
+          </w:p>
+        </w:tc>
+      </w:tr>
+      <w:tr>
+        <w:tc>
+          <w:tcPr>
+            <w:tcW w:type="dxa" w:w="1800"/>
+            <w:tcBorders>
+              <w:top w:val="single" w:color="D0D7D3" w:sz="4"/>
+              <w:left w:val="single" w:color="D0D7D3" w:sz="4"/>
+              <w:bottom w:val="single" w:color="D0D7D3" w:sz="4"/>
+              <w:right w:val="single" w:color="D0D7D3" w:sz="4"/>
+            </w:tcBorders>
+            <w:shd w:fill="F6F8F7" w:color="auto" w:val="clear"/>
+            <w:tcMar>
+              <w:top w:type="dxa" w:w="80"/>
+              <w:left w:type="dxa" w:w="120"/>
+              <w:bottom w:type="dxa" w:w="80"/>
+              <w:right w:type="dxa" w:w="120"/>
+            </w:tcMar>
+          </w:tcPr>
+          <w:p>
+            <w:r>
+              <w:rPr>
+                <w:b w:val="false"/>
+                <w:bCs w:val="false"/>
+                <w:sz w:val="20"/>
+                <w:szCs w:val="20"/>
+              </w:rPr>
+              <w:t xml:space="preserve">19 Oct 2026</w:t>
+            </w:r>
+          </w:p>
+        </w:tc>
+        <w:tc>
+          <w:tcPr>
+            <w:tcW w:type="dxa" w:w="7838"/>
+            <w:tcBorders>
+              <w:top w:val="single" w:color="D0D7D3" w:sz="4"/>
+              <w:left w:val="single" w:color="D0D7D3" w:sz="4"/>
+              <w:bottom w:val="single" w:color="D0D7D3" w:sz="4"/>
+              <w:right w:val="single" w:color="D0D7D3" w:sz="4"/>
+            </w:tcBorders>
+            <w:shd w:fill="F6F8F7" w:color="auto" w:val="clear"/>
+            <w:tcMar>
+              <w:top w:type="dxa" w:w="80"/>
+              <w:left w:type="dxa" w:w="120"/>
+              <w:bottom w:type="dxa" w:w="80"/>
+              <w:right w:type="dxa" w:w="120"/>
+            </w:tcMar>
+          </w:tcPr>
+          <w:p>
+            <w:r>
+              <w:rPr>
+                <w:b w:val="false"/>
+                <w:bCs w:val="false"/>
+                <w:sz w:val="20"/>
+                <w:szCs w:val="20"/>
+              </w:rPr>
               <w:t xml:space="preserve">Fees added to classes mid-term, pupil exemptions, and a price list for uniforms and books</w:t>
             </w:r>
           </w:p>
@@ -4114,7 +4234,6 @@
               <w:bottom w:val="single" w:color="D0D7D3" w:sz="4"/>
               <w:right w:val="single" w:color="D0D7D3" w:sz="4"/>
             </w:tcBorders>
-            <w:shd w:fill="F6F8F7" w:color="auto" w:val="clear"/>
             <w:tcMar>
               <w:top w:type="dxa" w:w="80"/>
               <w:left w:type="dxa" w:w="120"/>
@@ -4143,7 +4262,6 @@
               <w:bottom w:val="single" w:color="D0D7D3" w:sz="4"/>
               <w:right w:val="single" w:color="D0D7D3" w:sz="4"/>
             </w:tcBorders>
-            <w:shd w:fill="F6F8F7" w:color="auto" w:val="clear"/>
             <w:tcMar>
               <w:top w:type="dxa" w:w="80"/>
               <w:left w:type="dxa" w:w="120"/>
@@ -4174,6 +4292,7 @@
               <w:bottom w:val="single" w:color="D0D7D3" w:sz="4"/>
               <w:right w:val="single" w:color="D0D7D3" w:sz="4"/>
             </w:tcBorders>
+            <w:shd w:fill="F6F8F7" w:color="auto" w:val="clear"/>
             <w:tcMar>
               <w:top w:type="dxa" w:w="80"/>
               <w:left w:type="dxa" w:w="120"/>
@@ -4202,6 +4321,7 @@
               <w:bottom w:val="single" w:color="D0D7D3" w:sz="4"/>
               <w:right w:val="single" w:color="D0D7D3" w:sz="4"/>
             </w:tcBorders>
+            <w:shd w:fill="F6F8F7" w:color="auto" w:val="clear"/>
             <w:tcMar>
               <w:top w:type="dxa" w:w="80"/>
               <w:left w:type="dxa" w:w="120"/>
@@ -4232,7 +4352,6 @@
               <w:bottom w:val="single" w:color="D0D7D3" w:sz="4"/>
               <w:right w:val="single" w:color="D0D7D3" w:sz="4"/>
             </w:tcBorders>
-            <w:shd w:fill="F6F8F7" w:color="auto" w:val="clear"/>
             <w:tcMar>
               <w:top w:type="dxa" w:w="80"/>
               <w:left w:type="dxa" w:w="120"/>
@@ -4261,7 +4380,6 @@
               <w:bottom w:val="single" w:color="D0D7D3" w:sz="4"/>
               <w:right w:val="single" w:color="D0D7D3" w:sz="4"/>
             </w:tcBorders>
-            <w:shd w:fill="F6F8F7" w:color="auto" w:val="clear"/>
             <w:tcMar>
               <w:top w:type="dxa" w:w="80"/>
               <w:left w:type="dxa" w:w="120"/>
@@ -4292,6 +4410,7 @@
               <w:bottom w:val="single" w:color="D0D7D3" w:sz="4"/>
               <w:right w:val="single" w:color="D0D7D3" w:sz="4"/>
             </w:tcBorders>
+            <w:shd w:fill="F6F8F7" w:color="auto" w:val="clear"/>
             <w:tcMar>
               <w:top w:type="dxa" w:w="80"/>
               <w:left w:type="dxa" w:w="120"/>
@@ -4320,6 +4439,7 @@
               <w:bottom w:val="single" w:color="D0D7D3" w:sz="4"/>
               <w:right w:val="single" w:color="D0D7D3" w:sz="4"/>
             </w:tcBorders>
+            <w:shd w:fill="F6F8F7" w:color="auto" w:val="clear"/>
             <w:tcMar>
               <w:top w:type="dxa" w:w="80"/>
               <w:left w:type="dxa" w:w="120"/>
@@ -4350,7 +4470,6 @@
               <w:bottom w:val="single" w:color="D0D7D3" w:sz="4"/>
               <w:right w:val="single" w:color="D0D7D3" w:sz="4"/>
             </w:tcBorders>
-            <w:shd w:fill="F6F8F7" w:color="auto" w:val="clear"/>
             <w:tcMar>
               <w:top w:type="dxa" w:w="80"/>
               <w:left w:type="dxa" w:w="120"/>
@@ -4379,7 +4498,6 @@
               <w:bottom w:val="single" w:color="D0D7D3" w:sz="4"/>
               <w:right w:val="single" w:color="D0D7D3" w:sz="4"/>
             </w:tcBorders>
-            <w:shd w:fill="F6F8F7" w:color="auto" w:val="clear"/>
             <w:tcMar>
               <w:top w:type="dxa" w:w="80"/>
               <w:left w:type="dxa" w:w="120"/>
@@ -4410,6 +4528,7 @@
               <w:bottom w:val="single" w:color="D0D7D3" w:sz="4"/>
               <w:right w:val="single" w:color="D0D7D3" w:sz="4"/>
             </w:tcBorders>
+            <w:shd w:fill="F6F8F7" w:color="auto" w:val="clear"/>
             <w:tcMar>
               <w:top w:type="dxa" w:w="80"/>
               <w:left w:type="dxa" w:w="120"/>
@@ -4438,6 +4557,7 @@
               <w:bottom w:val="single" w:color="D0D7D3" w:sz="4"/>
               <w:right w:val="single" w:color="D0D7D3" w:sz="4"/>
             </w:tcBorders>
+            <w:shd w:fill="F6F8F7" w:color="auto" w:val="clear"/>
             <w:tcMar>
               <w:top w:type="dxa" w:w="80"/>
               <w:left w:type="dxa" w:w="120"/>
@@ -4468,7 +4588,6 @@
               <w:bottom w:val="single" w:color="D0D7D3" w:sz="4"/>
               <w:right w:val="single" w:color="D0D7D3" w:sz="4"/>
             </w:tcBorders>
-            <w:shd w:fill="F6F8F7" w:color="auto" w:val="clear"/>
             <w:tcMar>
               <w:top w:type="dxa" w:w="80"/>
               <w:left w:type="dxa" w:w="120"/>
@@ -4497,7 +4616,6 @@
               <w:bottom w:val="single" w:color="D0D7D3" w:sz="4"/>
               <w:right w:val="single" w:color="D0D7D3" w:sz="4"/>
             </w:tcBorders>
-            <w:shd w:fill="F6F8F7" w:color="auto" w:val="clear"/>
             <w:tcMar>
               <w:top w:type="dxa" w:w="80"/>
               <w:left w:type="dxa" w:w="120"/>
@@ -4528,6 +4646,7 @@
               <w:bottom w:val="single" w:color="D0D7D3" w:sz="4"/>
               <w:right w:val="single" w:color="D0D7D3" w:sz="4"/>
             </w:tcBorders>
+            <w:shd w:fill="F6F8F7" w:color="auto" w:val="clear"/>
             <w:tcMar>
               <w:top w:type="dxa" w:w="80"/>
               <w:left w:type="dxa" w:w="120"/>
@@ -4556,6 +4675,7 @@
               <w:bottom w:val="single" w:color="D0D7D3" w:sz="4"/>
               <w:right w:val="single" w:color="D0D7D3" w:sz="4"/>
             </w:tcBorders>
+            <w:shd w:fill="F6F8F7" w:color="auto" w:val="clear"/>
             <w:tcMar>
               <w:top w:type="dxa" w:w="80"/>
               <w:left w:type="dxa" w:w="120"/>
@@ -4586,7 +4706,6 @@
               <w:bottom w:val="single" w:color="D0D7D3" w:sz="4"/>
               <w:right w:val="single" w:color="D0D7D3" w:sz="4"/>
             </w:tcBorders>
-            <w:shd w:fill="F6F8F7" w:color="auto" w:val="clear"/>
             <w:tcMar>
               <w:top w:type="dxa" w:w="80"/>
               <w:left w:type="dxa" w:w="120"/>
@@ -4615,7 +4734,6 @@
               <w:bottom w:val="single" w:color="D0D7D3" w:sz="4"/>
               <w:right w:val="single" w:color="D0D7D3" w:sz="4"/>
             </w:tcBorders>
-            <w:shd w:fill="F6F8F7" w:color="auto" w:val="clear"/>
             <w:tcMar>
               <w:top w:type="dxa" w:w="80"/>
               <w:left w:type="dxa" w:w="120"/>
@@ -4646,6 +4764,7 @@
               <w:bottom w:val="single" w:color="D0D7D3" w:sz="4"/>
               <w:right w:val="single" w:color="D0D7D3" w:sz="4"/>
             </w:tcBorders>
+            <w:shd w:fill="F6F8F7" w:color="auto" w:val="clear"/>
             <w:tcMar>
               <w:top w:type="dxa" w:w="80"/>
               <w:left w:type="dxa" w:w="120"/>
@@ -4674,6 +4793,7 @@
               <w:bottom w:val="single" w:color="D0D7D3" w:sz="4"/>
               <w:right w:val="single" w:color="D0D7D3" w:sz="4"/>
             </w:tcBorders>
+            <w:shd w:fill="F6F8F7" w:color="auto" w:val="clear"/>
             <w:tcMar>
               <w:top w:type="dxa" w:w="80"/>
               <w:left w:type="dxa" w:w="120"/>
@@ -4704,7 +4824,6 @@
               <w:bottom w:val="single" w:color="D0D7D3" w:sz="4"/>
               <w:right w:val="single" w:color="D0D7D3" w:sz="4"/>
             </w:tcBorders>
-            <w:shd w:fill="F6F8F7" w:color="auto" w:val="clear"/>
             <w:tcMar>
               <w:top w:type="dxa" w:w="80"/>
               <w:left w:type="dxa" w:w="120"/>
@@ -4733,7 +4852,6 @@
               <w:bottom w:val="single" w:color="D0D7D3" w:sz="4"/>
               <w:right w:val="single" w:color="D0D7D3" w:sz="4"/>
             </w:tcBorders>
-            <w:shd w:fill="F6F8F7" w:color="auto" w:val="clear"/>
             <w:tcMar>
               <w:top w:type="dxa" w:w="80"/>
               <w:left w:type="dxa" w:w="120"/>

</xml_diff>

<commit_message>
Family payment link: one link per parent to pay for all their children
Bills and reminders carry each parent's own link (no sign-in). The page shows
each current child's first name, class, what's owed (up to the next instalment
on a plan) and account number. One card payment covers several children with
the amount chosen per child; it is recorded as one payment per child, each with
its own receipt, and a gateway total that doesn't match is parked for review.
Links expire, staff can copy or replace them, and erasing a parent ends theirs.
Payments are now recorded in batches (record_payments) in a fixed number of
statements.
</commit_message>
<xml_diff>
--- a/docs/product/ParentPay - what it does.docx
+++ b/docs/product/ParentPay - what it does.docx
@@ -2365,6 +2365,65 @@
                 <w:sz w:val="20"/>
                 <w:szCs w:val="20"/>
               </w:rPr>
+              <w:t xml:space="preserve">One payment link of their own, in every bill and reminder: all their children, no sign-in. One card payment covers several children, and they choose how much goes to each</w:t>
+            </w:r>
+          </w:p>
+        </w:tc>
+        <w:tc>
+          <w:tcPr>
+            <w:tcW w:type="dxa" w:w="4238"/>
+            <w:tcBorders>
+              <w:top w:val="single" w:color="D0D7D3" w:sz="4"/>
+              <w:left w:val="single" w:color="D0D7D3" w:sz="4"/>
+              <w:bottom w:val="single" w:color="D0D7D3" w:sz="4"/>
+              <w:right w:val="single" w:color="D0D7D3" w:sz="4"/>
+            </w:tcBorders>
+            <w:shd w:fill="F6F8F7" w:color="auto" w:val="clear"/>
+            <w:tcMar>
+              <w:top w:type="dxa" w:w="80"/>
+              <w:left w:type="dxa" w:w="120"/>
+              <w:bottom w:type="dxa" w:w="80"/>
+              <w:right w:type="dxa" w:w="120"/>
+            </w:tcMar>
+          </w:tcPr>
+          <w:p>
+            <w:r>
+              <w:rPr>
+                <w:b w:val="false"/>
+                <w:bCs w:val="false"/>
+                <w:sz w:val="20"/>
+                <w:szCs w:val="20"/>
+              </w:rPr>
+              <w:t xml:space="preserve">Paying for three children takes one minute, part now and the rest later if needed, with a receipt per child</w:t>
+            </w:r>
+          </w:p>
+        </w:tc>
+      </w:tr>
+      <w:tr>
+        <w:tc>
+          <w:tcPr>
+            <w:tcW w:type="dxa" w:w="5400"/>
+            <w:tcBorders>
+              <w:top w:val="single" w:color="D0D7D3" w:sz="4"/>
+              <w:left w:val="single" w:color="D0D7D3" w:sz="4"/>
+              <w:bottom w:val="single" w:color="D0D7D3" w:sz="4"/>
+              <w:right w:val="single" w:color="D0D7D3" w:sz="4"/>
+            </w:tcBorders>
+            <w:tcMar>
+              <w:top w:type="dxa" w:w="80"/>
+              <w:left w:type="dxa" w:w="120"/>
+              <w:bottom w:type="dxa" w:w="80"/>
+              <w:right w:type="dxa" w:w="120"/>
+            </w:tcMar>
+          </w:tcPr>
+          <w:p>
+            <w:r>
+              <w:rPr>
+                <w:b w:val="false"/>
+                <w:bCs w:val="false"/>
+                <w:sz w:val="20"/>
+                <w:szCs w:val="20"/>
+              </w:rPr>
               <w:t xml:space="preserve">See every bill with its items, every payment, and download receipts any time</w:t>
             </w:r>
           </w:p>
@@ -2378,7 +2437,6 @@
               <w:bottom w:val="single" w:color="D0D7D3" w:sz="4"/>
               <w:right w:val="single" w:color="D0D7D3" w:sz="4"/>
             </w:tcBorders>
-            <w:shd w:fill="F6F8F7" w:color="auto" w:val="clear"/>
             <w:tcMar>
               <w:top w:type="dxa" w:w="80"/>
               <w:left w:type="dxa" w:w="120"/>
@@ -2409,6 +2467,7 @@
               <w:bottom w:val="single" w:color="D0D7D3" w:sz="4"/>
               <w:right w:val="single" w:color="D0D7D3" w:sz="4"/>
             </w:tcBorders>
+            <w:shd w:fill="F6F8F7" w:color="auto" w:val="clear"/>
             <w:tcMar>
               <w:top w:type="dxa" w:w="80"/>
               <w:left w:type="dxa" w:w="120"/>
@@ -2437,6 +2496,7 @@
               <w:bottom w:val="single" w:color="D0D7D3" w:sz="4"/>
               <w:right w:val="single" w:color="D0D7D3" w:sz="4"/>
             </w:tcBorders>
+            <w:shd w:fill="F6F8F7" w:color="auto" w:val="clear"/>
             <w:tcMar>
               <w:top w:type="dxa" w:w="80"/>
               <w:left w:type="dxa" w:w="120"/>
@@ -2467,7 +2527,6 @@
               <w:bottom w:val="single" w:color="D0D7D3" w:sz="4"/>
               <w:right w:val="single" w:color="D0D7D3" w:sz="4"/>
             </w:tcBorders>
-            <w:shd w:fill="F6F8F7" w:color="auto" w:val="clear"/>
             <w:tcMar>
               <w:top w:type="dxa" w:w="80"/>
               <w:left w:type="dxa" w:w="120"/>
@@ -2496,7 +2555,6 @@
               <w:bottom w:val="single" w:color="D0D7D3" w:sz="4"/>
               <w:right w:val="single" w:color="D0D7D3" w:sz="4"/>
             </w:tcBorders>
-            <w:shd w:fill="F6F8F7" w:color="auto" w:val="clear"/>
             <w:tcMar>
               <w:top w:type="dxa" w:w="80"/>
               <w:left w:type="dxa" w:w="120"/>
@@ -2527,6 +2585,7 @@
               <w:bottom w:val="single" w:color="D0D7D3" w:sz="4"/>
               <w:right w:val="single" w:color="D0D7D3" w:sz="4"/>
             </w:tcBorders>
+            <w:shd w:fill="F6F8F7" w:color="auto" w:val="clear"/>
             <w:tcMar>
               <w:top w:type="dxa" w:w="80"/>
               <w:left w:type="dxa" w:w="120"/>
@@ -2555,6 +2614,7 @@
               <w:bottom w:val="single" w:color="D0D7D3" w:sz="4"/>
               <w:right w:val="single" w:color="D0D7D3" w:sz="4"/>
             </w:tcBorders>
+            <w:shd w:fill="F6F8F7" w:color="auto" w:val="clear"/>
             <w:tcMar>
               <w:top w:type="dxa" w:w="80"/>
               <w:left w:type="dxa" w:w="120"/>
@@ -2585,7 +2645,6 @@
               <w:bottom w:val="single" w:color="D0D7D3" w:sz="4"/>
               <w:right w:val="single" w:color="D0D7D3" w:sz="4"/>
             </w:tcBorders>
-            <w:shd w:fill="F6F8F7" w:color="auto" w:val="clear"/>
             <w:tcMar>
               <w:top w:type="dxa" w:w="80"/>
               <w:left w:type="dxa" w:w="120"/>
@@ -2614,7 +2673,6 @@
               <w:bottom w:val="single" w:color="D0D7D3" w:sz="4"/>
               <w:right w:val="single" w:color="D0D7D3" w:sz="4"/>
             </w:tcBorders>
-            <w:shd w:fill="F6F8F7" w:color="auto" w:val="clear"/>
             <w:tcMar>
               <w:top w:type="dxa" w:w="80"/>
               <w:left w:type="dxa" w:w="120"/>
@@ -3963,23 +4021,6 @@
       </w:pPr>
       <w:r>
         <w:t xml:space="preserve">Coming next</w:t>
-      </w:r>
-    </w:p>
-    <w:p>
-      <w:pPr>
-        <w:pStyle w:val="ListParagraph"/>
-        <w:numPr>
-          <w:ilvl w:val="0"/>
-          <w:numId w:val="2"/>
-        </w:numPr>
-        <w:spacing w:after="80"/>
-      </w:pPr>
-      <w:r>
-        <w:rPr>
-          <w:sz w:val="22"/>
-          <w:szCs w:val="22"/>
-        </w:rPr>
-        <w:t xml:space="preserve">A payment link a parent keeps and opens any time for all their children, with no sign-in</w:t>
       </w:r>
     </w:p>
     <w:p>
@@ -4159,6 +4200,66 @@
                 <w:sz w:val="20"/>
                 <w:szCs w:val="20"/>
               </w:rPr>
+              <w:t xml:space="preserve">Family payment link: one link per parent to pay for all their children, choosing the amount per child</w:t>
+            </w:r>
+          </w:p>
+        </w:tc>
+      </w:tr>
+      <w:tr>
+        <w:tc>
+          <w:tcPr>
+            <w:tcW w:type="dxa" w:w="1800"/>
+            <w:tcBorders>
+              <w:top w:val="single" w:color="D0D7D3" w:sz="4"/>
+              <w:left w:val="single" w:color="D0D7D3" w:sz="4"/>
+              <w:bottom w:val="single" w:color="D0D7D3" w:sz="4"/>
+              <w:right w:val="single" w:color="D0D7D3" w:sz="4"/>
+            </w:tcBorders>
+            <w:shd w:fill="F6F8F7" w:color="auto" w:val="clear"/>
+            <w:tcMar>
+              <w:top w:type="dxa" w:w="80"/>
+              <w:left w:type="dxa" w:w="120"/>
+              <w:bottom w:type="dxa" w:w="80"/>
+              <w:right w:type="dxa" w:w="120"/>
+            </w:tcMar>
+          </w:tcPr>
+          <w:p>
+            <w:r>
+              <w:rPr>
+                <w:b w:val="false"/>
+                <w:bCs w:val="false"/>
+                <w:sz w:val="20"/>
+                <w:szCs w:val="20"/>
+              </w:rPr>
+              <w:t xml:space="preserve">19 Oct 2026</w:t>
+            </w:r>
+          </w:p>
+        </w:tc>
+        <w:tc>
+          <w:tcPr>
+            <w:tcW w:type="dxa" w:w="7838"/>
+            <w:tcBorders>
+              <w:top w:val="single" w:color="D0D7D3" w:sz="4"/>
+              <w:left w:val="single" w:color="D0D7D3" w:sz="4"/>
+              <w:bottom w:val="single" w:color="D0D7D3" w:sz="4"/>
+              <w:right w:val="single" w:color="D0D7D3" w:sz="4"/>
+            </w:tcBorders>
+            <w:shd w:fill="F6F8F7" w:color="auto" w:val="clear"/>
+            <w:tcMar>
+              <w:top w:type="dxa" w:w="80"/>
+              <w:left w:type="dxa" w:w="120"/>
+              <w:bottom w:type="dxa" w:w="80"/>
+              <w:right w:type="dxa" w:w="120"/>
+            </w:tcMar>
+          </w:tcPr>
+          <w:p>
+            <w:r>
+              <w:rPr>
+                <w:b w:val="false"/>
+                <w:bCs w:val="false"/>
+                <w:sz w:val="20"/>
+                <w:szCs w:val="20"/>
+              </w:rPr>
               <w:t xml:space="preserve">School at a glance for school admins: pupils, classes and records that need attention</w:t>
             </w:r>
           </w:p>
@@ -4174,7 +4275,6 @@
               <w:bottom w:val="single" w:color="D0D7D3" w:sz="4"/>
               <w:right w:val="single" w:color="D0D7D3" w:sz="4"/>
             </w:tcBorders>
-            <w:shd w:fill="F6F8F7" w:color="auto" w:val="clear"/>
             <w:tcMar>
               <w:top w:type="dxa" w:w="80"/>
               <w:left w:type="dxa" w:w="120"/>
@@ -4203,7 +4303,6 @@
               <w:bottom w:val="single" w:color="D0D7D3" w:sz="4"/>
               <w:right w:val="single" w:color="D0D7D3" w:sz="4"/>
             </w:tcBorders>
-            <w:shd w:fill="F6F8F7" w:color="auto" w:val="clear"/>
             <w:tcMar>
               <w:top w:type="dxa" w:w="80"/>
               <w:left w:type="dxa" w:w="120"/>
@@ -4234,6 +4333,7 @@
               <w:bottom w:val="single" w:color="D0D7D3" w:sz="4"/>
               <w:right w:val="single" w:color="D0D7D3" w:sz="4"/>
             </w:tcBorders>
+            <w:shd w:fill="F6F8F7" w:color="auto" w:val="clear"/>
             <w:tcMar>
               <w:top w:type="dxa" w:w="80"/>
               <w:left w:type="dxa" w:w="120"/>
@@ -4262,6 +4362,7 @@
               <w:bottom w:val="single" w:color="D0D7D3" w:sz="4"/>
               <w:right w:val="single" w:color="D0D7D3" w:sz="4"/>
             </w:tcBorders>
+            <w:shd w:fill="F6F8F7" w:color="auto" w:val="clear"/>
             <w:tcMar>
               <w:top w:type="dxa" w:w="80"/>
               <w:left w:type="dxa" w:w="120"/>
@@ -4292,7 +4393,6 @@
               <w:bottom w:val="single" w:color="D0D7D3" w:sz="4"/>
               <w:right w:val="single" w:color="D0D7D3" w:sz="4"/>
             </w:tcBorders>
-            <w:shd w:fill="F6F8F7" w:color="auto" w:val="clear"/>
             <w:tcMar>
               <w:top w:type="dxa" w:w="80"/>
               <w:left w:type="dxa" w:w="120"/>
@@ -4321,7 +4421,6 @@
               <w:bottom w:val="single" w:color="D0D7D3" w:sz="4"/>
               <w:right w:val="single" w:color="D0D7D3" w:sz="4"/>
             </w:tcBorders>
-            <w:shd w:fill="F6F8F7" w:color="auto" w:val="clear"/>
             <w:tcMar>
               <w:top w:type="dxa" w:w="80"/>
               <w:left w:type="dxa" w:w="120"/>
@@ -4352,6 +4451,7 @@
               <w:bottom w:val="single" w:color="D0D7D3" w:sz="4"/>
               <w:right w:val="single" w:color="D0D7D3" w:sz="4"/>
             </w:tcBorders>
+            <w:shd w:fill="F6F8F7" w:color="auto" w:val="clear"/>
             <w:tcMar>
               <w:top w:type="dxa" w:w="80"/>
               <w:left w:type="dxa" w:w="120"/>
@@ -4380,6 +4480,7 @@
               <w:bottom w:val="single" w:color="D0D7D3" w:sz="4"/>
               <w:right w:val="single" w:color="D0D7D3" w:sz="4"/>
             </w:tcBorders>
+            <w:shd w:fill="F6F8F7" w:color="auto" w:val="clear"/>
             <w:tcMar>
               <w:top w:type="dxa" w:w="80"/>
               <w:left w:type="dxa" w:w="120"/>
@@ -4410,7 +4511,6 @@
               <w:bottom w:val="single" w:color="D0D7D3" w:sz="4"/>
               <w:right w:val="single" w:color="D0D7D3" w:sz="4"/>
             </w:tcBorders>
-            <w:shd w:fill="F6F8F7" w:color="auto" w:val="clear"/>
             <w:tcMar>
               <w:top w:type="dxa" w:w="80"/>
               <w:left w:type="dxa" w:w="120"/>
@@ -4439,7 +4539,6 @@
               <w:bottom w:val="single" w:color="D0D7D3" w:sz="4"/>
               <w:right w:val="single" w:color="D0D7D3" w:sz="4"/>
             </w:tcBorders>
-            <w:shd w:fill="F6F8F7" w:color="auto" w:val="clear"/>
             <w:tcMar>
               <w:top w:type="dxa" w:w="80"/>
               <w:left w:type="dxa" w:w="120"/>
@@ -4470,6 +4569,7 @@
               <w:bottom w:val="single" w:color="D0D7D3" w:sz="4"/>
               <w:right w:val="single" w:color="D0D7D3" w:sz="4"/>
             </w:tcBorders>
+            <w:shd w:fill="F6F8F7" w:color="auto" w:val="clear"/>
             <w:tcMar>
               <w:top w:type="dxa" w:w="80"/>
               <w:left w:type="dxa" w:w="120"/>
@@ -4498,6 +4598,7 @@
               <w:bottom w:val="single" w:color="D0D7D3" w:sz="4"/>
               <w:right w:val="single" w:color="D0D7D3" w:sz="4"/>
             </w:tcBorders>
+            <w:shd w:fill="F6F8F7" w:color="auto" w:val="clear"/>
             <w:tcMar>
               <w:top w:type="dxa" w:w="80"/>
               <w:left w:type="dxa" w:w="120"/>
@@ -4528,7 +4629,6 @@
               <w:bottom w:val="single" w:color="D0D7D3" w:sz="4"/>
               <w:right w:val="single" w:color="D0D7D3" w:sz="4"/>
             </w:tcBorders>
-            <w:shd w:fill="F6F8F7" w:color="auto" w:val="clear"/>
             <w:tcMar>
               <w:top w:type="dxa" w:w="80"/>
               <w:left w:type="dxa" w:w="120"/>
@@ -4557,7 +4657,6 @@
               <w:bottom w:val="single" w:color="D0D7D3" w:sz="4"/>
               <w:right w:val="single" w:color="D0D7D3" w:sz="4"/>
             </w:tcBorders>
-            <w:shd w:fill="F6F8F7" w:color="auto" w:val="clear"/>
             <w:tcMar>
               <w:top w:type="dxa" w:w="80"/>
               <w:left w:type="dxa" w:w="120"/>
@@ -4588,6 +4687,7 @@
               <w:bottom w:val="single" w:color="D0D7D3" w:sz="4"/>
               <w:right w:val="single" w:color="D0D7D3" w:sz="4"/>
             </w:tcBorders>
+            <w:shd w:fill="F6F8F7" w:color="auto" w:val="clear"/>
             <w:tcMar>
               <w:top w:type="dxa" w:w="80"/>
               <w:left w:type="dxa" w:w="120"/>
@@ -4616,6 +4716,7 @@
               <w:bottom w:val="single" w:color="D0D7D3" w:sz="4"/>
               <w:right w:val="single" w:color="D0D7D3" w:sz="4"/>
             </w:tcBorders>
+            <w:shd w:fill="F6F8F7" w:color="auto" w:val="clear"/>
             <w:tcMar>
               <w:top w:type="dxa" w:w="80"/>
               <w:left w:type="dxa" w:w="120"/>
@@ -4646,7 +4747,6 @@
               <w:bottom w:val="single" w:color="D0D7D3" w:sz="4"/>
               <w:right w:val="single" w:color="D0D7D3" w:sz="4"/>
             </w:tcBorders>
-            <w:shd w:fill="F6F8F7" w:color="auto" w:val="clear"/>
             <w:tcMar>
               <w:top w:type="dxa" w:w="80"/>
               <w:left w:type="dxa" w:w="120"/>
@@ -4675,7 +4775,6 @@
               <w:bottom w:val="single" w:color="D0D7D3" w:sz="4"/>
               <w:right w:val="single" w:color="D0D7D3" w:sz="4"/>
             </w:tcBorders>
-            <w:shd w:fill="F6F8F7" w:color="auto" w:val="clear"/>
             <w:tcMar>
               <w:top w:type="dxa" w:w="80"/>
               <w:left w:type="dxa" w:w="120"/>
@@ -4706,6 +4805,7 @@
               <w:bottom w:val="single" w:color="D0D7D3" w:sz="4"/>
               <w:right w:val="single" w:color="D0D7D3" w:sz="4"/>
             </w:tcBorders>
+            <w:shd w:fill="F6F8F7" w:color="auto" w:val="clear"/>
             <w:tcMar>
               <w:top w:type="dxa" w:w="80"/>
               <w:left w:type="dxa" w:w="120"/>
@@ -4734,6 +4834,7 @@
               <w:bottom w:val="single" w:color="D0D7D3" w:sz="4"/>
               <w:right w:val="single" w:color="D0D7D3" w:sz="4"/>
             </w:tcBorders>
+            <w:shd w:fill="F6F8F7" w:color="auto" w:val="clear"/>
             <w:tcMar>
               <w:top w:type="dxa" w:w="80"/>
               <w:left w:type="dxa" w:w="120"/>
@@ -4764,7 +4865,6 @@
               <w:bottom w:val="single" w:color="D0D7D3" w:sz="4"/>
               <w:right w:val="single" w:color="D0D7D3" w:sz="4"/>
             </w:tcBorders>
-            <w:shd w:fill="F6F8F7" w:color="auto" w:val="clear"/>
             <w:tcMar>
               <w:top w:type="dxa" w:w="80"/>
               <w:left w:type="dxa" w:w="120"/>
@@ -4793,7 +4893,6 @@
               <w:bottom w:val="single" w:color="D0D7D3" w:sz="4"/>
               <w:right w:val="single" w:color="D0D7D3" w:sz="4"/>
             </w:tcBorders>
-            <w:shd w:fill="F6F8F7" w:color="auto" w:val="clear"/>
             <w:tcMar>
               <w:top w:type="dxa" w:w="80"/>
               <w:left w:type="dxa" w:w="120"/>
@@ -4824,6 +4923,7 @@
               <w:bottom w:val="single" w:color="D0D7D3" w:sz="4"/>
               <w:right w:val="single" w:color="D0D7D3" w:sz="4"/>
             </w:tcBorders>
+            <w:shd w:fill="F6F8F7" w:color="auto" w:val="clear"/>
             <w:tcMar>
               <w:top w:type="dxa" w:w="80"/>
               <w:left w:type="dxa" w:w="120"/>
@@ -4852,6 +4952,7 @@
               <w:bottom w:val="single" w:color="D0D7D3" w:sz="4"/>
               <w:right w:val="single" w:color="D0D7D3" w:sz="4"/>
             </w:tcBorders>
+            <w:shd w:fill="F6F8F7" w:color="auto" w:val="clear"/>
             <w:tcMar>
               <w:top w:type="dxa" w:w="80"/>
               <w:left w:type="dxa" w:w="120"/>

</xml_diff>

<commit_message>
Phone calls for parents who don't read messages easily
Parents marked as preferring calls (by staff, or themselves in the portal) are
also phoned, in English or Pidgin: on overdue reminder days, saying what's owed
and reading the child's account number slowly twice, and when a payment arrives.
The text still goes so a POS agent can read the number. Schools switch calls on
with a cap per bill; calls only go 9:00-19:00 and re-check opt-out and payment
at calling time. Africa's Talking places the call and reads the words from our
callback, which answers only for our calls to the parent's own number. The demo
school phones a dozen parents, and its messages now carry real family links.
</commit_message>
<xml_diff>
--- a/docs/product/ParentPay - what it does.docx
+++ b/docs/product/ParentPay - what it does.docx
@@ -2365,6 +2365,65 @@
                 <w:sz w:val="20"/>
                 <w:szCs w:val="20"/>
               </w:rPr>
+              <w:t xml:space="preserve">Parents who don’t read messages easily can get a phone call, in English or Pidgin: what’s owed, the child’s account number read out slowly twice, and a call when the payment arrives</w:t>
+            </w:r>
+          </w:p>
+        </w:tc>
+        <w:tc>
+          <w:tcPr>
+            <w:tcW w:type="dxa" w:w="4238"/>
+            <w:tcBorders>
+              <w:top w:val="single" w:color="D0D7D3" w:sz="4"/>
+              <w:left w:val="single" w:color="D0D7D3" w:sz="4"/>
+              <w:bottom w:val="single" w:color="D0D7D3" w:sz="4"/>
+              <w:right w:val="single" w:color="D0D7D3" w:sz="4"/>
+            </w:tcBorders>
+            <w:shd w:fill="F6F8F7" w:color="auto" w:val="clear"/>
+            <w:tcMar>
+              <w:top w:type="dxa" w:w="80"/>
+              <w:left w:type="dxa" w:w="120"/>
+              <w:bottom w:type="dxa" w:w="80"/>
+              <w:right w:type="dxa" w:w="120"/>
+            </w:tcMar>
+          </w:tcPr>
+          <w:p>
+            <w:r>
+              <w:rPr>
+                <w:b w:val="false"/>
+                <w:bCs w:val="false"/>
+                <w:sz w:val="20"/>
+                <w:szCs w:val="20"/>
+              </w:rPr>
+              <w:t xml:space="preserve">Nobody is left out because they can’t read a text; they can hand the number to any POS agent</w:t>
+            </w:r>
+          </w:p>
+        </w:tc>
+      </w:tr>
+      <w:tr>
+        <w:tc>
+          <w:tcPr>
+            <w:tcW w:type="dxa" w:w="5400"/>
+            <w:tcBorders>
+              <w:top w:val="single" w:color="D0D7D3" w:sz="4"/>
+              <w:left w:val="single" w:color="D0D7D3" w:sz="4"/>
+              <w:bottom w:val="single" w:color="D0D7D3" w:sz="4"/>
+              <w:right w:val="single" w:color="D0D7D3" w:sz="4"/>
+            </w:tcBorders>
+            <w:tcMar>
+              <w:top w:type="dxa" w:w="80"/>
+              <w:left w:type="dxa" w:w="120"/>
+              <w:bottom w:type="dxa" w:w="80"/>
+              <w:right w:type="dxa" w:w="120"/>
+            </w:tcMar>
+          </w:tcPr>
+          <w:p>
+            <w:r>
+              <w:rPr>
+                <w:b w:val="false"/>
+                <w:bCs w:val="false"/>
+                <w:sz w:val="20"/>
+                <w:szCs w:val="20"/>
+              </w:rPr>
               <w:t xml:space="preserve">One payment link of their own, in every bill and reminder: all their children, no sign-in. One card payment covers several children, and they choose how much goes to each</w:t>
             </w:r>
           </w:p>
@@ -2378,7 +2437,6 @@
               <w:bottom w:val="single" w:color="D0D7D3" w:sz="4"/>
               <w:right w:val="single" w:color="D0D7D3" w:sz="4"/>
             </w:tcBorders>
-            <w:shd w:fill="F6F8F7" w:color="auto" w:val="clear"/>
             <w:tcMar>
               <w:top w:type="dxa" w:w="80"/>
               <w:left w:type="dxa" w:w="120"/>
@@ -2409,6 +2467,7 @@
               <w:bottom w:val="single" w:color="D0D7D3" w:sz="4"/>
               <w:right w:val="single" w:color="D0D7D3" w:sz="4"/>
             </w:tcBorders>
+            <w:shd w:fill="F6F8F7" w:color="auto" w:val="clear"/>
             <w:tcMar>
               <w:top w:type="dxa" w:w="80"/>
               <w:left w:type="dxa" w:w="120"/>
@@ -2437,6 +2496,7 @@
               <w:bottom w:val="single" w:color="D0D7D3" w:sz="4"/>
               <w:right w:val="single" w:color="D0D7D3" w:sz="4"/>
             </w:tcBorders>
+            <w:shd w:fill="F6F8F7" w:color="auto" w:val="clear"/>
             <w:tcMar>
               <w:top w:type="dxa" w:w="80"/>
               <w:left w:type="dxa" w:w="120"/>
@@ -2467,7 +2527,6 @@
               <w:bottom w:val="single" w:color="D0D7D3" w:sz="4"/>
               <w:right w:val="single" w:color="D0D7D3" w:sz="4"/>
             </w:tcBorders>
-            <w:shd w:fill="F6F8F7" w:color="auto" w:val="clear"/>
             <w:tcMar>
               <w:top w:type="dxa" w:w="80"/>
               <w:left w:type="dxa" w:w="120"/>
@@ -2496,7 +2555,6 @@
               <w:bottom w:val="single" w:color="D0D7D3" w:sz="4"/>
               <w:right w:val="single" w:color="D0D7D3" w:sz="4"/>
             </w:tcBorders>
-            <w:shd w:fill="F6F8F7" w:color="auto" w:val="clear"/>
             <w:tcMar>
               <w:top w:type="dxa" w:w="80"/>
               <w:left w:type="dxa" w:w="120"/>
@@ -2527,6 +2585,7 @@
               <w:bottom w:val="single" w:color="D0D7D3" w:sz="4"/>
               <w:right w:val="single" w:color="D0D7D3" w:sz="4"/>
             </w:tcBorders>
+            <w:shd w:fill="F6F8F7" w:color="auto" w:val="clear"/>
             <w:tcMar>
               <w:top w:type="dxa" w:w="80"/>
               <w:left w:type="dxa" w:w="120"/>
@@ -2555,6 +2614,7 @@
               <w:bottom w:val="single" w:color="D0D7D3" w:sz="4"/>
               <w:right w:val="single" w:color="D0D7D3" w:sz="4"/>
             </w:tcBorders>
+            <w:shd w:fill="F6F8F7" w:color="auto" w:val="clear"/>
             <w:tcMar>
               <w:top w:type="dxa" w:w="80"/>
               <w:left w:type="dxa" w:w="120"/>
@@ -2585,7 +2645,6 @@
               <w:bottom w:val="single" w:color="D0D7D3" w:sz="4"/>
               <w:right w:val="single" w:color="D0D7D3" w:sz="4"/>
             </w:tcBorders>
-            <w:shd w:fill="F6F8F7" w:color="auto" w:val="clear"/>
             <w:tcMar>
               <w:top w:type="dxa" w:w="80"/>
               <w:left w:type="dxa" w:w="120"/>
@@ -2614,7 +2673,6 @@
               <w:bottom w:val="single" w:color="D0D7D3" w:sz="4"/>
               <w:right w:val="single" w:color="D0D7D3" w:sz="4"/>
             </w:tcBorders>
-            <w:shd w:fill="F6F8F7" w:color="auto" w:val="clear"/>
             <w:tcMar>
               <w:top w:type="dxa" w:w="80"/>
               <w:left w:type="dxa" w:w="120"/>
@@ -2645,6 +2703,7 @@
               <w:bottom w:val="single" w:color="D0D7D3" w:sz="4"/>
               <w:right w:val="single" w:color="D0D7D3" w:sz="4"/>
             </w:tcBorders>
+            <w:shd w:fill="F6F8F7" w:color="auto" w:val="clear"/>
             <w:tcMar>
               <w:top w:type="dxa" w:w="80"/>
               <w:left w:type="dxa" w:w="120"/>
@@ -2673,6 +2732,7 @@
               <w:bottom w:val="single" w:color="D0D7D3" w:sz="4"/>
               <w:right w:val="single" w:color="D0D7D3" w:sz="4"/>
             </w:tcBorders>
+            <w:shd w:fill="F6F8F7" w:color="auto" w:val="clear"/>
             <w:tcMar>
               <w:top w:type="dxa" w:w="80"/>
               <w:left w:type="dxa" w:w="120"/>
@@ -4037,7 +4097,7 @@
           <w:sz w:val="22"/>
           <w:szCs w:val="22"/>
         </w:rPr>
-        <w:t xml:space="preserve">Voice call reminders: an automated call reading the reminder aloud, in English or a local language, for parents who don’t read messages</w:t>
+        <w:t xml:space="preserve">Phone calls in Yoruba, Hausa and Igbo (needs voices recorded by native speakers)</w:t>
       </w:r>
     </w:p>
     <w:p>
@@ -4200,6 +4260,66 @@
                 <w:sz w:val="20"/>
                 <w:szCs w:val="20"/>
               </w:rPr>
+              <w:t xml:space="preserve">Phone calls for parents who prefer them: overdue reminders and payment confirmations, in English or Pidgin</w:t>
+            </w:r>
+          </w:p>
+        </w:tc>
+      </w:tr>
+      <w:tr>
+        <w:tc>
+          <w:tcPr>
+            <w:tcW w:type="dxa" w:w="1800"/>
+            <w:tcBorders>
+              <w:top w:val="single" w:color="D0D7D3" w:sz="4"/>
+              <w:left w:val="single" w:color="D0D7D3" w:sz="4"/>
+              <w:bottom w:val="single" w:color="D0D7D3" w:sz="4"/>
+              <w:right w:val="single" w:color="D0D7D3" w:sz="4"/>
+            </w:tcBorders>
+            <w:shd w:fill="F6F8F7" w:color="auto" w:val="clear"/>
+            <w:tcMar>
+              <w:top w:type="dxa" w:w="80"/>
+              <w:left w:type="dxa" w:w="120"/>
+              <w:bottom w:type="dxa" w:w="80"/>
+              <w:right w:type="dxa" w:w="120"/>
+            </w:tcMar>
+          </w:tcPr>
+          <w:p>
+            <w:r>
+              <w:rPr>
+                <w:b w:val="false"/>
+                <w:bCs w:val="false"/>
+                <w:sz w:val="20"/>
+                <w:szCs w:val="20"/>
+              </w:rPr>
+              <w:t xml:space="preserve">19 Oct 2026</w:t>
+            </w:r>
+          </w:p>
+        </w:tc>
+        <w:tc>
+          <w:tcPr>
+            <w:tcW w:type="dxa" w:w="7838"/>
+            <w:tcBorders>
+              <w:top w:val="single" w:color="D0D7D3" w:sz="4"/>
+              <w:left w:val="single" w:color="D0D7D3" w:sz="4"/>
+              <w:bottom w:val="single" w:color="D0D7D3" w:sz="4"/>
+              <w:right w:val="single" w:color="D0D7D3" w:sz="4"/>
+            </w:tcBorders>
+            <w:shd w:fill="F6F8F7" w:color="auto" w:val="clear"/>
+            <w:tcMar>
+              <w:top w:type="dxa" w:w="80"/>
+              <w:left w:type="dxa" w:w="120"/>
+              <w:bottom w:type="dxa" w:w="80"/>
+              <w:right w:type="dxa" w:w="120"/>
+            </w:tcMar>
+          </w:tcPr>
+          <w:p>
+            <w:r>
+              <w:rPr>
+                <w:b w:val="false"/>
+                <w:bCs w:val="false"/>
+                <w:sz w:val="20"/>
+                <w:szCs w:val="20"/>
+              </w:rPr>
               <w:t xml:space="preserve">Family payment link: one link per parent to pay for all their children, choosing the amount per child</w:t>
             </w:r>
           </w:p>
@@ -4215,7 +4335,6 @@
               <w:bottom w:val="single" w:color="D0D7D3" w:sz="4"/>
               <w:right w:val="single" w:color="D0D7D3" w:sz="4"/>
             </w:tcBorders>
-            <w:shd w:fill="F6F8F7" w:color="auto" w:val="clear"/>
             <w:tcMar>
               <w:top w:type="dxa" w:w="80"/>
               <w:left w:type="dxa" w:w="120"/>
@@ -4244,7 +4363,6 @@
               <w:bottom w:val="single" w:color="D0D7D3" w:sz="4"/>
               <w:right w:val="single" w:color="D0D7D3" w:sz="4"/>
             </w:tcBorders>
-            <w:shd w:fill="F6F8F7" w:color="auto" w:val="clear"/>
             <w:tcMar>
               <w:top w:type="dxa" w:w="80"/>
               <w:left w:type="dxa" w:w="120"/>
@@ -4275,6 +4393,7 @@
               <w:bottom w:val="single" w:color="D0D7D3" w:sz="4"/>
               <w:right w:val="single" w:color="D0D7D3" w:sz="4"/>
             </w:tcBorders>
+            <w:shd w:fill="F6F8F7" w:color="auto" w:val="clear"/>
             <w:tcMar>
               <w:top w:type="dxa" w:w="80"/>
               <w:left w:type="dxa" w:w="120"/>
@@ -4303,6 +4422,7 @@
               <w:bottom w:val="single" w:color="D0D7D3" w:sz="4"/>
               <w:right w:val="single" w:color="D0D7D3" w:sz="4"/>
             </w:tcBorders>
+            <w:shd w:fill="F6F8F7" w:color="auto" w:val="clear"/>
             <w:tcMar>
               <w:top w:type="dxa" w:w="80"/>
               <w:left w:type="dxa" w:w="120"/>
@@ -4333,7 +4453,6 @@
               <w:bottom w:val="single" w:color="D0D7D3" w:sz="4"/>
               <w:right w:val="single" w:color="D0D7D3" w:sz="4"/>
             </w:tcBorders>
-            <w:shd w:fill="F6F8F7" w:color="auto" w:val="clear"/>
             <w:tcMar>
               <w:top w:type="dxa" w:w="80"/>
               <w:left w:type="dxa" w:w="120"/>
@@ -4362,7 +4481,6 @@
               <w:bottom w:val="single" w:color="D0D7D3" w:sz="4"/>
               <w:right w:val="single" w:color="D0D7D3" w:sz="4"/>
             </w:tcBorders>
-            <w:shd w:fill="F6F8F7" w:color="auto" w:val="clear"/>
             <w:tcMar>
               <w:top w:type="dxa" w:w="80"/>
               <w:left w:type="dxa" w:w="120"/>
@@ -4393,6 +4511,7 @@
               <w:bottom w:val="single" w:color="D0D7D3" w:sz="4"/>
               <w:right w:val="single" w:color="D0D7D3" w:sz="4"/>
             </w:tcBorders>
+            <w:shd w:fill="F6F8F7" w:color="auto" w:val="clear"/>
             <w:tcMar>
               <w:top w:type="dxa" w:w="80"/>
               <w:left w:type="dxa" w:w="120"/>
@@ -4421,6 +4540,7 @@
               <w:bottom w:val="single" w:color="D0D7D3" w:sz="4"/>
               <w:right w:val="single" w:color="D0D7D3" w:sz="4"/>
             </w:tcBorders>
+            <w:shd w:fill="F6F8F7" w:color="auto" w:val="clear"/>
             <w:tcMar>
               <w:top w:type="dxa" w:w="80"/>
               <w:left w:type="dxa" w:w="120"/>
@@ -4451,7 +4571,6 @@
               <w:bottom w:val="single" w:color="D0D7D3" w:sz="4"/>
               <w:right w:val="single" w:color="D0D7D3" w:sz="4"/>
             </w:tcBorders>
-            <w:shd w:fill="F6F8F7" w:color="auto" w:val="clear"/>
             <w:tcMar>
               <w:top w:type="dxa" w:w="80"/>
               <w:left w:type="dxa" w:w="120"/>
@@ -4480,7 +4599,6 @@
               <w:bottom w:val="single" w:color="D0D7D3" w:sz="4"/>
               <w:right w:val="single" w:color="D0D7D3" w:sz="4"/>
             </w:tcBorders>
-            <w:shd w:fill="F6F8F7" w:color="auto" w:val="clear"/>
             <w:tcMar>
               <w:top w:type="dxa" w:w="80"/>
               <w:left w:type="dxa" w:w="120"/>
@@ -4511,6 +4629,7 @@
               <w:bottom w:val="single" w:color="D0D7D3" w:sz="4"/>
               <w:right w:val="single" w:color="D0D7D3" w:sz="4"/>
             </w:tcBorders>
+            <w:shd w:fill="F6F8F7" w:color="auto" w:val="clear"/>
             <w:tcMar>
               <w:top w:type="dxa" w:w="80"/>
               <w:left w:type="dxa" w:w="120"/>
@@ -4539,6 +4658,7 @@
               <w:bottom w:val="single" w:color="D0D7D3" w:sz="4"/>
               <w:right w:val="single" w:color="D0D7D3" w:sz="4"/>
             </w:tcBorders>
+            <w:shd w:fill="F6F8F7" w:color="auto" w:val="clear"/>
             <w:tcMar>
               <w:top w:type="dxa" w:w="80"/>
               <w:left w:type="dxa" w:w="120"/>
@@ -4569,7 +4689,6 @@
               <w:bottom w:val="single" w:color="D0D7D3" w:sz="4"/>
               <w:right w:val="single" w:color="D0D7D3" w:sz="4"/>
             </w:tcBorders>
-            <w:shd w:fill="F6F8F7" w:color="auto" w:val="clear"/>
             <w:tcMar>
               <w:top w:type="dxa" w:w="80"/>
               <w:left w:type="dxa" w:w="120"/>
@@ -4598,7 +4717,6 @@
               <w:bottom w:val="single" w:color="D0D7D3" w:sz="4"/>
               <w:right w:val="single" w:color="D0D7D3" w:sz="4"/>
             </w:tcBorders>
-            <w:shd w:fill="F6F8F7" w:color="auto" w:val="clear"/>
             <w:tcMar>
               <w:top w:type="dxa" w:w="80"/>
               <w:left w:type="dxa" w:w="120"/>
@@ -4629,6 +4747,7 @@
               <w:bottom w:val="single" w:color="D0D7D3" w:sz="4"/>
               <w:right w:val="single" w:color="D0D7D3" w:sz="4"/>
             </w:tcBorders>
+            <w:shd w:fill="F6F8F7" w:color="auto" w:val="clear"/>
             <w:tcMar>
               <w:top w:type="dxa" w:w="80"/>
               <w:left w:type="dxa" w:w="120"/>
@@ -4657,6 +4776,7 @@
               <w:bottom w:val="single" w:color="D0D7D3" w:sz="4"/>
               <w:right w:val="single" w:color="D0D7D3" w:sz="4"/>
             </w:tcBorders>
+            <w:shd w:fill="F6F8F7" w:color="auto" w:val="clear"/>
             <w:tcMar>
               <w:top w:type="dxa" w:w="80"/>
               <w:left w:type="dxa" w:w="120"/>
@@ -4687,7 +4807,6 @@
               <w:bottom w:val="single" w:color="D0D7D3" w:sz="4"/>
               <w:right w:val="single" w:color="D0D7D3" w:sz="4"/>
             </w:tcBorders>
-            <w:shd w:fill="F6F8F7" w:color="auto" w:val="clear"/>
             <w:tcMar>
               <w:top w:type="dxa" w:w="80"/>
               <w:left w:type="dxa" w:w="120"/>
@@ -4716,7 +4835,6 @@
               <w:bottom w:val="single" w:color="D0D7D3" w:sz="4"/>
               <w:right w:val="single" w:color="D0D7D3" w:sz="4"/>
             </w:tcBorders>
-            <w:shd w:fill="F6F8F7" w:color="auto" w:val="clear"/>
             <w:tcMar>
               <w:top w:type="dxa" w:w="80"/>
               <w:left w:type="dxa" w:w="120"/>
@@ -4747,6 +4865,7 @@
               <w:bottom w:val="single" w:color="D0D7D3" w:sz="4"/>
               <w:right w:val="single" w:color="D0D7D3" w:sz="4"/>
             </w:tcBorders>
+            <w:shd w:fill="F6F8F7" w:color="auto" w:val="clear"/>
             <w:tcMar>
               <w:top w:type="dxa" w:w="80"/>
               <w:left w:type="dxa" w:w="120"/>
@@ -4775,6 +4894,7 @@
               <w:bottom w:val="single" w:color="D0D7D3" w:sz="4"/>
               <w:right w:val="single" w:color="D0D7D3" w:sz="4"/>
             </w:tcBorders>
+            <w:shd w:fill="F6F8F7" w:color="auto" w:val="clear"/>
             <w:tcMar>
               <w:top w:type="dxa" w:w="80"/>
               <w:left w:type="dxa" w:w="120"/>
@@ -4805,7 +4925,6 @@
               <w:bottom w:val="single" w:color="D0D7D3" w:sz="4"/>
               <w:right w:val="single" w:color="D0D7D3" w:sz="4"/>
             </w:tcBorders>
-            <w:shd w:fill="F6F8F7" w:color="auto" w:val="clear"/>
             <w:tcMar>
               <w:top w:type="dxa" w:w="80"/>
               <w:left w:type="dxa" w:w="120"/>
@@ -4834,7 +4953,6 @@
               <w:bottom w:val="single" w:color="D0D7D3" w:sz="4"/>
               <w:right w:val="single" w:color="D0D7D3" w:sz="4"/>
             </w:tcBorders>
-            <w:shd w:fill="F6F8F7" w:color="auto" w:val="clear"/>
             <w:tcMar>
               <w:top w:type="dxa" w:w="80"/>
               <w:left w:type="dxa" w:w="120"/>
@@ -4865,6 +4983,7 @@
               <w:bottom w:val="single" w:color="D0D7D3" w:sz="4"/>
               <w:right w:val="single" w:color="D0D7D3" w:sz="4"/>
             </w:tcBorders>
+            <w:shd w:fill="F6F8F7" w:color="auto" w:val="clear"/>
             <w:tcMar>
               <w:top w:type="dxa" w:w="80"/>
               <w:left w:type="dxa" w:w="120"/>
@@ -4893,6 +5012,7 @@
               <w:bottom w:val="single" w:color="D0D7D3" w:sz="4"/>
               <w:right w:val="single" w:color="D0D7D3" w:sz="4"/>
             </w:tcBorders>
+            <w:shd w:fill="F6F8F7" w:color="auto" w:val="clear"/>
             <w:tcMar>
               <w:top w:type="dxa" w:w="80"/>
               <w:left w:type="dxa" w:w="120"/>
@@ -4923,7 +5043,6 @@
               <w:bottom w:val="single" w:color="D0D7D3" w:sz="4"/>
               <w:right w:val="single" w:color="D0D7D3" w:sz="4"/>
             </w:tcBorders>
-            <w:shd w:fill="F6F8F7" w:color="auto" w:val="clear"/>
             <w:tcMar>
               <w:top w:type="dxa" w:w="80"/>
               <w:left w:type="dxa" w:w="120"/>
@@ -4952,7 +5071,6 @@
               <w:bottom w:val="single" w:color="D0D7D3" w:sz="4"/>
               <w:right w:val="single" w:color="D0D7D3" w:sz="4"/>
             </w:tcBorders>
-            <w:shd w:fill="F6F8F7" w:color="auto" w:val="clear"/>
             <w:tcMar>
               <w:top w:type="dxa" w:w="80"/>
               <w:left w:type="dxa" w:w="120"/>

</xml_diff>

<commit_message>
Pay for all children by transfer, card or USSD, also from the portal
The family payment page now asks the gateway's checkout to offer bank transfer
(a temporary account for the exact total), card and USSD, and records each
payment with the method actually used (new checkout_transfer and ussd methods).
Signed-in parents get the same page as "Pay for all your children" on their
home screen. Each child's own account number stays for transfers any time.
</commit_message>
<xml_diff>
--- a/docs/product/ParentPay - what it does.docx
+++ b/docs/product/ParentPay - what it does.docx
@@ -2424,7 +2424,7 @@
                 <w:sz w:val="20"/>
                 <w:szCs w:val="20"/>
               </w:rPr>
-              <w:t xml:space="preserve">One payment link of their own, in every bill and reminder: all their children, no sign-in. One card payment covers several children, and they choose how much goes to each</w:t>
+              <w:t xml:space="preserve">One payment link of their own, in every bill and reminder: all their children, no sign-in. One payment (bank transfer, card or USSD) covers several children, and they choose how much goes to each; the same “Pay for all your children” button is in the portal</w:t>
             </w:r>
           </w:p>
         </w:tc>
@@ -4260,6 +4260,66 @@
                 <w:sz w:val="20"/>
                 <w:szCs w:val="20"/>
               </w:rPr>
+              <w:t xml:space="preserve">Pay for all your children by bank transfer, card or USSD, from the link or the portal</w:t>
+            </w:r>
+          </w:p>
+        </w:tc>
+      </w:tr>
+      <w:tr>
+        <w:tc>
+          <w:tcPr>
+            <w:tcW w:type="dxa" w:w="1800"/>
+            <w:tcBorders>
+              <w:top w:val="single" w:color="D0D7D3" w:sz="4"/>
+              <w:left w:val="single" w:color="D0D7D3" w:sz="4"/>
+              <w:bottom w:val="single" w:color="D0D7D3" w:sz="4"/>
+              <w:right w:val="single" w:color="D0D7D3" w:sz="4"/>
+            </w:tcBorders>
+            <w:shd w:fill="F6F8F7" w:color="auto" w:val="clear"/>
+            <w:tcMar>
+              <w:top w:type="dxa" w:w="80"/>
+              <w:left w:type="dxa" w:w="120"/>
+              <w:bottom w:type="dxa" w:w="80"/>
+              <w:right w:type="dxa" w:w="120"/>
+            </w:tcMar>
+          </w:tcPr>
+          <w:p>
+            <w:r>
+              <w:rPr>
+                <w:b w:val="false"/>
+                <w:bCs w:val="false"/>
+                <w:sz w:val="20"/>
+                <w:szCs w:val="20"/>
+              </w:rPr>
+              <w:t xml:space="preserve">19 Oct 2026</w:t>
+            </w:r>
+          </w:p>
+        </w:tc>
+        <w:tc>
+          <w:tcPr>
+            <w:tcW w:type="dxa" w:w="7838"/>
+            <w:tcBorders>
+              <w:top w:val="single" w:color="D0D7D3" w:sz="4"/>
+              <w:left w:val="single" w:color="D0D7D3" w:sz="4"/>
+              <w:bottom w:val="single" w:color="D0D7D3" w:sz="4"/>
+              <w:right w:val="single" w:color="D0D7D3" w:sz="4"/>
+            </w:tcBorders>
+            <w:shd w:fill="F6F8F7" w:color="auto" w:val="clear"/>
+            <w:tcMar>
+              <w:top w:type="dxa" w:w="80"/>
+              <w:left w:type="dxa" w:w="120"/>
+              <w:bottom w:type="dxa" w:w="80"/>
+              <w:right w:type="dxa" w:w="120"/>
+            </w:tcMar>
+          </w:tcPr>
+          <w:p>
+            <w:r>
+              <w:rPr>
+                <w:b w:val="false"/>
+                <w:bCs w:val="false"/>
+                <w:sz w:val="20"/>
+                <w:szCs w:val="20"/>
+              </w:rPr>
               <w:t xml:space="preserve">Phone calls for parents who prefer them: overdue reminders and payment confirmations, in English or Pidgin</w:t>
             </w:r>
           </w:p>
@@ -4275,7 +4335,6 @@
               <w:bottom w:val="single" w:color="D0D7D3" w:sz="4"/>
               <w:right w:val="single" w:color="D0D7D3" w:sz="4"/>
             </w:tcBorders>
-            <w:shd w:fill="F6F8F7" w:color="auto" w:val="clear"/>
             <w:tcMar>
               <w:top w:type="dxa" w:w="80"/>
               <w:left w:type="dxa" w:w="120"/>
@@ -4304,7 +4363,6 @@
               <w:bottom w:val="single" w:color="D0D7D3" w:sz="4"/>
               <w:right w:val="single" w:color="D0D7D3" w:sz="4"/>
             </w:tcBorders>
-            <w:shd w:fill="F6F8F7" w:color="auto" w:val="clear"/>
             <w:tcMar>
               <w:top w:type="dxa" w:w="80"/>
               <w:left w:type="dxa" w:w="120"/>
@@ -4335,6 +4393,7 @@
               <w:bottom w:val="single" w:color="D0D7D3" w:sz="4"/>
               <w:right w:val="single" w:color="D0D7D3" w:sz="4"/>
             </w:tcBorders>
+            <w:shd w:fill="F6F8F7" w:color="auto" w:val="clear"/>
             <w:tcMar>
               <w:top w:type="dxa" w:w="80"/>
               <w:left w:type="dxa" w:w="120"/>
@@ -4363,6 +4422,7 @@
               <w:bottom w:val="single" w:color="D0D7D3" w:sz="4"/>
               <w:right w:val="single" w:color="D0D7D3" w:sz="4"/>
             </w:tcBorders>
+            <w:shd w:fill="F6F8F7" w:color="auto" w:val="clear"/>
             <w:tcMar>
               <w:top w:type="dxa" w:w="80"/>
               <w:left w:type="dxa" w:w="120"/>
@@ -4393,7 +4453,6 @@
               <w:bottom w:val="single" w:color="D0D7D3" w:sz="4"/>
               <w:right w:val="single" w:color="D0D7D3" w:sz="4"/>
             </w:tcBorders>
-            <w:shd w:fill="F6F8F7" w:color="auto" w:val="clear"/>
             <w:tcMar>
               <w:top w:type="dxa" w:w="80"/>
               <w:left w:type="dxa" w:w="120"/>
@@ -4422,7 +4481,6 @@
               <w:bottom w:val="single" w:color="D0D7D3" w:sz="4"/>
               <w:right w:val="single" w:color="D0D7D3" w:sz="4"/>
             </w:tcBorders>
-            <w:shd w:fill="F6F8F7" w:color="auto" w:val="clear"/>
             <w:tcMar>
               <w:top w:type="dxa" w:w="80"/>
               <w:left w:type="dxa" w:w="120"/>
@@ -4453,6 +4511,7 @@
               <w:bottom w:val="single" w:color="D0D7D3" w:sz="4"/>
               <w:right w:val="single" w:color="D0D7D3" w:sz="4"/>
             </w:tcBorders>
+            <w:shd w:fill="F6F8F7" w:color="auto" w:val="clear"/>
             <w:tcMar>
               <w:top w:type="dxa" w:w="80"/>
               <w:left w:type="dxa" w:w="120"/>
@@ -4481,6 +4540,7 @@
               <w:bottom w:val="single" w:color="D0D7D3" w:sz="4"/>
               <w:right w:val="single" w:color="D0D7D3" w:sz="4"/>
             </w:tcBorders>
+            <w:shd w:fill="F6F8F7" w:color="auto" w:val="clear"/>
             <w:tcMar>
               <w:top w:type="dxa" w:w="80"/>
               <w:left w:type="dxa" w:w="120"/>
@@ -4511,7 +4571,6 @@
               <w:bottom w:val="single" w:color="D0D7D3" w:sz="4"/>
               <w:right w:val="single" w:color="D0D7D3" w:sz="4"/>
             </w:tcBorders>
-            <w:shd w:fill="F6F8F7" w:color="auto" w:val="clear"/>
             <w:tcMar>
               <w:top w:type="dxa" w:w="80"/>
               <w:left w:type="dxa" w:w="120"/>
@@ -4540,7 +4599,6 @@
               <w:bottom w:val="single" w:color="D0D7D3" w:sz="4"/>
               <w:right w:val="single" w:color="D0D7D3" w:sz="4"/>
             </w:tcBorders>
-            <w:shd w:fill="F6F8F7" w:color="auto" w:val="clear"/>
             <w:tcMar>
               <w:top w:type="dxa" w:w="80"/>
               <w:left w:type="dxa" w:w="120"/>
@@ -4571,6 +4629,7 @@
               <w:bottom w:val="single" w:color="D0D7D3" w:sz="4"/>
               <w:right w:val="single" w:color="D0D7D3" w:sz="4"/>
             </w:tcBorders>
+            <w:shd w:fill="F6F8F7" w:color="auto" w:val="clear"/>
             <w:tcMar>
               <w:top w:type="dxa" w:w="80"/>
               <w:left w:type="dxa" w:w="120"/>
@@ -4599,6 +4658,7 @@
               <w:bottom w:val="single" w:color="D0D7D3" w:sz="4"/>
               <w:right w:val="single" w:color="D0D7D3" w:sz="4"/>
             </w:tcBorders>
+            <w:shd w:fill="F6F8F7" w:color="auto" w:val="clear"/>
             <w:tcMar>
               <w:top w:type="dxa" w:w="80"/>
               <w:left w:type="dxa" w:w="120"/>
@@ -4629,7 +4689,6 @@
               <w:bottom w:val="single" w:color="D0D7D3" w:sz="4"/>
               <w:right w:val="single" w:color="D0D7D3" w:sz="4"/>
             </w:tcBorders>
-            <w:shd w:fill="F6F8F7" w:color="auto" w:val="clear"/>
             <w:tcMar>
               <w:top w:type="dxa" w:w="80"/>
               <w:left w:type="dxa" w:w="120"/>
@@ -4658,7 +4717,6 @@
               <w:bottom w:val="single" w:color="D0D7D3" w:sz="4"/>
               <w:right w:val="single" w:color="D0D7D3" w:sz="4"/>
             </w:tcBorders>
-            <w:shd w:fill="F6F8F7" w:color="auto" w:val="clear"/>
             <w:tcMar>
               <w:top w:type="dxa" w:w="80"/>
               <w:left w:type="dxa" w:w="120"/>
@@ -4689,6 +4747,7 @@
               <w:bottom w:val="single" w:color="D0D7D3" w:sz="4"/>
               <w:right w:val="single" w:color="D0D7D3" w:sz="4"/>
             </w:tcBorders>
+            <w:shd w:fill="F6F8F7" w:color="auto" w:val="clear"/>
             <w:tcMar>
               <w:top w:type="dxa" w:w="80"/>
               <w:left w:type="dxa" w:w="120"/>
@@ -4717,6 +4776,7 @@
               <w:bottom w:val="single" w:color="D0D7D3" w:sz="4"/>
               <w:right w:val="single" w:color="D0D7D3" w:sz="4"/>
             </w:tcBorders>
+            <w:shd w:fill="F6F8F7" w:color="auto" w:val="clear"/>
             <w:tcMar>
               <w:top w:type="dxa" w:w="80"/>
               <w:left w:type="dxa" w:w="120"/>
@@ -4747,7 +4807,6 @@
               <w:bottom w:val="single" w:color="D0D7D3" w:sz="4"/>
               <w:right w:val="single" w:color="D0D7D3" w:sz="4"/>
             </w:tcBorders>
-            <w:shd w:fill="F6F8F7" w:color="auto" w:val="clear"/>
             <w:tcMar>
               <w:top w:type="dxa" w:w="80"/>
               <w:left w:type="dxa" w:w="120"/>
@@ -4776,7 +4835,6 @@
               <w:bottom w:val="single" w:color="D0D7D3" w:sz="4"/>
               <w:right w:val="single" w:color="D0D7D3" w:sz="4"/>
             </w:tcBorders>
-            <w:shd w:fill="F6F8F7" w:color="auto" w:val="clear"/>
             <w:tcMar>
               <w:top w:type="dxa" w:w="80"/>
               <w:left w:type="dxa" w:w="120"/>
@@ -4807,6 +4865,7 @@
               <w:bottom w:val="single" w:color="D0D7D3" w:sz="4"/>
               <w:right w:val="single" w:color="D0D7D3" w:sz="4"/>
             </w:tcBorders>
+            <w:shd w:fill="F6F8F7" w:color="auto" w:val="clear"/>
             <w:tcMar>
               <w:top w:type="dxa" w:w="80"/>
               <w:left w:type="dxa" w:w="120"/>
@@ -4835,6 +4894,7 @@
               <w:bottom w:val="single" w:color="D0D7D3" w:sz="4"/>
               <w:right w:val="single" w:color="D0D7D3" w:sz="4"/>
             </w:tcBorders>
+            <w:shd w:fill="F6F8F7" w:color="auto" w:val="clear"/>
             <w:tcMar>
               <w:top w:type="dxa" w:w="80"/>
               <w:left w:type="dxa" w:w="120"/>
@@ -4865,7 +4925,6 @@
               <w:bottom w:val="single" w:color="D0D7D3" w:sz="4"/>
               <w:right w:val="single" w:color="D0D7D3" w:sz="4"/>
             </w:tcBorders>
-            <w:shd w:fill="F6F8F7" w:color="auto" w:val="clear"/>
             <w:tcMar>
               <w:top w:type="dxa" w:w="80"/>
               <w:left w:type="dxa" w:w="120"/>
@@ -4894,7 +4953,6 @@
               <w:bottom w:val="single" w:color="D0D7D3" w:sz="4"/>
               <w:right w:val="single" w:color="D0D7D3" w:sz="4"/>
             </w:tcBorders>
-            <w:shd w:fill="F6F8F7" w:color="auto" w:val="clear"/>
             <w:tcMar>
               <w:top w:type="dxa" w:w="80"/>
               <w:left w:type="dxa" w:w="120"/>
@@ -4925,6 +4983,7 @@
               <w:bottom w:val="single" w:color="D0D7D3" w:sz="4"/>
               <w:right w:val="single" w:color="D0D7D3" w:sz="4"/>
             </w:tcBorders>
+            <w:shd w:fill="F6F8F7" w:color="auto" w:val="clear"/>
             <w:tcMar>
               <w:top w:type="dxa" w:w="80"/>
               <w:left w:type="dxa" w:w="120"/>
@@ -4953,6 +5012,7 @@
               <w:bottom w:val="single" w:color="D0D7D3" w:sz="4"/>
               <w:right w:val="single" w:color="D0D7D3" w:sz="4"/>
             </w:tcBorders>
+            <w:shd w:fill="F6F8F7" w:color="auto" w:val="clear"/>
             <w:tcMar>
               <w:top w:type="dxa" w:w="80"/>
               <w:left w:type="dxa" w:w="120"/>
@@ -4983,7 +5043,6 @@
               <w:bottom w:val="single" w:color="D0D7D3" w:sz="4"/>
               <w:right w:val="single" w:color="D0D7D3" w:sz="4"/>
             </w:tcBorders>
-            <w:shd w:fill="F6F8F7" w:color="auto" w:val="clear"/>
             <w:tcMar>
               <w:top w:type="dxa" w:w="80"/>
               <w:left w:type="dxa" w:w="120"/>
@@ -5012,7 +5071,6 @@
               <w:bottom w:val="single" w:color="D0D7D3" w:sz="4"/>
               <w:right w:val="single" w:color="D0D7D3" w:sz="4"/>
             </w:tcBorders>
-            <w:shd w:fill="F6F8F7" w:color="auto" w:val="clear"/>
             <w:tcMar>
               <w:top w:type="dxa" w:w="80"/>
               <w:left w:type="dxa" w:w="120"/>
@@ -5043,6 +5101,7 @@
               <w:bottom w:val="single" w:color="D0D7D3" w:sz="4"/>
               <w:right w:val="single" w:color="D0D7D3" w:sz="4"/>
             </w:tcBorders>
+            <w:shd w:fill="F6F8F7" w:color="auto" w:val="clear"/>
             <w:tcMar>
               <w:top w:type="dxa" w:w="80"/>
               <w:left w:type="dxa" w:w="120"/>
@@ -5071,6 +5130,7 @@
               <w:bottom w:val="single" w:color="D0D7D3" w:sz="4"/>
               <w:right w:val="single" w:color="D0D7D3" w:sz="4"/>
             </w:tcBorders>
+            <w:shd w:fill="F6F8F7" w:color="auto" w:val="clear"/>
             <w:tcMar>
               <w:top w:type="dxa" w:w="80"/>
               <w:left w:type="dxa" w:w="120"/>

</xml_diff>

<commit_message>
Fee status by pupil download; pay-for-all button at the bottom
A term's fees for every pupil, or one class, each paid, part paid or unpaid
with the amount left, plus earlier debts and the total owed. A bill's
payments are shown covering its fees in bill order. Excel has a sheet per
class with coloured statuses; the PDF prints a class list. The family
payment page and the portal now put the pay-for-all button below the
children.
</commit_message>
<xml_diff>
--- a/docs/product/ParentPay - what it does.docx
+++ b/docs/product/ParentPay - what it does.docx
@@ -42,7 +42,7 @@
           <w:sz w:val="20"/>
           <w:szCs w:val="20"/>
         </w:rPr>
-        <w:t xml:space="preserve">Updated 19 October 2026. Everything listed here is built and tested unless it’s under “Coming next”.</w:t>
+        <w:t xml:space="preserve">Updated 20 October 2026. Everything listed here is built and tested unless it’s under “Coming next”.</w:t>
       </w:r>
     </w:p>
     <w:p>
@@ -1239,6 +1239,65 @@
                 <w:sz w:val="20"/>
                 <w:szCs w:val="20"/>
               </w:rPr>
+              <w:t xml:space="preserve">Fee status by pupil: for the whole school or one class, each fee (tuition, bus, levies) marked paid, part paid or unpaid with what’s left; Excel with a sheet per class, or PDF</w:t>
+            </w:r>
+          </w:p>
+        </w:tc>
+        <w:tc>
+          <w:tcPr>
+            <w:tcW w:type="dxa" w:w="4238"/>
+            <w:tcBorders>
+              <w:top w:val="single" w:color="D0D7D3" w:sz="4"/>
+              <w:left w:val="single" w:color="D0D7D3" w:sz="4"/>
+              <w:bottom w:val="single" w:color="D0D7D3" w:sz="4"/>
+              <w:right w:val="single" w:color="D0D7D3" w:sz="4"/>
+            </w:tcBorders>
+            <w:shd w:fill="F6F8F7" w:color="auto" w:val="clear"/>
+            <w:tcMar>
+              <w:top w:type="dxa" w:w="80"/>
+              <w:left w:type="dxa" w:w="120"/>
+              <w:bottom w:type="dxa" w:w="80"/>
+              <w:right w:type="dxa" w:w="120"/>
+            </w:tcMar>
+          </w:tcPr>
+          <w:p>
+            <w:r>
+              <w:rPr>
+                <w:b w:val="false"/>
+                <w:bCs w:val="false"/>
+                <w:sz w:val="20"/>
+                <w:szCs w:val="20"/>
+              </w:rPr>
+              <w:t xml:space="preserve">Class teachers and the bursary see at a glance who still owes what, without adding anything up</w:t>
+            </w:r>
+          </w:p>
+        </w:tc>
+      </w:tr>
+      <w:tr>
+        <w:tc>
+          <w:tcPr>
+            <w:tcW w:type="dxa" w:w="5400"/>
+            <w:tcBorders>
+              <w:top w:val="single" w:color="D0D7D3" w:sz="4"/>
+              <w:left w:val="single" w:color="D0D7D3" w:sz="4"/>
+              <w:bottom w:val="single" w:color="D0D7D3" w:sz="4"/>
+              <w:right w:val="single" w:color="D0D7D3" w:sz="4"/>
+            </w:tcBorders>
+            <w:tcMar>
+              <w:top w:type="dxa" w:w="80"/>
+              <w:left w:type="dxa" w:w="120"/>
+              <w:bottom w:type="dxa" w:w="80"/>
+              <w:right w:type="dxa" w:w="120"/>
+            </w:tcMar>
+          </w:tcPr>
+          <w:p>
+            <w:r>
+              <w:rPr>
+                <w:b w:val="false"/>
+                <w:bCs w:val="false"/>
+                <w:sz w:val="20"/>
+                <w:szCs w:val="20"/>
+              </w:rPr>
               <w:t xml:space="preserve">Debtors list: who owes, how much, how late, the parent’s phone (tap to call), reminders sent; download for Excel or PDF</w:t>
             </w:r>
           </w:p>
@@ -1252,7 +1311,6 @@
               <w:bottom w:val="single" w:color="D0D7D3" w:sz="4"/>
               <w:right w:val="single" w:color="D0D7D3" w:sz="4"/>
             </w:tcBorders>
-            <w:shd w:fill="F6F8F7" w:color="auto" w:val="clear"/>
             <w:tcMar>
               <w:top w:type="dxa" w:w="80"/>
               <w:left w:type="dxa" w:w="120"/>
@@ -1283,6 +1341,7 @@
               <w:bottom w:val="single" w:color="D0D7D3" w:sz="4"/>
               <w:right w:val="single" w:color="D0D7D3" w:sz="4"/>
             </w:tcBorders>
+            <w:shd w:fill="F6F8F7" w:color="auto" w:val="clear"/>
             <w:tcMar>
               <w:top w:type="dxa" w:w="80"/>
               <w:left w:type="dxa" w:w="120"/>
@@ -1311,6 +1370,7 @@
               <w:bottom w:val="single" w:color="D0D7D3" w:sz="4"/>
               <w:right w:val="single" w:color="D0D7D3" w:sz="4"/>
             </w:tcBorders>
+            <w:shd w:fill="F6F8F7" w:color="auto" w:val="clear"/>
             <w:tcMar>
               <w:top w:type="dxa" w:w="80"/>
               <w:left w:type="dxa" w:w="120"/>
@@ -1341,7 +1401,6 @@
               <w:bottom w:val="single" w:color="D0D7D3" w:sz="4"/>
               <w:right w:val="single" w:color="D0D7D3" w:sz="4"/>
             </w:tcBorders>
-            <w:shd w:fill="F6F8F7" w:color="auto" w:val="clear"/>
             <w:tcMar>
               <w:top w:type="dxa" w:w="80"/>
               <w:left w:type="dxa" w:w="120"/>
@@ -1370,7 +1429,6 @@
               <w:bottom w:val="single" w:color="D0D7D3" w:sz="4"/>
               <w:right w:val="single" w:color="D0D7D3" w:sz="4"/>
             </w:tcBorders>
-            <w:shd w:fill="F6F8F7" w:color="auto" w:val="clear"/>
             <w:tcMar>
               <w:top w:type="dxa" w:w="80"/>
               <w:left w:type="dxa" w:w="120"/>
@@ -1401,6 +1459,7 @@
               <w:bottom w:val="single" w:color="D0D7D3" w:sz="4"/>
               <w:right w:val="single" w:color="D0D7D3" w:sz="4"/>
             </w:tcBorders>
+            <w:shd w:fill="F6F8F7" w:color="auto" w:val="clear"/>
             <w:tcMar>
               <w:top w:type="dxa" w:w="80"/>
               <w:left w:type="dxa" w:w="120"/>
@@ -1429,6 +1488,7 @@
               <w:bottom w:val="single" w:color="D0D7D3" w:sz="4"/>
               <w:right w:val="single" w:color="D0D7D3" w:sz="4"/>
             </w:tcBorders>
+            <w:shd w:fill="F6F8F7" w:color="auto" w:val="clear"/>
             <w:tcMar>
               <w:top w:type="dxa" w:w="80"/>
               <w:left w:type="dxa" w:w="120"/>
@@ -1459,7 +1519,6 @@
               <w:bottom w:val="single" w:color="D0D7D3" w:sz="4"/>
               <w:right w:val="single" w:color="D0D7D3" w:sz="4"/>
             </w:tcBorders>
-            <w:shd w:fill="F6F8F7" w:color="auto" w:val="clear"/>
             <w:tcMar>
               <w:top w:type="dxa" w:w="80"/>
               <w:left w:type="dxa" w:w="120"/>
@@ -1488,7 +1547,6 @@
               <w:bottom w:val="single" w:color="D0D7D3" w:sz="4"/>
               <w:right w:val="single" w:color="D0D7D3" w:sz="4"/>
             </w:tcBorders>
-            <w:shd w:fill="F6F8F7" w:color="auto" w:val="clear"/>
             <w:tcMar>
               <w:top w:type="dxa" w:w="80"/>
               <w:left w:type="dxa" w:w="120"/>
@@ -1519,6 +1577,7 @@
               <w:bottom w:val="single" w:color="D0D7D3" w:sz="4"/>
               <w:right w:val="single" w:color="D0D7D3" w:sz="4"/>
             </w:tcBorders>
+            <w:shd w:fill="F6F8F7" w:color="auto" w:val="clear"/>
             <w:tcMar>
               <w:top w:type="dxa" w:w="80"/>
               <w:left w:type="dxa" w:w="120"/>
@@ -1547,6 +1606,7 @@
               <w:bottom w:val="single" w:color="D0D7D3" w:sz="4"/>
               <w:right w:val="single" w:color="D0D7D3" w:sz="4"/>
             </w:tcBorders>
+            <w:shd w:fill="F6F8F7" w:color="auto" w:val="clear"/>
             <w:tcMar>
               <w:top w:type="dxa" w:w="80"/>
               <w:left w:type="dxa" w:w="120"/>
@@ -1577,7 +1637,6 @@
               <w:bottom w:val="single" w:color="D0D7D3" w:sz="4"/>
               <w:right w:val="single" w:color="D0D7D3" w:sz="4"/>
             </w:tcBorders>
-            <w:shd w:fill="F6F8F7" w:color="auto" w:val="clear"/>
             <w:tcMar>
               <w:top w:type="dxa" w:w="80"/>
               <w:left w:type="dxa" w:w="120"/>
@@ -1606,7 +1665,6 @@
               <w:bottom w:val="single" w:color="D0D7D3" w:sz="4"/>
               <w:right w:val="single" w:color="D0D7D3" w:sz="4"/>
             </w:tcBorders>
-            <w:shd w:fill="F6F8F7" w:color="auto" w:val="clear"/>
             <w:tcMar>
               <w:top w:type="dxa" w:w="80"/>
               <w:left w:type="dxa" w:w="120"/>
@@ -4232,6 +4290,65 @@
                 <w:sz w:val="20"/>
                 <w:szCs w:val="20"/>
               </w:rPr>
+              <w:t xml:space="preserve">20 Oct 2026</w:t>
+            </w:r>
+          </w:p>
+        </w:tc>
+        <w:tc>
+          <w:tcPr>
+            <w:tcW w:type="dxa" w:w="7838"/>
+            <w:tcBorders>
+              <w:top w:val="single" w:color="D0D7D3" w:sz="4"/>
+              <w:left w:val="single" w:color="D0D7D3" w:sz="4"/>
+              <w:bottom w:val="single" w:color="D0D7D3" w:sz="4"/>
+              <w:right w:val="single" w:color="D0D7D3" w:sz="4"/>
+            </w:tcBorders>
+            <w:tcMar>
+              <w:top w:type="dxa" w:w="80"/>
+              <w:left w:type="dxa" w:w="120"/>
+              <w:bottom w:type="dxa" w:w="80"/>
+              <w:right w:type="dxa" w:w="120"/>
+            </w:tcMar>
+          </w:tcPr>
+          <w:p>
+            <w:r>
+              <w:rPr>
+                <w:b w:val="false"/>
+                <w:bCs w:val="false"/>
+                <w:sz w:val="20"/>
+                <w:szCs w:val="20"/>
+              </w:rPr>
+              <w:t xml:space="preserve">Fee status by pupil: every fee paid, part paid or unpaid, for the school or one class (Excel and PDF)</w:t>
+            </w:r>
+          </w:p>
+        </w:tc>
+      </w:tr>
+      <w:tr>
+        <w:tc>
+          <w:tcPr>
+            <w:tcW w:type="dxa" w:w="1800"/>
+            <w:tcBorders>
+              <w:top w:val="single" w:color="D0D7D3" w:sz="4"/>
+              <w:left w:val="single" w:color="D0D7D3" w:sz="4"/>
+              <w:bottom w:val="single" w:color="D0D7D3" w:sz="4"/>
+              <w:right w:val="single" w:color="D0D7D3" w:sz="4"/>
+            </w:tcBorders>
+            <w:shd w:fill="F6F8F7" w:color="auto" w:val="clear"/>
+            <w:tcMar>
+              <w:top w:type="dxa" w:w="80"/>
+              <w:left w:type="dxa" w:w="120"/>
+              <w:bottom w:type="dxa" w:w="80"/>
+              <w:right w:type="dxa" w:w="120"/>
+            </w:tcMar>
+          </w:tcPr>
+          <w:p>
+            <w:r>
+              <w:rPr>
+                <w:b w:val="false"/>
+                <w:bCs w:val="false"/>
+                <w:sz w:val="20"/>
+                <w:szCs w:val="20"/>
+              </w:rPr>
               <w:t xml:space="preserve">19 Oct 2026</w:t>
             </w:r>
           </w:p>
@@ -4245,6 +4362,7 @@
               <w:bottom w:val="single" w:color="D0D7D3" w:sz="4"/>
               <w:right w:val="single" w:color="D0D7D3" w:sz="4"/>
             </w:tcBorders>
+            <w:shd w:fill="F6F8F7" w:color="auto" w:val="clear"/>
             <w:tcMar>
               <w:top w:type="dxa" w:w="80"/>
               <w:left w:type="dxa" w:w="120"/>
@@ -4275,7 +4393,6 @@
               <w:bottom w:val="single" w:color="D0D7D3" w:sz="4"/>
               <w:right w:val="single" w:color="D0D7D3" w:sz="4"/>
             </w:tcBorders>
-            <w:shd w:fill="F6F8F7" w:color="auto" w:val="clear"/>
             <w:tcMar>
               <w:top w:type="dxa" w:w="80"/>
               <w:left w:type="dxa" w:w="120"/>
@@ -4304,7 +4421,6 @@
               <w:bottom w:val="single" w:color="D0D7D3" w:sz="4"/>
               <w:right w:val="single" w:color="D0D7D3" w:sz="4"/>
             </w:tcBorders>
-            <w:shd w:fill="F6F8F7" w:color="auto" w:val="clear"/>
             <w:tcMar>
               <w:top w:type="dxa" w:w="80"/>
               <w:left w:type="dxa" w:w="120"/>
@@ -4335,6 +4451,7 @@
               <w:bottom w:val="single" w:color="D0D7D3" w:sz="4"/>
               <w:right w:val="single" w:color="D0D7D3" w:sz="4"/>
             </w:tcBorders>
+            <w:shd w:fill="F6F8F7" w:color="auto" w:val="clear"/>
             <w:tcMar>
               <w:top w:type="dxa" w:w="80"/>
               <w:left w:type="dxa" w:w="120"/>
@@ -4363,6 +4480,7 @@
               <w:bottom w:val="single" w:color="D0D7D3" w:sz="4"/>
               <w:right w:val="single" w:color="D0D7D3" w:sz="4"/>
             </w:tcBorders>
+            <w:shd w:fill="F6F8F7" w:color="auto" w:val="clear"/>
             <w:tcMar>
               <w:top w:type="dxa" w:w="80"/>
               <w:left w:type="dxa" w:w="120"/>
@@ -4393,7 +4511,6 @@
               <w:bottom w:val="single" w:color="D0D7D3" w:sz="4"/>
               <w:right w:val="single" w:color="D0D7D3" w:sz="4"/>
             </w:tcBorders>
-            <w:shd w:fill="F6F8F7" w:color="auto" w:val="clear"/>
             <w:tcMar>
               <w:top w:type="dxa" w:w="80"/>
               <w:left w:type="dxa" w:w="120"/>
@@ -4422,7 +4539,6 @@
               <w:bottom w:val="single" w:color="D0D7D3" w:sz="4"/>
               <w:right w:val="single" w:color="D0D7D3" w:sz="4"/>
             </w:tcBorders>
-            <w:shd w:fill="F6F8F7" w:color="auto" w:val="clear"/>
             <w:tcMar>
               <w:top w:type="dxa" w:w="80"/>
               <w:left w:type="dxa" w:w="120"/>
@@ -4453,6 +4569,7 @@
               <w:bottom w:val="single" w:color="D0D7D3" w:sz="4"/>
               <w:right w:val="single" w:color="D0D7D3" w:sz="4"/>
             </w:tcBorders>
+            <w:shd w:fill="F6F8F7" w:color="auto" w:val="clear"/>
             <w:tcMar>
               <w:top w:type="dxa" w:w="80"/>
               <w:left w:type="dxa" w:w="120"/>
@@ -4481,6 +4598,7 @@
               <w:bottom w:val="single" w:color="D0D7D3" w:sz="4"/>
               <w:right w:val="single" w:color="D0D7D3" w:sz="4"/>
             </w:tcBorders>
+            <w:shd w:fill="F6F8F7" w:color="auto" w:val="clear"/>
             <w:tcMar>
               <w:top w:type="dxa" w:w="80"/>
               <w:left w:type="dxa" w:w="120"/>
@@ -4511,7 +4629,6 @@
               <w:bottom w:val="single" w:color="D0D7D3" w:sz="4"/>
               <w:right w:val="single" w:color="D0D7D3" w:sz="4"/>
             </w:tcBorders>
-            <w:shd w:fill="F6F8F7" w:color="auto" w:val="clear"/>
             <w:tcMar>
               <w:top w:type="dxa" w:w="80"/>
               <w:left w:type="dxa" w:w="120"/>
@@ -4540,7 +4657,6 @@
               <w:bottom w:val="single" w:color="D0D7D3" w:sz="4"/>
               <w:right w:val="single" w:color="D0D7D3" w:sz="4"/>
             </w:tcBorders>
-            <w:shd w:fill="F6F8F7" w:color="auto" w:val="clear"/>
             <w:tcMar>
               <w:top w:type="dxa" w:w="80"/>
               <w:left w:type="dxa" w:w="120"/>
@@ -4571,6 +4687,7 @@
               <w:bottom w:val="single" w:color="D0D7D3" w:sz="4"/>
               <w:right w:val="single" w:color="D0D7D3" w:sz="4"/>
             </w:tcBorders>
+            <w:shd w:fill="F6F8F7" w:color="auto" w:val="clear"/>
             <w:tcMar>
               <w:top w:type="dxa" w:w="80"/>
               <w:left w:type="dxa" w:w="120"/>
@@ -4599,6 +4716,7 @@
               <w:bottom w:val="single" w:color="D0D7D3" w:sz="4"/>
               <w:right w:val="single" w:color="D0D7D3" w:sz="4"/>
             </w:tcBorders>
+            <w:shd w:fill="F6F8F7" w:color="auto" w:val="clear"/>
             <w:tcMar>
               <w:top w:type="dxa" w:w="80"/>
               <w:left w:type="dxa" w:w="120"/>
@@ -4629,7 +4747,6 @@
               <w:bottom w:val="single" w:color="D0D7D3" w:sz="4"/>
               <w:right w:val="single" w:color="D0D7D3" w:sz="4"/>
             </w:tcBorders>
-            <w:shd w:fill="F6F8F7" w:color="auto" w:val="clear"/>
             <w:tcMar>
               <w:top w:type="dxa" w:w="80"/>
               <w:left w:type="dxa" w:w="120"/>
@@ -4658,7 +4775,6 @@
               <w:bottom w:val="single" w:color="D0D7D3" w:sz="4"/>
               <w:right w:val="single" w:color="D0D7D3" w:sz="4"/>
             </w:tcBorders>
-            <w:shd w:fill="F6F8F7" w:color="auto" w:val="clear"/>
             <w:tcMar>
               <w:top w:type="dxa" w:w="80"/>
               <w:left w:type="dxa" w:w="120"/>
@@ -4689,6 +4805,7 @@
               <w:bottom w:val="single" w:color="D0D7D3" w:sz="4"/>
               <w:right w:val="single" w:color="D0D7D3" w:sz="4"/>
             </w:tcBorders>
+            <w:shd w:fill="F6F8F7" w:color="auto" w:val="clear"/>
             <w:tcMar>
               <w:top w:type="dxa" w:w="80"/>
               <w:left w:type="dxa" w:w="120"/>
@@ -4717,6 +4834,7 @@
               <w:bottom w:val="single" w:color="D0D7D3" w:sz="4"/>
               <w:right w:val="single" w:color="D0D7D3" w:sz="4"/>
             </w:tcBorders>
+            <w:shd w:fill="F6F8F7" w:color="auto" w:val="clear"/>
             <w:tcMar>
               <w:top w:type="dxa" w:w="80"/>
               <w:left w:type="dxa" w:w="120"/>
@@ -4747,7 +4865,6 @@
               <w:bottom w:val="single" w:color="D0D7D3" w:sz="4"/>
               <w:right w:val="single" w:color="D0D7D3" w:sz="4"/>
             </w:tcBorders>
-            <w:shd w:fill="F6F8F7" w:color="auto" w:val="clear"/>
             <w:tcMar>
               <w:top w:type="dxa" w:w="80"/>
               <w:left w:type="dxa" w:w="120"/>
@@ -4776,7 +4893,6 @@
               <w:bottom w:val="single" w:color="D0D7D3" w:sz="4"/>
               <w:right w:val="single" w:color="D0D7D3" w:sz="4"/>
             </w:tcBorders>
-            <w:shd w:fill="F6F8F7" w:color="auto" w:val="clear"/>
             <w:tcMar>
               <w:top w:type="dxa" w:w="80"/>
               <w:left w:type="dxa" w:w="120"/>
@@ -4807,6 +4923,7 @@
               <w:bottom w:val="single" w:color="D0D7D3" w:sz="4"/>
               <w:right w:val="single" w:color="D0D7D3" w:sz="4"/>
             </w:tcBorders>
+            <w:shd w:fill="F6F8F7" w:color="auto" w:val="clear"/>
             <w:tcMar>
               <w:top w:type="dxa" w:w="80"/>
               <w:left w:type="dxa" w:w="120"/>
@@ -4835,6 +4952,7 @@
               <w:bottom w:val="single" w:color="D0D7D3" w:sz="4"/>
               <w:right w:val="single" w:color="D0D7D3" w:sz="4"/>
             </w:tcBorders>
+            <w:shd w:fill="F6F8F7" w:color="auto" w:val="clear"/>
             <w:tcMar>
               <w:top w:type="dxa" w:w="80"/>
               <w:left w:type="dxa" w:w="120"/>
@@ -4865,7 +4983,6 @@
               <w:bottom w:val="single" w:color="D0D7D3" w:sz="4"/>
               <w:right w:val="single" w:color="D0D7D3" w:sz="4"/>
             </w:tcBorders>
-            <w:shd w:fill="F6F8F7" w:color="auto" w:val="clear"/>
             <w:tcMar>
               <w:top w:type="dxa" w:w="80"/>
               <w:left w:type="dxa" w:w="120"/>
@@ -4894,7 +5011,6 @@
               <w:bottom w:val="single" w:color="D0D7D3" w:sz="4"/>
               <w:right w:val="single" w:color="D0D7D3" w:sz="4"/>
             </w:tcBorders>
-            <w:shd w:fill="F6F8F7" w:color="auto" w:val="clear"/>
             <w:tcMar>
               <w:top w:type="dxa" w:w="80"/>
               <w:left w:type="dxa" w:w="120"/>
@@ -4925,6 +5041,7 @@
               <w:bottom w:val="single" w:color="D0D7D3" w:sz="4"/>
               <w:right w:val="single" w:color="D0D7D3" w:sz="4"/>
             </w:tcBorders>
+            <w:shd w:fill="F6F8F7" w:color="auto" w:val="clear"/>
             <w:tcMar>
               <w:top w:type="dxa" w:w="80"/>
               <w:left w:type="dxa" w:w="120"/>
@@ -4953,6 +5070,7 @@
               <w:bottom w:val="single" w:color="D0D7D3" w:sz="4"/>
               <w:right w:val="single" w:color="D0D7D3" w:sz="4"/>
             </w:tcBorders>
+            <w:shd w:fill="F6F8F7" w:color="auto" w:val="clear"/>
             <w:tcMar>
               <w:top w:type="dxa" w:w="80"/>
               <w:left w:type="dxa" w:w="120"/>
@@ -4983,7 +5101,6 @@
               <w:bottom w:val="single" w:color="D0D7D3" w:sz="4"/>
               <w:right w:val="single" w:color="D0D7D3" w:sz="4"/>
             </w:tcBorders>
-            <w:shd w:fill="F6F8F7" w:color="auto" w:val="clear"/>
             <w:tcMar>
               <w:top w:type="dxa" w:w="80"/>
               <w:left w:type="dxa" w:w="120"/>
@@ -5012,7 +5129,6 @@
               <w:bottom w:val="single" w:color="D0D7D3" w:sz="4"/>
               <w:right w:val="single" w:color="D0D7D3" w:sz="4"/>
             </w:tcBorders>
-            <w:shd w:fill="F6F8F7" w:color="auto" w:val="clear"/>
             <w:tcMar>
               <w:top w:type="dxa" w:w="80"/>
               <w:left w:type="dxa" w:w="120"/>
@@ -5043,6 +5159,7 @@
               <w:bottom w:val="single" w:color="D0D7D3" w:sz="4"/>
               <w:right w:val="single" w:color="D0D7D3" w:sz="4"/>
             </w:tcBorders>
+            <w:shd w:fill="F6F8F7" w:color="auto" w:val="clear"/>
             <w:tcMar>
               <w:top w:type="dxa" w:w="80"/>
               <w:left w:type="dxa" w:w="120"/>
@@ -5071,6 +5188,7 @@
               <w:bottom w:val="single" w:color="D0D7D3" w:sz="4"/>
               <w:right w:val="single" w:color="D0D7D3" w:sz="4"/>
             </w:tcBorders>
+            <w:shd w:fill="F6F8F7" w:color="auto" w:val="clear"/>
             <w:tcMar>
               <w:top w:type="dxa" w:w="80"/>
               <w:left w:type="dxa" w:w="120"/>
@@ -5101,7 +5219,6 @@
               <w:bottom w:val="single" w:color="D0D7D3" w:sz="4"/>
               <w:right w:val="single" w:color="D0D7D3" w:sz="4"/>
             </w:tcBorders>
-            <w:shd w:fill="F6F8F7" w:color="auto" w:val="clear"/>
             <w:tcMar>
               <w:top w:type="dxa" w:w="80"/>
               <w:left w:type="dxa" w:w="120"/>
@@ -5130,7 +5247,6 @@
               <w:bottom w:val="single" w:color="D0D7D3" w:sz="4"/>
               <w:right w:val="single" w:color="D0D7D3" w:sz="4"/>
             </w:tcBorders>
-            <w:shd w:fill="F6F8F7" w:color="auto" w:val="clear"/>
             <w:tcMar>
               <w:top w:type="dxa" w:w="80"/>
               <w:left w:type="dxa" w:w="120"/>

</xml_diff>

<commit_message>
Switch the payment provider at runtime; add Bachs
A platform admin picks the provider new checkouts go through (Paystack or
Bachs, among those configured) with PUT /platform/providers/payment, audited,
no deploy. Schools can be set up on several gateways; checkouts use the active
one and fall back to the school's other, so switching never stops payments.
Bachs: hosted onboarding as a connected account, checkout sessions as
destination charges with the platform fee, signed webhooks re-verified against
the payments API. Bachs can't issue students' own account numbers, so those
stay with Paystack. Paystack checkout now offers card, transfer and USSD.
</commit_message>
<xml_diff>
--- a/docs/product/ParentPay - what it does.docx
+++ b/docs/product/ParentPay - what it does.docx
@@ -4318,6 +4318,66 @@
                 <w:sz w:val="20"/>
                 <w:szCs w:val="20"/>
               </w:rPr>
+              <w:t xml:space="preserve">Payment provider switchable at any time (Paystack or Bachs), with Bachs checkout and onboarding</w:t>
+            </w:r>
+          </w:p>
+        </w:tc>
+      </w:tr>
+      <w:tr>
+        <w:tc>
+          <w:tcPr>
+            <w:tcW w:type="dxa" w:w="1800"/>
+            <w:tcBorders>
+              <w:top w:val="single" w:color="D0D7D3" w:sz="4"/>
+              <w:left w:val="single" w:color="D0D7D3" w:sz="4"/>
+              <w:bottom w:val="single" w:color="D0D7D3" w:sz="4"/>
+              <w:right w:val="single" w:color="D0D7D3" w:sz="4"/>
+            </w:tcBorders>
+            <w:shd w:fill="F6F8F7" w:color="auto" w:val="clear"/>
+            <w:tcMar>
+              <w:top w:type="dxa" w:w="80"/>
+              <w:left w:type="dxa" w:w="120"/>
+              <w:bottom w:type="dxa" w:w="80"/>
+              <w:right w:type="dxa" w:w="120"/>
+            </w:tcMar>
+          </w:tcPr>
+          <w:p>
+            <w:r>
+              <w:rPr>
+                <w:b w:val="false"/>
+                <w:bCs w:val="false"/>
+                <w:sz w:val="20"/>
+                <w:szCs w:val="20"/>
+              </w:rPr>
+              <w:t xml:space="preserve">20 Oct 2026</w:t>
+            </w:r>
+          </w:p>
+        </w:tc>
+        <w:tc>
+          <w:tcPr>
+            <w:tcW w:type="dxa" w:w="7838"/>
+            <w:tcBorders>
+              <w:top w:val="single" w:color="D0D7D3" w:sz="4"/>
+              <w:left w:val="single" w:color="D0D7D3" w:sz="4"/>
+              <w:bottom w:val="single" w:color="D0D7D3" w:sz="4"/>
+              <w:right w:val="single" w:color="D0D7D3" w:sz="4"/>
+            </w:tcBorders>
+            <w:shd w:fill="F6F8F7" w:color="auto" w:val="clear"/>
+            <w:tcMar>
+              <w:top w:type="dxa" w:w="80"/>
+              <w:left w:type="dxa" w:w="120"/>
+              <w:bottom w:type="dxa" w:w="80"/>
+              <w:right w:type="dxa" w:w="120"/>
+            </w:tcMar>
+          </w:tcPr>
+          <w:p>
+            <w:r>
+              <w:rPr>
+                <w:b w:val="false"/>
+                <w:bCs w:val="false"/>
+                <w:sz w:val="20"/>
+                <w:szCs w:val="20"/>
+              </w:rPr>
               <w:t xml:space="preserve">Fee status by pupil: every fee paid, part paid or unpaid, for the school or one class (Excel and PDF)</w:t>
             </w:r>
           </w:p>
@@ -4333,7 +4393,6 @@
               <w:bottom w:val="single" w:color="D0D7D3" w:sz="4"/>
               <w:right w:val="single" w:color="D0D7D3" w:sz="4"/>
             </w:tcBorders>
-            <w:shd w:fill="F6F8F7" w:color="auto" w:val="clear"/>
             <w:tcMar>
               <w:top w:type="dxa" w:w="80"/>
               <w:left w:type="dxa" w:w="120"/>
@@ -4362,7 +4421,6 @@
               <w:bottom w:val="single" w:color="D0D7D3" w:sz="4"/>
               <w:right w:val="single" w:color="D0D7D3" w:sz="4"/>
             </w:tcBorders>
-            <w:shd w:fill="F6F8F7" w:color="auto" w:val="clear"/>
             <w:tcMar>
               <w:top w:type="dxa" w:w="80"/>
               <w:left w:type="dxa" w:w="120"/>
@@ -4393,6 +4451,7 @@
               <w:bottom w:val="single" w:color="D0D7D3" w:sz="4"/>
               <w:right w:val="single" w:color="D0D7D3" w:sz="4"/>
             </w:tcBorders>
+            <w:shd w:fill="F6F8F7" w:color="auto" w:val="clear"/>
             <w:tcMar>
               <w:top w:type="dxa" w:w="80"/>
               <w:left w:type="dxa" w:w="120"/>
@@ -4421,6 +4480,7 @@
               <w:bottom w:val="single" w:color="D0D7D3" w:sz="4"/>
               <w:right w:val="single" w:color="D0D7D3" w:sz="4"/>
             </w:tcBorders>
+            <w:shd w:fill="F6F8F7" w:color="auto" w:val="clear"/>
             <w:tcMar>
               <w:top w:type="dxa" w:w="80"/>
               <w:left w:type="dxa" w:w="120"/>
@@ -4451,7 +4511,6 @@
               <w:bottom w:val="single" w:color="D0D7D3" w:sz="4"/>
               <w:right w:val="single" w:color="D0D7D3" w:sz="4"/>
             </w:tcBorders>
-            <w:shd w:fill="F6F8F7" w:color="auto" w:val="clear"/>
             <w:tcMar>
               <w:top w:type="dxa" w:w="80"/>
               <w:left w:type="dxa" w:w="120"/>
@@ -4480,7 +4539,6 @@
               <w:bottom w:val="single" w:color="D0D7D3" w:sz="4"/>
               <w:right w:val="single" w:color="D0D7D3" w:sz="4"/>
             </w:tcBorders>
-            <w:shd w:fill="F6F8F7" w:color="auto" w:val="clear"/>
             <w:tcMar>
               <w:top w:type="dxa" w:w="80"/>
               <w:left w:type="dxa" w:w="120"/>
@@ -4511,6 +4569,7 @@
               <w:bottom w:val="single" w:color="D0D7D3" w:sz="4"/>
               <w:right w:val="single" w:color="D0D7D3" w:sz="4"/>
             </w:tcBorders>
+            <w:shd w:fill="F6F8F7" w:color="auto" w:val="clear"/>
             <w:tcMar>
               <w:top w:type="dxa" w:w="80"/>
               <w:left w:type="dxa" w:w="120"/>
@@ -4539,6 +4598,7 @@
               <w:bottom w:val="single" w:color="D0D7D3" w:sz="4"/>
               <w:right w:val="single" w:color="D0D7D3" w:sz="4"/>
             </w:tcBorders>
+            <w:shd w:fill="F6F8F7" w:color="auto" w:val="clear"/>
             <w:tcMar>
               <w:top w:type="dxa" w:w="80"/>
               <w:left w:type="dxa" w:w="120"/>
@@ -4569,7 +4629,6 @@
               <w:bottom w:val="single" w:color="D0D7D3" w:sz="4"/>
               <w:right w:val="single" w:color="D0D7D3" w:sz="4"/>
             </w:tcBorders>
-            <w:shd w:fill="F6F8F7" w:color="auto" w:val="clear"/>
             <w:tcMar>
               <w:top w:type="dxa" w:w="80"/>
               <w:left w:type="dxa" w:w="120"/>
@@ -4598,7 +4657,6 @@
               <w:bottom w:val="single" w:color="D0D7D3" w:sz="4"/>
               <w:right w:val="single" w:color="D0D7D3" w:sz="4"/>
             </w:tcBorders>
-            <w:shd w:fill="F6F8F7" w:color="auto" w:val="clear"/>
             <w:tcMar>
               <w:top w:type="dxa" w:w="80"/>
               <w:left w:type="dxa" w:w="120"/>
@@ -4629,6 +4687,7 @@
               <w:bottom w:val="single" w:color="D0D7D3" w:sz="4"/>
               <w:right w:val="single" w:color="D0D7D3" w:sz="4"/>
             </w:tcBorders>
+            <w:shd w:fill="F6F8F7" w:color="auto" w:val="clear"/>
             <w:tcMar>
               <w:top w:type="dxa" w:w="80"/>
               <w:left w:type="dxa" w:w="120"/>
@@ -4657,6 +4716,7 @@
               <w:bottom w:val="single" w:color="D0D7D3" w:sz="4"/>
               <w:right w:val="single" w:color="D0D7D3" w:sz="4"/>
             </w:tcBorders>
+            <w:shd w:fill="F6F8F7" w:color="auto" w:val="clear"/>
             <w:tcMar>
               <w:top w:type="dxa" w:w="80"/>
               <w:left w:type="dxa" w:w="120"/>
@@ -4687,7 +4747,6 @@
               <w:bottom w:val="single" w:color="D0D7D3" w:sz="4"/>
               <w:right w:val="single" w:color="D0D7D3" w:sz="4"/>
             </w:tcBorders>
-            <w:shd w:fill="F6F8F7" w:color="auto" w:val="clear"/>
             <w:tcMar>
               <w:top w:type="dxa" w:w="80"/>
               <w:left w:type="dxa" w:w="120"/>
@@ -4716,7 +4775,6 @@
               <w:bottom w:val="single" w:color="D0D7D3" w:sz="4"/>
               <w:right w:val="single" w:color="D0D7D3" w:sz="4"/>
             </w:tcBorders>
-            <w:shd w:fill="F6F8F7" w:color="auto" w:val="clear"/>
             <w:tcMar>
               <w:top w:type="dxa" w:w="80"/>
               <w:left w:type="dxa" w:w="120"/>
@@ -4747,6 +4805,7 @@
               <w:bottom w:val="single" w:color="D0D7D3" w:sz="4"/>
               <w:right w:val="single" w:color="D0D7D3" w:sz="4"/>
             </w:tcBorders>
+            <w:shd w:fill="F6F8F7" w:color="auto" w:val="clear"/>
             <w:tcMar>
               <w:top w:type="dxa" w:w="80"/>
               <w:left w:type="dxa" w:w="120"/>
@@ -4775,6 +4834,7 @@
               <w:bottom w:val="single" w:color="D0D7D3" w:sz="4"/>
               <w:right w:val="single" w:color="D0D7D3" w:sz="4"/>
             </w:tcBorders>
+            <w:shd w:fill="F6F8F7" w:color="auto" w:val="clear"/>
             <w:tcMar>
               <w:top w:type="dxa" w:w="80"/>
               <w:left w:type="dxa" w:w="120"/>
@@ -4805,7 +4865,6 @@
               <w:bottom w:val="single" w:color="D0D7D3" w:sz="4"/>
               <w:right w:val="single" w:color="D0D7D3" w:sz="4"/>
             </w:tcBorders>
-            <w:shd w:fill="F6F8F7" w:color="auto" w:val="clear"/>
             <w:tcMar>
               <w:top w:type="dxa" w:w="80"/>
               <w:left w:type="dxa" w:w="120"/>
@@ -4834,7 +4893,6 @@
               <w:bottom w:val="single" w:color="D0D7D3" w:sz="4"/>
               <w:right w:val="single" w:color="D0D7D3" w:sz="4"/>
             </w:tcBorders>
-            <w:shd w:fill="F6F8F7" w:color="auto" w:val="clear"/>
             <w:tcMar>
               <w:top w:type="dxa" w:w="80"/>
               <w:left w:type="dxa" w:w="120"/>
@@ -4865,6 +4923,7 @@
               <w:bottom w:val="single" w:color="D0D7D3" w:sz="4"/>
               <w:right w:val="single" w:color="D0D7D3" w:sz="4"/>
             </w:tcBorders>
+            <w:shd w:fill="F6F8F7" w:color="auto" w:val="clear"/>
             <w:tcMar>
               <w:top w:type="dxa" w:w="80"/>
               <w:left w:type="dxa" w:w="120"/>
@@ -4893,6 +4952,7 @@
               <w:bottom w:val="single" w:color="D0D7D3" w:sz="4"/>
               <w:right w:val="single" w:color="D0D7D3" w:sz="4"/>
             </w:tcBorders>
+            <w:shd w:fill="F6F8F7" w:color="auto" w:val="clear"/>
             <w:tcMar>
               <w:top w:type="dxa" w:w="80"/>
               <w:left w:type="dxa" w:w="120"/>
@@ -4923,7 +4983,6 @@
               <w:bottom w:val="single" w:color="D0D7D3" w:sz="4"/>
               <w:right w:val="single" w:color="D0D7D3" w:sz="4"/>
             </w:tcBorders>
-            <w:shd w:fill="F6F8F7" w:color="auto" w:val="clear"/>
             <w:tcMar>
               <w:top w:type="dxa" w:w="80"/>
               <w:left w:type="dxa" w:w="120"/>
@@ -4952,7 +5011,6 @@
               <w:bottom w:val="single" w:color="D0D7D3" w:sz="4"/>
               <w:right w:val="single" w:color="D0D7D3" w:sz="4"/>
             </w:tcBorders>
-            <w:shd w:fill="F6F8F7" w:color="auto" w:val="clear"/>
             <w:tcMar>
               <w:top w:type="dxa" w:w="80"/>
               <w:left w:type="dxa" w:w="120"/>
@@ -4983,6 +5041,7 @@
               <w:bottom w:val="single" w:color="D0D7D3" w:sz="4"/>
               <w:right w:val="single" w:color="D0D7D3" w:sz="4"/>
             </w:tcBorders>
+            <w:shd w:fill="F6F8F7" w:color="auto" w:val="clear"/>
             <w:tcMar>
               <w:top w:type="dxa" w:w="80"/>
               <w:left w:type="dxa" w:w="120"/>
@@ -5011,6 +5070,7 @@
               <w:bottom w:val="single" w:color="D0D7D3" w:sz="4"/>
               <w:right w:val="single" w:color="D0D7D3" w:sz="4"/>
             </w:tcBorders>
+            <w:shd w:fill="F6F8F7" w:color="auto" w:val="clear"/>
             <w:tcMar>
               <w:top w:type="dxa" w:w="80"/>
               <w:left w:type="dxa" w:w="120"/>
@@ -5041,7 +5101,6 @@
               <w:bottom w:val="single" w:color="D0D7D3" w:sz="4"/>
               <w:right w:val="single" w:color="D0D7D3" w:sz="4"/>
             </w:tcBorders>
-            <w:shd w:fill="F6F8F7" w:color="auto" w:val="clear"/>
             <w:tcMar>
               <w:top w:type="dxa" w:w="80"/>
               <w:left w:type="dxa" w:w="120"/>
@@ -5070,7 +5129,6 @@
               <w:bottom w:val="single" w:color="D0D7D3" w:sz="4"/>
               <w:right w:val="single" w:color="D0D7D3" w:sz="4"/>
             </w:tcBorders>
-            <w:shd w:fill="F6F8F7" w:color="auto" w:val="clear"/>
             <w:tcMar>
               <w:top w:type="dxa" w:w="80"/>
               <w:left w:type="dxa" w:w="120"/>
@@ -5101,6 +5159,7 @@
               <w:bottom w:val="single" w:color="D0D7D3" w:sz="4"/>
               <w:right w:val="single" w:color="D0D7D3" w:sz="4"/>
             </w:tcBorders>
+            <w:shd w:fill="F6F8F7" w:color="auto" w:val="clear"/>
             <w:tcMar>
               <w:top w:type="dxa" w:w="80"/>
               <w:left w:type="dxa" w:w="120"/>
@@ -5129,6 +5188,7 @@
               <w:bottom w:val="single" w:color="D0D7D3" w:sz="4"/>
               <w:right w:val="single" w:color="D0D7D3" w:sz="4"/>
             </w:tcBorders>
+            <w:shd w:fill="F6F8F7" w:color="auto" w:val="clear"/>
             <w:tcMar>
               <w:top w:type="dxa" w:w="80"/>
               <w:left w:type="dxa" w:w="120"/>
@@ -5159,7 +5219,6 @@
               <w:bottom w:val="single" w:color="D0D7D3" w:sz="4"/>
               <w:right w:val="single" w:color="D0D7D3" w:sz="4"/>
             </w:tcBorders>
-            <w:shd w:fill="F6F8F7" w:color="auto" w:val="clear"/>
             <w:tcMar>
               <w:top w:type="dxa" w:w="80"/>
               <w:left w:type="dxa" w:w="120"/>
@@ -5188,7 +5247,6 @@
               <w:bottom w:val="single" w:color="D0D7D3" w:sz="4"/>
               <w:right w:val="single" w:color="D0D7D3" w:sz="4"/>
             </w:tcBorders>
-            <w:shd w:fill="F6F8F7" w:color="auto" w:val="clear"/>
             <w:tcMar>
               <w:top w:type="dxa" w:w="80"/>
               <w:left w:type="dxa" w:w="120"/>
@@ -5219,6 +5277,7 @@
               <w:bottom w:val="single" w:color="D0D7D3" w:sz="4"/>
               <w:right w:val="single" w:color="D0D7D3" w:sz="4"/>
             </w:tcBorders>
+            <w:shd w:fill="F6F8F7" w:color="auto" w:val="clear"/>
             <w:tcMar>
               <w:top w:type="dxa" w:w="80"/>
               <w:left w:type="dxa" w:w="120"/>
@@ -5247,6 +5306,7 @@
               <w:bottom w:val="single" w:color="D0D7D3" w:sz="4"/>
               <w:right w:val="single" w:color="D0D7D3" w:sz="4"/>
             </w:tcBorders>
+            <w:shd w:fill="F6F8F7" w:color="auto" w:val="clear"/>
             <w:tcMar>
               <w:top w:type="dxa" w:w="80"/>
               <w:left w:type="dxa" w:w="120"/>

</xml_diff>

<commit_message>
School admins can do everything the bursar does, with two-factor sign-in
Owner's decision: the school admin role gains billing, extra fees, payment
approvals and reversals, reports, messaging and the activity log; only the
proprietor manages staff and the school's bank account. Admins must now use
an authenticator code, like everyone who can move money. Cash still needs a
second person to approve it. The pupils overview now shows on the money
dashboard too. The Fees page points to where class and pupil fees are added.
</commit_message>
<xml_diff>
--- a/docs/product/ParentPay - what it does.docx
+++ b/docs/product/ParentPay - what it does.docx
@@ -1801,6 +1801,65 @@
                 <w:sz w:val="20"/>
                 <w:szCs w:val="20"/>
               </w:rPr>
+              <w:t xml:space="preserve">Everything the bursar can do (bills, extra fees, payments, approvals, reports, messages), with a code from an authenticator app at sign-in</w:t>
+            </w:r>
+          </w:p>
+        </w:tc>
+        <w:tc>
+          <w:tcPr>
+            <w:tcW w:type="dxa" w:w="4238"/>
+            <w:tcBorders>
+              <w:top w:val="single" w:color="D0D7D3" w:sz="4"/>
+              <w:left w:val="single" w:color="D0D7D3" w:sz="4"/>
+              <w:bottom w:val="single" w:color="D0D7D3" w:sz="4"/>
+              <w:right w:val="single" w:color="D0D7D3" w:sz="4"/>
+            </w:tcBorders>
+            <w:tcMar>
+              <w:top w:type="dxa" w:w="80"/>
+              <w:left w:type="dxa" w:w="120"/>
+              <w:bottom w:type="dxa" w:w="80"/>
+              <w:right w:type="dxa" w:w="120"/>
+            </w:tcMar>
+          </w:tcPr>
+          <w:p>
+            <w:r>
+              <w:rPr>
+                <w:b w:val="false"/>
+                <w:bCs w:val="false"/>
+                <w:sz w:val="20"/>
+                <w:szCs w:val="20"/>
+              </w:rPr>
+              <w:t xml:space="preserve">One person can run the school’s fees day to day; only the proprietor controls staff and the bank account</w:t>
+            </w:r>
+          </w:p>
+        </w:tc>
+      </w:tr>
+      <w:tr>
+        <w:tc>
+          <w:tcPr>
+            <w:tcW w:type="dxa" w:w="5400"/>
+            <w:tcBorders>
+              <w:top w:val="single" w:color="D0D7D3" w:sz="4"/>
+              <w:left w:val="single" w:color="D0D7D3" w:sz="4"/>
+              <w:bottom w:val="single" w:color="D0D7D3" w:sz="4"/>
+              <w:right w:val="single" w:color="D0D7D3" w:sz="4"/>
+            </w:tcBorders>
+            <w:shd w:fill="F6F8F7" w:color="auto" w:val="clear"/>
+            <w:tcMar>
+              <w:top w:type="dxa" w:w="80"/>
+              <w:left w:type="dxa" w:w="120"/>
+              <w:bottom w:type="dxa" w:w="80"/>
+              <w:right w:type="dxa" w:w="120"/>
+            </w:tcMar>
+          </w:tcPr>
+          <w:p>
+            <w:r>
+              <w:rPr>
+                <w:b w:val="false"/>
+                <w:bCs w:val="false"/>
+                <w:sz w:val="20"/>
+                <w:szCs w:val="20"/>
+              </w:rPr>
               <w:t xml:space="preserve">Load all pupils and their parents from the school’s existing Excel or CSV list, see every problem by row before saving</w:t>
             </w:r>
           </w:p>
@@ -1814,6 +1873,7 @@
               <w:bottom w:val="single" w:color="D0D7D3" w:sz="4"/>
               <w:right w:val="single" w:color="D0D7D3" w:sz="4"/>
             </w:tcBorders>
+            <w:shd w:fill="F6F8F7" w:color="auto" w:val="clear"/>
             <w:tcMar>
               <w:top w:type="dxa" w:w="80"/>
               <w:left w:type="dxa" w:w="120"/>
@@ -1844,7 +1904,6 @@
               <w:bottom w:val="single" w:color="D0D7D3" w:sz="4"/>
               <w:right w:val="single" w:color="D0D7D3" w:sz="4"/>
             </w:tcBorders>
-            <w:shd w:fill="F6F8F7" w:color="auto" w:val="clear"/>
             <w:tcMar>
               <w:top w:type="dxa" w:w="80"/>
               <w:left w:type="dxa" w:w="120"/>
@@ -1873,7 +1932,6 @@
               <w:bottom w:val="single" w:color="D0D7D3" w:sz="4"/>
               <w:right w:val="single" w:color="D0D7D3" w:sz="4"/>
             </w:tcBorders>
-            <w:shd w:fill="F6F8F7" w:color="auto" w:val="clear"/>
             <w:tcMar>
               <w:top w:type="dxa" w:w="80"/>
               <w:left w:type="dxa" w:w="120"/>
@@ -1904,6 +1962,7 @@
               <w:bottom w:val="single" w:color="D0D7D3" w:sz="4"/>
               <w:right w:val="single" w:color="D0D7D3" w:sz="4"/>
             </w:tcBorders>
+            <w:shd w:fill="F6F8F7" w:color="auto" w:val="clear"/>
             <w:tcMar>
               <w:top w:type="dxa" w:w="80"/>
               <w:left w:type="dxa" w:w="120"/>
@@ -1932,6 +1991,7 @@
               <w:bottom w:val="single" w:color="D0D7D3" w:sz="4"/>
               <w:right w:val="single" w:color="D0D7D3" w:sz="4"/>
             </w:tcBorders>
+            <w:shd w:fill="F6F8F7" w:color="auto" w:val="clear"/>
             <w:tcMar>
               <w:top w:type="dxa" w:w="80"/>
               <w:left w:type="dxa" w:w="120"/>
@@ -1962,7 +2022,6 @@
               <w:bottom w:val="single" w:color="D0D7D3" w:sz="4"/>
               <w:right w:val="single" w:color="D0D7D3" w:sz="4"/>
             </w:tcBorders>
-            <w:shd w:fill="F6F8F7" w:color="auto" w:val="clear"/>
             <w:tcMar>
               <w:top w:type="dxa" w:w="80"/>
               <w:left w:type="dxa" w:w="120"/>
@@ -1991,7 +2050,6 @@
               <w:bottom w:val="single" w:color="D0D7D3" w:sz="4"/>
               <w:right w:val="single" w:color="D0D7D3" w:sz="4"/>
             </w:tcBorders>
-            <w:shd w:fill="F6F8F7" w:color="auto" w:val="clear"/>
             <w:tcMar>
               <w:top w:type="dxa" w:w="80"/>
               <w:left w:type="dxa" w:w="120"/>
@@ -2022,6 +2080,7 @@
               <w:bottom w:val="single" w:color="D0D7D3" w:sz="4"/>
               <w:right w:val="single" w:color="D0D7D3" w:sz="4"/>
             </w:tcBorders>
+            <w:shd w:fill="F6F8F7" w:color="auto" w:val="clear"/>
             <w:tcMar>
               <w:top w:type="dxa" w:w="80"/>
               <w:left w:type="dxa" w:w="120"/>
@@ -2050,6 +2109,7 @@
               <w:bottom w:val="single" w:color="D0D7D3" w:sz="4"/>
               <w:right w:val="single" w:color="D0D7D3" w:sz="4"/>
             </w:tcBorders>
+            <w:shd w:fill="F6F8F7" w:color="auto" w:val="clear"/>
             <w:tcMar>
               <w:top w:type="dxa" w:w="80"/>
               <w:left w:type="dxa" w:w="120"/>
@@ -2080,7 +2140,6 @@
               <w:bottom w:val="single" w:color="D0D7D3" w:sz="4"/>
               <w:right w:val="single" w:color="D0D7D3" w:sz="4"/>
             </w:tcBorders>
-            <w:shd w:fill="F6F8F7" w:color="auto" w:val="clear"/>
             <w:tcMar>
               <w:top w:type="dxa" w:w="80"/>
               <w:left w:type="dxa" w:w="120"/>
@@ -2109,7 +2168,6 @@
               <w:bottom w:val="single" w:color="D0D7D3" w:sz="4"/>
               <w:right w:val="single" w:color="D0D7D3" w:sz="4"/>
             </w:tcBorders>
-            <w:shd w:fill="F6F8F7" w:color="auto" w:val="clear"/>
             <w:tcMar>
               <w:top w:type="dxa" w:w="80"/>
               <w:left w:type="dxa" w:w="120"/>
@@ -4318,6 +4376,66 @@
                 <w:sz w:val="20"/>
                 <w:szCs w:val="20"/>
               </w:rPr>
+              <w:t xml:space="preserve">School admins can now do everything the bursar does, with two-factor sign-in</w:t>
+            </w:r>
+          </w:p>
+        </w:tc>
+      </w:tr>
+      <w:tr>
+        <w:tc>
+          <w:tcPr>
+            <w:tcW w:type="dxa" w:w="1800"/>
+            <w:tcBorders>
+              <w:top w:val="single" w:color="D0D7D3" w:sz="4"/>
+              <w:left w:val="single" w:color="D0D7D3" w:sz="4"/>
+              <w:bottom w:val="single" w:color="D0D7D3" w:sz="4"/>
+              <w:right w:val="single" w:color="D0D7D3" w:sz="4"/>
+            </w:tcBorders>
+            <w:shd w:fill="F6F8F7" w:color="auto" w:val="clear"/>
+            <w:tcMar>
+              <w:top w:type="dxa" w:w="80"/>
+              <w:left w:type="dxa" w:w="120"/>
+              <w:bottom w:type="dxa" w:w="80"/>
+              <w:right w:type="dxa" w:w="120"/>
+            </w:tcMar>
+          </w:tcPr>
+          <w:p>
+            <w:r>
+              <w:rPr>
+                <w:b w:val="false"/>
+                <w:bCs w:val="false"/>
+                <w:sz w:val="20"/>
+                <w:szCs w:val="20"/>
+              </w:rPr>
+              <w:t xml:space="preserve">20 Oct 2026</w:t>
+            </w:r>
+          </w:p>
+        </w:tc>
+        <w:tc>
+          <w:tcPr>
+            <w:tcW w:type="dxa" w:w="7838"/>
+            <w:tcBorders>
+              <w:top w:val="single" w:color="D0D7D3" w:sz="4"/>
+              <w:left w:val="single" w:color="D0D7D3" w:sz="4"/>
+              <w:bottom w:val="single" w:color="D0D7D3" w:sz="4"/>
+              <w:right w:val="single" w:color="D0D7D3" w:sz="4"/>
+            </w:tcBorders>
+            <w:shd w:fill="F6F8F7" w:color="auto" w:val="clear"/>
+            <w:tcMar>
+              <w:top w:type="dxa" w:w="80"/>
+              <w:left w:type="dxa" w:w="120"/>
+              <w:bottom w:type="dxa" w:w="80"/>
+              <w:right w:type="dxa" w:w="120"/>
+            </w:tcMar>
+          </w:tcPr>
+          <w:p>
+            <w:r>
+              <w:rPr>
+                <w:b w:val="false"/>
+                <w:bCs w:val="false"/>
+                <w:sz w:val="20"/>
+                <w:szCs w:val="20"/>
+              </w:rPr>
               <w:t xml:space="preserve">Payment provider switchable at any time (Paystack or Bachs), with Bachs checkout and onboarding</w:t>
             </w:r>
           </w:p>
@@ -4333,7 +4451,6 @@
               <w:bottom w:val="single" w:color="D0D7D3" w:sz="4"/>
               <w:right w:val="single" w:color="D0D7D3" w:sz="4"/>
             </w:tcBorders>
-            <w:shd w:fill="F6F8F7" w:color="auto" w:val="clear"/>
             <w:tcMar>
               <w:top w:type="dxa" w:w="80"/>
               <w:left w:type="dxa" w:w="120"/>
@@ -4362,7 +4479,6 @@
               <w:bottom w:val="single" w:color="D0D7D3" w:sz="4"/>
               <w:right w:val="single" w:color="D0D7D3" w:sz="4"/>
             </w:tcBorders>
-            <w:shd w:fill="F6F8F7" w:color="auto" w:val="clear"/>
             <w:tcMar>
               <w:top w:type="dxa" w:w="80"/>
               <w:left w:type="dxa" w:w="120"/>
@@ -4393,6 +4509,7 @@
               <w:bottom w:val="single" w:color="D0D7D3" w:sz="4"/>
               <w:right w:val="single" w:color="D0D7D3" w:sz="4"/>
             </w:tcBorders>
+            <w:shd w:fill="F6F8F7" w:color="auto" w:val="clear"/>
             <w:tcMar>
               <w:top w:type="dxa" w:w="80"/>
               <w:left w:type="dxa" w:w="120"/>
@@ -4421,6 +4538,7 @@
               <w:bottom w:val="single" w:color="D0D7D3" w:sz="4"/>
               <w:right w:val="single" w:color="D0D7D3" w:sz="4"/>
             </w:tcBorders>
+            <w:shd w:fill="F6F8F7" w:color="auto" w:val="clear"/>
             <w:tcMar>
               <w:top w:type="dxa" w:w="80"/>
               <w:left w:type="dxa" w:w="120"/>
@@ -4451,7 +4569,6 @@
               <w:bottom w:val="single" w:color="D0D7D3" w:sz="4"/>
               <w:right w:val="single" w:color="D0D7D3" w:sz="4"/>
             </w:tcBorders>
-            <w:shd w:fill="F6F8F7" w:color="auto" w:val="clear"/>
             <w:tcMar>
               <w:top w:type="dxa" w:w="80"/>
               <w:left w:type="dxa" w:w="120"/>
@@ -4480,7 +4597,6 @@
               <w:bottom w:val="single" w:color="D0D7D3" w:sz="4"/>
               <w:right w:val="single" w:color="D0D7D3" w:sz="4"/>
             </w:tcBorders>
-            <w:shd w:fill="F6F8F7" w:color="auto" w:val="clear"/>
             <w:tcMar>
               <w:top w:type="dxa" w:w="80"/>
               <w:left w:type="dxa" w:w="120"/>
@@ -4511,6 +4627,7 @@
               <w:bottom w:val="single" w:color="D0D7D3" w:sz="4"/>
               <w:right w:val="single" w:color="D0D7D3" w:sz="4"/>
             </w:tcBorders>
+            <w:shd w:fill="F6F8F7" w:color="auto" w:val="clear"/>
             <w:tcMar>
               <w:top w:type="dxa" w:w="80"/>
               <w:left w:type="dxa" w:w="120"/>
@@ -4539,6 +4656,7 @@
               <w:bottom w:val="single" w:color="D0D7D3" w:sz="4"/>
               <w:right w:val="single" w:color="D0D7D3" w:sz="4"/>
             </w:tcBorders>
+            <w:shd w:fill="F6F8F7" w:color="auto" w:val="clear"/>
             <w:tcMar>
               <w:top w:type="dxa" w:w="80"/>
               <w:left w:type="dxa" w:w="120"/>
@@ -4569,7 +4687,6 @@
               <w:bottom w:val="single" w:color="D0D7D3" w:sz="4"/>
               <w:right w:val="single" w:color="D0D7D3" w:sz="4"/>
             </w:tcBorders>
-            <w:shd w:fill="F6F8F7" w:color="auto" w:val="clear"/>
             <w:tcMar>
               <w:top w:type="dxa" w:w="80"/>
               <w:left w:type="dxa" w:w="120"/>
@@ -4598,7 +4715,6 @@
               <w:bottom w:val="single" w:color="D0D7D3" w:sz="4"/>
               <w:right w:val="single" w:color="D0D7D3" w:sz="4"/>
             </w:tcBorders>
-            <w:shd w:fill="F6F8F7" w:color="auto" w:val="clear"/>
             <w:tcMar>
               <w:top w:type="dxa" w:w="80"/>
               <w:left w:type="dxa" w:w="120"/>
@@ -4629,6 +4745,7 @@
               <w:bottom w:val="single" w:color="D0D7D3" w:sz="4"/>
               <w:right w:val="single" w:color="D0D7D3" w:sz="4"/>
             </w:tcBorders>
+            <w:shd w:fill="F6F8F7" w:color="auto" w:val="clear"/>
             <w:tcMar>
               <w:top w:type="dxa" w:w="80"/>
               <w:left w:type="dxa" w:w="120"/>
@@ -4657,6 +4774,7 @@
               <w:bottom w:val="single" w:color="D0D7D3" w:sz="4"/>
               <w:right w:val="single" w:color="D0D7D3" w:sz="4"/>
             </w:tcBorders>
+            <w:shd w:fill="F6F8F7" w:color="auto" w:val="clear"/>
             <w:tcMar>
               <w:top w:type="dxa" w:w="80"/>
               <w:left w:type="dxa" w:w="120"/>
@@ -4687,7 +4805,6 @@
               <w:bottom w:val="single" w:color="D0D7D3" w:sz="4"/>
               <w:right w:val="single" w:color="D0D7D3" w:sz="4"/>
             </w:tcBorders>
-            <w:shd w:fill="F6F8F7" w:color="auto" w:val="clear"/>
             <w:tcMar>
               <w:top w:type="dxa" w:w="80"/>
               <w:left w:type="dxa" w:w="120"/>
@@ -4716,7 +4833,6 @@
               <w:bottom w:val="single" w:color="D0D7D3" w:sz="4"/>
               <w:right w:val="single" w:color="D0D7D3" w:sz="4"/>
             </w:tcBorders>
-            <w:shd w:fill="F6F8F7" w:color="auto" w:val="clear"/>
             <w:tcMar>
               <w:top w:type="dxa" w:w="80"/>
               <w:left w:type="dxa" w:w="120"/>
@@ -4747,6 +4863,7 @@
               <w:bottom w:val="single" w:color="D0D7D3" w:sz="4"/>
               <w:right w:val="single" w:color="D0D7D3" w:sz="4"/>
             </w:tcBorders>
+            <w:shd w:fill="F6F8F7" w:color="auto" w:val="clear"/>
             <w:tcMar>
               <w:top w:type="dxa" w:w="80"/>
               <w:left w:type="dxa" w:w="120"/>
@@ -4775,6 +4892,7 @@
               <w:bottom w:val="single" w:color="D0D7D3" w:sz="4"/>
               <w:right w:val="single" w:color="D0D7D3" w:sz="4"/>
             </w:tcBorders>
+            <w:shd w:fill="F6F8F7" w:color="auto" w:val="clear"/>
             <w:tcMar>
               <w:top w:type="dxa" w:w="80"/>
               <w:left w:type="dxa" w:w="120"/>
@@ -4805,7 +4923,6 @@
               <w:bottom w:val="single" w:color="D0D7D3" w:sz="4"/>
               <w:right w:val="single" w:color="D0D7D3" w:sz="4"/>
             </w:tcBorders>
-            <w:shd w:fill="F6F8F7" w:color="auto" w:val="clear"/>
             <w:tcMar>
               <w:top w:type="dxa" w:w="80"/>
               <w:left w:type="dxa" w:w="120"/>
@@ -4834,7 +4951,6 @@
               <w:bottom w:val="single" w:color="D0D7D3" w:sz="4"/>
               <w:right w:val="single" w:color="D0D7D3" w:sz="4"/>
             </w:tcBorders>
-            <w:shd w:fill="F6F8F7" w:color="auto" w:val="clear"/>
             <w:tcMar>
               <w:top w:type="dxa" w:w="80"/>
               <w:left w:type="dxa" w:w="120"/>
@@ -4865,6 +4981,7 @@
               <w:bottom w:val="single" w:color="D0D7D3" w:sz="4"/>
               <w:right w:val="single" w:color="D0D7D3" w:sz="4"/>
             </w:tcBorders>
+            <w:shd w:fill="F6F8F7" w:color="auto" w:val="clear"/>
             <w:tcMar>
               <w:top w:type="dxa" w:w="80"/>
               <w:left w:type="dxa" w:w="120"/>
@@ -4893,6 +5010,7 @@
               <w:bottom w:val="single" w:color="D0D7D3" w:sz="4"/>
               <w:right w:val="single" w:color="D0D7D3" w:sz="4"/>
             </w:tcBorders>
+            <w:shd w:fill="F6F8F7" w:color="auto" w:val="clear"/>
             <w:tcMar>
               <w:top w:type="dxa" w:w="80"/>
               <w:left w:type="dxa" w:w="120"/>
@@ -4923,7 +5041,6 @@
               <w:bottom w:val="single" w:color="D0D7D3" w:sz="4"/>
               <w:right w:val="single" w:color="D0D7D3" w:sz="4"/>
             </w:tcBorders>
-            <w:shd w:fill="F6F8F7" w:color="auto" w:val="clear"/>
             <w:tcMar>
               <w:top w:type="dxa" w:w="80"/>
               <w:left w:type="dxa" w:w="120"/>
@@ -4952,7 +5069,6 @@
               <w:bottom w:val="single" w:color="D0D7D3" w:sz="4"/>
               <w:right w:val="single" w:color="D0D7D3" w:sz="4"/>
             </w:tcBorders>
-            <w:shd w:fill="F6F8F7" w:color="auto" w:val="clear"/>
             <w:tcMar>
               <w:top w:type="dxa" w:w="80"/>
               <w:left w:type="dxa" w:w="120"/>
@@ -4983,6 +5099,7 @@
               <w:bottom w:val="single" w:color="D0D7D3" w:sz="4"/>
               <w:right w:val="single" w:color="D0D7D3" w:sz="4"/>
             </w:tcBorders>
+            <w:shd w:fill="F6F8F7" w:color="auto" w:val="clear"/>
             <w:tcMar>
               <w:top w:type="dxa" w:w="80"/>
               <w:left w:type="dxa" w:w="120"/>
@@ -5011,6 +5128,7 @@
               <w:bottom w:val="single" w:color="D0D7D3" w:sz="4"/>
               <w:right w:val="single" w:color="D0D7D3" w:sz="4"/>
             </w:tcBorders>
+            <w:shd w:fill="F6F8F7" w:color="auto" w:val="clear"/>
             <w:tcMar>
               <w:top w:type="dxa" w:w="80"/>
               <w:left w:type="dxa" w:w="120"/>
@@ -5041,7 +5159,6 @@
               <w:bottom w:val="single" w:color="D0D7D3" w:sz="4"/>
               <w:right w:val="single" w:color="D0D7D3" w:sz="4"/>
             </w:tcBorders>
-            <w:shd w:fill="F6F8F7" w:color="auto" w:val="clear"/>
             <w:tcMar>
               <w:top w:type="dxa" w:w="80"/>
               <w:left w:type="dxa" w:w="120"/>
@@ -5070,7 +5187,6 @@
               <w:bottom w:val="single" w:color="D0D7D3" w:sz="4"/>
               <w:right w:val="single" w:color="D0D7D3" w:sz="4"/>
             </w:tcBorders>
-            <w:shd w:fill="F6F8F7" w:color="auto" w:val="clear"/>
             <w:tcMar>
               <w:top w:type="dxa" w:w="80"/>
               <w:left w:type="dxa" w:w="120"/>
@@ -5101,6 +5217,7 @@
               <w:bottom w:val="single" w:color="D0D7D3" w:sz="4"/>
               <w:right w:val="single" w:color="D0D7D3" w:sz="4"/>
             </w:tcBorders>
+            <w:shd w:fill="F6F8F7" w:color="auto" w:val="clear"/>
             <w:tcMar>
               <w:top w:type="dxa" w:w="80"/>
               <w:left w:type="dxa" w:w="120"/>
@@ -5129,6 +5246,7 @@
               <w:bottom w:val="single" w:color="D0D7D3" w:sz="4"/>
               <w:right w:val="single" w:color="D0D7D3" w:sz="4"/>
             </w:tcBorders>
+            <w:shd w:fill="F6F8F7" w:color="auto" w:val="clear"/>
             <w:tcMar>
               <w:top w:type="dxa" w:w="80"/>
               <w:left w:type="dxa" w:w="120"/>
@@ -5159,7 +5277,6 @@
               <w:bottom w:val="single" w:color="D0D7D3" w:sz="4"/>
               <w:right w:val="single" w:color="D0D7D3" w:sz="4"/>
             </w:tcBorders>
-            <w:shd w:fill="F6F8F7" w:color="auto" w:val="clear"/>
             <w:tcMar>
               <w:top w:type="dxa" w:w="80"/>
               <w:left w:type="dxa" w:w="120"/>
@@ -5188,7 +5305,6 @@
               <w:bottom w:val="single" w:color="D0D7D3" w:sz="4"/>
               <w:right w:val="single" w:color="D0D7D3" w:sz="4"/>
             </w:tcBorders>
-            <w:shd w:fill="F6F8F7" w:color="auto" w:val="clear"/>
             <w:tcMar>
               <w:top w:type="dxa" w:w="80"/>
               <w:left w:type="dxa" w:w="120"/>
@@ -5219,6 +5335,7 @@
               <w:bottom w:val="single" w:color="D0D7D3" w:sz="4"/>
               <w:right w:val="single" w:color="D0D7D3" w:sz="4"/>
             </w:tcBorders>
+            <w:shd w:fill="F6F8F7" w:color="auto" w:val="clear"/>
             <w:tcMar>
               <w:top w:type="dxa" w:w="80"/>
               <w:left w:type="dxa" w:w="120"/>
@@ -5247,6 +5364,7 @@
               <w:bottom w:val="single" w:color="D0D7D3" w:sz="4"/>
               <w:right w:val="single" w:color="D0D7D3" w:sz="4"/>
             </w:tcBorders>
+            <w:shd w:fill="F6F8F7" w:color="auto" w:val="clear"/>
             <w:tcMar>
               <w:top w:type="dxa" w:w="80"/>
               <w:left w:type="dxa" w:w="120"/>
@@ -5277,7 +5395,6 @@
               <w:bottom w:val="single" w:color="D0D7D3" w:sz="4"/>
               <w:right w:val="single" w:color="D0D7D3" w:sz="4"/>
             </w:tcBorders>
-            <w:shd w:fill="F6F8F7" w:color="auto" w:val="clear"/>
             <w:tcMar>
               <w:top w:type="dxa" w:w="80"/>
               <w:left w:type="dxa" w:w="120"/>
@@ -5306,7 +5423,6 @@
               <w:bottom w:val="single" w:color="D0D7D3" w:sz="4"/>
               <w:right w:val="single" w:color="D0D7D3" w:sz="4"/>
             </w:tcBorders>
-            <w:shd w:fill="F6F8F7" w:color="auto" w:val="clear"/>
             <w:tcMar>
               <w:top w:type="dxa" w:w="80"/>
               <w:left w:type="dxa" w:w="120"/>

</xml_diff>

<commit_message>
Fee breakdowns: each fee charged, paid and left, wherever a balance shows
A pupil's balance is shown fee by fee (tuition, levies, WAEC, bus, one-off
charges by their own name) with what's paid and left on each, plus earlier
debts: a table on the staff pupil page (GET /reports/students/{id}/fee-breakdown),
and a list under each child in the parent portal and on the family payment
page. The figures come from the same rule as the fee-status report, so they
always agree.
</commit_message>
<xml_diff>
--- a/docs/product/ParentPay - what it does.docx
+++ b/docs/product/ParentPay - what it does.docx
@@ -4376,6 +4376,66 @@
                 <w:sz w:val="20"/>
                 <w:szCs w:val="20"/>
               </w:rPr>
+              <w:t xml:space="preserve">Fee breakdowns everywhere: each fee charged, paid and left, for staff, in the portal and on the payment page</w:t>
+            </w:r>
+          </w:p>
+        </w:tc>
+      </w:tr>
+      <w:tr>
+        <w:tc>
+          <w:tcPr>
+            <w:tcW w:type="dxa" w:w="1800"/>
+            <w:tcBorders>
+              <w:top w:val="single" w:color="D0D7D3" w:sz="4"/>
+              <w:left w:val="single" w:color="D0D7D3" w:sz="4"/>
+              <w:bottom w:val="single" w:color="D0D7D3" w:sz="4"/>
+              <w:right w:val="single" w:color="D0D7D3" w:sz="4"/>
+            </w:tcBorders>
+            <w:shd w:fill="F6F8F7" w:color="auto" w:val="clear"/>
+            <w:tcMar>
+              <w:top w:type="dxa" w:w="80"/>
+              <w:left w:type="dxa" w:w="120"/>
+              <w:bottom w:type="dxa" w:w="80"/>
+              <w:right w:type="dxa" w:w="120"/>
+            </w:tcMar>
+          </w:tcPr>
+          <w:p>
+            <w:r>
+              <w:rPr>
+                <w:b w:val="false"/>
+                <w:bCs w:val="false"/>
+                <w:sz w:val="20"/>
+                <w:szCs w:val="20"/>
+              </w:rPr>
+              <w:t xml:space="preserve">20 Oct 2026</w:t>
+            </w:r>
+          </w:p>
+        </w:tc>
+        <w:tc>
+          <w:tcPr>
+            <w:tcW w:type="dxa" w:w="7838"/>
+            <w:tcBorders>
+              <w:top w:val="single" w:color="D0D7D3" w:sz="4"/>
+              <w:left w:val="single" w:color="D0D7D3" w:sz="4"/>
+              <w:bottom w:val="single" w:color="D0D7D3" w:sz="4"/>
+              <w:right w:val="single" w:color="D0D7D3" w:sz="4"/>
+            </w:tcBorders>
+            <w:shd w:fill="F6F8F7" w:color="auto" w:val="clear"/>
+            <w:tcMar>
+              <w:top w:type="dxa" w:w="80"/>
+              <w:left w:type="dxa" w:w="120"/>
+              <w:bottom w:type="dxa" w:w="80"/>
+              <w:right w:type="dxa" w:w="120"/>
+            </w:tcMar>
+          </w:tcPr>
+          <w:p>
+            <w:r>
+              <w:rPr>
+                <w:b w:val="false"/>
+                <w:bCs w:val="false"/>
+                <w:sz w:val="20"/>
+                <w:szCs w:val="20"/>
+              </w:rPr>
               <w:t xml:space="preserve">School admins can now do everything the bursar does, with two-factor sign-in</w:t>
             </w:r>
           </w:p>
@@ -4391,7 +4451,6 @@
               <w:bottom w:val="single" w:color="D0D7D3" w:sz="4"/>
               <w:right w:val="single" w:color="D0D7D3" w:sz="4"/>
             </w:tcBorders>
-            <w:shd w:fill="F6F8F7" w:color="auto" w:val="clear"/>
             <w:tcMar>
               <w:top w:type="dxa" w:w="80"/>
               <w:left w:type="dxa" w:w="120"/>
@@ -4420,7 +4479,6 @@
               <w:bottom w:val="single" w:color="D0D7D3" w:sz="4"/>
               <w:right w:val="single" w:color="D0D7D3" w:sz="4"/>
             </w:tcBorders>
-            <w:shd w:fill="F6F8F7" w:color="auto" w:val="clear"/>
             <w:tcMar>
               <w:top w:type="dxa" w:w="80"/>
               <w:left w:type="dxa" w:w="120"/>
@@ -4451,6 +4509,7 @@
               <w:bottom w:val="single" w:color="D0D7D3" w:sz="4"/>
               <w:right w:val="single" w:color="D0D7D3" w:sz="4"/>
             </w:tcBorders>
+            <w:shd w:fill="F6F8F7" w:color="auto" w:val="clear"/>
             <w:tcMar>
               <w:top w:type="dxa" w:w="80"/>
               <w:left w:type="dxa" w:w="120"/>
@@ -4479,6 +4538,7 @@
               <w:bottom w:val="single" w:color="D0D7D3" w:sz="4"/>
               <w:right w:val="single" w:color="D0D7D3" w:sz="4"/>
             </w:tcBorders>
+            <w:shd w:fill="F6F8F7" w:color="auto" w:val="clear"/>
             <w:tcMar>
               <w:top w:type="dxa" w:w="80"/>
               <w:left w:type="dxa" w:w="120"/>
@@ -4509,7 +4569,6 @@
               <w:bottom w:val="single" w:color="D0D7D3" w:sz="4"/>
               <w:right w:val="single" w:color="D0D7D3" w:sz="4"/>
             </w:tcBorders>
-            <w:shd w:fill="F6F8F7" w:color="auto" w:val="clear"/>
             <w:tcMar>
               <w:top w:type="dxa" w:w="80"/>
               <w:left w:type="dxa" w:w="120"/>
@@ -4538,7 +4597,6 @@
               <w:bottom w:val="single" w:color="D0D7D3" w:sz="4"/>
               <w:right w:val="single" w:color="D0D7D3" w:sz="4"/>
             </w:tcBorders>
-            <w:shd w:fill="F6F8F7" w:color="auto" w:val="clear"/>
             <w:tcMar>
               <w:top w:type="dxa" w:w="80"/>
               <w:left w:type="dxa" w:w="120"/>
@@ -4569,6 +4627,7 @@
               <w:bottom w:val="single" w:color="D0D7D3" w:sz="4"/>
               <w:right w:val="single" w:color="D0D7D3" w:sz="4"/>
             </w:tcBorders>
+            <w:shd w:fill="F6F8F7" w:color="auto" w:val="clear"/>
             <w:tcMar>
               <w:top w:type="dxa" w:w="80"/>
               <w:left w:type="dxa" w:w="120"/>
@@ -4597,6 +4656,7 @@
               <w:bottom w:val="single" w:color="D0D7D3" w:sz="4"/>
               <w:right w:val="single" w:color="D0D7D3" w:sz="4"/>
             </w:tcBorders>
+            <w:shd w:fill="F6F8F7" w:color="auto" w:val="clear"/>
             <w:tcMar>
               <w:top w:type="dxa" w:w="80"/>
               <w:left w:type="dxa" w:w="120"/>
@@ -4627,7 +4687,6 @@
               <w:bottom w:val="single" w:color="D0D7D3" w:sz="4"/>
               <w:right w:val="single" w:color="D0D7D3" w:sz="4"/>
             </w:tcBorders>
-            <w:shd w:fill="F6F8F7" w:color="auto" w:val="clear"/>
             <w:tcMar>
               <w:top w:type="dxa" w:w="80"/>
               <w:left w:type="dxa" w:w="120"/>
@@ -4656,7 +4715,6 @@
               <w:bottom w:val="single" w:color="D0D7D3" w:sz="4"/>
               <w:right w:val="single" w:color="D0D7D3" w:sz="4"/>
             </w:tcBorders>
-            <w:shd w:fill="F6F8F7" w:color="auto" w:val="clear"/>
             <w:tcMar>
               <w:top w:type="dxa" w:w="80"/>
               <w:left w:type="dxa" w:w="120"/>
@@ -4687,6 +4745,7 @@
               <w:bottom w:val="single" w:color="D0D7D3" w:sz="4"/>
               <w:right w:val="single" w:color="D0D7D3" w:sz="4"/>
             </w:tcBorders>
+            <w:shd w:fill="F6F8F7" w:color="auto" w:val="clear"/>
             <w:tcMar>
               <w:top w:type="dxa" w:w="80"/>
               <w:left w:type="dxa" w:w="120"/>
@@ -4715,6 +4774,7 @@
               <w:bottom w:val="single" w:color="D0D7D3" w:sz="4"/>
               <w:right w:val="single" w:color="D0D7D3" w:sz="4"/>
             </w:tcBorders>
+            <w:shd w:fill="F6F8F7" w:color="auto" w:val="clear"/>
             <w:tcMar>
               <w:top w:type="dxa" w:w="80"/>
               <w:left w:type="dxa" w:w="120"/>
@@ -4745,7 +4805,6 @@
               <w:bottom w:val="single" w:color="D0D7D3" w:sz="4"/>
               <w:right w:val="single" w:color="D0D7D3" w:sz="4"/>
             </w:tcBorders>
-            <w:shd w:fill="F6F8F7" w:color="auto" w:val="clear"/>
             <w:tcMar>
               <w:top w:type="dxa" w:w="80"/>
               <w:left w:type="dxa" w:w="120"/>
@@ -4774,7 +4833,6 @@
               <w:bottom w:val="single" w:color="D0D7D3" w:sz="4"/>
               <w:right w:val="single" w:color="D0D7D3" w:sz="4"/>
             </w:tcBorders>
-            <w:shd w:fill="F6F8F7" w:color="auto" w:val="clear"/>
             <w:tcMar>
               <w:top w:type="dxa" w:w="80"/>
               <w:left w:type="dxa" w:w="120"/>
@@ -4805,6 +4863,7 @@
               <w:bottom w:val="single" w:color="D0D7D3" w:sz="4"/>
               <w:right w:val="single" w:color="D0D7D3" w:sz="4"/>
             </w:tcBorders>
+            <w:shd w:fill="F6F8F7" w:color="auto" w:val="clear"/>
             <w:tcMar>
               <w:top w:type="dxa" w:w="80"/>
               <w:left w:type="dxa" w:w="120"/>
@@ -4833,6 +4892,7 @@
               <w:bottom w:val="single" w:color="D0D7D3" w:sz="4"/>
               <w:right w:val="single" w:color="D0D7D3" w:sz="4"/>
             </w:tcBorders>
+            <w:shd w:fill="F6F8F7" w:color="auto" w:val="clear"/>
             <w:tcMar>
               <w:top w:type="dxa" w:w="80"/>
               <w:left w:type="dxa" w:w="120"/>
@@ -4863,7 +4923,6 @@
               <w:bottom w:val="single" w:color="D0D7D3" w:sz="4"/>
               <w:right w:val="single" w:color="D0D7D3" w:sz="4"/>
             </w:tcBorders>
-            <w:shd w:fill="F6F8F7" w:color="auto" w:val="clear"/>
             <w:tcMar>
               <w:top w:type="dxa" w:w="80"/>
               <w:left w:type="dxa" w:w="120"/>
@@ -4892,7 +4951,6 @@
               <w:bottom w:val="single" w:color="D0D7D3" w:sz="4"/>
               <w:right w:val="single" w:color="D0D7D3" w:sz="4"/>
             </w:tcBorders>
-            <w:shd w:fill="F6F8F7" w:color="auto" w:val="clear"/>
             <w:tcMar>
               <w:top w:type="dxa" w:w="80"/>
               <w:left w:type="dxa" w:w="120"/>
@@ -4923,6 +4981,7 @@
               <w:bottom w:val="single" w:color="D0D7D3" w:sz="4"/>
               <w:right w:val="single" w:color="D0D7D3" w:sz="4"/>
             </w:tcBorders>
+            <w:shd w:fill="F6F8F7" w:color="auto" w:val="clear"/>
             <w:tcMar>
               <w:top w:type="dxa" w:w="80"/>
               <w:left w:type="dxa" w:w="120"/>
@@ -4951,6 +5010,7 @@
               <w:bottom w:val="single" w:color="D0D7D3" w:sz="4"/>
               <w:right w:val="single" w:color="D0D7D3" w:sz="4"/>
             </w:tcBorders>
+            <w:shd w:fill="F6F8F7" w:color="auto" w:val="clear"/>
             <w:tcMar>
               <w:top w:type="dxa" w:w="80"/>
               <w:left w:type="dxa" w:w="120"/>
@@ -4981,7 +5041,6 @@
               <w:bottom w:val="single" w:color="D0D7D3" w:sz="4"/>
               <w:right w:val="single" w:color="D0D7D3" w:sz="4"/>
             </w:tcBorders>
-            <w:shd w:fill="F6F8F7" w:color="auto" w:val="clear"/>
             <w:tcMar>
               <w:top w:type="dxa" w:w="80"/>
               <w:left w:type="dxa" w:w="120"/>
@@ -5010,7 +5069,6 @@
               <w:bottom w:val="single" w:color="D0D7D3" w:sz="4"/>
               <w:right w:val="single" w:color="D0D7D3" w:sz="4"/>
             </w:tcBorders>
-            <w:shd w:fill="F6F8F7" w:color="auto" w:val="clear"/>
             <w:tcMar>
               <w:top w:type="dxa" w:w="80"/>
               <w:left w:type="dxa" w:w="120"/>
@@ -5041,6 +5099,7 @@
               <w:bottom w:val="single" w:color="D0D7D3" w:sz="4"/>
               <w:right w:val="single" w:color="D0D7D3" w:sz="4"/>
             </w:tcBorders>
+            <w:shd w:fill="F6F8F7" w:color="auto" w:val="clear"/>
             <w:tcMar>
               <w:top w:type="dxa" w:w="80"/>
               <w:left w:type="dxa" w:w="120"/>
@@ -5069,6 +5128,7 @@
               <w:bottom w:val="single" w:color="D0D7D3" w:sz="4"/>
               <w:right w:val="single" w:color="D0D7D3" w:sz="4"/>
             </w:tcBorders>
+            <w:shd w:fill="F6F8F7" w:color="auto" w:val="clear"/>
             <w:tcMar>
               <w:top w:type="dxa" w:w="80"/>
               <w:left w:type="dxa" w:w="120"/>
@@ -5099,7 +5159,6 @@
               <w:bottom w:val="single" w:color="D0D7D3" w:sz="4"/>
               <w:right w:val="single" w:color="D0D7D3" w:sz="4"/>
             </w:tcBorders>
-            <w:shd w:fill="F6F8F7" w:color="auto" w:val="clear"/>
             <w:tcMar>
               <w:top w:type="dxa" w:w="80"/>
               <w:left w:type="dxa" w:w="120"/>
@@ -5128,7 +5187,6 @@
               <w:bottom w:val="single" w:color="D0D7D3" w:sz="4"/>
               <w:right w:val="single" w:color="D0D7D3" w:sz="4"/>
             </w:tcBorders>
-            <w:shd w:fill="F6F8F7" w:color="auto" w:val="clear"/>
             <w:tcMar>
               <w:top w:type="dxa" w:w="80"/>
               <w:left w:type="dxa" w:w="120"/>
@@ -5159,6 +5217,7 @@
               <w:bottom w:val="single" w:color="D0D7D3" w:sz="4"/>
               <w:right w:val="single" w:color="D0D7D3" w:sz="4"/>
             </w:tcBorders>
+            <w:shd w:fill="F6F8F7" w:color="auto" w:val="clear"/>
             <w:tcMar>
               <w:top w:type="dxa" w:w="80"/>
               <w:left w:type="dxa" w:w="120"/>
@@ -5187,6 +5246,7 @@
               <w:bottom w:val="single" w:color="D0D7D3" w:sz="4"/>
               <w:right w:val="single" w:color="D0D7D3" w:sz="4"/>
             </w:tcBorders>
+            <w:shd w:fill="F6F8F7" w:color="auto" w:val="clear"/>
             <w:tcMar>
               <w:top w:type="dxa" w:w="80"/>
               <w:left w:type="dxa" w:w="120"/>
@@ -5217,7 +5277,6 @@
               <w:bottom w:val="single" w:color="D0D7D3" w:sz="4"/>
               <w:right w:val="single" w:color="D0D7D3" w:sz="4"/>
             </w:tcBorders>
-            <w:shd w:fill="F6F8F7" w:color="auto" w:val="clear"/>
             <w:tcMar>
               <w:top w:type="dxa" w:w="80"/>
               <w:left w:type="dxa" w:w="120"/>
@@ -5246,7 +5305,6 @@
               <w:bottom w:val="single" w:color="D0D7D3" w:sz="4"/>
               <w:right w:val="single" w:color="D0D7D3" w:sz="4"/>
             </w:tcBorders>
-            <w:shd w:fill="F6F8F7" w:color="auto" w:val="clear"/>
             <w:tcMar>
               <w:top w:type="dxa" w:w="80"/>
               <w:left w:type="dxa" w:w="120"/>
@@ -5277,6 +5335,7 @@
               <w:bottom w:val="single" w:color="D0D7D3" w:sz="4"/>
               <w:right w:val="single" w:color="D0D7D3" w:sz="4"/>
             </w:tcBorders>
+            <w:shd w:fill="F6F8F7" w:color="auto" w:val="clear"/>
             <w:tcMar>
               <w:top w:type="dxa" w:w="80"/>
               <w:left w:type="dxa" w:w="120"/>
@@ -5305,6 +5364,7 @@
               <w:bottom w:val="single" w:color="D0D7D3" w:sz="4"/>
               <w:right w:val="single" w:color="D0D7D3" w:sz="4"/>
             </w:tcBorders>
+            <w:shd w:fill="F6F8F7" w:color="auto" w:val="clear"/>
             <w:tcMar>
               <w:top w:type="dxa" w:w="80"/>
               <w:left w:type="dxa" w:w="120"/>
@@ -5335,7 +5395,6 @@
               <w:bottom w:val="single" w:color="D0D7D3" w:sz="4"/>
               <w:right w:val="single" w:color="D0D7D3" w:sz="4"/>
             </w:tcBorders>
-            <w:shd w:fill="F6F8F7" w:color="auto" w:val="clear"/>
             <w:tcMar>
               <w:top w:type="dxa" w:w="80"/>
               <w:left w:type="dxa" w:w="120"/>
@@ -5364,7 +5423,6 @@
               <w:bottom w:val="single" w:color="D0D7D3" w:sz="4"/>
               <w:right w:val="single" w:color="D0D7D3" w:sz="4"/>
             </w:tcBorders>
-            <w:shd w:fill="F6F8F7" w:color="auto" w:val="clear"/>
             <w:tcMar>
               <w:top w:type="dxa" w:w="80"/>
               <w:left w:type="dxa" w:w="120"/>
@@ -5395,6 +5453,7 @@
               <w:bottom w:val="single" w:color="D0D7D3" w:sz="4"/>
               <w:right w:val="single" w:color="D0D7D3" w:sz="4"/>
             </w:tcBorders>
+            <w:shd w:fill="F6F8F7" w:color="auto" w:val="clear"/>
             <w:tcMar>
               <w:top w:type="dxa" w:w="80"/>
               <w:left w:type="dxa" w:w="120"/>
@@ -5423,6 +5482,7 @@
               <w:bottom w:val="single" w:color="D0D7D3" w:sz="4"/>
               <w:right w:val="single" w:color="D0D7D3" w:sz="4"/>
             </w:tcBorders>
+            <w:shd w:fill="F6F8F7" w:color="auto" w:val="clear"/>
             <w:tcMar>
               <w:top w:type="dxa" w:w="80"/>
               <w:left w:type="dxa" w:w="120"/>

</xml_diff>

<commit_message>
Add fees set in the grid after billing to the bills already sent
Fees added to the term's fee grid after its bills were generated (WAEC for
SSS 3) didn't reach those bills. The Fees page now spots the gap and offers to
add the missing fees in one click (POST /terms/{id}/bills/sync, previewed
first), skipping exempt pupils and optional fees a pupil hasn't taken, and
using any credit paid ahead.
</commit_message>
<xml_diff>
--- a/docs/product/ParentPay - what it does.docx
+++ b/docs/product/ParentPay - what it does.docx
@@ -4376,6 +4376,66 @@
                 <w:sz w:val="20"/>
                 <w:szCs w:val="20"/>
               </w:rPr>
+              <w:t xml:space="preserve">Fees added to the fee grid after billing can be added to the bills already sent, in one click</w:t>
+            </w:r>
+          </w:p>
+        </w:tc>
+      </w:tr>
+      <w:tr>
+        <w:tc>
+          <w:tcPr>
+            <w:tcW w:type="dxa" w:w="1800"/>
+            <w:tcBorders>
+              <w:top w:val="single" w:color="D0D7D3" w:sz="4"/>
+              <w:left w:val="single" w:color="D0D7D3" w:sz="4"/>
+              <w:bottom w:val="single" w:color="D0D7D3" w:sz="4"/>
+              <w:right w:val="single" w:color="D0D7D3" w:sz="4"/>
+            </w:tcBorders>
+            <w:shd w:fill="F6F8F7" w:color="auto" w:val="clear"/>
+            <w:tcMar>
+              <w:top w:type="dxa" w:w="80"/>
+              <w:left w:type="dxa" w:w="120"/>
+              <w:bottom w:type="dxa" w:w="80"/>
+              <w:right w:type="dxa" w:w="120"/>
+            </w:tcMar>
+          </w:tcPr>
+          <w:p>
+            <w:r>
+              <w:rPr>
+                <w:b w:val="false"/>
+                <w:bCs w:val="false"/>
+                <w:sz w:val="20"/>
+                <w:szCs w:val="20"/>
+              </w:rPr>
+              <w:t xml:space="preserve">20 Oct 2026</w:t>
+            </w:r>
+          </w:p>
+        </w:tc>
+        <w:tc>
+          <w:tcPr>
+            <w:tcW w:type="dxa" w:w="7838"/>
+            <w:tcBorders>
+              <w:top w:val="single" w:color="D0D7D3" w:sz="4"/>
+              <w:left w:val="single" w:color="D0D7D3" w:sz="4"/>
+              <w:bottom w:val="single" w:color="D0D7D3" w:sz="4"/>
+              <w:right w:val="single" w:color="D0D7D3" w:sz="4"/>
+            </w:tcBorders>
+            <w:shd w:fill="F6F8F7" w:color="auto" w:val="clear"/>
+            <w:tcMar>
+              <w:top w:type="dxa" w:w="80"/>
+              <w:left w:type="dxa" w:w="120"/>
+              <w:bottom w:type="dxa" w:w="80"/>
+              <w:right w:type="dxa" w:w="120"/>
+            </w:tcMar>
+          </w:tcPr>
+          <w:p>
+            <w:r>
+              <w:rPr>
+                <w:b w:val="false"/>
+                <w:bCs w:val="false"/>
+                <w:sz w:val="20"/>
+                <w:szCs w:val="20"/>
+              </w:rPr>
               <w:t xml:space="preserve">Fee breakdowns everywhere: each fee charged, paid and left, for staff, in the portal and on the payment page</w:t>
             </w:r>
           </w:p>
@@ -4391,7 +4451,6 @@
               <w:bottom w:val="single" w:color="D0D7D3" w:sz="4"/>
               <w:right w:val="single" w:color="D0D7D3" w:sz="4"/>
             </w:tcBorders>
-            <w:shd w:fill="F6F8F7" w:color="auto" w:val="clear"/>
             <w:tcMar>
               <w:top w:type="dxa" w:w="80"/>
               <w:left w:type="dxa" w:w="120"/>
@@ -4420,7 +4479,6 @@
               <w:bottom w:val="single" w:color="D0D7D3" w:sz="4"/>
               <w:right w:val="single" w:color="D0D7D3" w:sz="4"/>
             </w:tcBorders>
-            <w:shd w:fill="F6F8F7" w:color="auto" w:val="clear"/>
             <w:tcMar>
               <w:top w:type="dxa" w:w="80"/>
               <w:left w:type="dxa" w:w="120"/>
@@ -4451,6 +4509,7 @@
               <w:bottom w:val="single" w:color="D0D7D3" w:sz="4"/>
               <w:right w:val="single" w:color="D0D7D3" w:sz="4"/>
             </w:tcBorders>
+            <w:shd w:fill="F6F8F7" w:color="auto" w:val="clear"/>
             <w:tcMar>
               <w:top w:type="dxa" w:w="80"/>
               <w:left w:type="dxa" w:w="120"/>
@@ -4479,6 +4538,7 @@
               <w:bottom w:val="single" w:color="D0D7D3" w:sz="4"/>
               <w:right w:val="single" w:color="D0D7D3" w:sz="4"/>
             </w:tcBorders>
+            <w:shd w:fill="F6F8F7" w:color="auto" w:val="clear"/>
             <w:tcMar>
               <w:top w:type="dxa" w:w="80"/>
               <w:left w:type="dxa" w:w="120"/>
@@ -4509,7 +4569,6 @@
               <w:bottom w:val="single" w:color="D0D7D3" w:sz="4"/>
               <w:right w:val="single" w:color="D0D7D3" w:sz="4"/>
             </w:tcBorders>
-            <w:shd w:fill="F6F8F7" w:color="auto" w:val="clear"/>
             <w:tcMar>
               <w:top w:type="dxa" w:w="80"/>
               <w:left w:type="dxa" w:w="120"/>
@@ -4538,7 +4597,6 @@
               <w:bottom w:val="single" w:color="D0D7D3" w:sz="4"/>
               <w:right w:val="single" w:color="D0D7D3" w:sz="4"/>
             </w:tcBorders>
-            <w:shd w:fill="F6F8F7" w:color="auto" w:val="clear"/>
             <w:tcMar>
               <w:top w:type="dxa" w:w="80"/>
               <w:left w:type="dxa" w:w="120"/>
@@ -4569,6 +4627,7 @@
               <w:bottom w:val="single" w:color="D0D7D3" w:sz="4"/>
               <w:right w:val="single" w:color="D0D7D3" w:sz="4"/>
             </w:tcBorders>
+            <w:shd w:fill="F6F8F7" w:color="auto" w:val="clear"/>
             <w:tcMar>
               <w:top w:type="dxa" w:w="80"/>
               <w:left w:type="dxa" w:w="120"/>
@@ -4597,6 +4656,7 @@
               <w:bottom w:val="single" w:color="D0D7D3" w:sz="4"/>
               <w:right w:val="single" w:color="D0D7D3" w:sz="4"/>
             </w:tcBorders>
+            <w:shd w:fill="F6F8F7" w:color="auto" w:val="clear"/>
             <w:tcMar>
               <w:top w:type="dxa" w:w="80"/>
               <w:left w:type="dxa" w:w="120"/>
@@ -4627,7 +4687,6 @@
               <w:bottom w:val="single" w:color="D0D7D3" w:sz="4"/>
               <w:right w:val="single" w:color="D0D7D3" w:sz="4"/>
             </w:tcBorders>
-            <w:shd w:fill="F6F8F7" w:color="auto" w:val="clear"/>
             <w:tcMar>
               <w:top w:type="dxa" w:w="80"/>
               <w:left w:type="dxa" w:w="120"/>
@@ -4656,7 +4715,6 @@
               <w:bottom w:val="single" w:color="D0D7D3" w:sz="4"/>
               <w:right w:val="single" w:color="D0D7D3" w:sz="4"/>
             </w:tcBorders>
-            <w:shd w:fill="F6F8F7" w:color="auto" w:val="clear"/>
             <w:tcMar>
               <w:top w:type="dxa" w:w="80"/>
               <w:left w:type="dxa" w:w="120"/>
@@ -4687,6 +4745,7 @@
               <w:bottom w:val="single" w:color="D0D7D3" w:sz="4"/>
               <w:right w:val="single" w:color="D0D7D3" w:sz="4"/>
             </w:tcBorders>
+            <w:shd w:fill="F6F8F7" w:color="auto" w:val="clear"/>
             <w:tcMar>
               <w:top w:type="dxa" w:w="80"/>
               <w:left w:type="dxa" w:w="120"/>
@@ -4715,6 +4774,7 @@
               <w:bottom w:val="single" w:color="D0D7D3" w:sz="4"/>
               <w:right w:val="single" w:color="D0D7D3" w:sz="4"/>
             </w:tcBorders>
+            <w:shd w:fill="F6F8F7" w:color="auto" w:val="clear"/>
             <w:tcMar>
               <w:top w:type="dxa" w:w="80"/>
               <w:left w:type="dxa" w:w="120"/>
@@ -4745,7 +4805,6 @@
               <w:bottom w:val="single" w:color="D0D7D3" w:sz="4"/>
               <w:right w:val="single" w:color="D0D7D3" w:sz="4"/>
             </w:tcBorders>
-            <w:shd w:fill="F6F8F7" w:color="auto" w:val="clear"/>
             <w:tcMar>
               <w:top w:type="dxa" w:w="80"/>
               <w:left w:type="dxa" w:w="120"/>
@@ -4774,7 +4833,6 @@
               <w:bottom w:val="single" w:color="D0D7D3" w:sz="4"/>
               <w:right w:val="single" w:color="D0D7D3" w:sz="4"/>
             </w:tcBorders>
-            <w:shd w:fill="F6F8F7" w:color="auto" w:val="clear"/>
             <w:tcMar>
               <w:top w:type="dxa" w:w="80"/>
               <w:left w:type="dxa" w:w="120"/>
@@ -4805,6 +4863,7 @@
               <w:bottom w:val="single" w:color="D0D7D3" w:sz="4"/>
               <w:right w:val="single" w:color="D0D7D3" w:sz="4"/>
             </w:tcBorders>
+            <w:shd w:fill="F6F8F7" w:color="auto" w:val="clear"/>
             <w:tcMar>
               <w:top w:type="dxa" w:w="80"/>
               <w:left w:type="dxa" w:w="120"/>
@@ -4833,6 +4892,7 @@
               <w:bottom w:val="single" w:color="D0D7D3" w:sz="4"/>
               <w:right w:val="single" w:color="D0D7D3" w:sz="4"/>
             </w:tcBorders>
+            <w:shd w:fill="F6F8F7" w:color="auto" w:val="clear"/>
             <w:tcMar>
               <w:top w:type="dxa" w:w="80"/>
               <w:left w:type="dxa" w:w="120"/>
@@ -4863,7 +4923,6 @@
               <w:bottom w:val="single" w:color="D0D7D3" w:sz="4"/>
               <w:right w:val="single" w:color="D0D7D3" w:sz="4"/>
             </w:tcBorders>
-            <w:shd w:fill="F6F8F7" w:color="auto" w:val="clear"/>
             <w:tcMar>
               <w:top w:type="dxa" w:w="80"/>
               <w:left w:type="dxa" w:w="120"/>
@@ -4892,7 +4951,6 @@
               <w:bottom w:val="single" w:color="D0D7D3" w:sz="4"/>
               <w:right w:val="single" w:color="D0D7D3" w:sz="4"/>
             </w:tcBorders>
-            <w:shd w:fill="F6F8F7" w:color="auto" w:val="clear"/>
             <w:tcMar>
               <w:top w:type="dxa" w:w="80"/>
               <w:left w:type="dxa" w:w="120"/>
@@ -4923,6 +4981,7 @@
               <w:bottom w:val="single" w:color="D0D7D3" w:sz="4"/>
               <w:right w:val="single" w:color="D0D7D3" w:sz="4"/>
             </w:tcBorders>
+            <w:shd w:fill="F6F8F7" w:color="auto" w:val="clear"/>
             <w:tcMar>
               <w:top w:type="dxa" w:w="80"/>
               <w:left w:type="dxa" w:w="120"/>
@@ -4951,6 +5010,7 @@
               <w:bottom w:val="single" w:color="D0D7D3" w:sz="4"/>
               <w:right w:val="single" w:color="D0D7D3" w:sz="4"/>
             </w:tcBorders>
+            <w:shd w:fill="F6F8F7" w:color="auto" w:val="clear"/>
             <w:tcMar>
               <w:top w:type="dxa" w:w="80"/>
               <w:left w:type="dxa" w:w="120"/>
@@ -4981,7 +5041,6 @@
               <w:bottom w:val="single" w:color="D0D7D3" w:sz="4"/>
               <w:right w:val="single" w:color="D0D7D3" w:sz="4"/>
             </w:tcBorders>
-            <w:shd w:fill="F6F8F7" w:color="auto" w:val="clear"/>
             <w:tcMar>
               <w:top w:type="dxa" w:w="80"/>
               <w:left w:type="dxa" w:w="120"/>
@@ -5010,7 +5069,6 @@
               <w:bottom w:val="single" w:color="D0D7D3" w:sz="4"/>
               <w:right w:val="single" w:color="D0D7D3" w:sz="4"/>
             </w:tcBorders>
-            <w:shd w:fill="F6F8F7" w:color="auto" w:val="clear"/>
             <w:tcMar>
               <w:top w:type="dxa" w:w="80"/>
               <w:left w:type="dxa" w:w="120"/>
@@ -5041,6 +5099,7 @@
               <w:bottom w:val="single" w:color="D0D7D3" w:sz="4"/>
               <w:right w:val="single" w:color="D0D7D3" w:sz="4"/>
             </w:tcBorders>
+            <w:shd w:fill="F6F8F7" w:color="auto" w:val="clear"/>
             <w:tcMar>
               <w:top w:type="dxa" w:w="80"/>
               <w:left w:type="dxa" w:w="120"/>
@@ -5069,6 +5128,7 @@
               <w:bottom w:val="single" w:color="D0D7D3" w:sz="4"/>
               <w:right w:val="single" w:color="D0D7D3" w:sz="4"/>
             </w:tcBorders>
+            <w:shd w:fill="F6F8F7" w:color="auto" w:val="clear"/>
             <w:tcMar>
               <w:top w:type="dxa" w:w="80"/>
               <w:left w:type="dxa" w:w="120"/>
@@ -5099,7 +5159,6 @@
               <w:bottom w:val="single" w:color="D0D7D3" w:sz="4"/>
               <w:right w:val="single" w:color="D0D7D3" w:sz="4"/>
             </w:tcBorders>
-            <w:shd w:fill="F6F8F7" w:color="auto" w:val="clear"/>
             <w:tcMar>
               <w:top w:type="dxa" w:w="80"/>
               <w:left w:type="dxa" w:w="120"/>
@@ -5128,7 +5187,6 @@
               <w:bottom w:val="single" w:color="D0D7D3" w:sz="4"/>
               <w:right w:val="single" w:color="D0D7D3" w:sz="4"/>
             </w:tcBorders>
-            <w:shd w:fill="F6F8F7" w:color="auto" w:val="clear"/>
             <w:tcMar>
               <w:top w:type="dxa" w:w="80"/>
               <w:left w:type="dxa" w:w="120"/>
@@ -5159,6 +5217,7 @@
               <w:bottom w:val="single" w:color="D0D7D3" w:sz="4"/>
               <w:right w:val="single" w:color="D0D7D3" w:sz="4"/>
             </w:tcBorders>
+            <w:shd w:fill="F6F8F7" w:color="auto" w:val="clear"/>
             <w:tcMar>
               <w:top w:type="dxa" w:w="80"/>
               <w:left w:type="dxa" w:w="120"/>
@@ -5187,6 +5246,7 @@
               <w:bottom w:val="single" w:color="D0D7D3" w:sz="4"/>
               <w:right w:val="single" w:color="D0D7D3" w:sz="4"/>
             </w:tcBorders>
+            <w:shd w:fill="F6F8F7" w:color="auto" w:val="clear"/>
             <w:tcMar>
               <w:top w:type="dxa" w:w="80"/>
               <w:left w:type="dxa" w:w="120"/>
@@ -5217,7 +5277,6 @@
               <w:bottom w:val="single" w:color="D0D7D3" w:sz="4"/>
               <w:right w:val="single" w:color="D0D7D3" w:sz="4"/>
             </w:tcBorders>
-            <w:shd w:fill="F6F8F7" w:color="auto" w:val="clear"/>
             <w:tcMar>
               <w:top w:type="dxa" w:w="80"/>
               <w:left w:type="dxa" w:w="120"/>
@@ -5246,7 +5305,6 @@
               <w:bottom w:val="single" w:color="D0D7D3" w:sz="4"/>
               <w:right w:val="single" w:color="D0D7D3" w:sz="4"/>
             </w:tcBorders>
-            <w:shd w:fill="F6F8F7" w:color="auto" w:val="clear"/>
             <w:tcMar>
               <w:top w:type="dxa" w:w="80"/>
               <w:left w:type="dxa" w:w="120"/>
@@ -5277,6 +5335,7 @@
               <w:bottom w:val="single" w:color="D0D7D3" w:sz="4"/>
               <w:right w:val="single" w:color="D0D7D3" w:sz="4"/>
             </w:tcBorders>
+            <w:shd w:fill="F6F8F7" w:color="auto" w:val="clear"/>
             <w:tcMar>
               <w:top w:type="dxa" w:w="80"/>
               <w:left w:type="dxa" w:w="120"/>
@@ -5305,6 +5364,7 @@
               <w:bottom w:val="single" w:color="D0D7D3" w:sz="4"/>
               <w:right w:val="single" w:color="D0D7D3" w:sz="4"/>
             </w:tcBorders>
+            <w:shd w:fill="F6F8F7" w:color="auto" w:val="clear"/>
             <w:tcMar>
               <w:top w:type="dxa" w:w="80"/>
               <w:left w:type="dxa" w:w="120"/>
@@ -5335,7 +5395,6 @@
               <w:bottom w:val="single" w:color="D0D7D3" w:sz="4"/>
               <w:right w:val="single" w:color="D0D7D3" w:sz="4"/>
             </w:tcBorders>
-            <w:shd w:fill="F6F8F7" w:color="auto" w:val="clear"/>
             <w:tcMar>
               <w:top w:type="dxa" w:w="80"/>
               <w:left w:type="dxa" w:w="120"/>
@@ -5364,7 +5423,6 @@
               <w:bottom w:val="single" w:color="D0D7D3" w:sz="4"/>
               <w:right w:val="single" w:color="D0D7D3" w:sz="4"/>
             </w:tcBorders>
-            <w:shd w:fill="F6F8F7" w:color="auto" w:val="clear"/>
             <w:tcMar>
               <w:top w:type="dxa" w:w="80"/>
               <w:left w:type="dxa" w:w="120"/>
@@ -5395,6 +5453,7 @@
               <w:bottom w:val="single" w:color="D0D7D3" w:sz="4"/>
               <w:right w:val="single" w:color="D0D7D3" w:sz="4"/>
             </w:tcBorders>
+            <w:shd w:fill="F6F8F7" w:color="auto" w:val="clear"/>
             <w:tcMar>
               <w:top w:type="dxa" w:w="80"/>
               <w:left w:type="dxa" w:w="120"/>
@@ -5423,6 +5482,7 @@
               <w:bottom w:val="single" w:color="D0D7D3" w:sz="4"/>
               <w:right w:val="single" w:color="D0D7D3" w:sz="4"/>
             </w:tcBorders>
+            <w:shd w:fill="F6F8F7" w:color="auto" w:val="clear"/>
             <w:tcMar>
               <w:top w:type="dxa" w:w="80"/>
               <w:left w:type="dxa" w:w="120"/>
@@ -5453,7 +5513,6 @@
               <w:bottom w:val="single" w:color="D0D7D3" w:sz="4"/>
               <w:right w:val="single" w:color="D0D7D3" w:sz="4"/>
             </w:tcBorders>
-            <w:shd w:fill="F6F8F7" w:color="auto" w:val="clear"/>
             <w:tcMar>
               <w:top w:type="dxa" w:w="80"/>
               <w:left w:type="dxa" w:w="120"/>
@@ -5482,7 +5541,6 @@
               <w:bottom w:val="single" w:color="D0D7D3" w:sz="4"/>
               <w:right w:val="single" w:color="D0D7D3" w:sz="4"/>
             </w:tcBorders>
-            <w:shd w:fill="F6F8F7" w:color="auto" w:val="clear"/>
             <w:tcMar>
               <w:top w:type="dxa" w:w="80"/>
               <w:left w:type="dxa" w:w="120"/>

</xml_diff>

<commit_message>
Pay for particular fees (e.g. WAEC), not just the bill in general
Parents can tick fees per child on the payment page, and whoever records cash
or a teller can say which fees it's for. The payment is earmarked (new
append-only payment_earmarks): allocation sends it to the bills holding those
fees first, even before older debts (owner's decision), and the fee
breakdowns, fee-status report and receipt ("Paid for: WAEC") show those fees
paid. A reversed payment's earmarks stop counting. Transfers into a child's
own account number still follow the bill order.
</commit_message>
<xml_diff>
--- a/docs/product/ParentPay - what it does.docx
+++ b/docs/product/ParentPay - what it does.docx
@@ -4376,6 +4376,66 @@
                 <w:sz w:val="20"/>
                 <w:szCs w:val="20"/>
               </w:rPr>
+              <w:t xml:space="preserve">Parents (and the bursary) can pay for particular fees, such as WAEC; the receipt says what it was for</w:t>
+            </w:r>
+          </w:p>
+        </w:tc>
+      </w:tr>
+      <w:tr>
+        <w:tc>
+          <w:tcPr>
+            <w:tcW w:type="dxa" w:w="1800"/>
+            <w:tcBorders>
+              <w:top w:val="single" w:color="D0D7D3" w:sz="4"/>
+              <w:left w:val="single" w:color="D0D7D3" w:sz="4"/>
+              <w:bottom w:val="single" w:color="D0D7D3" w:sz="4"/>
+              <w:right w:val="single" w:color="D0D7D3" w:sz="4"/>
+            </w:tcBorders>
+            <w:shd w:fill="F6F8F7" w:color="auto" w:val="clear"/>
+            <w:tcMar>
+              <w:top w:type="dxa" w:w="80"/>
+              <w:left w:type="dxa" w:w="120"/>
+              <w:bottom w:type="dxa" w:w="80"/>
+              <w:right w:type="dxa" w:w="120"/>
+            </w:tcMar>
+          </w:tcPr>
+          <w:p>
+            <w:r>
+              <w:rPr>
+                <w:b w:val="false"/>
+                <w:bCs w:val="false"/>
+                <w:sz w:val="20"/>
+                <w:szCs w:val="20"/>
+              </w:rPr>
+              <w:t xml:space="preserve">20 Oct 2026</w:t>
+            </w:r>
+          </w:p>
+        </w:tc>
+        <w:tc>
+          <w:tcPr>
+            <w:tcW w:type="dxa" w:w="7838"/>
+            <w:tcBorders>
+              <w:top w:val="single" w:color="D0D7D3" w:sz="4"/>
+              <w:left w:val="single" w:color="D0D7D3" w:sz="4"/>
+              <w:bottom w:val="single" w:color="D0D7D3" w:sz="4"/>
+              <w:right w:val="single" w:color="D0D7D3" w:sz="4"/>
+            </w:tcBorders>
+            <w:shd w:fill="F6F8F7" w:color="auto" w:val="clear"/>
+            <w:tcMar>
+              <w:top w:type="dxa" w:w="80"/>
+              <w:left w:type="dxa" w:w="120"/>
+              <w:bottom w:type="dxa" w:w="80"/>
+              <w:right w:type="dxa" w:w="120"/>
+            </w:tcMar>
+          </w:tcPr>
+          <w:p>
+            <w:r>
+              <w:rPr>
+                <w:b w:val="false"/>
+                <w:bCs w:val="false"/>
+                <w:sz w:val="20"/>
+                <w:szCs w:val="20"/>
+              </w:rPr>
               <w:t xml:space="preserve">Fees added to the fee grid after billing can be added to the bills already sent, in one click</w:t>
             </w:r>
           </w:p>
@@ -4391,7 +4451,6 @@
               <w:bottom w:val="single" w:color="D0D7D3" w:sz="4"/>
               <w:right w:val="single" w:color="D0D7D3" w:sz="4"/>
             </w:tcBorders>
-            <w:shd w:fill="F6F8F7" w:color="auto" w:val="clear"/>
             <w:tcMar>
               <w:top w:type="dxa" w:w="80"/>
               <w:left w:type="dxa" w:w="120"/>
@@ -4420,7 +4479,6 @@
               <w:bottom w:val="single" w:color="D0D7D3" w:sz="4"/>
               <w:right w:val="single" w:color="D0D7D3" w:sz="4"/>
             </w:tcBorders>
-            <w:shd w:fill="F6F8F7" w:color="auto" w:val="clear"/>
             <w:tcMar>
               <w:top w:type="dxa" w:w="80"/>
               <w:left w:type="dxa" w:w="120"/>
@@ -4451,6 +4509,7 @@
               <w:bottom w:val="single" w:color="D0D7D3" w:sz="4"/>
               <w:right w:val="single" w:color="D0D7D3" w:sz="4"/>
             </w:tcBorders>
+            <w:shd w:fill="F6F8F7" w:color="auto" w:val="clear"/>
             <w:tcMar>
               <w:top w:type="dxa" w:w="80"/>
               <w:left w:type="dxa" w:w="120"/>
@@ -4479,6 +4538,7 @@
               <w:bottom w:val="single" w:color="D0D7D3" w:sz="4"/>
               <w:right w:val="single" w:color="D0D7D3" w:sz="4"/>
             </w:tcBorders>
+            <w:shd w:fill="F6F8F7" w:color="auto" w:val="clear"/>
             <w:tcMar>
               <w:top w:type="dxa" w:w="80"/>
               <w:left w:type="dxa" w:w="120"/>
@@ -4509,7 +4569,6 @@
               <w:bottom w:val="single" w:color="D0D7D3" w:sz="4"/>
               <w:right w:val="single" w:color="D0D7D3" w:sz="4"/>
             </w:tcBorders>
-            <w:shd w:fill="F6F8F7" w:color="auto" w:val="clear"/>
             <w:tcMar>
               <w:top w:type="dxa" w:w="80"/>
               <w:left w:type="dxa" w:w="120"/>
@@ -4538,7 +4597,6 @@
               <w:bottom w:val="single" w:color="D0D7D3" w:sz="4"/>
               <w:right w:val="single" w:color="D0D7D3" w:sz="4"/>
             </w:tcBorders>
-            <w:shd w:fill="F6F8F7" w:color="auto" w:val="clear"/>
             <w:tcMar>
               <w:top w:type="dxa" w:w="80"/>
               <w:left w:type="dxa" w:w="120"/>
@@ -4569,6 +4627,7 @@
               <w:bottom w:val="single" w:color="D0D7D3" w:sz="4"/>
               <w:right w:val="single" w:color="D0D7D3" w:sz="4"/>
             </w:tcBorders>
+            <w:shd w:fill="F6F8F7" w:color="auto" w:val="clear"/>
             <w:tcMar>
               <w:top w:type="dxa" w:w="80"/>
               <w:left w:type="dxa" w:w="120"/>
@@ -4597,6 +4656,7 @@
               <w:bottom w:val="single" w:color="D0D7D3" w:sz="4"/>
               <w:right w:val="single" w:color="D0D7D3" w:sz="4"/>
             </w:tcBorders>
+            <w:shd w:fill="F6F8F7" w:color="auto" w:val="clear"/>
             <w:tcMar>
               <w:top w:type="dxa" w:w="80"/>
               <w:left w:type="dxa" w:w="120"/>
@@ -4627,7 +4687,6 @@
               <w:bottom w:val="single" w:color="D0D7D3" w:sz="4"/>
               <w:right w:val="single" w:color="D0D7D3" w:sz="4"/>
             </w:tcBorders>
-            <w:shd w:fill="F6F8F7" w:color="auto" w:val="clear"/>
             <w:tcMar>
               <w:top w:type="dxa" w:w="80"/>
               <w:left w:type="dxa" w:w="120"/>
@@ -4656,7 +4715,6 @@
               <w:bottom w:val="single" w:color="D0D7D3" w:sz="4"/>
               <w:right w:val="single" w:color="D0D7D3" w:sz="4"/>
             </w:tcBorders>
-            <w:shd w:fill="F6F8F7" w:color="auto" w:val="clear"/>
             <w:tcMar>
               <w:top w:type="dxa" w:w="80"/>
               <w:left w:type="dxa" w:w="120"/>
@@ -4687,6 +4745,7 @@
               <w:bottom w:val="single" w:color="D0D7D3" w:sz="4"/>
               <w:right w:val="single" w:color="D0D7D3" w:sz="4"/>
             </w:tcBorders>
+            <w:shd w:fill="F6F8F7" w:color="auto" w:val="clear"/>
             <w:tcMar>
               <w:top w:type="dxa" w:w="80"/>
               <w:left w:type="dxa" w:w="120"/>
@@ -4715,6 +4774,7 @@
               <w:bottom w:val="single" w:color="D0D7D3" w:sz="4"/>
               <w:right w:val="single" w:color="D0D7D3" w:sz="4"/>
             </w:tcBorders>
+            <w:shd w:fill="F6F8F7" w:color="auto" w:val="clear"/>
             <w:tcMar>
               <w:top w:type="dxa" w:w="80"/>
               <w:left w:type="dxa" w:w="120"/>
@@ -4745,7 +4805,6 @@
               <w:bottom w:val="single" w:color="D0D7D3" w:sz="4"/>
               <w:right w:val="single" w:color="D0D7D3" w:sz="4"/>
             </w:tcBorders>
-            <w:shd w:fill="F6F8F7" w:color="auto" w:val="clear"/>
             <w:tcMar>
               <w:top w:type="dxa" w:w="80"/>
               <w:left w:type="dxa" w:w="120"/>
@@ -4774,7 +4833,6 @@
               <w:bottom w:val="single" w:color="D0D7D3" w:sz="4"/>
               <w:right w:val="single" w:color="D0D7D3" w:sz="4"/>
             </w:tcBorders>
-            <w:shd w:fill="F6F8F7" w:color="auto" w:val="clear"/>
             <w:tcMar>
               <w:top w:type="dxa" w:w="80"/>
               <w:left w:type="dxa" w:w="120"/>
@@ -4805,6 +4863,7 @@
               <w:bottom w:val="single" w:color="D0D7D3" w:sz="4"/>
               <w:right w:val="single" w:color="D0D7D3" w:sz="4"/>
             </w:tcBorders>
+            <w:shd w:fill="F6F8F7" w:color="auto" w:val="clear"/>
             <w:tcMar>
               <w:top w:type="dxa" w:w="80"/>
               <w:left w:type="dxa" w:w="120"/>
@@ -4833,6 +4892,7 @@
               <w:bottom w:val="single" w:color="D0D7D3" w:sz="4"/>
               <w:right w:val="single" w:color="D0D7D3" w:sz="4"/>
             </w:tcBorders>
+            <w:shd w:fill="F6F8F7" w:color="auto" w:val="clear"/>
             <w:tcMar>
               <w:top w:type="dxa" w:w="80"/>
               <w:left w:type="dxa" w:w="120"/>
@@ -4863,7 +4923,6 @@
               <w:bottom w:val="single" w:color="D0D7D3" w:sz="4"/>
               <w:right w:val="single" w:color="D0D7D3" w:sz="4"/>
             </w:tcBorders>
-            <w:shd w:fill="F6F8F7" w:color="auto" w:val="clear"/>
             <w:tcMar>
               <w:top w:type="dxa" w:w="80"/>
               <w:left w:type="dxa" w:w="120"/>
@@ -4892,7 +4951,6 @@
               <w:bottom w:val="single" w:color="D0D7D3" w:sz="4"/>
               <w:right w:val="single" w:color="D0D7D3" w:sz="4"/>
             </w:tcBorders>
-            <w:shd w:fill="F6F8F7" w:color="auto" w:val="clear"/>
             <w:tcMar>
               <w:top w:type="dxa" w:w="80"/>
               <w:left w:type="dxa" w:w="120"/>
@@ -4923,6 +4981,7 @@
               <w:bottom w:val="single" w:color="D0D7D3" w:sz="4"/>
               <w:right w:val="single" w:color="D0D7D3" w:sz="4"/>
             </w:tcBorders>
+            <w:shd w:fill="F6F8F7" w:color="auto" w:val="clear"/>
             <w:tcMar>
               <w:top w:type="dxa" w:w="80"/>
               <w:left w:type="dxa" w:w="120"/>
@@ -4951,6 +5010,7 @@
               <w:bottom w:val="single" w:color="D0D7D3" w:sz="4"/>
               <w:right w:val="single" w:color="D0D7D3" w:sz="4"/>
             </w:tcBorders>
+            <w:shd w:fill="F6F8F7" w:color="auto" w:val="clear"/>
             <w:tcMar>
               <w:top w:type="dxa" w:w="80"/>
               <w:left w:type="dxa" w:w="120"/>
@@ -4981,7 +5041,6 @@
               <w:bottom w:val="single" w:color="D0D7D3" w:sz="4"/>
               <w:right w:val="single" w:color="D0D7D3" w:sz="4"/>
             </w:tcBorders>
-            <w:shd w:fill="F6F8F7" w:color="auto" w:val="clear"/>
             <w:tcMar>
               <w:top w:type="dxa" w:w="80"/>
               <w:left w:type="dxa" w:w="120"/>
@@ -5010,7 +5069,6 @@
               <w:bottom w:val="single" w:color="D0D7D3" w:sz="4"/>
               <w:right w:val="single" w:color="D0D7D3" w:sz="4"/>
             </w:tcBorders>
-            <w:shd w:fill="F6F8F7" w:color="auto" w:val="clear"/>
             <w:tcMar>
               <w:top w:type="dxa" w:w="80"/>
               <w:left w:type="dxa" w:w="120"/>
@@ -5041,6 +5099,7 @@
               <w:bottom w:val="single" w:color="D0D7D3" w:sz="4"/>
               <w:right w:val="single" w:color="D0D7D3" w:sz="4"/>
             </w:tcBorders>
+            <w:shd w:fill="F6F8F7" w:color="auto" w:val="clear"/>
             <w:tcMar>
               <w:top w:type="dxa" w:w="80"/>
               <w:left w:type="dxa" w:w="120"/>
@@ -5069,6 +5128,7 @@
               <w:bottom w:val="single" w:color="D0D7D3" w:sz="4"/>
               <w:right w:val="single" w:color="D0D7D3" w:sz="4"/>
             </w:tcBorders>
+            <w:shd w:fill="F6F8F7" w:color="auto" w:val="clear"/>
             <w:tcMar>
               <w:top w:type="dxa" w:w="80"/>
               <w:left w:type="dxa" w:w="120"/>
@@ -5099,7 +5159,6 @@
               <w:bottom w:val="single" w:color="D0D7D3" w:sz="4"/>
               <w:right w:val="single" w:color="D0D7D3" w:sz="4"/>
             </w:tcBorders>
-            <w:shd w:fill="F6F8F7" w:color="auto" w:val="clear"/>
             <w:tcMar>
               <w:top w:type="dxa" w:w="80"/>
               <w:left w:type="dxa" w:w="120"/>
@@ -5128,7 +5187,6 @@
               <w:bottom w:val="single" w:color="D0D7D3" w:sz="4"/>
               <w:right w:val="single" w:color="D0D7D3" w:sz="4"/>
             </w:tcBorders>
-            <w:shd w:fill="F6F8F7" w:color="auto" w:val="clear"/>
             <w:tcMar>
               <w:top w:type="dxa" w:w="80"/>
               <w:left w:type="dxa" w:w="120"/>
@@ -5159,6 +5217,7 @@
               <w:bottom w:val="single" w:color="D0D7D3" w:sz="4"/>
               <w:right w:val="single" w:color="D0D7D3" w:sz="4"/>
             </w:tcBorders>
+            <w:shd w:fill="F6F8F7" w:color="auto" w:val="clear"/>
             <w:tcMar>
               <w:top w:type="dxa" w:w="80"/>
               <w:left w:type="dxa" w:w="120"/>
@@ -5187,6 +5246,7 @@
               <w:bottom w:val="single" w:color="D0D7D3" w:sz="4"/>
               <w:right w:val="single" w:color="D0D7D3" w:sz="4"/>
             </w:tcBorders>
+            <w:shd w:fill="F6F8F7" w:color="auto" w:val="clear"/>
             <w:tcMar>
               <w:top w:type="dxa" w:w="80"/>
               <w:left w:type="dxa" w:w="120"/>
@@ -5217,7 +5277,6 @@
               <w:bottom w:val="single" w:color="D0D7D3" w:sz="4"/>
               <w:right w:val="single" w:color="D0D7D3" w:sz="4"/>
             </w:tcBorders>
-            <w:shd w:fill="F6F8F7" w:color="auto" w:val="clear"/>
             <w:tcMar>
               <w:top w:type="dxa" w:w="80"/>
               <w:left w:type="dxa" w:w="120"/>
@@ -5246,7 +5305,6 @@
               <w:bottom w:val="single" w:color="D0D7D3" w:sz="4"/>
               <w:right w:val="single" w:color="D0D7D3" w:sz="4"/>
             </w:tcBorders>
-            <w:shd w:fill="F6F8F7" w:color="auto" w:val="clear"/>
             <w:tcMar>
               <w:top w:type="dxa" w:w="80"/>
               <w:left w:type="dxa" w:w="120"/>
@@ -5277,6 +5335,7 @@
               <w:bottom w:val="single" w:color="D0D7D3" w:sz="4"/>
               <w:right w:val="single" w:color="D0D7D3" w:sz="4"/>
             </w:tcBorders>
+            <w:shd w:fill="F6F8F7" w:color="auto" w:val="clear"/>
             <w:tcMar>
               <w:top w:type="dxa" w:w="80"/>
               <w:left w:type="dxa" w:w="120"/>
@@ -5305,6 +5364,7 @@
               <w:bottom w:val="single" w:color="D0D7D3" w:sz="4"/>
               <w:right w:val="single" w:color="D0D7D3" w:sz="4"/>
             </w:tcBorders>
+            <w:shd w:fill="F6F8F7" w:color="auto" w:val="clear"/>
             <w:tcMar>
               <w:top w:type="dxa" w:w="80"/>
               <w:left w:type="dxa" w:w="120"/>
@@ -5335,7 +5395,6 @@
               <w:bottom w:val="single" w:color="D0D7D3" w:sz="4"/>
               <w:right w:val="single" w:color="D0D7D3" w:sz="4"/>
             </w:tcBorders>
-            <w:shd w:fill="F6F8F7" w:color="auto" w:val="clear"/>
             <w:tcMar>
               <w:top w:type="dxa" w:w="80"/>
               <w:left w:type="dxa" w:w="120"/>
@@ -5364,7 +5423,6 @@
               <w:bottom w:val="single" w:color="D0D7D3" w:sz="4"/>
               <w:right w:val="single" w:color="D0D7D3" w:sz="4"/>
             </w:tcBorders>
-            <w:shd w:fill="F6F8F7" w:color="auto" w:val="clear"/>
             <w:tcMar>
               <w:top w:type="dxa" w:w="80"/>
               <w:left w:type="dxa" w:w="120"/>
@@ -5395,6 +5453,7 @@
               <w:bottom w:val="single" w:color="D0D7D3" w:sz="4"/>
               <w:right w:val="single" w:color="D0D7D3" w:sz="4"/>
             </w:tcBorders>
+            <w:shd w:fill="F6F8F7" w:color="auto" w:val="clear"/>
             <w:tcMar>
               <w:top w:type="dxa" w:w="80"/>
               <w:left w:type="dxa" w:w="120"/>
@@ -5423,6 +5482,7 @@
               <w:bottom w:val="single" w:color="D0D7D3" w:sz="4"/>
               <w:right w:val="single" w:color="D0D7D3" w:sz="4"/>
             </w:tcBorders>
+            <w:shd w:fill="F6F8F7" w:color="auto" w:val="clear"/>
             <w:tcMar>
               <w:top w:type="dxa" w:w="80"/>
               <w:left w:type="dxa" w:w="120"/>
@@ -5453,7 +5513,6 @@
               <w:bottom w:val="single" w:color="D0D7D3" w:sz="4"/>
               <w:right w:val="single" w:color="D0D7D3" w:sz="4"/>
             </w:tcBorders>
-            <w:shd w:fill="F6F8F7" w:color="auto" w:val="clear"/>
             <w:tcMar>
               <w:top w:type="dxa" w:w="80"/>
               <w:left w:type="dxa" w:w="120"/>
@@ -5482,7 +5541,6 @@
               <w:bottom w:val="single" w:color="D0D7D3" w:sz="4"/>
               <w:right w:val="single" w:color="D0D7D3" w:sz="4"/>
             </w:tcBorders>
-            <w:shd w:fill="F6F8F7" w:color="auto" w:val="clear"/>
             <w:tcMar>
               <w:top w:type="dxa" w:w="80"/>
               <w:left w:type="dxa" w:w="120"/>
@@ -5513,6 +5571,7 @@
               <w:bottom w:val="single" w:color="D0D7D3" w:sz="4"/>
               <w:right w:val="single" w:color="D0D7D3" w:sz="4"/>
             </w:tcBorders>
+            <w:shd w:fill="F6F8F7" w:color="auto" w:val="clear"/>
             <w:tcMar>
               <w:top w:type="dxa" w:w="80"/>
               <w:left w:type="dxa" w:w="120"/>
@@ -5541,6 +5600,7 @@
               <w:bottom w:val="single" w:color="D0D7D3" w:sz="4"/>
               <w:right w:val="single" w:color="D0D7D3" w:sz="4"/>
             </w:tcBorders>
+            <w:shd w:fill="F6F8F7" w:color="auto" w:val="clear"/>
             <w:tcMar>
               <w:top w:type="dxa" w:w="80"/>
               <w:left w:type="dxa" w:w="120"/>

</xml_diff>

<commit_message>
Fee status download per class: each class's own fees, what was paid, a printable page per class
- Each class lists only the fees it is charged (classes pay different fees,
  e.g. WAEC for SSS 3) instead of every fee in the school
- Part-paid fees show what was paid as well as what's left (Excel adds a
  paid column per fee; PDF cells read '40,000 paid, 60,000 left')
- PDF: one landscape page per class with paid this term, earlier debts
  (when any), total owed and a coloured status; up to nine fee columns
- The note now explains money paid for particular fees
</commit_message>
<xml_diff>
--- a/docs/product/ParentPay - what it does.docx
+++ b/docs/product/ParentPay - what it does.docx
@@ -1239,7 +1239,7 @@
                 <w:sz w:val="20"/>
                 <w:szCs w:val="20"/>
               </w:rPr>
-              <w:t xml:space="preserve">Fee status by pupil: for the whole school or one class, each fee (tuition, bus, levies) marked paid, part paid or unpaid with what’s left; Excel with a sheet per class, or PDF</w:t>
+              <w:t xml:space="preserve">Fee status by pupil: for the whole school or one class, each fee (tuition, bus, levies) marked paid, part paid or unpaid with what was paid and what’s left; each class lists only its own fees, as a printable PDF with a page per class or Excel with a sheet per class</w:t>
             </w:r>
           </w:p>
         </w:tc>
@@ -4702,6 +4702,65 @@
                 <w:sz w:val="20"/>
                 <w:szCs w:val="20"/>
               </w:rPr>
+              <w:t xml:space="preserve">21 Oct 2026</w:t>
+            </w:r>
+          </w:p>
+        </w:tc>
+        <w:tc>
+          <w:tcPr>
+            <w:tcW w:type="dxa" w:w="7838"/>
+            <w:tcBorders>
+              <w:top w:val="single" w:color="D0D7D3" w:sz="4"/>
+              <w:left w:val="single" w:color="D0D7D3" w:sz="4"/>
+              <w:bottom w:val="single" w:color="D0D7D3" w:sz="4"/>
+              <w:right w:val="single" w:color="D0D7D3" w:sz="4"/>
+            </w:tcBorders>
+            <w:tcMar>
+              <w:top w:type="dxa" w:w="80"/>
+              <w:left w:type="dxa" w:w="120"/>
+              <w:bottom w:type="dxa" w:w="80"/>
+              <w:right w:type="dxa" w:w="120"/>
+            </w:tcMar>
+          </w:tcPr>
+          <w:p>
+            <w:r>
+              <w:rPr>
+                <w:b w:val="false"/>
+                <w:bCs w:val="false"/>
+                <w:sz w:val="20"/>
+                <w:szCs w:val="20"/>
+              </w:rPr>
+              <w:t xml:space="preserve">Fee status download: each class with only its own fees, what was paid on part-paid fees, a printable page per class</w:t>
+            </w:r>
+          </w:p>
+        </w:tc>
+      </w:tr>
+      <w:tr>
+        <w:tc>
+          <w:tcPr>
+            <w:tcW w:type="dxa" w:w="1800"/>
+            <w:tcBorders>
+              <w:top w:val="single" w:color="D0D7D3" w:sz="4"/>
+              <w:left w:val="single" w:color="D0D7D3" w:sz="4"/>
+              <w:bottom w:val="single" w:color="D0D7D3" w:sz="4"/>
+              <w:right w:val="single" w:color="D0D7D3" w:sz="4"/>
+            </w:tcBorders>
+            <w:shd w:fill="F6F8F7" w:color="auto" w:val="clear"/>
+            <w:tcMar>
+              <w:top w:type="dxa" w:w="80"/>
+              <w:left w:type="dxa" w:w="120"/>
+              <w:bottom w:type="dxa" w:w="80"/>
+              <w:right w:type="dxa" w:w="120"/>
+            </w:tcMar>
+          </w:tcPr>
+          <w:p>
+            <w:r>
+              <w:rPr>
+                <w:b w:val="false"/>
+                <w:bCs w:val="false"/>
+                <w:sz w:val="20"/>
+                <w:szCs w:val="20"/>
+              </w:rPr>
               <w:t xml:space="preserve">19 Oct 2026</w:t>
             </w:r>
           </w:p>
@@ -4715,6 +4774,7 @@
               <w:bottom w:val="single" w:color="D0D7D3" w:sz="4"/>
               <w:right w:val="single" w:color="D0D7D3" w:sz="4"/>
             </w:tcBorders>
+            <w:shd w:fill="F6F8F7" w:color="auto" w:val="clear"/>
             <w:tcMar>
               <w:top w:type="dxa" w:w="80"/>
               <w:left w:type="dxa" w:w="120"/>
@@ -4745,7 +4805,6 @@
               <w:bottom w:val="single" w:color="D0D7D3" w:sz="4"/>
               <w:right w:val="single" w:color="D0D7D3" w:sz="4"/>
             </w:tcBorders>
-            <w:shd w:fill="F6F8F7" w:color="auto" w:val="clear"/>
             <w:tcMar>
               <w:top w:type="dxa" w:w="80"/>
               <w:left w:type="dxa" w:w="120"/>
@@ -4774,7 +4833,6 @@
               <w:bottom w:val="single" w:color="D0D7D3" w:sz="4"/>
               <w:right w:val="single" w:color="D0D7D3" w:sz="4"/>
             </w:tcBorders>
-            <w:shd w:fill="F6F8F7" w:color="auto" w:val="clear"/>
             <w:tcMar>
               <w:top w:type="dxa" w:w="80"/>
               <w:left w:type="dxa" w:w="120"/>
@@ -4805,6 +4863,7 @@
               <w:bottom w:val="single" w:color="D0D7D3" w:sz="4"/>
               <w:right w:val="single" w:color="D0D7D3" w:sz="4"/>
             </w:tcBorders>
+            <w:shd w:fill="F6F8F7" w:color="auto" w:val="clear"/>
             <w:tcMar>
               <w:top w:type="dxa" w:w="80"/>
               <w:left w:type="dxa" w:w="120"/>
@@ -4833,6 +4892,7 @@
               <w:bottom w:val="single" w:color="D0D7D3" w:sz="4"/>
               <w:right w:val="single" w:color="D0D7D3" w:sz="4"/>
             </w:tcBorders>
+            <w:shd w:fill="F6F8F7" w:color="auto" w:val="clear"/>
             <w:tcMar>
               <w:top w:type="dxa" w:w="80"/>
               <w:left w:type="dxa" w:w="120"/>
@@ -4863,7 +4923,6 @@
               <w:bottom w:val="single" w:color="D0D7D3" w:sz="4"/>
               <w:right w:val="single" w:color="D0D7D3" w:sz="4"/>
             </w:tcBorders>
-            <w:shd w:fill="F6F8F7" w:color="auto" w:val="clear"/>
             <w:tcMar>
               <w:top w:type="dxa" w:w="80"/>
               <w:left w:type="dxa" w:w="120"/>
@@ -4892,7 +4951,6 @@
               <w:bottom w:val="single" w:color="D0D7D3" w:sz="4"/>
               <w:right w:val="single" w:color="D0D7D3" w:sz="4"/>
             </w:tcBorders>
-            <w:shd w:fill="F6F8F7" w:color="auto" w:val="clear"/>
             <w:tcMar>
               <w:top w:type="dxa" w:w="80"/>
               <w:left w:type="dxa" w:w="120"/>
@@ -4923,6 +4981,7 @@
               <w:bottom w:val="single" w:color="D0D7D3" w:sz="4"/>
               <w:right w:val="single" w:color="D0D7D3" w:sz="4"/>
             </w:tcBorders>
+            <w:shd w:fill="F6F8F7" w:color="auto" w:val="clear"/>
             <w:tcMar>
               <w:top w:type="dxa" w:w="80"/>
               <w:left w:type="dxa" w:w="120"/>
@@ -4951,6 +5010,7 @@
               <w:bottom w:val="single" w:color="D0D7D3" w:sz="4"/>
               <w:right w:val="single" w:color="D0D7D3" w:sz="4"/>
             </w:tcBorders>
+            <w:shd w:fill="F6F8F7" w:color="auto" w:val="clear"/>
             <w:tcMar>
               <w:top w:type="dxa" w:w="80"/>
               <w:left w:type="dxa" w:w="120"/>
@@ -4981,7 +5041,6 @@
               <w:bottom w:val="single" w:color="D0D7D3" w:sz="4"/>
               <w:right w:val="single" w:color="D0D7D3" w:sz="4"/>
             </w:tcBorders>
-            <w:shd w:fill="F6F8F7" w:color="auto" w:val="clear"/>
             <w:tcMar>
               <w:top w:type="dxa" w:w="80"/>
               <w:left w:type="dxa" w:w="120"/>
@@ -5010,7 +5069,6 @@
               <w:bottom w:val="single" w:color="D0D7D3" w:sz="4"/>
               <w:right w:val="single" w:color="D0D7D3" w:sz="4"/>
             </w:tcBorders>
-            <w:shd w:fill="F6F8F7" w:color="auto" w:val="clear"/>
             <w:tcMar>
               <w:top w:type="dxa" w:w="80"/>
               <w:left w:type="dxa" w:w="120"/>
@@ -5041,6 +5099,7 @@
               <w:bottom w:val="single" w:color="D0D7D3" w:sz="4"/>
               <w:right w:val="single" w:color="D0D7D3" w:sz="4"/>
             </w:tcBorders>
+            <w:shd w:fill="F6F8F7" w:color="auto" w:val="clear"/>
             <w:tcMar>
               <w:top w:type="dxa" w:w="80"/>
               <w:left w:type="dxa" w:w="120"/>
@@ -5069,6 +5128,7 @@
               <w:bottom w:val="single" w:color="D0D7D3" w:sz="4"/>
               <w:right w:val="single" w:color="D0D7D3" w:sz="4"/>
             </w:tcBorders>
+            <w:shd w:fill="F6F8F7" w:color="auto" w:val="clear"/>
             <w:tcMar>
               <w:top w:type="dxa" w:w="80"/>
               <w:left w:type="dxa" w:w="120"/>
@@ -5099,7 +5159,6 @@
               <w:bottom w:val="single" w:color="D0D7D3" w:sz="4"/>
               <w:right w:val="single" w:color="D0D7D3" w:sz="4"/>
             </w:tcBorders>
-            <w:shd w:fill="F6F8F7" w:color="auto" w:val="clear"/>
             <w:tcMar>
               <w:top w:type="dxa" w:w="80"/>
               <w:left w:type="dxa" w:w="120"/>
@@ -5128,7 +5187,6 @@
               <w:bottom w:val="single" w:color="D0D7D3" w:sz="4"/>
               <w:right w:val="single" w:color="D0D7D3" w:sz="4"/>
             </w:tcBorders>
-            <w:shd w:fill="F6F8F7" w:color="auto" w:val="clear"/>
             <w:tcMar>
               <w:top w:type="dxa" w:w="80"/>
               <w:left w:type="dxa" w:w="120"/>
@@ -5159,6 +5217,7 @@
               <w:bottom w:val="single" w:color="D0D7D3" w:sz="4"/>
               <w:right w:val="single" w:color="D0D7D3" w:sz="4"/>
             </w:tcBorders>
+            <w:shd w:fill="F6F8F7" w:color="auto" w:val="clear"/>
             <w:tcMar>
               <w:top w:type="dxa" w:w="80"/>
               <w:left w:type="dxa" w:w="120"/>
@@ -5187,6 +5246,7 @@
               <w:bottom w:val="single" w:color="D0D7D3" w:sz="4"/>
               <w:right w:val="single" w:color="D0D7D3" w:sz="4"/>
             </w:tcBorders>
+            <w:shd w:fill="F6F8F7" w:color="auto" w:val="clear"/>
             <w:tcMar>
               <w:top w:type="dxa" w:w="80"/>
               <w:left w:type="dxa" w:w="120"/>
@@ -5217,7 +5277,6 @@
               <w:bottom w:val="single" w:color="D0D7D3" w:sz="4"/>
               <w:right w:val="single" w:color="D0D7D3" w:sz="4"/>
             </w:tcBorders>
-            <w:shd w:fill="F6F8F7" w:color="auto" w:val="clear"/>
             <w:tcMar>
               <w:top w:type="dxa" w:w="80"/>
               <w:left w:type="dxa" w:w="120"/>
@@ -5246,7 +5305,6 @@
               <w:bottom w:val="single" w:color="D0D7D3" w:sz="4"/>
               <w:right w:val="single" w:color="D0D7D3" w:sz="4"/>
             </w:tcBorders>
-            <w:shd w:fill="F6F8F7" w:color="auto" w:val="clear"/>
             <w:tcMar>
               <w:top w:type="dxa" w:w="80"/>
               <w:left w:type="dxa" w:w="120"/>
@@ -5277,6 +5335,7 @@
               <w:bottom w:val="single" w:color="D0D7D3" w:sz="4"/>
               <w:right w:val="single" w:color="D0D7D3" w:sz="4"/>
             </w:tcBorders>
+            <w:shd w:fill="F6F8F7" w:color="auto" w:val="clear"/>
             <w:tcMar>
               <w:top w:type="dxa" w:w="80"/>
               <w:left w:type="dxa" w:w="120"/>
@@ -5305,6 +5364,7 @@
               <w:bottom w:val="single" w:color="D0D7D3" w:sz="4"/>
               <w:right w:val="single" w:color="D0D7D3" w:sz="4"/>
             </w:tcBorders>
+            <w:shd w:fill="F6F8F7" w:color="auto" w:val="clear"/>
             <w:tcMar>
               <w:top w:type="dxa" w:w="80"/>
               <w:left w:type="dxa" w:w="120"/>
@@ -5335,7 +5395,6 @@
               <w:bottom w:val="single" w:color="D0D7D3" w:sz="4"/>
               <w:right w:val="single" w:color="D0D7D3" w:sz="4"/>
             </w:tcBorders>
-            <w:shd w:fill="F6F8F7" w:color="auto" w:val="clear"/>
             <w:tcMar>
               <w:top w:type="dxa" w:w="80"/>
               <w:left w:type="dxa" w:w="120"/>
@@ -5364,7 +5423,6 @@
               <w:bottom w:val="single" w:color="D0D7D3" w:sz="4"/>
               <w:right w:val="single" w:color="D0D7D3" w:sz="4"/>
             </w:tcBorders>
-            <w:shd w:fill="F6F8F7" w:color="auto" w:val="clear"/>
             <w:tcMar>
               <w:top w:type="dxa" w:w="80"/>
               <w:left w:type="dxa" w:w="120"/>
@@ -5395,6 +5453,7 @@
               <w:bottom w:val="single" w:color="D0D7D3" w:sz="4"/>
               <w:right w:val="single" w:color="D0D7D3" w:sz="4"/>
             </w:tcBorders>
+            <w:shd w:fill="F6F8F7" w:color="auto" w:val="clear"/>
             <w:tcMar>
               <w:top w:type="dxa" w:w="80"/>
               <w:left w:type="dxa" w:w="120"/>
@@ -5423,6 +5482,7 @@
               <w:bottom w:val="single" w:color="D0D7D3" w:sz="4"/>
               <w:right w:val="single" w:color="D0D7D3" w:sz="4"/>
             </w:tcBorders>
+            <w:shd w:fill="F6F8F7" w:color="auto" w:val="clear"/>
             <w:tcMar>
               <w:top w:type="dxa" w:w="80"/>
               <w:left w:type="dxa" w:w="120"/>
@@ -5453,7 +5513,6 @@
               <w:bottom w:val="single" w:color="D0D7D3" w:sz="4"/>
               <w:right w:val="single" w:color="D0D7D3" w:sz="4"/>
             </w:tcBorders>
-            <w:shd w:fill="F6F8F7" w:color="auto" w:val="clear"/>
             <w:tcMar>
               <w:top w:type="dxa" w:w="80"/>
               <w:left w:type="dxa" w:w="120"/>
@@ -5482,7 +5541,6 @@
               <w:bottom w:val="single" w:color="D0D7D3" w:sz="4"/>
               <w:right w:val="single" w:color="D0D7D3" w:sz="4"/>
             </w:tcBorders>
-            <w:shd w:fill="F6F8F7" w:color="auto" w:val="clear"/>
             <w:tcMar>
               <w:top w:type="dxa" w:w="80"/>
               <w:left w:type="dxa" w:w="120"/>
@@ -5513,6 +5571,7 @@
               <w:bottom w:val="single" w:color="D0D7D3" w:sz="4"/>
               <w:right w:val="single" w:color="D0D7D3" w:sz="4"/>
             </w:tcBorders>
+            <w:shd w:fill="F6F8F7" w:color="auto" w:val="clear"/>
             <w:tcMar>
               <w:top w:type="dxa" w:w="80"/>
               <w:left w:type="dxa" w:w="120"/>
@@ -5541,6 +5600,7 @@
               <w:bottom w:val="single" w:color="D0D7D3" w:sz="4"/>
               <w:right w:val="single" w:color="D0D7D3" w:sz="4"/>
             </w:tcBorders>
+            <w:shd w:fill="F6F8F7" w:color="auto" w:val="clear"/>
             <w:tcMar>
               <w:top w:type="dxa" w:w="80"/>
               <w:left w:type="dxa" w:w="120"/>
@@ -5571,7 +5631,6 @@
               <w:bottom w:val="single" w:color="D0D7D3" w:sz="4"/>
               <w:right w:val="single" w:color="D0D7D3" w:sz="4"/>
             </w:tcBorders>
-            <w:shd w:fill="F6F8F7" w:color="auto" w:val="clear"/>
             <w:tcMar>
               <w:top w:type="dxa" w:w="80"/>
               <w:left w:type="dxa" w:w="120"/>
@@ -5600,7 +5659,6 @@
               <w:bottom w:val="single" w:color="D0D7D3" w:sz="4"/>
               <w:right w:val="single" w:color="D0D7D3" w:sz="4"/>
             </w:tcBorders>
-            <w:shd w:fill="F6F8F7" w:color="auto" w:val="clear"/>
             <w:tcMar>
               <w:top w:type="dxa" w:w="80"/>
               <w:left w:type="dxa" w:w="120"/>

</xml_diff>

<commit_message>
Redesign the app: sidebar layout, new design system, calmer dashboard and pupil page
- Design tokens (emerald on a deep green sidebar, softer neutrals, radii and
  shadows), Plus Jakarta Sans self-hosted, lucide icons; every page picks it up
- Fixed left sidebar with icons and an always-open Setup group, the signed-in
  person and sign-out at the bottom; a slide-in menu on small screens
- Dashboard fits one screen: four headline figures, a strip for older debts,
  credit and approvals, then one tabbed panel (money in, by class, how late,
  pupils)
- Pupil page: profile header with the balance, tabs (overview, fees,
  payments); rarer actions in a More menu and a menu per parent
- Shared Tabs, Stat, Menu and BackLink components; dropdowns size to their
  content; table names read as names; sign-in cards carry the brand mark
</commit_message>
<xml_diff>
--- a/docs/product/ParentPay - what it does.docx
+++ b/docs/product/ParentPay - what it does.docx
@@ -4761,6 +4761,65 @@
                 <w:sz w:val="20"/>
                 <w:szCs w:val="20"/>
               </w:rPr>
+              <w:t xml:space="preserve">21 Oct 2026</w:t>
+            </w:r>
+          </w:p>
+        </w:tc>
+        <w:tc>
+          <w:tcPr>
+            <w:tcW w:type="dxa" w:w="7838"/>
+            <w:tcBorders>
+              <w:top w:val="single" w:color="D0D7D3" w:sz="4"/>
+              <w:left w:val="single" w:color="D0D7D3" w:sz="4"/>
+              <w:bottom w:val="single" w:color="D0D7D3" w:sz="4"/>
+              <w:right w:val="single" w:color="D0D7D3" w:sz="4"/>
+            </w:tcBorders>
+            <w:shd w:fill="F6F8F7" w:color="auto" w:val="clear"/>
+            <w:tcMar>
+              <w:top w:type="dxa" w:w="80"/>
+              <w:left w:type="dxa" w:w="120"/>
+              <w:bottom w:type="dxa" w:w="80"/>
+              <w:right w:type="dxa" w:w="120"/>
+            </w:tcMar>
+          </w:tcPr>
+          <w:p>
+            <w:r>
+              <w:rPr>
+                <w:b w:val="false"/>
+                <w:bCs w:val="false"/>
+                <w:sz w:val="20"/>
+                <w:szCs w:val="20"/>
+              </w:rPr>
+              <w:t xml:space="preserve">New look: a sidebar for every page, calmer colours and type, a dashboard that fits on one screen, and the pupil page split into tabs</w:t>
+            </w:r>
+          </w:p>
+        </w:tc>
+      </w:tr>
+      <w:tr>
+        <w:tc>
+          <w:tcPr>
+            <w:tcW w:type="dxa" w:w="1800"/>
+            <w:tcBorders>
+              <w:top w:val="single" w:color="D0D7D3" w:sz="4"/>
+              <w:left w:val="single" w:color="D0D7D3" w:sz="4"/>
+              <w:bottom w:val="single" w:color="D0D7D3" w:sz="4"/>
+              <w:right w:val="single" w:color="D0D7D3" w:sz="4"/>
+            </w:tcBorders>
+            <w:tcMar>
+              <w:top w:type="dxa" w:w="80"/>
+              <w:left w:type="dxa" w:w="120"/>
+              <w:bottom w:type="dxa" w:w="80"/>
+              <w:right w:type="dxa" w:w="120"/>
+            </w:tcMar>
+          </w:tcPr>
+          <w:p>
+            <w:r>
+              <w:rPr>
+                <w:b w:val="false"/>
+                <w:bCs w:val="false"/>
+                <w:sz w:val="20"/>
+                <w:szCs w:val="20"/>
+              </w:rPr>
               <w:t xml:space="preserve">19 Oct 2026</w:t>
             </w:r>
           </w:p>
@@ -4774,7 +4833,6 @@
               <w:bottom w:val="single" w:color="D0D7D3" w:sz="4"/>
               <w:right w:val="single" w:color="D0D7D3" w:sz="4"/>
             </w:tcBorders>
-            <w:shd w:fill="F6F8F7" w:color="auto" w:val="clear"/>
             <w:tcMar>
               <w:top w:type="dxa" w:w="80"/>
               <w:left w:type="dxa" w:w="120"/>
@@ -4805,6 +4863,7 @@
               <w:bottom w:val="single" w:color="D0D7D3" w:sz="4"/>
               <w:right w:val="single" w:color="D0D7D3" w:sz="4"/>
             </w:tcBorders>
+            <w:shd w:fill="F6F8F7" w:color="auto" w:val="clear"/>
             <w:tcMar>
               <w:top w:type="dxa" w:w="80"/>
               <w:left w:type="dxa" w:w="120"/>
@@ -4833,6 +4892,7 @@
               <w:bottom w:val="single" w:color="D0D7D3" w:sz="4"/>
               <w:right w:val="single" w:color="D0D7D3" w:sz="4"/>
             </w:tcBorders>
+            <w:shd w:fill="F6F8F7" w:color="auto" w:val="clear"/>
             <w:tcMar>
               <w:top w:type="dxa" w:w="80"/>
               <w:left w:type="dxa" w:w="120"/>
@@ -4863,7 +4923,6 @@
               <w:bottom w:val="single" w:color="D0D7D3" w:sz="4"/>
               <w:right w:val="single" w:color="D0D7D3" w:sz="4"/>
             </w:tcBorders>
-            <w:shd w:fill="F6F8F7" w:color="auto" w:val="clear"/>
             <w:tcMar>
               <w:top w:type="dxa" w:w="80"/>
               <w:left w:type="dxa" w:w="120"/>
@@ -4892,7 +4951,6 @@
               <w:bottom w:val="single" w:color="D0D7D3" w:sz="4"/>
               <w:right w:val="single" w:color="D0D7D3" w:sz="4"/>
             </w:tcBorders>
-            <w:shd w:fill="F6F8F7" w:color="auto" w:val="clear"/>
             <w:tcMar>
               <w:top w:type="dxa" w:w="80"/>
               <w:left w:type="dxa" w:w="120"/>
@@ -4923,6 +4981,7 @@
               <w:bottom w:val="single" w:color="D0D7D3" w:sz="4"/>
               <w:right w:val="single" w:color="D0D7D3" w:sz="4"/>
             </w:tcBorders>
+            <w:shd w:fill="F6F8F7" w:color="auto" w:val="clear"/>
             <w:tcMar>
               <w:top w:type="dxa" w:w="80"/>
               <w:left w:type="dxa" w:w="120"/>
@@ -4951,6 +5010,7 @@
               <w:bottom w:val="single" w:color="D0D7D3" w:sz="4"/>
               <w:right w:val="single" w:color="D0D7D3" w:sz="4"/>
             </w:tcBorders>
+            <w:shd w:fill="F6F8F7" w:color="auto" w:val="clear"/>
             <w:tcMar>
               <w:top w:type="dxa" w:w="80"/>
               <w:left w:type="dxa" w:w="120"/>
@@ -4981,7 +5041,6 @@
               <w:bottom w:val="single" w:color="D0D7D3" w:sz="4"/>
               <w:right w:val="single" w:color="D0D7D3" w:sz="4"/>
             </w:tcBorders>
-            <w:shd w:fill="F6F8F7" w:color="auto" w:val="clear"/>
             <w:tcMar>
               <w:top w:type="dxa" w:w="80"/>
               <w:left w:type="dxa" w:w="120"/>
@@ -5010,7 +5069,6 @@
               <w:bottom w:val="single" w:color="D0D7D3" w:sz="4"/>
               <w:right w:val="single" w:color="D0D7D3" w:sz="4"/>
             </w:tcBorders>
-            <w:shd w:fill="F6F8F7" w:color="auto" w:val="clear"/>
             <w:tcMar>
               <w:top w:type="dxa" w:w="80"/>
               <w:left w:type="dxa" w:w="120"/>
@@ -5041,6 +5099,7 @@
               <w:bottom w:val="single" w:color="D0D7D3" w:sz="4"/>
               <w:right w:val="single" w:color="D0D7D3" w:sz="4"/>
             </w:tcBorders>
+            <w:shd w:fill="F6F8F7" w:color="auto" w:val="clear"/>
             <w:tcMar>
               <w:top w:type="dxa" w:w="80"/>
               <w:left w:type="dxa" w:w="120"/>
@@ -5069,6 +5128,7 @@
               <w:bottom w:val="single" w:color="D0D7D3" w:sz="4"/>
               <w:right w:val="single" w:color="D0D7D3" w:sz="4"/>
             </w:tcBorders>
+            <w:shd w:fill="F6F8F7" w:color="auto" w:val="clear"/>
             <w:tcMar>
               <w:top w:type="dxa" w:w="80"/>
               <w:left w:type="dxa" w:w="120"/>
@@ -5099,7 +5159,6 @@
               <w:bottom w:val="single" w:color="D0D7D3" w:sz="4"/>
               <w:right w:val="single" w:color="D0D7D3" w:sz="4"/>
             </w:tcBorders>
-            <w:shd w:fill="F6F8F7" w:color="auto" w:val="clear"/>
             <w:tcMar>
               <w:top w:type="dxa" w:w="80"/>
               <w:left w:type="dxa" w:w="120"/>
@@ -5128,7 +5187,6 @@
               <w:bottom w:val="single" w:color="D0D7D3" w:sz="4"/>
               <w:right w:val="single" w:color="D0D7D3" w:sz="4"/>
             </w:tcBorders>
-            <w:shd w:fill="F6F8F7" w:color="auto" w:val="clear"/>
             <w:tcMar>
               <w:top w:type="dxa" w:w="80"/>
               <w:left w:type="dxa" w:w="120"/>
@@ -5159,6 +5217,7 @@
               <w:bottom w:val="single" w:color="D0D7D3" w:sz="4"/>
               <w:right w:val="single" w:color="D0D7D3" w:sz="4"/>
             </w:tcBorders>
+            <w:shd w:fill="F6F8F7" w:color="auto" w:val="clear"/>
             <w:tcMar>
               <w:top w:type="dxa" w:w="80"/>
               <w:left w:type="dxa" w:w="120"/>
@@ -5187,6 +5246,7 @@
               <w:bottom w:val="single" w:color="D0D7D3" w:sz="4"/>
               <w:right w:val="single" w:color="D0D7D3" w:sz="4"/>
             </w:tcBorders>
+            <w:shd w:fill="F6F8F7" w:color="auto" w:val="clear"/>
             <w:tcMar>
               <w:top w:type="dxa" w:w="80"/>
               <w:left w:type="dxa" w:w="120"/>
@@ -5217,7 +5277,6 @@
               <w:bottom w:val="single" w:color="D0D7D3" w:sz="4"/>
               <w:right w:val="single" w:color="D0D7D3" w:sz="4"/>
             </w:tcBorders>
-            <w:shd w:fill="F6F8F7" w:color="auto" w:val="clear"/>
             <w:tcMar>
               <w:top w:type="dxa" w:w="80"/>
               <w:left w:type="dxa" w:w="120"/>
@@ -5246,7 +5305,6 @@
               <w:bottom w:val="single" w:color="D0D7D3" w:sz="4"/>
               <w:right w:val="single" w:color="D0D7D3" w:sz="4"/>
             </w:tcBorders>
-            <w:shd w:fill="F6F8F7" w:color="auto" w:val="clear"/>
             <w:tcMar>
               <w:top w:type="dxa" w:w="80"/>
               <w:left w:type="dxa" w:w="120"/>
@@ -5277,6 +5335,7 @@
               <w:bottom w:val="single" w:color="D0D7D3" w:sz="4"/>
               <w:right w:val="single" w:color="D0D7D3" w:sz="4"/>
             </w:tcBorders>
+            <w:shd w:fill="F6F8F7" w:color="auto" w:val="clear"/>
             <w:tcMar>
               <w:top w:type="dxa" w:w="80"/>
               <w:left w:type="dxa" w:w="120"/>
@@ -5305,6 +5364,7 @@
               <w:bottom w:val="single" w:color="D0D7D3" w:sz="4"/>
               <w:right w:val="single" w:color="D0D7D3" w:sz="4"/>
             </w:tcBorders>
+            <w:shd w:fill="F6F8F7" w:color="auto" w:val="clear"/>
             <w:tcMar>
               <w:top w:type="dxa" w:w="80"/>
               <w:left w:type="dxa" w:w="120"/>
@@ -5335,7 +5395,6 @@
               <w:bottom w:val="single" w:color="D0D7D3" w:sz="4"/>
               <w:right w:val="single" w:color="D0D7D3" w:sz="4"/>
             </w:tcBorders>
-            <w:shd w:fill="F6F8F7" w:color="auto" w:val="clear"/>
             <w:tcMar>
               <w:top w:type="dxa" w:w="80"/>
               <w:left w:type="dxa" w:w="120"/>
@@ -5364,7 +5423,6 @@
               <w:bottom w:val="single" w:color="D0D7D3" w:sz="4"/>
               <w:right w:val="single" w:color="D0D7D3" w:sz="4"/>
             </w:tcBorders>
-            <w:shd w:fill="F6F8F7" w:color="auto" w:val="clear"/>
             <w:tcMar>
               <w:top w:type="dxa" w:w="80"/>
               <w:left w:type="dxa" w:w="120"/>
@@ -5395,6 +5453,7 @@
               <w:bottom w:val="single" w:color="D0D7D3" w:sz="4"/>
               <w:right w:val="single" w:color="D0D7D3" w:sz="4"/>
             </w:tcBorders>
+            <w:shd w:fill="F6F8F7" w:color="auto" w:val="clear"/>
             <w:tcMar>
               <w:top w:type="dxa" w:w="80"/>
               <w:left w:type="dxa" w:w="120"/>
@@ -5423,6 +5482,7 @@
               <w:bottom w:val="single" w:color="D0D7D3" w:sz="4"/>
               <w:right w:val="single" w:color="D0D7D3" w:sz="4"/>
             </w:tcBorders>
+            <w:shd w:fill="F6F8F7" w:color="auto" w:val="clear"/>
             <w:tcMar>
               <w:top w:type="dxa" w:w="80"/>
               <w:left w:type="dxa" w:w="120"/>
@@ -5453,7 +5513,6 @@
               <w:bottom w:val="single" w:color="D0D7D3" w:sz="4"/>
               <w:right w:val="single" w:color="D0D7D3" w:sz="4"/>
             </w:tcBorders>
-            <w:shd w:fill="F6F8F7" w:color="auto" w:val="clear"/>
             <w:tcMar>
               <w:top w:type="dxa" w:w="80"/>
               <w:left w:type="dxa" w:w="120"/>
@@ -5482,7 +5541,6 @@
               <w:bottom w:val="single" w:color="D0D7D3" w:sz="4"/>
               <w:right w:val="single" w:color="D0D7D3" w:sz="4"/>
             </w:tcBorders>
-            <w:shd w:fill="F6F8F7" w:color="auto" w:val="clear"/>
             <w:tcMar>
               <w:top w:type="dxa" w:w="80"/>
               <w:left w:type="dxa" w:w="120"/>
@@ -5513,6 +5571,7 @@
               <w:bottom w:val="single" w:color="D0D7D3" w:sz="4"/>
               <w:right w:val="single" w:color="D0D7D3" w:sz="4"/>
             </w:tcBorders>
+            <w:shd w:fill="F6F8F7" w:color="auto" w:val="clear"/>
             <w:tcMar>
               <w:top w:type="dxa" w:w="80"/>
               <w:left w:type="dxa" w:w="120"/>
@@ -5541,6 +5600,7 @@
               <w:bottom w:val="single" w:color="D0D7D3" w:sz="4"/>
               <w:right w:val="single" w:color="D0D7D3" w:sz="4"/>
             </w:tcBorders>
+            <w:shd w:fill="F6F8F7" w:color="auto" w:val="clear"/>
             <w:tcMar>
               <w:top w:type="dxa" w:w="80"/>
               <w:left w:type="dxa" w:w="120"/>
@@ -5571,7 +5631,6 @@
               <w:bottom w:val="single" w:color="D0D7D3" w:sz="4"/>
               <w:right w:val="single" w:color="D0D7D3" w:sz="4"/>
             </w:tcBorders>
-            <w:shd w:fill="F6F8F7" w:color="auto" w:val="clear"/>
             <w:tcMar>
               <w:top w:type="dxa" w:w="80"/>
               <w:left w:type="dxa" w:w="120"/>
@@ -5600,7 +5659,6 @@
               <w:bottom w:val="single" w:color="D0D7D3" w:sz="4"/>
               <w:right w:val="single" w:color="D0D7D3" w:sz="4"/>
             </w:tcBorders>
-            <w:shd w:fill="F6F8F7" w:color="auto" w:val="clear"/>
             <w:tcMar>
               <w:top w:type="dxa" w:w="80"/>
               <w:left w:type="dxa" w:w="120"/>
@@ -5631,6 +5689,7 @@
               <w:bottom w:val="single" w:color="D0D7D3" w:sz="4"/>
               <w:right w:val="single" w:color="D0D7D3" w:sz="4"/>
             </w:tcBorders>
+            <w:shd w:fill="F6F8F7" w:color="auto" w:val="clear"/>
             <w:tcMar>
               <w:top w:type="dxa" w:w="80"/>
               <w:left w:type="dxa" w:w="120"/>
@@ -5659,6 +5718,7 @@
               <w:bottom w:val="single" w:color="D0D7D3" w:sz="4"/>
               <w:right w:val="single" w:color="D0D7D3" w:sz="4"/>
             </w:tcBorders>
+            <w:shd w:fill="F6F8F7" w:color="auto" w:val="clear"/>
             <w:tcMar>
               <w:top w:type="dxa" w:w="80"/>
               <w:left w:type="dxa" w:w="120"/>

</xml_diff>

<commit_message>
Set up classes from the usual list: Creche to SSS 3, ready ticked
- A new school's Classes page lists the usual Nigerian classes (Preparatory:
  Creche to Nursery 3; Primary 1-6; JSS 1-3; SSS 1-3), all ticked; untick
  what the school doesn't run, add its own, choose the arms, create in one go
- Later, 'Add from the usual list' offers only the missing ones; each slots
  into its usual place in the promotion order, the school's own go last
- GET /class-levels/standard and POST /class-levels/batch (one audit entry,
  a fixed number of statements however many classes)
- Frontend tests wait up to 5 s for async UI (parallel runs on a busy
  machine went past the 1 s default)
</commit_message>
<xml_diff>
--- a/docs/product/ParentPay - what it does.docx
+++ b/docs/product/ParentPay - what it does.docx
@@ -1919,7 +1919,7 @@
                 <w:sz w:val="20"/>
                 <w:szCs w:val="20"/>
               </w:rPr>
-              <w:t xml:space="preserve">Set up the school year, terms, classes and arms; move everyone into the next term or promote them at the end of the year</w:t>
+              <w:t xml:space="preserve">Set up the school year, terms, classes and arms (the usual classes from Creche to SSS 3 come ready to tick); move everyone into the next term or promote them at the end of the year</w:t>
             </w:r>
           </w:p>
         </w:tc>
@@ -4790,6 +4790,64 @@
                 <w:sz w:val="20"/>
                 <w:szCs w:val="20"/>
               </w:rPr>
+              <w:t xml:space="preserve">Classes set up in one click: the usual list from Creche to SSS 3 comes ticked; untick what you don’t run and add your own</w:t>
+            </w:r>
+          </w:p>
+        </w:tc>
+      </w:tr>
+      <w:tr>
+        <w:tc>
+          <w:tcPr>
+            <w:tcW w:type="dxa" w:w="1800"/>
+            <w:tcBorders>
+              <w:top w:val="single" w:color="D0D7D3" w:sz="4"/>
+              <w:left w:val="single" w:color="D0D7D3" w:sz="4"/>
+              <w:bottom w:val="single" w:color="D0D7D3" w:sz="4"/>
+              <w:right w:val="single" w:color="D0D7D3" w:sz="4"/>
+            </w:tcBorders>
+            <w:tcMar>
+              <w:top w:type="dxa" w:w="80"/>
+              <w:left w:type="dxa" w:w="120"/>
+              <w:bottom w:type="dxa" w:w="80"/>
+              <w:right w:type="dxa" w:w="120"/>
+            </w:tcMar>
+          </w:tcPr>
+          <w:p>
+            <w:r>
+              <w:rPr>
+                <w:b w:val="false"/>
+                <w:bCs w:val="false"/>
+                <w:sz w:val="20"/>
+                <w:szCs w:val="20"/>
+              </w:rPr>
+              <w:t xml:space="preserve">21 Oct 2026</w:t>
+            </w:r>
+          </w:p>
+        </w:tc>
+        <w:tc>
+          <w:tcPr>
+            <w:tcW w:type="dxa" w:w="7838"/>
+            <w:tcBorders>
+              <w:top w:val="single" w:color="D0D7D3" w:sz="4"/>
+              <w:left w:val="single" w:color="D0D7D3" w:sz="4"/>
+              <w:bottom w:val="single" w:color="D0D7D3" w:sz="4"/>
+              <w:right w:val="single" w:color="D0D7D3" w:sz="4"/>
+            </w:tcBorders>
+            <w:tcMar>
+              <w:top w:type="dxa" w:w="80"/>
+              <w:left w:type="dxa" w:w="120"/>
+              <w:bottom w:type="dxa" w:w="80"/>
+              <w:right w:type="dxa" w:w="120"/>
+            </w:tcMar>
+          </w:tcPr>
+          <w:p>
+            <w:r>
+              <w:rPr>
+                <w:b w:val="false"/>
+                <w:bCs w:val="false"/>
+                <w:sz w:val="20"/>
+                <w:szCs w:val="20"/>
+              </w:rPr>
               <w:t xml:space="preserve">New look: a sidebar for every page, calmer colours and type, a dashboard that fits on one screen, and the pupil page split into tabs</w:t>
             </w:r>
           </w:p>
@@ -4805,6 +4863,7 @@
               <w:bottom w:val="single" w:color="D0D7D3" w:sz="4"/>
               <w:right w:val="single" w:color="D0D7D3" w:sz="4"/>
             </w:tcBorders>
+            <w:shd w:fill="F6F8F7" w:color="auto" w:val="clear"/>
             <w:tcMar>
               <w:top w:type="dxa" w:w="80"/>
               <w:left w:type="dxa" w:w="120"/>
@@ -4833,6 +4892,7 @@
               <w:bottom w:val="single" w:color="D0D7D3" w:sz="4"/>
               <w:right w:val="single" w:color="D0D7D3" w:sz="4"/>
             </w:tcBorders>
+            <w:shd w:fill="F6F8F7" w:color="auto" w:val="clear"/>
             <w:tcMar>
               <w:top w:type="dxa" w:w="80"/>
               <w:left w:type="dxa" w:w="120"/>
@@ -4863,7 +4923,6 @@
               <w:bottom w:val="single" w:color="D0D7D3" w:sz="4"/>
               <w:right w:val="single" w:color="D0D7D3" w:sz="4"/>
             </w:tcBorders>
-            <w:shd w:fill="F6F8F7" w:color="auto" w:val="clear"/>
             <w:tcMar>
               <w:top w:type="dxa" w:w="80"/>
               <w:left w:type="dxa" w:w="120"/>
@@ -4892,7 +4951,6 @@
               <w:bottom w:val="single" w:color="D0D7D3" w:sz="4"/>
               <w:right w:val="single" w:color="D0D7D3" w:sz="4"/>
             </w:tcBorders>
-            <w:shd w:fill="F6F8F7" w:color="auto" w:val="clear"/>
             <w:tcMar>
               <w:top w:type="dxa" w:w="80"/>
               <w:left w:type="dxa" w:w="120"/>
@@ -4923,6 +4981,7 @@
               <w:bottom w:val="single" w:color="D0D7D3" w:sz="4"/>
               <w:right w:val="single" w:color="D0D7D3" w:sz="4"/>
             </w:tcBorders>
+            <w:shd w:fill="F6F8F7" w:color="auto" w:val="clear"/>
             <w:tcMar>
               <w:top w:type="dxa" w:w="80"/>
               <w:left w:type="dxa" w:w="120"/>
@@ -4951,6 +5010,7 @@
               <w:bottom w:val="single" w:color="D0D7D3" w:sz="4"/>
               <w:right w:val="single" w:color="D0D7D3" w:sz="4"/>
             </w:tcBorders>
+            <w:shd w:fill="F6F8F7" w:color="auto" w:val="clear"/>
             <w:tcMar>
               <w:top w:type="dxa" w:w="80"/>
               <w:left w:type="dxa" w:w="120"/>
@@ -4981,7 +5041,6 @@
               <w:bottom w:val="single" w:color="D0D7D3" w:sz="4"/>
               <w:right w:val="single" w:color="D0D7D3" w:sz="4"/>
             </w:tcBorders>
-            <w:shd w:fill="F6F8F7" w:color="auto" w:val="clear"/>
             <w:tcMar>
               <w:top w:type="dxa" w:w="80"/>
               <w:left w:type="dxa" w:w="120"/>
@@ -5010,7 +5069,6 @@
               <w:bottom w:val="single" w:color="D0D7D3" w:sz="4"/>
               <w:right w:val="single" w:color="D0D7D3" w:sz="4"/>
             </w:tcBorders>
-            <w:shd w:fill="F6F8F7" w:color="auto" w:val="clear"/>
             <w:tcMar>
               <w:top w:type="dxa" w:w="80"/>
               <w:left w:type="dxa" w:w="120"/>
@@ -5041,6 +5099,7 @@
               <w:bottom w:val="single" w:color="D0D7D3" w:sz="4"/>
               <w:right w:val="single" w:color="D0D7D3" w:sz="4"/>
             </w:tcBorders>
+            <w:shd w:fill="F6F8F7" w:color="auto" w:val="clear"/>
             <w:tcMar>
               <w:top w:type="dxa" w:w="80"/>
               <w:left w:type="dxa" w:w="120"/>
@@ -5069,6 +5128,7 @@
               <w:bottom w:val="single" w:color="D0D7D3" w:sz="4"/>
               <w:right w:val="single" w:color="D0D7D3" w:sz="4"/>
             </w:tcBorders>
+            <w:shd w:fill="F6F8F7" w:color="auto" w:val="clear"/>
             <w:tcMar>
               <w:top w:type="dxa" w:w="80"/>
               <w:left w:type="dxa" w:w="120"/>
@@ -5099,7 +5159,6 @@
               <w:bottom w:val="single" w:color="D0D7D3" w:sz="4"/>
               <w:right w:val="single" w:color="D0D7D3" w:sz="4"/>
             </w:tcBorders>
-            <w:shd w:fill="F6F8F7" w:color="auto" w:val="clear"/>
             <w:tcMar>
               <w:top w:type="dxa" w:w="80"/>
               <w:left w:type="dxa" w:w="120"/>
@@ -5128,7 +5187,6 @@
               <w:bottom w:val="single" w:color="D0D7D3" w:sz="4"/>
               <w:right w:val="single" w:color="D0D7D3" w:sz="4"/>
             </w:tcBorders>
-            <w:shd w:fill="F6F8F7" w:color="auto" w:val="clear"/>
             <w:tcMar>
               <w:top w:type="dxa" w:w="80"/>
               <w:left w:type="dxa" w:w="120"/>
@@ -5159,6 +5217,7 @@
               <w:bottom w:val="single" w:color="D0D7D3" w:sz="4"/>
               <w:right w:val="single" w:color="D0D7D3" w:sz="4"/>
             </w:tcBorders>
+            <w:shd w:fill="F6F8F7" w:color="auto" w:val="clear"/>
             <w:tcMar>
               <w:top w:type="dxa" w:w="80"/>
               <w:left w:type="dxa" w:w="120"/>
@@ -5187,6 +5246,7 @@
               <w:bottom w:val="single" w:color="D0D7D3" w:sz="4"/>
               <w:right w:val="single" w:color="D0D7D3" w:sz="4"/>
             </w:tcBorders>
+            <w:shd w:fill="F6F8F7" w:color="auto" w:val="clear"/>
             <w:tcMar>
               <w:top w:type="dxa" w:w="80"/>
               <w:left w:type="dxa" w:w="120"/>
@@ -5217,7 +5277,6 @@
               <w:bottom w:val="single" w:color="D0D7D3" w:sz="4"/>
               <w:right w:val="single" w:color="D0D7D3" w:sz="4"/>
             </w:tcBorders>
-            <w:shd w:fill="F6F8F7" w:color="auto" w:val="clear"/>
             <w:tcMar>
               <w:top w:type="dxa" w:w="80"/>
               <w:left w:type="dxa" w:w="120"/>
@@ -5246,7 +5305,6 @@
               <w:bottom w:val="single" w:color="D0D7D3" w:sz="4"/>
               <w:right w:val="single" w:color="D0D7D3" w:sz="4"/>
             </w:tcBorders>
-            <w:shd w:fill="F6F8F7" w:color="auto" w:val="clear"/>
             <w:tcMar>
               <w:top w:type="dxa" w:w="80"/>
               <w:left w:type="dxa" w:w="120"/>
@@ -5277,6 +5335,7 @@
               <w:bottom w:val="single" w:color="D0D7D3" w:sz="4"/>
               <w:right w:val="single" w:color="D0D7D3" w:sz="4"/>
             </w:tcBorders>
+            <w:shd w:fill="F6F8F7" w:color="auto" w:val="clear"/>
             <w:tcMar>
               <w:top w:type="dxa" w:w="80"/>
               <w:left w:type="dxa" w:w="120"/>
@@ -5305,6 +5364,7 @@
               <w:bottom w:val="single" w:color="D0D7D3" w:sz="4"/>
               <w:right w:val="single" w:color="D0D7D3" w:sz="4"/>
             </w:tcBorders>
+            <w:shd w:fill="F6F8F7" w:color="auto" w:val="clear"/>
             <w:tcMar>
               <w:top w:type="dxa" w:w="80"/>
               <w:left w:type="dxa" w:w="120"/>
@@ -5335,7 +5395,6 @@
               <w:bottom w:val="single" w:color="D0D7D3" w:sz="4"/>
               <w:right w:val="single" w:color="D0D7D3" w:sz="4"/>
             </w:tcBorders>
-            <w:shd w:fill="F6F8F7" w:color="auto" w:val="clear"/>
             <w:tcMar>
               <w:top w:type="dxa" w:w="80"/>
               <w:left w:type="dxa" w:w="120"/>
@@ -5364,7 +5423,6 @@
               <w:bottom w:val="single" w:color="D0D7D3" w:sz="4"/>
               <w:right w:val="single" w:color="D0D7D3" w:sz="4"/>
             </w:tcBorders>
-            <w:shd w:fill="F6F8F7" w:color="auto" w:val="clear"/>
             <w:tcMar>
               <w:top w:type="dxa" w:w="80"/>
               <w:left w:type="dxa" w:w="120"/>
@@ -5395,6 +5453,7 @@
               <w:bottom w:val="single" w:color="D0D7D3" w:sz="4"/>
               <w:right w:val="single" w:color="D0D7D3" w:sz="4"/>
             </w:tcBorders>
+            <w:shd w:fill="F6F8F7" w:color="auto" w:val="clear"/>
             <w:tcMar>
               <w:top w:type="dxa" w:w="80"/>
               <w:left w:type="dxa" w:w="120"/>
@@ -5423,6 +5482,7 @@
               <w:bottom w:val="single" w:color="D0D7D3" w:sz="4"/>
               <w:right w:val="single" w:color="D0D7D3" w:sz="4"/>
             </w:tcBorders>
+            <w:shd w:fill="F6F8F7" w:color="auto" w:val="clear"/>
             <w:tcMar>
               <w:top w:type="dxa" w:w="80"/>
               <w:left w:type="dxa" w:w="120"/>
@@ -5453,7 +5513,6 @@
               <w:bottom w:val="single" w:color="D0D7D3" w:sz="4"/>
               <w:right w:val="single" w:color="D0D7D3" w:sz="4"/>
             </w:tcBorders>
-            <w:shd w:fill="F6F8F7" w:color="auto" w:val="clear"/>
             <w:tcMar>
               <w:top w:type="dxa" w:w="80"/>
               <w:left w:type="dxa" w:w="120"/>
@@ -5482,7 +5541,6 @@
               <w:bottom w:val="single" w:color="D0D7D3" w:sz="4"/>
               <w:right w:val="single" w:color="D0D7D3" w:sz="4"/>
             </w:tcBorders>
-            <w:shd w:fill="F6F8F7" w:color="auto" w:val="clear"/>
             <w:tcMar>
               <w:top w:type="dxa" w:w="80"/>
               <w:left w:type="dxa" w:w="120"/>
@@ -5513,6 +5571,7 @@
               <w:bottom w:val="single" w:color="D0D7D3" w:sz="4"/>
               <w:right w:val="single" w:color="D0D7D3" w:sz="4"/>
             </w:tcBorders>
+            <w:shd w:fill="F6F8F7" w:color="auto" w:val="clear"/>
             <w:tcMar>
               <w:top w:type="dxa" w:w="80"/>
               <w:left w:type="dxa" w:w="120"/>
@@ -5541,6 +5600,7 @@
               <w:bottom w:val="single" w:color="D0D7D3" w:sz="4"/>
               <w:right w:val="single" w:color="D0D7D3" w:sz="4"/>
             </w:tcBorders>
+            <w:shd w:fill="F6F8F7" w:color="auto" w:val="clear"/>
             <w:tcMar>
               <w:top w:type="dxa" w:w="80"/>
               <w:left w:type="dxa" w:w="120"/>
@@ -5571,7 +5631,6 @@
               <w:bottom w:val="single" w:color="D0D7D3" w:sz="4"/>
               <w:right w:val="single" w:color="D0D7D3" w:sz="4"/>
             </w:tcBorders>
-            <w:shd w:fill="F6F8F7" w:color="auto" w:val="clear"/>
             <w:tcMar>
               <w:top w:type="dxa" w:w="80"/>
               <w:left w:type="dxa" w:w="120"/>
@@ -5600,7 +5659,6 @@
               <w:bottom w:val="single" w:color="D0D7D3" w:sz="4"/>
               <w:right w:val="single" w:color="D0D7D3" w:sz="4"/>
             </w:tcBorders>
-            <w:shd w:fill="F6F8F7" w:color="auto" w:val="clear"/>
             <w:tcMar>
               <w:top w:type="dxa" w:w="80"/>
               <w:left w:type="dxa" w:w="120"/>
@@ -5631,6 +5689,7 @@
               <w:bottom w:val="single" w:color="D0D7D3" w:sz="4"/>
               <w:right w:val="single" w:color="D0D7D3" w:sz="4"/>
             </w:tcBorders>
+            <w:shd w:fill="F6F8F7" w:color="auto" w:val="clear"/>
             <w:tcMar>
               <w:top w:type="dxa" w:w="80"/>
               <w:left w:type="dxa" w:w="120"/>
@@ -5659,6 +5718,7 @@
               <w:bottom w:val="single" w:color="D0D7D3" w:sz="4"/>
               <w:right w:val="single" w:color="D0D7D3" w:sz="4"/>
             </w:tcBorders>
+            <w:shd w:fill="F6F8F7" w:color="auto" w:val="clear"/>
             <w:tcMar>
               <w:top w:type="dxa" w:w="80"/>
               <w:left w:type="dxa" w:w="120"/>
@@ -5689,7 +5749,6 @@
               <w:bottom w:val="single" w:color="D0D7D3" w:sz="4"/>
               <w:right w:val="single" w:color="D0D7D3" w:sz="4"/>
             </w:tcBorders>
-            <w:shd w:fill="F6F8F7" w:color="auto" w:val="clear"/>
             <w:tcMar>
               <w:top w:type="dxa" w:w="80"/>
               <w:left w:type="dxa" w:w="120"/>
@@ -5718,7 +5777,6 @@
               <w:bottom w:val="single" w:color="D0D7D3" w:sz="4"/>
               <w:right w:val="single" w:color="D0D7D3" w:sz="4"/>
             </w:tcBorders>
-            <w:shd w:fill="F6F8F7" w:color="auto" w:val="clear"/>
             <w:tcMar>
               <w:top w:type="dxa" w:w="80"/>
               <w:left w:type="dxa" w:w="120"/>

</xml_diff>

<commit_message>
School year filled in, printable pay cards, and ask to add new fees to sent bills
- Calendar: the school year comes filled in with the usual Nigerian term dates
  (GET /academic-sessions/suggested: Sept-July, terms Monday to Friday, the
  next session after the latest one); creating takes current_term so the term
  today falls in becomes current; a new school sees it ready on the page
- Pay cards for parents who don't use apps: one pupil or a class four to an
  A4 page, with the child's account number in large type, bank and account
  name, a QR code to the parent's family link (with the date it stops
  working) and the school's phone; payments.record, rate limited, audited
- live_links makes or reuses many parents' links in three statements
- Fees: right after saving the grid, ask whether to add fees the sent bills
  don't have yet (WAEC for SSS 3), instead of relying on the notice
- Lagos time in one place (app/core/clock.py) instead of eight copies
</commit_message>
<xml_diff>
--- a/docs/product/ParentPay - what it does.docx
+++ b/docs/product/ParentPay - what it does.docx
@@ -4731,6 +4731,124 @@
                 <w:szCs w:val="20"/>
               </w:rPr>
               <w:t xml:space="preserve">Fee status download: each class with only its own fees, what was paid on part-paid fees, a printable page per class</w:t>
+            </w:r>
+          </w:p>
+        </w:tc>
+      </w:tr>
+      <w:tr>
+        <w:tc>
+          <w:tcPr>
+            <w:tcW w:type="dxa" w:w="1800"/>
+            <w:tcBorders>
+              <w:top w:val="single" w:color="D0D7D3" w:sz="4"/>
+              <w:left w:val="single" w:color="D0D7D3" w:sz="4"/>
+              <w:bottom w:val="single" w:color="D0D7D3" w:sz="4"/>
+              <w:right w:val="single" w:color="D0D7D3" w:sz="4"/>
+            </w:tcBorders>
+            <w:shd w:fill="F6F8F7" w:color="auto" w:val="clear"/>
+            <w:tcMar>
+              <w:top w:type="dxa" w:w="80"/>
+              <w:left w:type="dxa" w:w="120"/>
+              <w:bottom w:type="dxa" w:w="80"/>
+              <w:right w:type="dxa" w:w="120"/>
+            </w:tcMar>
+          </w:tcPr>
+          <w:p>
+            <w:r>
+              <w:rPr>
+                <w:b w:val="false"/>
+                <w:bCs w:val="false"/>
+                <w:sz w:val="20"/>
+                <w:szCs w:val="20"/>
+              </w:rPr>
+              <w:t xml:space="preserve">21 Oct 2026</w:t>
+            </w:r>
+          </w:p>
+        </w:tc>
+        <w:tc>
+          <w:tcPr>
+            <w:tcW w:type="dxa" w:w="7838"/>
+            <w:tcBorders>
+              <w:top w:val="single" w:color="D0D7D3" w:sz="4"/>
+              <w:left w:val="single" w:color="D0D7D3" w:sz="4"/>
+              <w:bottom w:val="single" w:color="D0D7D3" w:sz="4"/>
+              <w:right w:val="single" w:color="D0D7D3" w:sz="4"/>
+            </w:tcBorders>
+            <w:shd w:fill="F6F8F7" w:color="auto" w:val="clear"/>
+            <w:tcMar>
+              <w:top w:type="dxa" w:w="80"/>
+              <w:left w:type="dxa" w:w="120"/>
+              <w:bottom w:type="dxa" w:w="80"/>
+              <w:right w:type="dxa" w:w="120"/>
+            </w:tcMar>
+          </w:tcPr>
+          <w:p>
+            <w:r>
+              <w:rPr>
+                <w:b w:val="false"/>
+                <w:bCs w:val="false"/>
+                <w:sz w:val="20"/>
+                <w:szCs w:val="20"/>
+              </w:rPr>
+              <w:t xml:space="preserve">Printable pay cards: each child’s account number in large type and a code to scan and pay, a class at a time</w:t>
+            </w:r>
+          </w:p>
+        </w:tc>
+      </w:tr>
+      <w:tr>
+        <w:tc>
+          <w:tcPr>
+            <w:tcW w:type="dxa" w:w="1800"/>
+            <w:tcBorders>
+              <w:top w:val="single" w:color="D0D7D3" w:sz="4"/>
+              <w:left w:val="single" w:color="D0D7D3" w:sz="4"/>
+              <w:bottom w:val="single" w:color="D0D7D3" w:sz="4"/>
+              <w:right w:val="single" w:color="D0D7D3" w:sz="4"/>
+            </w:tcBorders>
+            <w:tcMar>
+              <w:top w:type="dxa" w:w="80"/>
+              <w:left w:type="dxa" w:w="120"/>
+              <w:bottom w:type="dxa" w:w="80"/>
+              <w:right w:type="dxa" w:w="120"/>
+            </w:tcMar>
+          </w:tcPr>
+          <w:p>
+            <w:r>
+              <w:rPr>
+                <w:b w:val="false"/>
+                <w:bCs w:val="false"/>
+                <w:sz w:val="20"/>
+                <w:szCs w:val="20"/>
+              </w:rPr>
+              <w:t xml:space="preserve">21 Oct 2026</w:t>
+            </w:r>
+          </w:p>
+        </w:tc>
+        <w:tc>
+          <w:tcPr>
+            <w:tcW w:type="dxa" w:w="7838"/>
+            <w:tcBorders>
+              <w:top w:val="single" w:color="D0D7D3" w:sz="4"/>
+              <w:left w:val="single" w:color="D0D7D3" w:sz="4"/>
+              <w:bottom w:val="single" w:color="D0D7D3" w:sz="4"/>
+              <w:right w:val="single" w:color="D0D7D3" w:sz="4"/>
+            </w:tcBorders>
+            <w:tcMar>
+              <w:top w:type="dxa" w:w="80"/>
+              <w:left w:type="dxa" w:w="120"/>
+              <w:bottom w:type="dxa" w:w="80"/>
+              <w:right w:type="dxa" w:w="120"/>
+            </w:tcMar>
+          </w:tcPr>
+          <w:p>
+            <w:r>
+              <w:rPr>
+                <w:b w:val="false"/>
+                <w:bCs w:val="false"/>
+                <w:sz w:val="20"/>
+                <w:szCs w:val="20"/>
+              </w:rPr>
+              <w:t xml:space="preserve">The school year comes filled in with the usual term dates; check them and create it in one click</w:t>
             </w:r>
           </w:p>
         </w:tc>

</xml_diff>

<commit_message>
A fee added to a class goes onto every bill in that class as soon as it's saved
Owner's rule (2026-10-21): when a fee is added to a class in the fee grid
after the term's bills went out (WAEC for SSS 3), every current pupil's bill
in that class gets it straight away, in the same transaction as the save.
Exempt pupils and optional fees a pupil hasn't taken are left out.

- charges.save_schedule saves the grid and adds missing fees to sent bills;
  PUT /terms/{id}/fee-schedule returns the entries and what was added
- The Fees page says what went onto which bills; no confirmation pop-up
- The statement-count test now measures the save itself (3 vs 18 bills)
</commit_message>
<xml_diff>
--- a/docs/product/ParentPay - what it does.docx
+++ b/docs/product/ParentPay - what it does.docx
@@ -4790,6 +4790,64 @@
                 <w:sz w:val="20"/>
                 <w:szCs w:val="20"/>
               </w:rPr>
+              <w:t xml:space="preserve">A fee added to a class after billing (e.g. WAEC for SSS 3) goes straight onto every pupil’s bill in that class</w:t>
+            </w:r>
+          </w:p>
+        </w:tc>
+      </w:tr>
+      <w:tr>
+        <w:tc>
+          <w:tcPr>
+            <w:tcW w:type="dxa" w:w="1800"/>
+            <w:tcBorders>
+              <w:top w:val="single" w:color="D0D7D3" w:sz="4"/>
+              <w:left w:val="single" w:color="D0D7D3" w:sz="4"/>
+              <w:bottom w:val="single" w:color="D0D7D3" w:sz="4"/>
+              <w:right w:val="single" w:color="D0D7D3" w:sz="4"/>
+            </w:tcBorders>
+            <w:tcMar>
+              <w:top w:type="dxa" w:w="80"/>
+              <w:left w:type="dxa" w:w="120"/>
+              <w:bottom w:type="dxa" w:w="80"/>
+              <w:right w:type="dxa" w:w="120"/>
+            </w:tcMar>
+          </w:tcPr>
+          <w:p>
+            <w:r>
+              <w:rPr>
+                <w:b w:val="false"/>
+                <w:bCs w:val="false"/>
+                <w:sz w:val="20"/>
+                <w:szCs w:val="20"/>
+              </w:rPr>
+              <w:t xml:space="preserve">21 Oct 2026</w:t>
+            </w:r>
+          </w:p>
+        </w:tc>
+        <w:tc>
+          <w:tcPr>
+            <w:tcW w:type="dxa" w:w="7838"/>
+            <w:tcBorders>
+              <w:top w:val="single" w:color="D0D7D3" w:sz="4"/>
+              <w:left w:val="single" w:color="D0D7D3" w:sz="4"/>
+              <w:bottom w:val="single" w:color="D0D7D3" w:sz="4"/>
+              <w:right w:val="single" w:color="D0D7D3" w:sz="4"/>
+            </w:tcBorders>
+            <w:tcMar>
+              <w:top w:type="dxa" w:w="80"/>
+              <w:left w:type="dxa" w:w="120"/>
+              <w:bottom w:type="dxa" w:w="80"/>
+              <w:right w:type="dxa" w:w="120"/>
+            </w:tcMar>
+          </w:tcPr>
+          <w:p>
+            <w:r>
+              <w:rPr>
+                <w:b w:val="false"/>
+                <w:bCs w:val="false"/>
+                <w:sz w:val="20"/>
+                <w:szCs w:val="20"/>
+              </w:rPr>
               <w:t xml:space="preserve">Printable pay cards: each child’s account number in large type and this term’s fees with what’s left to pay, a class at a time</w:t>
             </w:r>
           </w:p>
@@ -4805,6 +4863,7 @@
               <w:bottom w:val="single" w:color="D0D7D3" w:sz="4"/>
               <w:right w:val="single" w:color="D0D7D3" w:sz="4"/>
             </w:tcBorders>
+            <w:shd w:fill="F6F8F7" w:color="auto" w:val="clear"/>
             <w:tcMar>
               <w:top w:type="dxa" w:w="80"/>
               <w:left w:type="dxa" w:w="120"/>
@@ -4833,6 +4892,7 @@
               <w:bottom w:val="single" w:color="D0D7D3" w:sz="4"/>
               <w:right w:val="single" w:color="D0D7D3" w:sz="4"/>
             </w:tcBorders>
+            <w:shd w:fill="F6F8F7" w:color="auto" w:val="clear"/>
             <w:tcMar>
               <w:top w:type="dxa" w:w="80"/>
               <w:left w:type="dxa" w:w="120"/>
@@ -4863,7 +4923,6 @@
               <w:bottom w:val="single" w:color="D0D7D3" w:sz="4"/>
               <w:right w:val="single" w:color="D0D7D3" w:sz="4"/>
             </w:tcBorders>
-            <w:shd w:fill="F6F8F7" w:color="auto" w:val="clear"/>
             <w:tcMar>
               <w:top w:type="dxa" w:w="80"/>
               <w:left w:type="dxa" w:w="120"/>
@@ -4892,7 +4951,6 @@
               <w:bottom w:val="single" w:color="D0D7D3" w:sz="4"/>
               <w:right w:val="single" w:color="D0D7D3" w:sz="4"/>
             </w:tcBorders>
-            <w:shd w:fill="F6F8F7" w:color="auto" w:val="clear"/>
             <w:tcMar>
               <w:top w:type="dxa" w:w="80"/>
               <w:left w:type="dxa" w:w="120"/>
@@ -4923,6 +4981,7 @@
               <w:bottom w:val="single" w:color="D0D7D3" w:sz="4"/>
               <w:right w:val="single" w:color="D0D7D3" w:sz="4"/>
             </w:tcBorders>
+            <w:shd w:fill="F6F8F7" w:color="auto" w:val="clear"/>
             <w:tcMar>
               <w:top w:type="dxa" w:w="80"/>
               <w:left w:type="dxa" w:w="120"/>
@@ -4951,6 +5010,7 @@
               <w:bottom w:val="single" w:color="D0D7D3" w:sz="4"/>
               <w:right w:val="single" w:color="D0D7D3" w:sz="4"/>
             </w:tcBorders>
+            <w:shd w:fill="F6F8F7" w:color="auto" w:val="clear"/>
             <w:tcMar>
               <w:top w:type="dxa" w:w="80"/>
               <w:left w:type="dxa" w:w="120"/>
@@ -4981,7 +5041,6 @@
               <w:bottom w:val="single" w:color="D0D7D3" w:sz="4"/>
               <w:right w:val="single" w:color="D0D7D3" w:sz="4"/>
             </w:tcBorders>
-            <w:shd w:fill="F6F8F7" w:color="auto" w:val="clear"/>
             <w:tcMar>
               <w:top w:type="dxa" w:w="80"/>
               <w:left w:type="dxa" w:w="120"/>
@@ -5010,7 +5069,6 @@
               <w:bottom w:val="single" w:color="D0D7D3" w:sz="4"/>
               <w:right w:val="single" w:color="D0D7D3" w:sz="4"/>
             </w:tcBorders>
-            <w:shd w:fill="F6F8F7" w:color="auto" w:val="clear"/>
             <w:tcMar>
               <w:top w:type="dxa" w:w="80"/>
               <w:left w:type="dxa" w:w="120"/>
@@ -5041,6 +5099,7 @@
               <w:bottom w:val="single" w:color="D0D7D3" w:sz="4"/>
               <w:right w:val="single" w:color="D0D7D3" w:sz="4"/>
             </w:tcBorders>
+            <w:shd w:fill="F6F8F7" w:color="auto" w:val="clear"/>
             <w:tcMar>
               <w:top w:type="dxa" w:w="80"/>
               <w:left w:type="dxa" w:w="120"/>
@@ -5069,6 +5128,7 @@
               <w:bottom w:val="single" w:color="D0D7D3" w:sz="4"/>
               <w:right w:val="single" w:color="D0D7D3" w:sz="4"/>
             </w:tcBorders>
+            <w:shd w:fill="F6F8F7" w:color="auto" w:val="clear"/>
             <w:tcMar>
               <w:top w:type="dxa" w:w="80"/>
               <w:left w:type="dxa" w:w="120"/>
@@ -5099,7 +5159,6 @@
               <w:bottom w:val="single" w:color="D0D7D3" w:sz="4"/>
               <w:right w:val="single" w:color="D0D7D3" w:sz="4"/>
             </w:tcBorders>
-            <w:shd w:fill="F6F8F7" w:color="auto" w:val="clear"/>
             <w:tcMar>
               <w:top w:type="dxa" w:w="80"/>
               <w:left w:type="dxa" w:w="120"/>
@@ -5128,7 +5187,6 @@
               <w:bottom w:val="single" w:color="D0D7D3" w:sz="4"/>
               <w:right w:val="single" w:color="D0D7D3" w:sz="4"/>
             </w:tcBorders>
-            <w:shd w:fill="F6F8F7" w:color="auto" w:val="clear"/>
             <w:tcMar>
               <w:top w:type="dxa" w:w="80"/>
               <w:left w:type="dxa" w:w="120"/>
@@ -5159,6 +5217,7 @@
               <w:bottom w:val="single" w:color="D0D7D3" w:sz="4"/>
               <w:right w:val="single" w:color="D0D7D3" w:sz="4"/>
             </w:tcBorders>
+            <w:shd w:fill="F6F8F7" w:color="auto" w:val="clear"/>
             <w:tcMar>
               <w:top w:type="dxa" w:w="80"/>
               <w:left w:type="dxa" w:w="120"/>
@@ -5187,6 +5246,7 @@
               <w:bottom w:val="single" w:color="D0D7D3" w:sz="4"/>
               <w:right w:val="single" w:color="D0D7D3" w:sz="4"/>
             </w:tcBorders>
+            <w:shd w:fill="F6F8F7" w:color="auto" w:val="clear"/>
             <w:tcMar>
               <w:top w:type="dxa" w:w="80"/>
               <w:left w:type="dxa" w:w="120"/>
@@ -5217,7 +5277,6 @@
               <w:bottom w:val="single" w:color="D0D7D3" w:sz="4"/>
               <w:right w:val="single" w:color="D0D7D3" w:sz="4"/>
             </w:tcBorders>
-            <w:shd w:fill="F6F8F7" w:color="auto" w:val="clear"/>
             <w:tcMar>
               <w:top w:type="dxa" w:w="80"/>
               <w:left w:type="dxa" w:w="120"/>
@@ -5246,7 +5305,6 @@
               <w:bottom w:val="single" w:color="D0D7D3" w:sz="4"/>
               <w:right w:val="single" w:color="D0D7D3" w:sz="4"/>
             </w:tcBorders>
-            <w:shd w:fill="F6F8F7" w:color="auto" w:val="clear"/>
             <w:tcMar>
               <w:top w:type="dxa" w:w="80"/>
               <w:left w:type="dxa" w:w="120"/>
@@ -5277,6 +5335,7 @@
               <w:bottom w:val="single" w:color="D0D7D3" w:sz="4"/>
               <w:right w:val="single" w:color="D0D7D3" w:sz="4"/>
             </w:tcBorders>
+            <w:shd w:fill="F6F8F7" w:color="auto" w:val="clear"/>
             <w:tcMar>
               <w:top w:type="dxa" w:w="80"/>
               <w:left w:type="dxa" w:w="120"/>
@@ -5305,6 +5364,7 @@
               <w:bottom w:val="single" w:color="D0D7D3" w:sz="4"/>
               <w:right w:val="single" w:color="D0D7D3" w:sz="4"/>
             </w:tcBorders>
+            <w:shd w:fill="F6F8F7" w:color="auto" w:val="clear"/>
             <w:tcMar>
               <w:top w:type="dxa" w:w="80"/>
               <w:left w:type="dxa" w:w="120"/>
@@ -5335,7 +5395,6 @@
               <w:bottom w:val="single" w:color="D0D7D3" w:sz="4"/>
               <w:right w:val="single" w:color="D0D7D3" w:sz="4"/>
             </w:tcBorders>
-            <w:shd w:fill="F6F8F7" w:color="auto" w:val="clear"/>
             <w:tcMar>
               <w:top w:type="dxa" w:w="80"/>
               <w:left w:type="dxa" w:w="120"/>
@@ -5364,7 +5423,6 @@
               <w:bottom w:val="single" w:color="D0D7D3" w:sz="4"/>
               <w:right w:val="single" w:color="D0D7D3" w:sz="4"/>
             </w:tcBorders>
-            <w:shd w:fill="F6F8F7" w:color="auto" w:val="clear"/>
             <w:tcMar>
               <w:top w:type="dxa" w:w="80"/>
               <w:left w:type="dxa" w:w="120"/>
@@ -5395,6 +5453,7 @@
               <w:bottom w:val="single" w:color="D0D7D3" w:sz="4"/>
               <w:right w:val="single" w:color="D0D7D3" w:sz="4"/>
             </w:tcBorders>
+            <w:shd w:fill="F6F8F7" w:color="auto" w:val="clear"/>
             <w:tcMar>
               <w:top w:type="dxa" w:w="80"/>
               <w:left w:type="dxa" w:w="120"/>
@@ -5423,6 +5482,7 @@
               <w:bottom w:val="single" w:color="D0D7D3" w:sz="4"/>
               <w:right w:val="single" w:color="D0D7D3" w:sz="4"/>
             </w:tcBorders>
+            <w:shd w:fill="F6F8F7" w:color="auto" w:val="clear"/>
             <w:tcMar>
               <w:top w:type="dxa" w:w="80"/>
               <w:left w:type="dxa" w:w="120"/>
@@ -5453,7 +5513,6 @@
               <w:bottom w:val="single" w:color="D0D7D3" w:sz="4"/>
               <w:right w:val="single" w:color="D0D7D3" w:sz="4"/>
             </w:tcBorders>
-            <w:shd w:fill="F6F8F7" w:color="auto" w:val="clear"/>
             <w:tcMar>
               <w:top w:type="dxa" w:w="80"/>
               <w:left w:type="dxa" w:w="120"/>
@@ -5482,7 +5541,6 @@
               <w:bottom w:val="single" w:color="D0D7D3" w:sz="4"/>
               <w:right w:val="single" w:color="D0D7D3" w:sz="4"/>
             </w:tcBorders>
-            <w:shd w:fill="F6F8F7" w:color="auto" w:val="clear"/>
             <w:tcMar>
               <w:top w:type="dxa" w:w="80"/>
               <w:left w:type="dxa" w:w="120"/>
@@ -5513,6 +5571,7 @@
               <w:bottom w:val="single" w:color="D0D7D3" w:sz="4"/>
               <w:right w:val="single" w:color="D0D7D3" w:sz="4"/>
             </w:tcBorders>
+            <w:shd w:fill="F6F8F7" w:color="auto" w:val="clear"/>
             <w:tcMar>
               <w:top w:type="dxa" w:w="80"/>
               <w:left w:type="dxa" w:w="120"/>
@@ -5541,6 +5600,7 @@
               <w:bottom w:val="single" w:color="D0D7D3" w:sz="4"/>
               <w:right w:val="single" w:color="D0D7D3" w:sz="4"/>
             </w:tcBorders>
+            <w:shd w:fill="F6F8F7" w:color="auto" w:val="clear"/>
             <w:tcMar>
               <w:top w:type="dxa" w:w="80"/>
               <w:left w:type="dxa" w:w="120"/>
@@ -5571,7 +5631,6 @@
               <w:bottom w:val="single" w:color="D0D7D3" w:sz="4"/>
               <w:right w:val="single" w:color="D0D7D3" w:sz="4"/>
             </w:tcBorders>
-            <w:shd w:fill="F6F8F7" w:color="auto" w:val="clear"/>
             <w:tcMar>
               <w:top w:type="dxa" w:w="80"/>
               <w:left w:type="dxa" w:w="120"/>
@@ -5600,7 +5659,6 @@
               <w:bottom w:val="single" w:color="D0D7D3" w:sz="4"/>
               <w:right w:val="single" w:color="D0D7D3" w:sz="4"/>
             </w:tcBorders>
-            <w:shd w:fill="F6F8F7" w:color="auto" w:val="clear"/>
             <w:tcMar>
               <w:top w:type="dxa" w:w="80"/>
               <w:left w:type="dxa" w:w="120"/>
@@ -5631,6 +5689,7 @@
               <w:bottom w:val="single" w:color="D0D7D3" w:sz="4"/>
               <w:right w:val="single" w:color="D0D7D3" w:sz="4"/>
             </w:tcBorders>
+            <w:shd w:fill="F6F8F7" w:color="auto" w:val="clear"/>
             <w:tcMar>
               <w:top w:type="dxa" w:w="80"/>
               <w:left w:type="dxa" w:w="120"/>
@@ -5659,6 +5718,7 @@
               <w:bottom w:val="single" w:color="D0D7D3" w:sz="4"/>
               <w:right w:val="single" w:color="D0D7D3" w:sz="4"/>
             </w:tcBorders>
+            <w:shd w:fill="F6F8F7" w:color="auto" w:val="clear"/>
             <w:tcMar>
               <w:top w:type="dxa" w:w="80"/>
               <w:left w:type="dxa" w:w="120"/>
@@ -5689,7 +5749,6 @@
               <w:bottom w:val="single" w:color="D0D7D3" w:sz="4"/>
               <w:right w:val="single" w:color="D0D7D3" w:sz="4"/>
             </w:tcBorders>
-            <w:shd w:fill="F6F8F7" w:color="auto" w:val="clear"/>
             <w:tcMar>
               <w:top w:type="dxa" w:w="80"/>
               <w:left w:type="dxa" w:w="120"/>
@@ -5718,7 +5777,6 @@
               <w:bottom w:val="single" w:color="D0D7D3" w:sz="4"/>
               <w:right w:val="single" w:color="D0D7D3" w:sz="4"/>
             </w:tcBorders>
-            <w:shd w:fill="F6F8F7" w:color="auto" w:val="clear"/>
             <w:tcMar>
               <w:top w:type="dxa" w:w="80"/>
               <w:left w:type="dxa" w:w="120"/>
@@ -5749,6 +5807,7 @@
               <w:bottom w:val="single" w:color="D0D7D3" w:sz="4"/>
               <w:right w:val="single" w:color="D0D7D3" w:sz="4"/>
             </w:tcBorders>
+            <w:shd w:fill="F6F8F7" w:color="auto" w:val="clear"/>
             <w:tcMar>
               <w:top w:type="dxa" w:w="80"/>
               <w:left w:type="dxa" w:w="120"/>
@@ -5777,6 +5836,7 @@
               <w:bottom w:val="single" w:color="D0D7D3" w:sz="4"/>
               <w:right w:val="single" w:color="D0D7D3" w:sz="4"/>
             </w:tcBorders>
+            <w:shd w:fill="F6F8F7" w:color="auto" w:val="clear"/>
             <w:tcMar>
               <w:top w:type="dxa" w:w="80"/>
               <w:left w:type="dxa" w:w="120"/>
@@ -5807,7 +5867,6 @@
               <w:bottom w:val="single" w:color="D0D7D3" w:sz="4"/>
               <w:right w:val="single" w:color="D0D7D3" w:sz="4"/>
             </w:tcBorders>
-            <w:shd w:fill="F6F8F7" w:color="auto" w:val="clear"/>
             <w:tcMar>
               <w:top w:type="dxa" w:w="80"/>
               <w:left w:type="dxa" w:w="120"/>
@@ -5836,7 +5895,6 @@
               <w:bottom w:val="single" w:color="D0D7D3" w:sz="4"/>
               <w:right w:val="single" w:color="D0D7D3" w:sz="4"/>
             </w:tcBorders>
-            <w:shd w:fill="F6F8F7" w:color="auto" w:val="clear"/>
             <w:tcMar>
               <w:top w:type="dxa" w:w="80"/>
               <w:left w:type="dxa" w:w="120"/>
@@ -5867,6 +5925,7 @@
               <w:bottom w:val="single" w:color="D0D7D3" w:sz="4"/>
               <w:right w:val="single" w:color="D0D7D3" w:sz="4"/>
             </w:tcBorders>
+            <w:shd w:fill="F6F8F7" w:color="auto" w:val="clear"/>
             <w:tcMar>
               <w:top w:type="dxa" w:w="80"/>
               <w:left w:type="dxa" w:w="120"/>
@@ -5895,6 +5954,7 @@
               <w:bottom w:val="single" w:color="D0D7D3" w:sz="4"/>
               <w:right w:val="single" w:color="D0D7D3" w:sz="4"/>
             </w:tcBorders>
+            <w:shd w:fill="F6F8F7" w:color="auto" w:val="clear"/>
             <w:tcMar>
               <w:top w:type="dxa" w:w="80"/>
               <w:left w:type="dxa" w:w="120"/>

</xml_diff>

<commit_message>
Mark a payment for fees after it arrived
When a parent says what an unmarked payment was for ("that transfer was for
the PTA levy"), staff tick the fees on the Payments page. The money the
payment put on each bill is placed against those fees, up to what each is
still open for; the rest stays unmarked (tuition first). Only which fees
show as paid changes: allocation, balances and the receipt stay as they
were.

- POST /payments/{id}/fees (payments.record), audited as
  payments.marked_for_fees; marks are append-only, so once per payment and
  only if it had none; reversals and reversed payments are refused
- Payments carry for_fees (one batched query); the list shows 'For: ...'
</commit_message>
<xml_diff>
--- a/docs/product/ParentPay - what it does.docx
+++ b/docs/product/ParentPay - what it does.docx
@@ -4790,6 +4790,64 @@
                 <w:sz w:val="20"/>
                 <w:szCs w:val="20"/>
               </w:rPr>
+              <w:t xml:space="preserve">Money that doesn’t say what it’s for covers tuition first; a payment can be marked afterwards for the fee the parent meant (e.g. PTA)</w:t>
+            </w:r>
+          </w:p>
+        </w:tc>
+      </w:tr>
+      <w:tr>
+        <w:tc>
+          <w:tcPr>
+            <w:tcW w:type="dxa" w:w="1800"/>
+            <w:tcBorders>
+              <w:top w:val="single" w:color="D0D7D3" w:sz="4"/>
+              <w:left w:val="single" w:color="D0D7D3" w:sz="4"/>
+              <w:bottom w:val="single" w:color="D0D7D3" w:sz="4"/>
+              <w:right w:val="single" w:color="D0D7D3" w:sz="4"/>
+            </w:tcBorders>
+            <w:tcMar>
+              <w:top w:type="dxa" w:w="80"/>
+              <w:left w:type="dxa" w:w="120"/>
+              <w:bottom w:type="dxa" w:w="80"/>
+              <w:right w:type="dxa" w:w="120"/>
+            </w:tcMar>
+          </w:tcPr>
+          <w:p>
+            <w:r>
+              <w:rPr>
+                <w:b w:val="false"/>
+                <w:bCs w:val="false"/>
+                <w:sz w:val="20"/>
+                <w:szCs w:val="20"/>
+              </w:rPr>
+              <w:t xml:space="preserve">21 Oct 2026</w:t>
+            </w:r>
+          </w:p>
+        </w:tc>
+        <w:tc>
+          <w:tcPr>
+            <w:tcW w:type="dxa" w:w="7838"/>
+            <w:tcBorders>
+              <w:top w:val="single" w:color="D0D7D3" w:sz="4"/>
+              <w:left w:val="single" w:color="D0D7D3" w:sz="4"/>
+              <w:bottom w:val="single" w:color="D0D7D3" w:sz="4"/>
+              <w:right w:val="single" w:color="D0D7D3" w:sz="4"/>
+            </w:tcBorders>
+            <w:tcMar>
+              <w:top w:type="dxa" w:w="80"/>
+              <w:left w:type="dxa" w:w="120"/>
+              <w:bottom w:type="dxa" w:w="80"/>
+              <w:right w:type="dxa" w:w="120"/>
+            </w:tcMar>
+          </w:tcPr>
+          <w:p>
+            <w:r>
+              <w:rPr>
+                <w:b w:val="false"/>
+                <w:bCs w:val="false"/>
+                <w:sz w:val="20"/>
+                <w:szCs w:val="20"/>
+              </w:rPr>
               <w:t xml:space="preserve">A fee added to a class after billing (e.g. WAEC for SSS 3) goes straight onto every pupil’s bill in that class</w:t>
             </w:r>
           </w:p>
@@ -4805,6 +4863,7 @@
               <w:bottom w:val="single" w:color="D0D7D3" w:sz="4"/>
               <w:right w:val="single" w:color="D0D7D3" w:sz="4"/>
             </w:tcBorders>
+            <w:shd w:fill="F6F8F7" w:color="auto" w:val="clear"/>
             <w:tcMar>
               <w:top w:type="dxa" w:w="80"/>
               <w:left w:type="dxa" w:w="120"/>
@@ -4833,6 +4892,7 @@
               <w:bottom w:val="single" w:color="D0D7D3" w:sz="4"/>
               <w:right w:val="single" w:color="D0D7D3" w:sz="4"/>
             </w:tcBorders>
+            <w:shd w:fill="F6F8F7" w:color="auto" w:val="clear"/>
             <w:tcMar>
               <w:top w:type="dxa" w:w="80"/>
               <w:left w:type="dxa" w:w="120"/>
@@ -4863,7 +4923,6 @@
               <w:bottom w:val="single" w:color="D0D7D3" w:sz="4"/>
               <w:right w:val="single" w:color="D0D7D3" w:sz="4"/>
             </w:tcBorders>
-            <w:shd w:fill="F6F8F7" w:color="auto" w:val="clear"/>
             <w:tcMar>
               <w:top w:type="dxa" w:w="80"/>
               <w:left w:type="dxa" w:w="120"/>
@@ -4892,7 +4951,6 @@
               <w:bottom w:val="single" w:color="D0D7D3" w:sz="4"/>
               <w:right w:val="single" w:color="D0D7D3" w:sz="4"/>
             </w:tcBorders>
-            <w:shd w:fill="F6F8F7" w:color="auto" w:val="clear"/>
             <w:tcMar>
               <w:top w:type="dxa" w:w="80"/>
               <w:left w:type="dxa" w:w="120"/>
@@ -4923,6 +4981,7 @@
               <w:bottom w:val="single" w:color="D0D7D3" w:sz="4"/>
               <w:right w:val="single" w:color="D0D7D3" w:sz="4"/>
             </w:tcBorders>
+            <w:shd w:fill="F6F8F7" w:color="auto" w:val="clear"/>
             <w:tcMar>
               <w:top w:type="dxa" w:w="80"/>
               <w:left w:type="dxa" w:w="120"/>
@@ -4951,6 +5010,7 @@
               <w:bottom w:val="single" w:color="D0D7D3" w:sz="4"/>
               <w:right w:val="single" w:color="D0D7D3" w:sz="4"/>
             </w:tcBorders>
+            <w:shd w:fill="F6F8F7" w:color="auto" w:val="clear"/>
             <w:tcMar>
               <w:top w:type="dxa" w:w="80"/>
               <w:left w:type="dxa" w:w="120"/>
@@ -4981,7 +5041,6 @@
               <w:bottom w:val="single" w:color="D0D7D3" w:sz="4"/>
               <w:right w:val="single" w:color="D0D7D3" w:sz="4"/>
             </w:tcBorders>
-            <w:shd w:fill="F6F8F7" w:color="auto" w:val="clear"/>
             <w:tcMar>
               <w:top w:type="dxa" w:w="80"/>
               <w:left w:type="dxa" w:w="120"/>
@@ -5010,7 +5069,6 @@
               <w:bottom w:val="single" w:color="D0D7D3" w:sz="4"/>
               <w:right w:val="single" w:color="D0D7D3" w:sz="4"/>
             </w:tcBorders>
-            <w:shd w:fill="F6F8F7" w:color="auto" w:val="clear"/>
             <w:tcMar>
               <w:top w:type="dxa" w:w="80"/>
               <w:left w:type="dxa" w:w="120"/>
@@ -5041,6 +5099,7 @@
               <w:bottom w:val="single" w:color="D0D7D3" w:sz="4"/>
               <w:right w:val="single" w:color="D0D7D3" w:sz="4"/>
             </w:tcBorders>
+            <w:shd w:fill="F6F8F7" w:color="auto" w:val="clear"/>
             <w:tcMar>
               <w:top w:type="dxa" w:w="80"/>
               <w:left w:type="dxa" w:w="120"/>
@@ -5069,6 +5128,7 @@
               <w:bottom w:val="single" w:color="D0D7D3" w:sz="4"/>
               <w:right w:val="single" w:color="D0D7D3" w:sz="4"/>
             </w:tcBorders>
+            <w:shd w:fill="F6F8F7" w:color="auto" w:val="clear"/>
             <w:tcMar>
               <w:top w:type="dxa" w:w="80"/>
               <w:left w:type="dxa" w:w="120"/>
@@ -5099,7 +5159,6 @@
               <w:bottom w:val="single" w:color="D0D7D3" w:sz="4"/>
               <w:right w:val="single" w:color="D0D7D3" w:sz="4"/>
             </w:tcBorders>
-            <w:shd w:fill="F6F8F7" w:color="auto" w:val="clear"/>
             <w:tcMar>
               <w:top w:type="dxa" w:w="80"/>
               <w:left w:type="dxa" w:w="120"/>
@@ -5128,7 +5187,6 @@
               <w:bottom w:val="single" w:color="D0D7D3" w:sz="4"/>
               <w:right w:val="single" w:color="D0D7D3" w:sz="4"/>
             </w:tcBorders>
-            <w:shd w:fill="F6F8F7" w:color="auto" w:val="clear"/>
             <w:tcMar>
               <w:top w:type="dxa" w:w="80"/>
               <w:left w:type="dxa" w:w="120"/>
@@ -5159,6 +5217,7 @@
               <w:bottom w:val="single" w:color="D0D7D3" w:sz="4"/>
               <w:right w:val="single" w:color="D0D7D3" w:sz="4"/>
             </w:tcBorders>
+            <w:shd w:fill="F6F8F7" w:color="auto" w:val="clear"/>
             <w:tcMar>
               <w:top w:type="dxa" w:w="80"/>
               <w:left w:type="dxa" w:w="120"/>
@@ -5187,6 +5246,7 @@
               <w:bottom w:val="single" w:color="D0D7D3" w:sz="4"/>
               <w:right w:val="single" w:color="D0D7D3" w:sz="4"/>
             </w:tcBorders>
+            <w:shd w:fill="F6F8F7" w:color="auto" w:val="clear"/>
             <w:tcMar>
               <w:top w:type="dxa" w:w="80"/>
               <w:left w:type="dxa" w:w="120"/>
@@ -5217,7 +5277,6 @@
               <w:bottom w:val="single" w:color="D0D7D3" w:sz="4"/>
               <w:right w:val="single" w:color="D0D7D3" w:sz="4"/>
             </w:tcBorders>
-            <w:shd w:fill="F6F8F7" w:color="auto" w:val="clear"/>
             <w:tcMar>
               <w:top w:type="dxa" w:w="80"/>
               <w:left w:type="dxa" w:w="120"/>
@@ -5246,7 +5305,6 @@
               <w:bottom w:val="single" w:color="D0D7D3" w:sz="4"/>
               <w:right w:val="single" w:color="D0D7D3" w:sz="4"/>
             </w:tcBorders>
-            <w:shd w:fill="F6F8F7" w:color="auto" w:val="clear"/>
             <w:tcMar>
               <w:top w:type="dxa" w:w="80"/>
               <w:left w:type="dxa" w:w="120"/>
@@ -5277,6 +5335,7 @@
               <w:bottom w:val="single" w:color="D0D7D3" w:sz="4"/>
               <w:right w:val="single" w:color="D0D7D3" w:sz="4"/>
             </w:tcBorders>
+            <w:shd w:fill="F6F8F7" w:color="auto" w:val="clear"/>
             <w:tcMar>
               <w:top w:type="dxa" w:w="80"/>
               <w:left w:type="dxa" w:w="120"/>
@@ -5305,6 +5364,7 @@
               <w:bottom w:val="single" w:color="D0D7D3" w:sz="4"/>
               <w:right w:val="single" w:color="D0D7D3" w:sz="4"/>
             </w:tcBorders>
+            <w:shd w:fill="F6F8F7" w:color="auto" w:val="clear"/>
             <w:tcMar>
               <w:top w:type="dxa" w:w="80"/>
               <w:left w:type="dxa" w:w="120"/>
@@ -5335,7 +5395,6 @@
               <w:bottom w:val="single" w:color="D0D7D3" w:sz="4"/>
               <w:right w:val="single" w:color="D0D7D3" w:sz="4"/>
             </w:tcBorders>
-            <w:shd w:fill="F6F8F7" w:color="auto" w:val="clear"/>
             <w:tcMar>
               <w:top w:type="dxa" w:w="80"/>
               <w:left w:type="dxa" w:w="120"/>
@@ -5364,7 +5423,6 @@
               <w:bottom w:val="single" w:color="D0D7D3" w:sz="4"/>
               <w:right w:val="single" w:color="D0D7D3" w:sz="4"/>
             </w:tcBorders>
-            <w:shd w:fill="F6F8F7" w:color="auto" w:val="clear"/>
             <w:tcMar>
               <w:top w:type="dxa" w:w="80"/>
               <w:left w:type="dxa" w:w="120"/>
@@ -5395,6 +5453,7 @@
               <w:bottom w:val="single" w:color="D0D7D3" w:sz="4"/>
               <w:right w:val="single" w:color="D0D7D3" w:sz="4"/>
             </w:tcBorders>
+            <w:shd w:fill="F6F8F7" w:color="auto" w:val="clear"/>
             <w:tcMar>
               <w:top w:type="dxa" w:w="80"/>
               <w:left w:type="dxa" w:w="120"/>
@@ -5423,6 +5482,7 @@
               <w:bottom w:val="single" w:color="D0D7D3" w:sz="4"/>
               <w:right w:val="single" w:color="D0D7D3" w:sz="4"/>
             </w:tcBorders>
+            <w:shd w:fill="F6F8F7" w:color="auto" w:val="clear"/>
             <w:tcMar>
               <w:top w:type="dxa" w:w="80"/>
               <w:left w:type="dxa" w:w="120"/>
@@ -5453,7 +5513,6 @@
               <w:bottom w:val="single" w:color="D0D7D3" w:sz="4"/>
               <w:right w:val="single" w:color="D0D7D3" w:sz="4"/>
             </w:tcBorders>
-            <w:shd w:fill="F6F8F7" w:color="auto" w:val="clear"/>
             <w:tcMar>
               <w:top w:type="dxa" w:w="80"/>
               <w:left w:type="dxa" w:w="120"/>
@@ -5482,7 +5541,6 @@
               <w:bottom w:val="single" w:color="D0D7D3" w:sz="4"/>
               <w:right w:val="single" w:color="D0D7D3" w:sz="4"/>
             </w:tcBorders>
-            <w:shd w:fill="F6F8F7" w:color="auto" w:val="clear"/>
             <w:tcMar>
               <w:top w:type="dxa" w:w="80"/>
               <w:left w:type="dxa" w:w="120"/>
@@ -5513,6 +5571,7 @@
               <w:bottom w:val="single" w:color="D0D7D3" w:sz="4"/>
               <w:right w:val="single" w:color="D0D7D3" w:sz="4"/>
             </w:tcBorders>
+            <w:shd w:fill="F6F8F7" w:color="auto" w:val="clear"/>
             <w:tcMar>
               <w:top w:type="dxa" w:w="80"/>
               <w:left w:type="dxa" w:w="120"/>
@@ -5541,6 +5600,7 @@
               <w:bottom w:val="single" w:color="D0D7D3" w:sz="4"/>
               <w:right w:val="single" w:color="D0D7D3" w:sz="4"/>
             </w:tcBorders>
+            <w:shd w:fill="F6F8F7" w:color="auto" w:val="clear"/>
             <w:tcMar>
               <w:top w:type="dxa" w:w="80"/>
               <w:left w:type="dxa" w:w="120"/>
@@ -5571,7 +5631,6 @@
               <w:bottom w:val="single" w:color="D0D7D3" w:sz="4"/>
               <w:right w:val="single" w:color="D0D7D3" w:sz="4"/>
             </w:tcBorders>
-            <w:shd w:fill="F6F8F7" w:color="auto" w:val="clear"/>
             <w:tcMar>
               <w:top w:type="dxa" w:w="80"/>
               <w:left w:type="dxa" w:w="120"/>
@@ -5600,7 +5659,6 @@
               <w:bottom w:val="single" w:color="D0D7D3" w:sz="4"/>
               <w:right w:val="single" w:color="D0D7D3" w:sz="4"/>
             </w:tcBorders>
-            <w:shd w:fill="F6F8F7" w:color="auto" w:val="clear"/>
             <w:tcMar>
               <w:top w:type="dxa" w:w="80"/>
               <w:left w:type="dxa" w:w="120"/>
@@ -5631,6 +5689,7 @@
               <w:bottom w:val="single" w:color="D0D7D3" w:sz="4"/>
               <w:right w:val="single" w:color="D0D7D3" w:sz="4"/>
             </w:tcBorders>
+            <w:shd w:fill="F6F8F7" w:color="auto" w:val="clear"/>
             <w:tcMar>
               <w:top w:type="dxa" w:w="80"/>
               <w:left w:type="dxa" w:w="120"/>
@@ -5659,6 +5718,7 @@
               <w:bottom w:val="single" w:color="D0D7D3" w:sz="4"/>
               <w:right w:val="single" w:color="D0D7D3" w:sz="4"/>
             </w:tcBorders>
+            <w:shd w:fill="F6F8F7" w:color="auto" w:val="clear"/>
             <w:tcMar>
               <w:top w:type="dxa" w:w="80"/>
               <w:left w:type="dxa" w:w="120"/>
@@ -5689,7 +5749,6 @@
               <w:bottom w:val="single" w:color="D0D7D3" w:sz="4"/>
               <w:right w:val="single" w:color="D0D7D3" w:sz="4"/>
             </w:tcBorders>
-            <w:shd w:fill="F6F8F7" w:color="auto" w:val="clear"/>
             <w:tcMar>
               <w:top w:type="dxa" w:w="80"/>
               <w:left w:type="dxa" w:w="120"/>
@@ -5718,7 +5777,6 @@
               <w:bottom w:val="single" w:color="D0D7D3" w:sz="4"/>
               <w:right w:val="single" w:color="D0D7D3" w:sz="4"/>
             </w:tcBorders>
-            <w:shd w:fill="F6F8F7" w:color="auto" w:val="clear"/>
             <w:tcMar>
               <w:top w:type="dxa" w:w="80"/>
               <w:left w:type="dxa" w:w="120"/>
@@ -5749,6 +5807,7 @@
               <w:bottom w:val="single" w:color="D0D7D3" w:sz="4"/>
               <w:right w:val="single" w:color="D0D7D3" w:sz="4"/>
             </w:tcBorders>
+            <w:shd w:fill="F6F8F7" w:color="auto" w:val="clear"/>
             <w:tcMar>
               <w:top w:type="dxa" w:w="80"/>
               <w:left w:type="dxa" w:w="120"/>
@@ -5777,6 +5836,7 @@
               <w:bottom w:val="single" w:color="D0D7D3" w:sz="4"/>
               <w:right w:val="single" w:color="D0D7D3" w:sz="4"/>
             </w:tcBorders>
+            <w:shd w:fill="F6F8F7" w:color="auto" w:val="clear"/>
             <w:tcMar>
               <w:top w:type="dxa" w:w="80"/>
               <w:left w:type="dxa" w:w="120"/>
@@ -5807,7 +5867,6 @@
               <w:bottom w:val="single" w:color="D0D7D3" w:sz="4"/>
               <w:right w:val="single" w:color="D0D7D3" w:sz="4"/>
             </w:tcBorders>
-            <w:shd w:fill="F6F8F7" w:color="auto" w:val="clear"/>
             <w:tcMar>
               <w:top w:type="dxa" w:w="80"/>
               <w:left w:type="dxa" w:w="120"/>
@@ -5836,7 +5895,6 @@
               <w:bottom w:val="single" w:color="D0D7D3" w:sz="4"/>
               <w:right w:val="single" w:color="D0D7D3" w:sz="4"/>
             </w:tcBorders>
-            <w:shd w:fill="F6F8F7" w:color="auto" w:val="clear"/>
             <w:tcMar>
               <w:top w:type="dxa" w:w="80"/>
               <w:left w:type="dxa" w:w="120"/>
@@ -5867,6 +5925,7 @@
               <w:bottom w:val="single" w:color="D0D7D3" w:sz="4"/>
               <w:right w:val="single" w:color="D0D7D3" w:sz="4"/>
             </w:tcBorders>
+            <w:shd w:fill="F6F8F7" w:color="auto" w:val="clear"/>
             <w:tcMar>
               <w:top w:type="dxa" w:w="80"/>
               <w:left w:type="dxa" w:w="120"/>
@@ -5895,6 +5954,7 @@
               <w:bottom w:val="single" w:color="D0D7D3" w:sz="4"/>
               <w:right w:val="single" w:color="D0D7D3" w:sz="4"/>
             </w:tcBorders>
+            <w:shd w:fill="F6F8F7" w:color="auto" w:val="clear"/>
             <w:tcMar>
               <w:top w:type="dxa" w:w="80"/>
               <w:left w:type="dxa" w:w="120"/>
@@ -5925,7 +5985,6 @@
               <w:bottom w:val="single" w:color="D0D7D3" w:sz="4"/>
               <w:right w:val="single" w:color="D0D7D3" w:sz="4"/>
             </w:tcBorders>
-            <w:shd w:fill="F6F8F7" w:color="auto" w:val="clear"/>
             <w:tcMar>
               <w:top w:type="dxa" w:w="80"/>
               <w:left w:type="dxa" w:w="120"/>
@@ -5954,7 +6013,6 @@
               <w:bottom w:val="single" w:color="D0D7D3" w:sz="4"/>
               <w:right w:val="single" w:color="D0D7D3" w:sz="4"/>
             </w:tcBorders>
-            <w:shd w:fill="F6F8F7" w:color="auto" w:val="clear"/>
             <w:tcMar>
               <w:top w:type="dxa" w:w="80"/>
               <w:left w:type="dxa" w:w="120"/>

</xml_diff>

<commit_message>
Parent portal: one clear page to pay, history and settings a tap away
At the owner's direction (2026-10-22), paying stays on one page for parents
who aren't confident on smartphones:
- The total to pay at the top, then each child in full: what's owed with
  'Pay online', the child's account number with a copy button, the term's
  fees; 'Pay for all your children' stays at the bottom
- Bills and receipts per child are a tap away; message settings, phone
  calls and 'Download my data' moved to a Settings page (gear icon)
- Icons for settings and sign-out in the top bar; fits a 360px phone
</commit_message>
<xml_diff>
--- a/docs/product/ParentPay - what it does.docx
+++ b/docs/product/ParentPay - what it does.docx
@@ -4761,6 +4761,65 @@
                 <w:sz w:val="20"/>
                 <w:szCs w:val="20"/>
               </w:rPr>
+              <w:t xml:space="preserve">22 Oct 2026</w:t>
+            </w:r>
+          </w:p>
+        </w:tc>
+        <w:tc>
+          <w:tcPr>
+            <w:tcW w:type="dxa" w:w="7838"/>
+            <w:tcBorders>
+              <w:top w:val="single" w:color="D0D7D3" w:sz="4"/>
+              <w:left w:val="single" w:color="D0D7D3" w:sz="4"/>
+              <w:bottom w:val="single" w:color="D0D7D3" w:sz="4"/>
+              <w:right w:val="single" w:color="D0D7D3" w:sz="4"/>
+            </w:tcBorders>
+            <w:shd w:fill="F6F8F7" w:color="auto" w:val="clear"/>
+            <w:tcMar>
+              <w:top w:type="dxa" w:w="80"/>
+              <w:left w:type="dxa" w:w="120"/>
+              <w:bottom w:type="dxa" w:w="80"/>
+              <w:right w:type="dxa" w:w="120"/>
+            </w:tcMar>
+          </w:tcPr>
+          <w:p>
+            <w:r>
+              <w:rPr>
+                <w:b w:val="false"/>
+                <w:bCs w:val="false"/>
+                <w:sz w:val="20"/>
+                <w:szCs w:val="20"/>
+              </w:rPr>
+              <w:t xml:space="preserve">Parent portal redesigned: one simple page with the total, each child’s amount, account number and fees, and one button to pay for everyone</w:t>
+            </w:r>
+          </w:p>
+        </w:tc>
+      </w:tr>
+      <w:tr>
+        <w:tc>
+          <w:tcPr>
+            <w:tcW w:type="dxa" w:w="1800"/>
+            <w:tcBorders>
+              <w:top w:val="single" w:color="D0D7D3" w:sz="4"/>
+              <w:left w:val="single" w:color="D0D7D3" w:sz="4"/>
+              <w:bottom w:val="single" w:color="D0D7D3" w:sz="4"/>
+              <w:right w:val="single" w:color="D0D7D3" w:sz="4"/>
+            </w:tcBorders>
+            <w:tcMar>
+              <w:top w:type="dxa" w:w="80"/>
+              <w:left w:type="dxa" w:w="120"/>
+              <w:bottom w:type="dxa" w:w="80"/>
+              <w:right w:type="dxa" w:w="120"/>
+            </w:tcMar>
+          </w:tcPr>
+          <w:p>
+            <w:r>
+              <w:rPr>
+                <w:b w:val="false"/>
+                <w:bCs w:val="false"/>
+                <w:sz w:val="20"/>
+                <w:szCs w:val="20"/>
+              </w:rPr>
               <w:t xml:space="preserve">21 Oct 2026</w:t>
             </w:r>
           </w:p>
@@ -4774,7 +4833,6 @@
               <w:bottom w:val="single" w:color="D0D7D3" w:sz="4"/>
               <w:right w:val="single" w:color="D0D7D3" w:sz="4"/>
             </w:tcBorders>
-            <w:shd w:fill="F6F8F7" w:color="auto" w:val="clear"/>
             <w:tcMar>
               <w:top w:type="dxa" w:w="80"/>
               <w:left w:type="dxa" w:w="120"/>
@@ -4805,6 +4863,7 @@
               <w:bottom w:val="single" w:color="D0D7D3" w:sz="4"/>
               <w:right w:val="single" w:color="D0D7D3" w:sz="4"/>
             </w:tcBorders>
+            <w:shd w:fill="F6F8F7" w:color="auto" w:val="clear"/>
             <w:tcMar>
               <w:top w:type="dxa" w:w="80"/>
               <w:left w:type="dxa" w:w="120"/>
@@ -4833,6 +4892,7 @@
               <w:bottom w:val="single" w:color="D0D7D3" w:sz="4"/>
               <w:right w:val="single" w:color="D0D7D3" w:sz="4"/>
             </w:tcBorders>
+            <w:shd w:fill="F6F8F7" w:color="auto" w:val="clear"/>
             <w:tcMar>
               <w:top w:type="dxa" w:w="80"/>
               <w:left w:type="dxa" w:w="120"/>
@@ -4863,7 +4923,6 @@
               <w:bottom w:val="single" w:color="D0D7D3" w:sz="4"/>
               <w:right w:val="single" w:color="D0D7D3" w:sz="4"/>
             </w:tcBorders>
-            <w:shd w:fill="F6F8F7" w:color="auto" w:val="clear"/>
             <w:tcMar>
               <w:top w:type="dxa" w:w="80"/>
               <w:left w:type="dxa" w:w="120"/>
@@ -4892,7 +4951,6 @@
               <w:bottom w:val="single" w:color="D0D7D3" w:sz="4"/>
               <w:right w:val="single" w:color="D0D7D3" w:sz="4"/>
             </w:tcBorders>
-            <w:shd w:fill="F6F8F7" w:color="auto" w:val="clear"/>
             <w:tcMar>
               <w:top w:type="dxa" w:w="80"/>
               <w:left w:type="dxa" w:w="120"/>
@@ -4923,6 +4981,7 @@
               <w:bottom w:val="single" w:color="D0D7D3" w:sz="4"/>
               <w:right w:val="single" w:color="D0D7D3" w:sz="4"/>
             </w:tcBorders>
+            <w:shd w:fill="F6F8F7" w:color="auto" w:val="clear"/>
             <w:tcMar>
               <w:top w:type="dxa" w:w="80"/>
               <w:left w:type="dxa" w:w="120"/>
@@ -4951,6 +5010,7 @@
               <w:bottom w:val="single" w:color="D0D7D3" w:sz="4"/>
               <w:right w:val="single" w:color="D0D7D3" w:sz="4"/>
             </w:tcBorders>
+            <w:shd w:fill="F6F8F7" w:color="auto" w:val="clear"/>
             <w:tcMar>
               <w:top w:type="dxa" w:w="80"/>
               <w:left w:type="dxa" w:w="120"/>
@@ -4981,7 +5041,6 @@
               <w:bottom w:val="single" w:color="D0D7D3" w:sz="4"/>
               <w:right w:val="single" w:color="D0D7D3" w:sz="4"/>
             </w:tcBorders>
-            <w:shd w:fill="F6F8F7" w:color="auto" w:val="clear"/>
             <w:tcMar>
               <w:top w:type="dxa" w:w="80"/>
               <w:left w:type="dxa" w:w="120"/>
@@ -5010,7 +5069,6 @@
               <w:bottom w:val="single" w:color="D0D7D3" w:sz="4"/>
               <w:right w:val="single" w:color="D0D7D3" w:sz="4"/>
             </w:tcBorders>
-            <w:shd w:fill="F6F8F7" w:color="auto" w:val="clear"/>
             <w:tcMar>
               <w:top w:type="dxa" w:w="80"/>
               <w:left w:type="dxa" w:w="120"/>
@@ -5041,6 +5099,7 @@
               <w:bottom w:val="single" w:color="D0D7D3" w:sz="4"/>
               <w:right w:val="single" w:color="D0D7D3" w:sz="4"/>
             </w:tcBorders>
+            <w:shd w:fill="F6F8F7" w:color="auto" w:val="clear"/>
             <w:tcMar>
               <w:top w:type="dxa" w:w="80"/>
               <w:left w:type="dxa" w:w="120"/>
@@ -5069,6 +5128,7 @@
               <w:bottom w:val="single" w:color="D0D7D3" w:sz="4"/>
               <w:right w:val="single" w:color="D0D7D3" w:sz="4"/>
             </w:tcBorders>
+            <w:shd w:fill="F6F8F7" w:color="auto" w:val="clear"/>
             <w:tcMar>
               <w:top w:type="dxa" w:w="80"/>
               <w:left w:type="dxa" w:w="120"/>
@@ -5099,7 +5159,6 @@
               <w:bottom w:val="single" w:color="D0D7D3" w:sz="4"/>
               <w:right w:val="single" w:color="D0D7D3" w:sz="4"/>
             </w:tcBorders>
-            <w:shd w:fill="F6F8F7" w:color="auto" w:val="clear"/>
             <w:tcMar>
               <w:top w:type="dxa" w:w="80"/>
               <w:left w:type="dxa" w:w="120"/>
@@ -5128,7 +5187,6 @@
               <w:bottom w:val="single" w:color="D0D7D3" w:sz="4"/>
               <w:right w:val="single" w:color="D0D7D3" w:sz="4"/>
             </w:tcBorders>
-            <w:shd w:fill="F6F8F7" w:color="auto" w:val="clear"/>
             <w:tcMar>
               <w:top w:type="dxa" w:w="80"/>
               <w:left w:type="dxa" w:w="120"/>
@@ -5159,6 +5217,7 @@
               <w:bottom w:val="single" w:color="D0D7D3" w:sz="4"/>
               <w:right w:val="single" w:color="D0D7D3" w:sz="4"/>
             </w:tcBorders>
+            <w:shd w:fill="F6F8F7" w:color="auto" w:val="clear"/>
             <w:tcMar>
               <w:top w:type="dxa" w:w="80"/>
               <w:left w:type="dxa" w:w="120"/>
@@ -5187,6 +5246,7 @@
               <w:bottom w:val="single" w:color="D0D7D3" w:sz="4"/>
               <w:right w:val="single" w:color="D0D7D3" w:sz="4"/>
             </w:tcBorders>
+            <w:shd w:fill="F6F8F7" w:color="auto" w:val="clear"/>
             <w:tcMar>
               <w:top w:type="dxa" w:w="80"/>
               <w:left w:type="dxa" w:w="120"/>
@@ -5217,7 +5277,6 @@
               <w:bottom w:val="single" w:color="D0D7D3" w:sz="4"/>
               <w:right w:val="single" w:color="D0D7D3" w:sz="4"/>
             </w:tcBorders>
-            <w:shd w:fill="F6F8F7" w:color="auto" w:val="clear"/>
             <w:tcMar>
               <w:top w:type="dxa" w:w="80"/>
               <w:left w:type="dxa" w:w="120"/>
@@ -5246,7 +5305,6 @@
               <w:bottom w:val="single" w:color="D0D7D3" w:sz="4"/>
               <w:right w:val="single" w:color="D0D7D3" w:sz="4"/>
             </w:tcBorders>
-            <w:shd w:fill="F6F8F7" w:color="auto" w:val="clear"/>
             <w:tcMar>
               <w:top w:type="dxa" w:w="80"/>
               <w:left w:type="dxa" w:w="120"/>
@@ -5277,6 +5335,7 @@
               <w:bottom w:val="single" w:color="D0D7D3" w:sz="4"/>
               <w:right w:val="single" w:color="D0D7D3" w:sz="4"/>
             </w:tcBorders>
+            <w:shd w:fill="F6F8F7" w:color="auto" w:val="clear"/>
             <w:tcMar>
               <w:top w:type="dxa" w:w="80"/>
               <w:left w:type="dxa" w:w="120"/>
@@ -5305,6 +5364,7 @@
               <w:bottom w:val="single" w:color="D0D7D3" w:sz="4"/>
               <w:right w:val="single" w:color="D0D7D3" w:sz="4"/>
             </w:tcBorders>
+            <w:shd w:fill="F6F8F7" w:color="auto" w:val="clear"/>
             <w:tcMar>
               <w:top w:type="dxa" w:w="80"/>
               <w:left w:type="dxa" w:w="120"/>
@@ -5335,7 +5395,6 @@
               <w:bottom w:val="single" w:color="D0D7D3" w:sz="4"/>
               <w:right w:val="single" w:color="D0D7D3" w:sz="4"/>
             </w:tcBorders>
-            <w:shd w:fill="F6F8F7" w:color="auto" w:val="clear"/>
             <w:tcMar>
               <w:top w:type="dxa" w:w="80"/>
               <w:left w:type="dxa" w:w="120"/>
@@ -5364,7 +5423,6 @@
               <w:bottom w:val="single" w:color="D0D7D3" w:sz="4"/>
               <w:right w:val="single" w:color="D0D7D3" w:sz="4"/>
             </w:tcBorders>
-            <w:shd w:fill="F6F8F7" w:color="auto" w:val="clear"/>
             <w:tcMar>
               <w:top w:type="dxa" w:w="80"/>
               <w:left w:type="dxa" w:w="120"/>
@@ -5395,6 +5453,7 @@
               <w:bottom w:val="single" w:color="D0D7D3" w:sz="4"/>
               <w:right w:val="single" w:color="D0D7D3" w:sz="4"/>
             </w:tcBorders>
+            <w:shd w:fill="F6F8F7" w:color="auto" w:val="clear"/>
             <w:tcMar>
               <w:top w:type="dxa" w:w="80"/>
               <w:left w:type="dxa" w:w="120"/>
@@ -5423,6 +5482,7 @@
               <w:bottom w:val="single" w:color="D0D7D3" w:sz="4"/>
               <w:right w:val="single" w:color="D0D7D3" w:sz="4"/>
             </w:tcBorders>
+            <w:shd w:fill="F6F8F7" w:color="auto" w:val="clear"/>
             <w:tcMar>
               <w:top w:type="dxa" w:w="80"/>
               <w:left w:type="dxa" w:w="120"/>
@@ -5453,7 +5513,6 @@
               <w:bottom w:val="single" w:color="D0D7D3" w:sz="4"/>
               <w:right w:val="single" w:color="D0D7D3" w:sz="4"/>
             </w:tcBorders>
-            <w:shd w:fill="F6F8F7" w:color="auto" w:val="clear"/>
             <w:tcMar>
               <w:top w:type="dxa" w:w="80"/>
               <w:left w:type="dxa" w:w="120"/>
@@ -5482,7 +5541,6 @@
               <w:bottom w:val="single" w:color="D0D7D3" w:sz="4"/>
               <w:right w:val="single" w:color="D0D7D3" w:sz="4"/>
             </w:tcBorders>
-            <w:shd w:fill="F6F8F7" w:color="auto" w:val="clear"/>
             <w:tcMar>
               <w:top w:type="dxa" w:w="80"/>
               <w:left w:type="dxa" w:w="120"/>
@@ -5513,6 +5571,7 @@
               <w:bottom w:val="single" w:color="D0D7D3" w:sz="4"/>
               <w:right w:val="single" w:color="D0D7D3" w:sz="4"/>
             </w:tcBorders>
+            <w:shd w:fill="F6F8F7" w:color="auto" w:val="clear"/>
             <w:tcMar>
               <w:top w:type="dxa" w:w="80"/>
               <w:left w:type="dxa" w:w="120"/>
@@ -5541,6 +5600,7 @@
               <w:bottom w:val="single" w:color="D0D7D3" w:sz="4"/>
               <w:right w:val="single" w:color="D0D7D3" w:sz="4"/>
             </w:tcBorders>
+            <w:shd w:fill="F6F8F7" w:color="auto" w:val="clear"/>
             <w:tcMar>
               <w:top w:type="dxa" w:w="80"/>
               <w:left w:type="dxa" w:w="120"/>
@@ -5571,7 +5631,6 @@
               <w:bottom w:val="single" w:color="D0D7D3" w:sz="4"/>
               <w:right w:val="single" w:color="D0D7D3" w:sz="4"/>
             </w:tcBorders>
-            <w:shd w:fill="F6F8F7" w:color="auto" w:val="clear"/>
             <w:tcMar>
               <w:top w:type="dxa" w:w="80"/>
               <w:left w:type="dxa" w:w="120"/>
@@ -5600,7 +5659,6 @@
               <w:bottom w:val="single" w:color="D0D7D3" w:sz="4"/>
               <w:right w:val="single" w:color="D0D7D3" w:sz="4"/>
             </w:tcBorders>
-            <w:shd w:fill="F6F8F7" w:color="auto" w:val="clear"/>
             <w:tcMar>
               <w:top w:type="dxa" w:w="80"/>
               <w:left w:type="dxa" w:w="120"/>
@@ -5631,6 +5689,7 @@
               <w:bottom w:val="single" w:color="D0D7D3" w:sz="4"/>
               <w:right w:val="single" w:color="D0D7D3" w:sz="4"/>
             </w:tcBorders>
+            <w:shd w:fill="F6F8F7" w:color="auto" w:val="clear"/>
             <w:tcMar>
               <w:top w:type="dxa" w:w="80"/>
               <w:left w:type="dxa" w:w="120"/>
@@ -5659,6 +5718,7 @@
               <w:bottom w:val="single" w:color="D0D7D3" w:sz="4"/>
               <w:right w:val="single" w:color="D0D7D3" w:sz="4"/>
             </w:tcBorders>
+            <w:shd w:fill="F6F8F7" w:color="auto" w:val="clear"/>
             <w:tcMar>
               <w:top w:type="dxa" w:w="80"/>
               <w:left w:type="dxa" w:w="120"/>
@@ -5689,7 +5749,6 @@
               <w:bottom w:val="single" w:color="D0D7D3" w:sz="4"/>
               <w:right w:val="single" w:color="D0D7D3" w:sz="4"/>
             </w:tcBorders>
-            <w:shd w:fill="F6F8F7" w:color="auto" w:val="clear"/>
             <w:tcMar>
               <w:top w:type="dxa" w:w="80"/>
               <w:left w:type="dxa" w:w="120"/>
@@ -5718,7 +5777,6 @@
               <w:bottom w:val="single" w:color="D0D7D3" w:sz="4"/>
               <w:right w:val="single" w:color="D0D7D3" w:sz="4"/>
             </w:tcBorders>
-            <w:shd w:fill="F6F8F7" w:color="auto" w:val="clear"/>
             <w:tcMar>
               <w:top w:type="dxa" w:w="80"/>
               <w:left w:type="dxa" w:w="120"/>
@@ -5749,6 +5807,7 @@
               <w:bottom w:val="single" w:color="D0D7D3" w:sz="4"/>
               <w:right w:val="single" w:color="D0D7D3" w:sz="4"/>
             </w:tcBorders>
+            <w:shd w:fill="F6F8F7" w:color="auto" w:val="clear"/>
             <w:tcMar>
               <w:top w:type="dxa" w:w="80"/>
               <w:left w:type="dxa" w:w="120"/>
@@ -5777,6 +5836,7 @@
               <w:bottom w:val="single" w:color="D0D7D3" w:sz="4"/>
               <w:right w:val="single" w:color="D0D7D3" w:sz="4"/>
             </w:tcBorders>
+            <w:shd w:fill="F6F8F7" w:color="auto" w:val="clear"/>
             <w:tcMar>
               <w:top w:type="dxa" w:w="80"/>
               <w:left w:type="dxa" w:w="120"/>
@@ -5807,7 +5867,6 @@
               <w:bottom w:val="single" w:color="D0D7D3" w:sz="4"/>
               <w:right w:val="single" w:color="D0D7D3" w:sz="4"/>
             </w:tcBorders>
-            <w:shd w:fill="F6F8F7" w:color="auto" w:val="clear"/>
             <w:tcMar>
               <w:top w:type="dxa" w:w="80"/>
               <w:left w:type="dxa" w:w="120"/>
@@ -5836,7 +5895,6 @@
               <w:bottom w:val="single" w:color="D0D7D3" w:sz="4"/>
               <w:right w:val="single" w:color="D0D7D3" w:sz="4"/>
             </w:tcBorders>
-            <w:shd w:fill="F6F8F7" w:color="auto" w:val="clear"/>
             <w:tcMar>
               <w:top w:type="dxa" w:w="80"/>
               <w:left w:type="dxa" w:w="120"/>
@@ -5867,6 +5925,7 @@
               <w:bottom w:val="single" w:color="D0D7D3" w:sz="4"/>
               <w:right w:val="single" w:color="D0D7D3" w:sz="4"/>
             </w:tcBorders>
+            <w:shd w:fill="F6F8F7" w:color="auto" w:val="clear"/>
             <w:tcMar>
               <w:top w:type="dxa" w:w="80"/>
               <w:left w:type="dxa" w:w="120"/>
@@ -5895,6 +5954,7 @@
               <w:bottom w:val="single" w:color="D0D7D3" w:sz="4"/>
               <w:right w:val="single" w:color="D0D7D3" w:sz="4"/>
             </w:tcBorders>
+            <w:shd w:fill="F6F8F7" w:color="auto" w:val="clear"/>
             <w:tcMar>
               <w:top w:type="dxa" w:w="80"/>
               <w:left w:type="dxa" w:w="120"/>
@@ -5925,7 +5985,6 @@
               <w:bottom w:val="single" w:color="D0D7D3" w:sz="4"/>
               <w:right w:val="single" w:color="D0D7D3" w:sz="4"/>
             </w:tcBorders>
-            <w:shd w:fill="F6F8F7" w:color="auto" w:val="clear"/>
             <w:tcMar>
               <w:top w:type="dxa" w:w="80"/>
               <w:left w:type="dxa" w:w="120"/>
@@ -5954,7 +6013,6 @@
               <w:bottom w:val="single" w:color="D0D7D3" w:sz="4"/>
               <w:right w:val="single" w:color="D0D7D3" w:sz="4"/>
             </w:tcBorders>
-            <w:shd w:fill="F6F8F7" w:color="auto" w:val="clear"/>
             <w:tcMar>
               <w:top w:type="dxa" w:w="80"/>
               <w:left w:type="dxa" w:w="120"/>
@@ -5985,6 +6043,7 @@
               <w:bottom w:val="single" w:color="D0D7D3" w:sz="4"/>
               <w:right w:val="single" w:color="D0D7D3" w:sz="4"/>
             </w:tcBorders>
+            <w:shd w:fill="F6F8F7" w:color="auto" w:val="clear"/>
             <w:tcMar>
               <w:top w:type="dxa" w:w="80"/>
               <w:left w:type="dxa" w:w="120"/>
@@ -6013,6 +6072,7 @@
               <w:bottom w:val="single" w:color="D0D7D3" w:sz="4"/>
               <w:right w:val="single" w:color="D0D7D3" w:sz="4"/>
             </w:tcBorders>
+            <w:shd w:fill="F6F8F7" w:color="auto" w:val="clear"/>
             <w:tcMar>
               <w:top w:type="dxa" w:w="80"/>
               <w:left w:type="dxa" w:w="120"/>

</xml_diff>

<commit_message>
Word overview: describe the one-page parent portal and phone-first input
</commit_message>
<xml_diff>
--- a/docs/product/ParentPay - what it does.docx
+++ b/docs/product/ParentPay - what it does.docx
@@ -2363,7 +2363,7 @@
                 <w:sz w:val="20"/>
                 <w:szCs w:val="20"/>
               </w:rPr>
-              <w:t xml:space="preserve">All their children at the school on one screen: what’s owed, credit, and each child’s account number</w:t>
+              <w:t xml:space="preserve">One simple page with everything needed to pay: the total at the top, then each child with what’s owed, a Pay online button, their own account number (with a copy button) and the term’s fees; “Pay for all your children” at the bottom. Bills, receipts and settings are a tap away</w:t>
             </w:r>
           </w:p>
         </w:tc>
@@ -2392,7 +2392,7 @@
                 <w:sz w:val="20"/>
                 <w:szCs w:val="20"/>
               </w:rPr>
-              <w:t xml:space="preserve">One place for every child, with a copy button for the account number</w:t>
+              <w:t xml:space="preserve">Built for parents who aren’t confident on smartphones: nothing to search for, no tapping around to pay</w:t>
             </w:r>
           </w:p>
         </w:tc>
@@ -2835,7 +2835,7 @@
                 <w:sz w:val="20"/>
                 <w:szCs w:val="20"/>
               </w:rPr>
-              <w:t xml:space="preserve">Works comfortably on a phone; free for parents</w:t>
+              <w:t xml:space="preserve">Made for phones first; the phone’s own keypad comes up for numbers, and the texted sign-in code can be filled in with one tap; free for parents</w:t>
             </w:r>
           </w:p>
         </w:tc>
@@ -2864,7 +2864,7 @@
                 <w:sz w:val="20"/>
                 <w:szCs w:val="20"/>
               </w:rPr>
-              <w:t xml:space="preserve">No app to install and no extra charges</w:t>
+              <w:t xml:space="preserve">No app to install, nothing new to learn, and no extra charges</w:t>
             </w:r>
           </w:p>
         </w:tc>

</xml_diff>

<commit_message>
Reminders and new-bill messages say what the money is for
{fees} lists the fees with money left, as the pupil's page works them out
(tuition first, fees parents chose), biggest first so tuition is never
hidden, at most four then 'N more', plus earlier terms, e.g. ': Tuition
₦142,500, WAEC ₦100,000, School bus ₦45,000, 2 more ₦15,000'. It's in the
default wording after the due date, and the last parameter of the WhatsApp
bill and reminder templates (earlier ones keep their places). Plan
reminders leave it out: they ask for the instalment. 'Send reminder' on a
pupil uses the current term.
</commit_message>
<xml_diff>
--- a/docs/product/ParentPay - what it does.docx
+++ b/docs/product/ParentPay - what it does.docx
@@ -4790,6 +4790,64 @@
                 <w:sz w:val="20"/>
                 <w:szCs w:val="20"/>
               </w:rPr>
+              <w:t xml:space="preserve">Reminders and new-bill messages list what the money is for (biggest first), with the child’s account number</w:t>
+            </w:r>
+          </w:p>
+        </w:tc>
+      </w:tr>
+      <w:tr>
+        <w:tc>
+          <w:tcPr>
+            <w:tcW w:type="dxa" w:w="1800"/>
+            <w:tcBorders>
+              <w:top w:val="single" w:color="D0D7D3" w:sz="4"/>
+              <w:left w:val="single" w:color="D0D7D3" w:sz="4"/>
+              <w:bottom w:val="single" w:color="D0D7D3" w:sz="4"/>
+              <w:right w:val="single" w:color="D0D7D3" w:sz="4"/>
+            </w:tcBorders>
+            <w:tcMar>
+              <w:top w:type="dxa" w:w="80"/>
+              <w:left w:type="dxa" w:w="120"/>
+              <w:bottom w:type="dxa" w:w="80"/>
+              <w:right w:type="dxa" w:w="120"/>
+            </w:tcMar>
+          </w:tcPr>
+          <w:p>
+            <w:r>
+              <w:rPr>
+                <w:b w:val="false"/>
+                <w:bCs w:val="false"/>
+                <w:sz w:val="20"/>
+                <w:szCs w:val="20"/>
+              </w:rPr>
+              <w:t xml:space="preserve">22 Oct 2026</w:t>
+            </w:r>
+          </w:p>
+        </w:tc>
+        <w:tc>
+          <w:tcPr>
+            <w:tcW w:type="dxa" w:w="7838"/>
+            <w:tcBorders>
+              <w:top w:val="single" w:color="D0D7D3" w:sz="4"/>
+              <w:left w:val="single" w:color="D0D7D3" w:sz="4"/>
+              <w:bottom w:val="single" w:color="D0D7D3" w:sz="4"/>
+              <w:right w:val="single" w:color="D0D7D3" w:sz="4"/>
+            </w:tcBorders>
+            <w:tcMar>
+              <w:top w:type="dxa" w:w="80"/>
+              <w:left w:type="dxa" w:w="120"/>
+              <w:bottom w:type="dxa" w:w="80"/>
+              <w:right w:type="dxa" w:w="120"/>
+            </w:tcMar>
+          </w:tcPr>
+          <w:p>
+            <w:r>
+              <w:rPr>
+                <w:b w:val="false"/>
+                <w:bCs w:val="false"/>
+                <w:sz w:val="20"/>
+                <w:szCs w:val="20"/>
+              </w:rPr>
               <w:t xml:space="preserve">Parent portal redesigned: one simple page with the total, each child’s amount, account number and fees, and one button to pay for everyone</w:t>
             </w:r>
           </w:p>
@@ -4805,6 +4863,7 @@
               <w:bottom w:val="single" w:color="D0D7D3" w:sz="4"/>
               <w:right w:val="single" w:color="D0D7D3" w:sz="4"/>
             </w:tcBorders>
+            <w:shd w:fill="F6F8F7" w:color="auto" w:val="clear"/>
             <w:tcMar>
               <w:top w:type="dxa" w:w="80"/>
               <w:left w:type="dxa" w:w="120"/>
@@ -4833,6 +4892,7 @@
               <w:bottom w:val="single" w:color="D0D7D3" w:sz="4"/>
               <w:right w:val="single" w:color="D0D7D3" w:sz="4"/>
             </w:tcBorders>
+            <w:shd w:fill="F6F8F7" w:color="auto" w:val="clear"/>
             <w:tcMar>
               <w:top w:type="dxa" w:w="80"/>
               <w:left w:type="dxa" w:w="120"/>
@@ -4863,7 +4923,6 @@
               <w:bottom w:val="single" w:color="D0D7D3" w:sz="4"/>
               <w:right w:val="single" w:color="D0D7D3" w:sz="4"/>
             </w:tcBorders>
-            <w:shd w:fill="F6F8F7" w:color="auto" w:val="clear"/>
             <w:tcMar>
               <w:top w:type="dxa" w:w="80"/>
               <w:left w:type="dxa" w:w="120"/>
@@ -4892,7 +4951,6 @@
               <w:bottom w:val="single" w:color="D0D7D3" w:sz="4"/>
               <w:right w:val="single" w:color="D0D7D3" w:sz="4"/>
             </w:tcBorders>
-            <w:shd w:fill="F6F8F7" w:color="auto" w:val="clear"/>
             <w:tcMar>
               <w:top w:type="dxa" w:w="80"/>
               <w:left w:type="dxa" w:w="120"/>
@@ -4923,6 +4981,7 @@
               <w:bottom w:val="single" w:color="D0D7D3" w:sz="4"/>
               <w:right w:val="single" w:color="D0D7D3" w:sz="4"/>
             </w:tcBorders>
+            <w:shd w:fill="F6F8F7" w:color="auto" w:val="clear"/>
             <w:tcMar>
               <w:top w:type="dxa" w:w="80"/>
               <w:left w:type="dxa" w:w="120"/>
@@ -4951,6 +5010,7 @@
               <w:bottom w:val="single" w:color="D0D7D3" w:sz="4"/>
               <w:right w:val="single" w:color="D0D7D3" w:sz="4"/>
             </w:tcBorders>
+            <w:shd w:fill="F6F8F7" w:color="auto" w:val="clear"/>
             <w:tcMar>
               <w:top w:type="dxa" w:w="80"/>
               <w:left w:type="dxa" w:w="120"/>
@@ -4981,7 +5041,6 @@
               <w:bottom w:val="single" w:color="D0D7D3" w:sz="4"/>
               <w:right w:val="single" w:color="D0D7D3" w:sz="4"/>
             </w:tcBorders>
-            <w:shd w:fill="F6F8F7" w:color="auto" w:val="clear"/>
             <w:tcMar>
               <w:top w:type="dxa" w:w="80"/>
               <w:left w:type="dxa" w:w="120"/>
@@ -5010,7 +5069,6 @@
               <w:bottom w:val="single" w:color="D0D7D3" w:sz="4"/>
               <w:right w:val="single" w:color="D0D7D3" w:sz="4"/>
             </w:tcBorders>
-            <w:shd w:fill="F6F8F7" w:color="auto" w:val="clear"/>
             <w:tcMar>
               <w:top w:type="dxa" w:w="80"/>
               <w:left w:type="dxa" w:w="120"/>
@@ -5041,6 +5099,7 @@
               <w:bottom w:val="single" w:color="D0D7D3" w:sz="4"/>
               <w:right w:val="single" w:color="D0D7D3" w:sz="4"/>
             </w:tcBorders>
+            <w:shd w:fill="F6F8F7" w:color="auto" w:val="clear"/>
             <w:tcMar>
               <w:top w:type="dxa" w:w="80"/>
               <w:left w:type="dxa" w:w="120"/>
@@ -5069,6 +5128,7 @@
               <w:bottom w:val="single" w:color="D0D7D3" w:sz="4"/>
               <w:right w:val="single" w:color="D0D7D3" w:sz="4"/>
             </w:tcBorders>
+            <w:shd w:fill="F6F8F7" w:color="auto" w:val="clear"/>
             <w:tcMar>
               <w:top w:type="dxa" w:w="80"/>
               <w:left w:type="dxa" w:w="120"/>
@@ -5099,7 +5159,6 @@
               <w:bottom w:val="single" w:color="D0D7D3" w:sz="4"/>
               <w:right w:val="single" w:color="D0D7D3" w:sz="4"/>
             </w:tcBorders>
-            <w:shd w:fill="F6F8F7" w:color="auto" w:val="clear"/>
             <w:tcMar>
               <w:top w:type="dxa" w:w="80"/>
               <w:left w:type="dxa" w:w="120"/>
@@ -5128,7 +5187,6 @@
               <w:bottom w:val="single" w:color="D0D7D3" w:sz="4"/>
               <w:right w:val="single" w:color="D0D7D3" w:sz="4"/>
             </w:tcBorders>
-            <w:shd w:fill="F6F8F7" w:color="auto" w:val="clear"/>
             <w:tcMar>
               <w:top w:type="dxa" w:w="80"/>
               <w:left w:type="dxa" w:w="120"/>
@@ -5159,6 +5217,7 @@
               <w:bottom w:val="single" w:color="D0D7D3" w:sz="4"/>
               <w:right w:val="single" w:color="D0D7D3" w:sz="4"/>
             </w:tcBorders>
+            <w:shd w:fill="F6F8F7" w:color="auto" w:val="clear"/>
             <w:tcMar>
               <w:top w:type="dxa" w:w="80"/>
               <w:left w:type="dxa" w:w="120"/>
@@ -5187,6 +5246,7 @@
               <w:bottom w:val="single" w:color="D0D7D3" w:sz="4"/>
               <w:right w:val="single" w:color="D0D7D3" w:sz="4"/>
             </w:tcBorders>
+            <w:shd w:fill="F6F8F7" w:color="auto" w:val="clear"/>
             <w:tcMar>
               <w:top w:type="dxa" w:w="80"/>
               <w:left w:type="dxa" w:w="120"/>
@@ -5217,7 +5277,6 @@
               <w:bottom w:val="single" w:color="D0D7D3" w:sz="4"/>
               <w:right w:val="single" w:color="D0D7D3" w:sz="4"/>
             </w:tcBorders>
-            <w:shd w:fill="F6F8F7" w:color="auto" w:val="clear"/>
             <w:tcMar>
               <w:top w:type="dxa" w:w="80"/>
               <w:left w:type="dxa" w:w="120"/>
@@ -5246,7 +5305,6 @@
               <w:bottom w:val="single" w:color="D0D7D3" w:sz="4"/>
               <w:right w:val="single" w:color="D0D7D3" w:sz="4"/>
             </w:tcBorders>
-            <w:shd w:fill="F6F8F7" w:color="auto" w:val="clear"/>
             <w:tcMar>
               <w:top w:type="dxa" w:w="80"/>
               <w:left w:type="dxa" w:w="120"/>
@@ -5277,6 +5335,7 @@
               <w:bottom w:val="single" w:color="D0D7D3" w:sz="4"/>
               <w:right w:val="single" w:color="D0D7D3" w:sz="4"/>
             </w:tcBorders>
+            <w:shd w:fill="F6F8F7" w:color="auto" w:val="clear"/>
             <w:tcMar>
               <w:top w:type="dxa" w:w="80"/>
               <w:left w:type="dxa" w:w="120"/>
@@ -5305,6 +5364,7 @@
               <w:bottom w:val="single" w:color="D0D7D3" w:sz="4"/>
               <w:right w:val="single" w:color="D0D7D3" w:sz="4"/>
             </w:tcBorders>
+            <w:shd w:fill="F6F8F7" w:color="auto" w:val="clear"/>
             <w:tcMar>
               <w:top w:type="dxa" w:w="80"/>
               <w:left w:type="dxa" w:w="120"/>
@@ -5335,7 +5395,6 @@
               <w:bottom w:val="single" w:color="D0D7D3" w:sz="4"/>
               <w:right w:val="single" w:color="D0D7D3" w:sz="4"/>
             </w:tcBorders>
-            <w:shd w:fill="F6F8F7" w:color="auto" w:val="clear"/>
             <w:tcMar>
               <w:top w:type="dxa" w:w="80"/>
               <w:left w:type="dxa" w:w="120"/>
@@ -5364,7 +5423,6 @@
               <w:bottom w:val="single" w:color="D0D7D3" w:sz="4"/>
               <w:right w:val="single" w:color="D0D7D3" w:sz="4"/>
             </w:tcBorders>
-            <w:shd w:fill="F6F8F7" w:color="auto" w:val="clear"/>
             <w:tcMar>
               <w:top w:type="dxa" w:w="80"/>
               <w:left w:type="dxa" w:w="120"/>
@@ -5395,6 +5453,7 @@
               <w:bottom w:val="single" w:color="D0D7D3" w:sz="4"/>
               <w:right w:val="single" w:color="D0D7D3" w:sz="4"/>
             </w:tcBorders>
+            <w:shd w:fill="F6F8F7" w:color="auto" w:val="clear"/>
             <w:tcMar>
               <w:top w:type="dxa" w:w="80"/>
               <w:left w:type="dxa" w:w="120"/>
@@ -5423,6 +5482,7 @@
               <w:bottom w:val="single" w:color="D0D7D3" w:sz="4"/>
               <w:right w:val="single" w:color="D0D7D3" w:sz="4"/>
             </w:tcBorders>
+            <w:shd w:fill="F6F8F7" w:color="auto" w:val="clear"/>
             <w:tcMar>
               <w:top w:type="dxa" w:w="80"/>
               <w:left w:type="dxa" w:w="120"/>
@@ -5453,7 +5513,6 @@
               <w:bottom w:val="single" w:color="D0D7D3" w:sz="4"/>
               <w:right w:val="single" w:color="D0D7D3" w:sz="4"/>
             </w:tcBorders>
-            <w:shd w:fill="F6F8F7" w:color="auto" w:val="clear"/>
             <w:tcMar>
               <w:top w:type="dxa" w:w="80"/>
               <w:left w:type="dxa" w:w="120"/>
@@ -5482,7 +5541,6 @@
               <w:bottom w:val="single" w:color="D0D7D3" w:sz="4"/>
               <w:right w:val="single" w:color="D0D7D3" w:sz="4"/>
             </w:tcBorders>
-            <w:shd w:fill="F6F8F7" w:color="auto" w:val="clear"/>
             <w:tcMar>
               <w:top w:type="dxa" w:w="80"/>
               <w:left w:type="dxa" w:w="120"/>
@@ -5513,6 +5571,7 @@
               <w:bottom w:val="single" w:color="D0D7D3" w:sz="4"/>
               <w:right w:val="single" w:color="D0D7D3" w:sz="4"/>
             </w:tcBorders>
+            <w:shd w:fill="F6F8F7" w:color="auto" w:val="clear"/>
             <w:tcMar>
               <w:top w:type="dxa" w:w="80"/>
               <w:left w:type="dxa" w:w="120"/>
@@ -5541,6 +5600,7 @@
               <w:bottom w:val="single" w:color="D0D7D3" w:sz="4"/>
               <w:right w:val="single" w:color="D0D7D3" w:sz="4"/>
             </w:tcBorders>
+            <w:shd w:fill="F6F8F7" w:color="auto" w:val="clear"/>
             <w:tcMar>
               <w:top w:type="dxa" w:w="80"/>
               <w:left w:type="dxa" w:w="120"/>
@@ -5571,7 +5631,6 @@
               <w:bottom w:val="single" w:color="D0D7D3" w:sz="4"/>
               <w:right w:val="single" w:color="D0D7D3" w:sz="4"/>
             </w:tcBorders>
-            <w:shd w:fill="F6F8F7" w:color="auto" w:val="clear"/>
             <w:tcMar>
               <w:top w:type="dxa" w:w="80"/>
               <w:left w:type="dxa" w:w="120"/>
@@ -5600,7 +5659,6 @@
               <w:bottom w:val="single" w:color="D0D7D3" w:sz="4"/>
               <w:right w:val="single" w:color="D0D7D3" w:sz="4"/>
             </w:tcBorders>
-            <w:shd w:fill="F6F8F7" w:color="auto" w:val="clear"/>
             <w:tcMar>
               <w:top w:type="dxa" w:w="80"/>
               <w:left w:type="dxa" w:w="120"/>
@@ -5631,6 +5689,7 @@
               <w:bottom w:val="single" w:color="D0D7D3" w:sz="4"/>
               <w:right w:val="single" w:color="D0D7D3" w:sz="4"/>
             </w:tcBorders>
+            <w:shd w:fill="F6F8F7" w:color="auto" w:val="clear"/>
             <w:tcMar>
               <w:top w:type="dxa" w:w="80"/>
               <w:left w:type="dxa" w:w="120"/>
@@ -5659,6 +5718,7 @@
               <w:bottom w:val="single" w:color="D0D7D3" w:sz="4"/>
               <w:right w:val="single" w:color="D0D7D3" w:sz="4"/>
             </w:tcBorders>
+            <w:shd w:fill="F6F8F7" w:color="auto" w:val="clear"/>
             <w:tcMar>
               <w:top w:type="dxa" w:w="80"/>
               <w:left w:type="dxa" w:w="120"/>
@@ -5689,7 +5749,6 @@
               <w:bottom w:val="single" w:color="D0D7D3" w:sz="4"/>
               <w:right w:val="single" w:color="D0D7D3" w:sz="4"/>
             </w:tcBorders>
-            <w:shd w:fill="F6F8F7" w:color="auto" w:val="clear"/>
             <w:tcMar>
               <w:top w:type="dxa" w:w="80"/>
               <w:left w:type="dxa" w:w="120"/>
@@ -5718,7 +5777,6 @@
               <w:bottom w:val="single" w:color="D0D7D3" w:sz="4"/>
               <w:right w:val="single" w:color="D0D7D3" w:sz="4"/>
             </w:tcBorders>
-            <w:shd w:fill="F6F8F7" w:color="auto" w:val="clear"/>
             <w:tcMar>
               <w:top w:type="dxa" w:w="80"/>
               <w:left w:type="dxa" w:w="120"/>
@@ -5749,6 +5807,7 @@
               <w:bottom w:val="single" w:color="D0D7D3" w:sz="4"/>
               <w:right w:val="single" w:color="D0D7D3" w:sz="4"/>
             </w:tcBorders>
+            <w:shd w:fill="F6F8F7" w:color="auto" w:val="clear"/>
             <w:tcMar>
               <w:top w:type="dxa" w:w="80"/>
               <w:left w:type="dxa" w:w="120"/>
@@ -5777,6 +5836,7 @@
               <w:bottom w:val="single" w:color="D0D7D3" w:sz="4"/>
               <w:right w:val="single" w:color="D0D7D3" w:sz="4"/>
             </w:tcBorders>
+            <w:shd w:fill="F6F8F7" w:color="auto" w:val="clear"/>
             <w:tcMar>
               <w:top w:type="dxa" w:w="80"/>
               <w:left w:type="dxa" w:w="120"/>
@@ -5807,7 +5867,6 @@
               <w:bottom w:val="single" w:color="D0D7D3" w:sz="4"/>
               <w:right w:val="single" w:color="D0D7D3" w:sz="4"/>
             </w:tcBorders>
-            <w:shd w:fill="F6F8F7" w:color="auto" w:val="clear"/>
             <w:tcMar>
               <w:top w:type="dxa" w:w="80"/>
               <w:left w:type="dxa" w:w="120"/>
@@ -5836,7 +5895,6 @@
               <w:bottom w:val="single" w:color="D0D7D3" w:sz="4"/>
               <w:right w:val="single" w:color="D0D7D3" w:sz="4"/>
             </w:tcBorders>
-            <w:shd w:fill="F6F8F7" w:color="auto" w:val="clear"/>
             <w:tcMar>
               <w:top w:type="dxa" w:w="80"/>
               <w:left w:type="dxa" w:w="120"/>
@@ -5867,6 +5925,7 @@
               <w:bottom w:val="single" w:color="D0D7D3" w:sz="4"/>
               <w:right w:val="single" w:color="D0D7D3" w:sz="4"/>
             </w:tcBorders>
+            <w:shd w:fill="F6F8F7" w:color="auto" w:val="clear"/>
             <w:tcMar>
               <w:top w:type="dxa" w:w="80"/>
               <w:left w:type="dxa" w:w="120"/>
@@ -5895,6 +5954,7 @@
               <w:bottom w:val="single" w:color="D0D7D3" w:sz="4"/>
               <w:right w:val="single" w:color="D0D7D3" w:sz="4"/>
             </w:tcBorders>
+            <w:shd w:fill="F6F8F7" w:color="auto" w:val="clear"/>
             <w:tcMar>
               <w:top w:type="dxa" w:w="80"/>
               <w:left w:type="dxa" w:w="120"/>
@@ -5925,7 +5985,6 @@
               <w:bottom w:val="single" w:color="D0D7D3" w:sz="4"/>
               <w:right w:val="single" w:color="D0D7D3" w:sz="4"/>
             </w:tcBorders>
-            <w:shd w:fill="F6F8F7" w:color="auto" w:val="clear"/>
             <w:tcMar>
               <w:top w:type="dxa" w:w="80"/>
               <w:left w:type="dxa" w:w="120"/>
@@ -5954,7 +6013,6 @@
               <w:bottom w:val="single" w:color="D0D7D3" w:sz="4"/>
               <w:right w:val="single" w:color="D0D7D3" w:sz="4"/>
             </w:tcBorders>
-            <w:shd w:fill="F6F8F7" w:color="auto" w:val="clear"/>
             <w:tcMar>
               <w:top w:type="dxa" w:w="80"/>
               <w:left w:type="dxa" w:w="120"/>
@@ -5985,6 +6043,7 @@
               <w:bottom w:val="single" w:color="D0D7D3" w:sz="4"/>
               <w:right w:val="single" w:color="D0D7D3" w:sz="4"/>
             </w:tcBorders>
+            <w:shd w:fill="F6F8F7" w:color="auto" w:val="clear"/>
             <w:tcMar>
               <w:top w:type="dxa" w:w="80"/>
               <w:left w:type="dxa" w:w="120"/>
@@ -6013,6 +6072,7 @@
               <w:bottom w:val="single" w:color="D0D7D3" w:sz="4"/>
               <w:right w:val="single" w:color="D0D7D3" w:sz="4"/>
             </w:tcBorders>
+            <w:shd w:fill="F6F8F7" w:color="auto" w:val="clear"/>
             <w:tcMar>
               <w:top w:type="dxa" w:w="80"/>
               <w:left w:type="dxa" w:w="120"/>
@@ -6043,7 +6103,6 @@
               <w:bottom w:val="single" w:color="D0D7D3" w:sz="4"/>
               <w:right w:val="single" w:color="D0D7D3" w:sz="4"/>
             </w:tcBorders>
-            <w:shd w:fill="F6F8F7" w:color="auto" w:val="clear"/>
             <w:tcMar>
               <w:top w:type="dxa" w:w="80"/>
               <w:left w:type="dxa" w:w="120"/>
@@ -6072,7 +6131,6 @@
               <w:bottom w:val="single" w:color="D0D7D3" w:sz="4"/>
               <w:right w:val="single" w:color="D0D7D3" w:sz="4"/>
             </w:tcBorders>
-            <w:shd w:fill="F6F8F7" w:color="auto" w:val="clear"/>
             <w:tcMar>
               <w:top w:type="dxa" w:w="80"/>
               <w:left w:type="dxa" w:w="120"/>

</xml_diff>

<commit_message>
Texts keep to the SMS alphabet: NGN for the naira sign, half the SMS pages
One character outside the GSM 03.38 alphabet (the naira sign, a phone
keyboard's curly quote, an emoji) makes a whole text Unicode, billed at 70
characters a page instead of 160. Every text now goes through to_gsm when
sent: NGN for the naira sign (owner's choice), plain quotes and dashes,
anything else outside the alphabet dropped. A typical reminder went from 7
SMS pages to 3. WhatsApp, email and the message log keep the naira sign.
The wording preview shows the text version and how many SMS pages it is.
</commit_message>
<xml_diff>
--- a/docs/product/ParentPay - what it does.docx
+++ b/docs/product/ParentPay - what it does.docx
@@ -4790,6 +4790,64 @@
                 <w:sz w:val="20"/>
                 <w:szCs w:val="20"/>
               </w:rPr>
+              <w:t xml:space="preserve">Text messages cost less than half as much: they write NGN for ₦ and keep to the plain SMS alphabet (a reminder went from 7 SMS pages to 3)</w:t>
+            </w:r>
+          </w:p>
+        </w:tc>
+      </w:tr>
+      <w:tr>
+        <w:tc>
+          <w:tcPr>
+            <w:tcW w:type="dxa" w:w="1800"/>
+            <w:tcBorders>
+              <w:top w:val="single" w:color="D0D7D3" w:sz="4"/>
+              <w:left w:val="single" w:color="D0D7D3" w:sz="4"/>
+              <w:bottom w:val="single" w:color="D0D7D3" w:sz="4"/>
+              <w:right w:val="single" w:color="D0D7D3" w:sz="4"/>
+            </w:tcBorders>
+            <w:tcMar>
+              <w:top w:type="dxa" w:w="80"/>
+              <w:left w:type="dxa" w:w="120"/>
+              <w:bottom w:type="dxa" w:w="80"/>
+              <w:right w:type="dxa" w:w="120"/>
+            </w:tcMar>
+          </w:tcPr>
+          <w:p>
+            <w:r>
+              <w:rPr>
+                <w:b w:val="false"/>
+                <w:bCs w:val="false"/>
+                <w:sz w:val="20"/>
+                <w:szCs w:val="20"/>
+              </w:rPr>
+              <w:t xml:space="preserve">22 Oct 2026</w:t>
+            </w:r>
+          </w:p>
+        </w:tc>
+        <w:tc>
+          <w:tcPr>
+            <w:tcW w:type="dxa" w:w="7838"/>
+            <w:tcBorders>
+              <w:top w:val="single" w:color="D0D7D3" w:sz="4"/>
+              <w:left w:val="single" w:color="D0D7D3" w:sz="4"/>
+              <w:bottom w:val="single" w:color="D0D7D3" w:sz="4"/>
+              <w:right w:val="single" w:color="D0D7D3" w:sz="4"/>
+            </w:tcBorders>
+            <w:tcMar>
+              <w:top w:type="dxa" w:w="80"/>
+              <w:left w:type="dxa" w:w="120"/>
+              <w:bottom w:type="dxa" w:w="80"/>
+              <w:right w:type="dxa" w:w="120"/>
+            </w:tcMar>
+          </w:tcPr>
+          <w:p>
+            <w:r>
+              <w:rPr>
+                <w:b w:val="false"/>
+                <w:bCs w:val="false"/>
+                <w:sz w:val="20"/>
+                <w:szCs w:val="20"/>
+              </w:rPr>
               <w:t xml:space="preserve">Reminders and new-bill messages list what the money is for (biggest first), with the child’s account number</w:t>
             </w:r>
           </w:p>
@@ -4805,6 +4863,7 @@
               <w:bottom w:val="single" w:color="D0D7D3" w:sz="4"/>
               <w:right w:val="single" w:color="D0D7D3" w:sz="4"/>
             </w:tcBorders>
+            <w:shd w:fill="F6F8F7" w:color="auto" w:val="clear"/>
             <w:tcMar>
               <w:top w:type="dxa" w:w="80"/>
               <w:left w:type="dxa" w:w="120"/>
@@ -4833,6 +4892,7 @@
               <w:bottom w:val="single" w:color="D0D7D3" w:sz="4"/>
               <w:right w:val="single" w:color="D0D7D3" w:sz="4"/>
             </w:tcBorders>
+            <w:shd w:fill="F6F8F7" w:color="auto" w:val="clear"/>
             <w:tcMar>
               <w:top w:type="dxa" w:w="80"/>
               <w:left w:type="dxa" w:w="120"/>
@@ -4863,7 +4923,6 @@
               <w:bottom w:val="single" w:color="D0D7D3" w:sz="4"/>
               <w:right w:val="single" w:color="D0D7D3" w:sz="4"/>
             </w:tcBorders>
-            <w:shd w:fill="F6F8F7" w:color="auto" w:val="clear"/>
             <w:tcMar>
               <w:top w:type="dxa" w:w="80"/>
               <w:left w:type="dxa" w:w="120"/>
@@ -4892,7 +4951,6 @@
               <w:bottom w:val="single" w:color="D0D7D3" w:sz="4"/>
               <w:right w:val="single" w:color="D0D7D3" w:sz="4"/>
             </w:tcBorders>
-            <w:shd w:fill="F6F8F7" w:color="auto" w:val="clear"/>
             <w:tcMar>
               <w:top w:type="dxa" w:w="80"/>
               <w:left w:type="dxa" w:w="120"/>
@@ -4923,6 +4981,7 @@
               <w:bottom w:val="single" w:color="D0D7D3" w:sz="4"/>
               <w:right w:val="single" w:color="D0D7D3" w:sz="4"/>
             </w:tcBorders>
+            <w:shd w:fill="F6F8F7" w:color="auto" w:val="clear"/>
             <w:tcMar>
               <w:top w:type="dxa" w:w="80"/>
               <w:left w:type="dxa" w:w="120"/>
@@ -4951,6 +5010,7 @@
               <w:bottom w:val="single" w:color="D0D7D3" w:sz="4"/>
               <w:right w:val="single" w:color="D0D7D3" w:sz="4"/>
             </w:tcBorders>
+            <w:shd w:fill="F6F8F7" w:color="auto" w:val="clear"/>
             <w:tcMar>
               <w:top w:type="dxa" w:w="80"/>
               <w:left w:type="dxa" w:w="120"/>
@@ -4981,7 +5041,6 @@
               <w:bottom w:val="single" w:color="D0D7D3" w:sz="4"/>
               <w:right w:val="single" w:color="D0D7D3" w:sz="4"/>
             </w:tcBorders>
-            <w:shd w:fill="F6F8F7" w:color="auto" w:val="clear"/>
             <w:tcMar>
               <w:top w:type="dxa" w:w="80"/>
               <w:left w:type="dxa" w:w="120"/>
@@ -5010,7 +5069,6 @@
               <w:bottom w:val="single" w:color="D0D7D3" w:sz="4"/>
               <w:right w:val="single" w:color="D0D7D3" w:sz="4"/>
             </w:tcBorders>
-            <w:shd w:fill="F6F8F7" w:color="auto" w:val="clear"/>
             <w:tcMar>
               <w:top w:type="dxa" w:w="80"/>
               <w:left w:type="dxa" w:w="120"/>
@@ -5041,6 +5099,7 @@
               <w:bottom w:val="single" w:color="D0D7D3" w:sz="4"/>
               <w:right w:val="single" w:color="D0D7D3" w:sz="4"/>
             </w:tcBorders>
+            <w:shd w:fill="F6F8F7" w:color="auto" w:val="clear"/>
             <w:tcMar>
               <w:top w:type="dxa" w:w="80"/>
               <w:left w:type="dxa" w:w="120"/>
@@ -5069,6 +5128,7 @@
               <w:bottom w:val="single" w:color="D0D7D3" w:sz="4"/>
               <w:right w:val="single" w:color="D0D7D3" w:sz="4"/>
             </w:tcBorders>
+            <w:shd w:fill="F6F8F7" w:color="auto" w:val="clear"/>
             <w:tcMar>
               <w:top w:type="dxa" w:w="80"/>
               <w:left w:type="dxa" w:w="120"/>
@@ -5099,7 +5159,6 @@
               <w:bottom w:val="single" w:color="D0D7D3" w:sz="4"/>
               <w:right w:val="single" w:color="D0D7D3" w:sz="4"/>
             </w:tcBorders>
-            <w:shd w:fill="F6F8F7" w:color="auto" w:val="clear"/>
             <w:tcMar>
               <w:top w:type="dxa" w:w="80"/>
               <w:left w:type="dxa" w:w="120"/>
@@ -5128,7 +5187,6 @@
               <w:bottom w:val="single" w:color="D0D7D3" w:sz="4"/>
               <w:right w:val="single" w:color="D0D7D3" w:sz="4"/>
             </w:tcBorders>
-            <w:shd w:fill="F6F8F7" w:color="auto" w:val="clear"/>
             <w:tcMar>
               <w:top w:type="dxa" w:w="80"/>
               <w:left w:type="dxa" w:w="120"/>
@@ -5159,6 +5217,7 @@
               <w:bottom w:val="single" w:color="D0D7D3" w:sz="4"/>
               <w:right w:val="single" w:color="D0D7D3" w:sz="4"/>
             </w:tcBorders>
+            <w:shd w:fill="F6F8F7" w:color="auto" w:val="clear"/>
             <w:tcMar>
               <w:top w:type="dxa" w:w="80"/>
               <w:left w:type="dxa" w:w="120"/>
@@ -5187,6 +5246,7 @@
               <w:bottom w:val="single" w:color="D0D7D3" w:sz="4"/>
               <w:right w:val="single" w:color="D0D7D3" w:sz="4"/>
             </w:tcBorders>
+            <w:shd w:fill="F6F8F7" w:color="auto" w:val="clear"/>
             <w:tcMar>
               <w:top w:type="dxa" w:w="80"/>
               <w:left w:type="dxa" w:w="120"/>
@@ -5217,7 +5277,6 @@
               <w:bottom w:val="single" w:color="D0D7D3" w:sz="4"/>
               <w:right w:val="single" w:color="D0D7D3" w:sz="4"/>
             </w:tcBorders>
-            <w:shd w:fill="F6F8F7" w:color="auto" w:val="clear"/>
             <w:tcMar>
               <w:top w:type="dxa" w:w="80"/>
               <w:left w:type="dxa" w:w="120"/>
@@ -5246,7 +5305,6 @@
               <w:bottom w:val="single" w:color="D0D7D3" w:sz="4"/>
               <w:right w:val="single" w:color="D0D7D3" w:sz="4"/>
             </w:tcBorders>
-            <w:shd w:fill="F6F8F7" w:color="auto" w:val="clear"/>
             <w:tcMar>
               <w:top w:type="dxa" w:w="80"/>
               <w:left w:type="dxa" w:w="120"/>
@@ -5277,6 +5335,7 @@
               <w:bottom w:val="single" w:color="D0D7D3" w:sz="4"/>
               <w:right w:val="single" w:color="D0D7D3" w:sz="4"/>
             </w:tcBorders>
+            <w:shd w:fill="F6F8F7" w:color="auto" w:val="clear"/>
             <w:tcMar>
               <w:top w:type="dxa" w:w="80"/>
               <w:left w:type="dxa" w:w="120"/>
@@ -5305,6 +5364,7 @@
               <w:bottom w:val="single" w:color="D0D7D3" w:sz="4"/>
               <w:right w:val="single" w:color="D0D7D3" w:sz="4"/>
             </w:tcBorders>
+            <w:shd w:fill="F6F8F7" w:color="auto" w:val="clear"/>
             <w:tcMar>
               <w:top w:type="dxa" w:w="80"/>
               <w:left w:type="dxa" w:w="120"/>
@@ -5335,7 +5395,6 @@
               <w:bottom w:val="single" w:color="D0D7D3" w:sz="4"/>
               <w:right w:val="single" w:color="D0D7D3" w:sz="4"/>
             </w:tcBorders>
-            <w:shd w:fill="F6F8F7" w:color="auto" w:val="clear"/>
             <w:tcMar>
               <w:top w:type="dxa" w:w="80"/>
               <w:left w:type="dxa" w:w="120"/>
@@ -5364,7 +5423,6 @@
               <w:bottom w:val="single" w:color="D0D7D3" w:sz="4"/>
               <w:right w:val="single" w:color="D0D7D3" w:sz="4"/>
             </w:tcBorders>
-            <w:shd w:fill="F6F8F7" w:color="auto" w:val="clear"/>
             <w:tcMar>
               <w:top w:type="dxa" w:w="80"/>
               <w:left w:type="dxa" w:w="120"/>
@@ -5395,6 +5453,7 @@
               <w:bottom w:val="single" w:color="D0D7D3" w:sz="4"/>
               <w:right w:val="single" w:color="D0D7D3" w:sz="4"/>
             </w:tcBorders>
+            <w:shd w:fill="F6F8F7" w:color="auto" w:val="clear"/>
             <w:tcMar>
               <w:top w:type="dxa" w:w="80"/>
               <w:left w:type="dxa" w:w="120"/>
@@ -5423,6 +5482,7 @@
               <w:bottom w:val="single" w:color="D0D7D3" w:sz="4"/>
               <w:right w:val="single" w:color="D0D7D3" w:sz="4"/>
             </w:tcBorders>
+            <w:shd w:fill="F6F8F7" w:color="auto" w:val="clear"/>
             <w:tcMar>
               <w:top w:type="dxa" w:w="80"/>
               <w:left w:type="dxa" w:w="120"/>
@@ -5453,7 +5513,6 @@
               <w:bottom w:val="single" w:color="D0D7D3" w:sz="4"/>
               <w:right w:val="single" w:color="D0D7D3" w:sz="4"/>
             </w:tcBorders>
-            <w:shd w:fill="F6F8F7" w:color="auto" w:val="clear"/>
             <w:tcMar>
               <w:top w:type="dxa" w:w="80"/>
               <w:left w:type="dxa" w:w="120"/>
@@ -5482,7 +5541,6 @@
               <w:bottom w:val="single" w:color="D0D7D3" w:sz="4"/>
               <w:right w:val="single" w:color="D0D7D3" w:sz="4"/>
             </w:tcBorders>
-            <w:shd w:fill="F6F8F7" w:color="auto" w:val="clear"/>
             <w:tcMar>
               <w:top w:type="dxa" w:w="80"/>
               <w:left w:type="dxa" w:w="120"/>
@@ -5513,6 +5571,7 @@
               <w:bottom w:val="single" w:color="D0D7D3" w:sz="4"/>
               <w:right w:val="single" w:color="D0D7D3" w:sz="4"/>
             </w:tcBorders>
+            <w:shd w:fill="F6F8F7" w:color="auto" w:val="clear"/>
             <w:tcMar>
               <w:top w:type="dxa" w:w="80"/>
               <w:left w:type="dxa" w:w="120"/>
@@ -5541,6 +5600,7 @@
               <w:bottom w:val="single" w:color="D0D7D3" w:sz="4"/>
               <w:right w:val="single" w:color="D0D7D3" w:sz="4"/>
             </w:tcBorders>
+            <w:shd w:fill="F6F8F7" w:color="auto" w:val="clear"/>
             <w:tcMar>
               <w:top w:type="dxa" w:w="80"/>
               <w:left w:type="dxa" w:w="120"/>
@@ -5571,7 +5631,6 @@
               <w:bottom w:val="single" w:color="D0D7D3" w:sz="4"/>
               <w:right w:val="single" w:color="D0D7D3" w:sz="4"/>
             </w:tcBorders>
-            <w:shd w:fill="F6F8F7" w:color="auto" w:val="clear"/>
             <w:tcMar>
               <w:top w:type="dxa" w:w="80"/>
               <w:left w:type="dxa" w:w="120"/>
@@ -5600,7 +5659,6 @@
               <w:bottom w:val="single" w:color="D0D7D3" w:sz="4"/>
               <w:right w:val="single" w:color="D0D7D3" w:sz="4"/>
             </w:tcBorders>
-            <w:shd w:fill="F6F8F7" w:color="auto" w:val="clear"/>
             <w:tcMar>
               <w:top w:type="dxa" w:w="80"/>
               <w:left w:type="dxa" w:w="120"/>
@@ -5631,6 +5689,7 @@
               <w:bottom w:val="single" w:color="D0D7D3" w:sz="4"/>
               <w:right w:val="single" w:color="D0D7D3" w:sz="4"/>
             </w:tcBorders>
+            <w:shd w:fill="F6F8F7" w:color="auto" w:val="clear"/>
             <w:tcMar>
               <w:top w:type="dxa" w:w="80"/>
               <w:left w:type="dxa" w:w="120"/>
@@ -5659,6 +5718,7 @@
               <w:bottom w:val="single" w:color="D0D7D3" w:sz="4"/>
               <w:right w:val="single" w:color="D0D7D3" w:sz="4"/>
             </w:tcBorders>
+            <w:shd w:fill="F6F8F7" w:color="auto" w:val="clear"/>
             <w:tcMar>
               <w:top w:type="dxa" w:w="80"/>
               <w:left w:type="dxa" w:w="120"/>
@@ -5689,7 +5749,6 @@
               <w:bottom w:val="single" w:color="D0D7D3" w:sz="4"/>
               <w:right w:val="single" w:color="D0D7D3" w:sz="4"/>
             </w:tcBorders>
-            <w:shd w:fill="F6F8F7" w:color="auto" w:val="clear"/>
             <w:tcMar>
               <w:top w:type="dxa" w:w="80"/>
               <w:left w:type="dxa" w:w="120"/>
@@ -5718,7 +5777,6 @@
               <w:bottom w:val="single" w:color="D0D7D3" w:sz="4"/>
               <w:right w:val="single" w:color="D0D7D3" w:sz="4"/>
             </w:tcBorders>
-            <w:shd w:fill="F6F8F7" w:color="auto" w:val="clear"/>
             <w:tcMar>
               <w:top w:type="dxa" w:w="80"/>
               <w:left w:type="dxa" w:w="120"/>
@@ -5749,6 +5807,7 @@
               <w:bottom w:val="single" w:color="D0D7D3" w:sz="4"/>
               <w:right w:val="single" w:color="D0D7D3" w:sz="4"/>
             </w:tcBorders>
+            <w:shd w:fill="F6F8F7" w:color="auto" w:val="clear"/>
             <w:tcMar>
               <w:top w:type="dxa" w:w="80"/>
               <w:left w:type="dxa" w:w="120"/>
@@ -5777,6 +5836,7 @@
               <w:bottom w:val="single" w:color="D0D7D3" w:sz="4"/>
               <w:right w:val="single" w:color="D0D7D3" w:sz="4"/>
             </w:tcBorders>
+            <w:shd w:fill="F6F8F7" w:color="auto" w:val="clear"/>
             <w:tcMar>
               <w:top w:type="dxa" w:w="80"/>
               <w:left w:type="dxa" w:w="120"/>
@@ -5807,7 +5867,6 @@
               <w:bottom w:val="single" w:color="D0D7D3" w:sz="4"/>
               <w:right w:val="single" w:color="D0D7D3" w:sz="4"/>
             </w:tcBorders>
-            <w:shd w:fill="F6F8F7" w:color="auto" w:val="clear"/>
             <w:tcMar>
               <w:top w:type="dxa" w:w="80"/>
               <w:left w:type="dxa" w:w="120"/>
@@ -5836,7 +5895,6 @@
               <w:bottom w:val="single" w:color="D0D7D3" w:sz="4"/>
               <w:right w:val="single" w:color="D0D7D3" w:sz="4"/>
             </w:tcBorders>
-            <w:shd w:fill="F6F8F7" w:color="auto" w:val="clear"/>
             <w:tcMar>
               <w:top w:type="dxa" w:w="80"/>
               <w:left w:type="dxa" w:w="120"/>
@@ -5867,6 +5925,7 @@
               <w:bottom w:val="single" w:color="D0D7D3" w:sz="4"/>
               <w:right w:val="single" w:color="D0D7D3" w:sz="4"/>
             </w:tcBorders>
+            <w:shd w:fill="F6F8F7" w:color="auto" w:val="clear"/>
             <w:tcMar>
               <w:top w:type="dxa" w:w="80"/>
               <w:left w:type="dxa" w:w="120"/>
@@ -5895,6 +5954,7 @@
               <w:bottom w:val="single" w:color="D0D7D3" w:sz="4"/>
               <w:right w:val="single" w:color="D0D7D3" w:sz="4"/>
             </w:tcBorders>
+            <w:shd w:fill="F6F8F7" w:color="auto" w:val="clear"/>
             <w:tcMar>
               <w:top w:type="dxa" w:w="80"/>
               <w:left w:type="dxa" w:w="120"/>
@@ -5925,7 +5985,6 @@
               <w:bottom w:val="single" w:color="D0D7D3" w:sz="4"/>
               <w:right w:val="single" w:color="D0D7D3" w:sz="4"/>
             </w:tcBorders>
-            <w:shd w:fill="F6F8F7" w:color="auto" w:val="clear"/>
             <w:tcMar>
               <w:top w:type="dxa" w:w="80"/>
               <w:left w:type="dxa" w:w="120"/>
@@ -5954,7 +6013,6 @@
               <w:bottom w:val="single" w:color="D0D7D3" w:sz="4"/>
               <w:right w:val="single" w:color="D0D7D3" w:sz="4"/>
             </w:tcBorders>
-            <w:shd w:fill="F6F8F7" w:color="auto" w:val="clear"/>
             <w:tcMar>
               <w:top w:type="dxa" w:w="80"/>
               <w:left w:type="dxa" w:w="120"/>
@@ -5985,6 +6043,7 @@
               <w:bottom w:val="single" w:color="D0D7D3" w:sz="4"/>
               <w:right w:val="single" w:color="D0D7D3" w:sz="4"/>
             </w:tcBorders>
+            <w:shd w:fill="F6F8F7" w:color="auto" w:val="clear"/>
             <w:tcMar>
               <w:top w:type="dxa" w:w="80"/>
               <w:left w:type="dxa" w:w="120"/>
@@ -6013,6 +6072,7 @@
               <w:bottom w:val="single" w:color="D0D7D3" w:sz="4"/>
               <w:right w:val="single" w:color="D0D7D3" w:sz="4"/>
             </w:tcBorders>
+            <w:shd w:fill="F6F8F7" w:color="auto" w:val="clear"/>
             <w:tcMar>
               <w:top w:type="dxa" w:w="80"/>
               <w:left w:type="dxa" w:w="120"/>
@@ -6043,7 +6103,6 @@
               <w:bottom w:val="single" w:color="D0D7D3" w:sz="4"/>
               <w:right w:val="single" w:color="D0D7D3" w:sz="4"/>
             </w:tcBorders>
-            <w:shd w:fill="F6F8F7" w:color="auto" w:val="clear"/>
             <w:tcMar>
               <w:top w:type="dxa" w:w="80"/>
               <w:left w:type="dxa" w:w="120"/>
@@ -6072,7 +6131,6 @@
               <w:bottom w:val="single" w:color="D0D7D3" w:sz="4"/>
               <w:right w:val="single" w:color="D0D7D3" w:sz="4"/>
             </w:tcBorders>
-            <w:shd w:fill="F6F8F7" w:color="auto" w:val="clear"/>
             <w:tcMar>
               <w:top w:type="dxa" w:w="80"/>
               <w:left w:type="dxa" w:w="120"/>
@@ -6103,6 +6161,7 @@
               <w:bottom w:val="single" w:color="D0D7D3" w:sz="4"/>
               <w:right w:val="single" w:color="D0D7D3" w:sz="4"/>
             </w:tcBorders>
+            <w:shd w:fill="F6F8F7" w:color="auto" w:val="clear"/>
             <w:tcMar>
               <w:top w:type="dxa" w:w="80"/>
               <w:left w:type="dxa" w:w="120"/>
@@ -6131,6 +6190,7 @@
               <w:bottom w:val="single" w:color="D0D7D3" w:sz="4"/>
               <w:right w:val="single" w:color="D0D7D3" w:sz="4"/>
             </w:tcBorders>
+            <w:shd w:fill="F6F8F7" w:color="auto" w:val="clear"/>
             <w:tcMar>
               <w:top w:type="dxa" w:w="80"/>
               <w:left w:type="dxa" w:w="120"/>

</xml_diff>

<commit_message>
Set up a new school step by step
A wizard at /console/get-started, reached from the dashboard's
getting-started card: school details, the school year (filled in), classes
(ticked), this term's fees, pupils, then the term's bills. Fees are typed
once per section (Preparatory, Primary, JSS, SSS, Other) and set for every
class in it, creating fee items that don't exist yet. It opens on the first
step not done, every step can be skipped, and it reuses the calendar's
session form, the class set-up and the bill generator.
</commit_message>
<xml_diff>
--- a/docs/product/ParentPay - what it does.docx
+++ b/docs/product/ParentPay - what it does.docx
@@ -4790,6 +4790,64 @@
                 <w:sz w:val="20"/>
                 <w:szCs w:val="20"/>
               </w:rPr>
+              <w:t xml:space="preserve">Set up a new school step by step: details, school year, classes, fees once per section (Primary, JSS, SSS), pupils and bills</w:t>
+            </w:r>
+          </w:p>
+        </w:tc>
+      </w:tr>
+      <w:tr>
+        <w:tc>
+          <w:tcPr>
+            <w:tcW w:type="dxa" w:w="1800"/>
+            <w:tcBorders>
+              <w:top w:val="single" w:color="D0D7D3" w:sz="4"/>
+              <w:left w:val="single" w:color="D0D7D3" w:sz="4"/>
+              <w:bottom w:val="single" w:color="D0D7D3" w:sz="4"/>
+              <w:right w:val="single" w:color="D0D7D3" w:sz="4"/>
+            </w:tcBorders>
+            <w:tcMar>
+              <w:top w:type="dxa" w:w="80"/>
+              <w:left w:type="dxa" w:w="120"/>
+              <w:bottom w:type="dxa" w:w="80"/>
+              <w:right w:type="dxa" w:w="120"/>
+            </w:tcMar>
+          </w:tcPr>
+          <w:p>
+            <w:r>
+              <w:rPr>
+                <w:b w:val="false"/>
+                <w:bCs w:val="false"/>
+                <w:sz w:val="20"/>
+                <w:szCs w:val="20"/>
+              </w:rPr>
+              <w:t xml:space="preserve">22 Oct 2026</w:t>
+            </w:r>
+          </w:p>
+        </w:tc>
+        <w:tc>
+          <w:tcPr>
+            <w:tcW w:type="dxa" w:w="7838"/>
+            <w:tcBorders>
+              <w:top w:val="single" w:color="D0D7D3" w:sz="4"/>
+              <w:left w:val="single" w:color="D0D7D3" w:sz="4"/>
+              <w:bottom w:val="single" w:color="D0D7D3" w:sz="4"/>
+              <w:right w:val="single" w:color="D0D7D3" w:sz="4"/>
+            </w:tcBorders>
+            <w:tcMar>
+              <w:top w:type="dxa" w:w="80"/>
+              <w:left w:type="dxa" w:w="120"/>
+              <w:bottom w:type="dxa" w:w="80"/>
+              <w:right w:type="dxa" w:w="120"/>
+            </w:tcMar>
+          </w:tcPr>
+          <w:p>
+            <w:r>
+              <w:rPr>
+                <w:b w:val="false"/>
+                <w:bCs w:val="false"/>
+                <w:sz w:val="20"/>
+                <w:szCs w:val="20"/>
+              </w:rPr>
               <w:t xml:space="preserve">Text messages cost less than half as much: they write NGN for ₦ and keep to the plain SMS alphabet (a reminder went from 7 SMS pages to 3)</w:t>
             </w:r>
           </w:p>
@@ -4805,6 +4863,7 @@
               <w:bottom w:val="single" w:color="D0D7D3" w:sz="4"/>
               <w:right w:val="single" w:color="D0D7D3" w:sz="4"/>
             </w:tcBorders>
+            <w:shd w:fill="F6F8F7" w:color="auto" w:val="clear"/>
             <w:tcMar>
               <w:top w:type="dxa" w:w="80"/>
               <w:left w:type="dxa" w:w="120"/>
@@ -4833,6 +4892,7 @@
               <w:bottom w:val="single" w:color="D0D7D3" w:sz="4"/>
               <w:right w:val="single" w:color="D0D7D3" w:sz="4"/>
             </w:tcBorders>
+            <w:shd w:fill="F6F8F7" w:color="auto" w:val="clear"/>
             <w:tcMar>
               <w:top w:type="dxa" w:w="80"/>
               <w:left w:type="dxa" w:w="120"/>
@@ -4863,7 +4923,6 @@
               <w:bottom w:val="single" w:color="D0D7D3" w:sz="4"/>
               <w:right w:val="single" w:color="D0D7D3" w:sz="4"/>
             </w:tcBorders>
-            <w:shd w:fill="F6F8F7" w:color="auto" w:val="clear"/>
             <w:tcMar>
               <w:top w:type="dxa" w:w="80"/>
               <w:left w:type="dxa" w:w="120"/>
@@ -4892,7 +4951,6 @@
               <w:bottom w:val="single" w:color="D0D7D3" w:sz="4"/>
               <w:right w:val="single" w:color="D0D7D3" w:sz="4"/>
             </w:tcBorders>
-            <w:shd w:fill="F6F8F7" w:color="auto" w:val="clear"/>
             <w:tcMar>
               <w:top w:type="dxa" w:w="80"/>
               <w:left w:type="dxa" w:w="120"/>
@@ -4923,6 +4981,7 @@
               <w:bottom w:val="single" w:color="D0D7D3" w:sz="4"/>
               <w:right w:val="single" w:color="D0D7D3" w:sz="4"/>
             </w:tcBorders>
+            <w:shd w:fill="F6F8F7" w:color="auto" w:val="clear"/>
             <w:tcMar>
               <w:top w:type="dxa" w:w="80"/>
               <w:left w:type="dxa" w:w="120"/>
@@ -4951,6 +5010,7 @@
               <w:bottom w:val="single" w:color="D0D7D3" w:sz="4"/>
               <w:right w:val="single" w:color="D0D7D3" w:sz="4"/>
             </w:tcBorders>
+            <w:shd w:fill="F6F8F7" w:color="auto" w:val="clear"/>
             <w:tcMar>
               <w:top w:type="dxa" w:w="80"/>
               <w:left w:type="dxa" w:w="120"/>
@@ -4981,7 +5041,6 @@
               <w:bottom w:val="single" w:color="D0D7D3" w:sz="4"/>
               <w:right w:val="single" w:color="D0D7D3" w:sz="4"/>
             </w:tcBorders>
-            <w:shd w:fill="F6F8F7" w:color="auto" w:val="clear"/>
             <w:tcMar>
               <w:top w:type="dxa" w:w="80"/>
               <w:left w:type="dxa" w:w="120"/>
@@ -5010,7 +5069,6 @@
               <w:bottom w:val="single" w:color="D0D7D3" w:sz="4"/>
               <w:right w:val="single" w:color="D0D7D3" w:sz="4"/>
             </w:tcBorders>
-            <w:shd w:fill="F6F8F7" w:color="auto" w:val="clear"/>
             <w:tcMar>
               <w:top w:type="dxa" w:w="80"/>
               <w:left w:type="dxa" w:w="120"/>
@@ -5041,6 +5099,7 @@
               <w:bottom w:val="single" w:color="D0D7D3" w:sz="4"/>
               <w:right w:val="single" w:color="D0D7D3" w:sz="4"/>
             </w:tcBorders>
+            <w:shd w:fill="F6F8F7" w:color="auto" w:val="clear"/>
             <w:tcMar>
               <w:top w:type="dxa" w:w="80"/>
               <w:left w:type="dxa" w:w="120"/>
@@ -5069,6 +5128,7 @@
               <w:bottom w:val="single" w:color="D0D7D3" w:sz="4"/>
               <w:right w:val="single" w:color="D0D7D3" w:sz="4"/>
             </w:tcBorders>
+            <w:shd w:fill="F6F8F7" w:color="auto" w:val="clear"/>
             <w:tcMar>
               <w:top w:type="dxa" w:w="80"/>
               <w:left w:type="dxa" w:w="120"/>
@@ -5099,7 +5159,6 @@
               <w:bottom w:val="single" w:color="D0D7D3" w:sz="4"/>
               <w:right w:val="single" w:color="D0D7D3" w:sz="4"/>
             </w:tcBorders>
-            <w:shd w:fill="F6F8F7" w:color="auto" w:val="clear"/>
             <w:tcMar>
               <w:top w:type="dxa" w:w="80"/>
               <w:left w:type="dxa" w:w="120"/>
@@ -5128,7 +5187,6 @@
               <w:bottom w:val="single" w:color="D0D7D3" w:sz="4"/>
               <w:right w:val="single" w:color="D0D7D3" w:sz="4"/>
             </w:tcBorders>
-            <w:shd w:fill="F6F8F7" w:color="auto" w:val="clear"/>
             <w:tcMar>
               <w:top w:type="dxa" w:w="80"/>
               <w:left w:type="dxa" w:w="120"/>
@@ -5159,6 +5217,7 @@
               <w:bottom w:val="single" w:color="D0D7D3" w:sz="4"/>
               <w:right w:val="single" w:color="D0D7D3" w:sz="4"/>
             </w:tcBorders>
+            <w:shd w:fill="F6F8F7" w:color="auto" w:val="clear"/>
             <w:tcMar>
               <w:top w:type="dxa" w:w="80"/>
               <w:left w:type="dxa" w:w="120"/>
@@ -5187,6 +5246,7 @@
               <w:bottom w:val="single" w:color="D0D7D3" w:sz="4"/>
               <w:right w:val="single" w:color="D0D7D3" w:sz="4"/>
             </w:tcBorders>
+            <w:shd w:fill="F6F8F7" w:color="auto" w:val="clear"/>
             <w:tcMar>
               <w:top w:type="dxa" w:w="80"/>
               <w:left w:type="dxa" w:w="120"/>
@@ -5217,7 +5277,6 @@
               <w:bottom w:val="single" w:color="D0D7D3" w:sz="4"/>
               <w:right w:val="single" w:color="D0D7D3" w:sz="4"/>
             </w:tcBorders>
-            <w:shd w:fill="F6F8F7" w:color="auto" w:val="clear"/>
             <w:tcMar>
               <w:top w:type="dxa" w:w="80"/>
               <w:left w:type="dxa" w:w="120"/>
@@ -5246,7 +5305,6 @@
               <w:bottom w:val="single" w:color="D0D7D3" w:sz="4"/>
               <w:right w:val="single" w:color="D0D7D3" w:sz="4"/>
             </w:tcBorders>
-            <w:shd w:fill="F6F8F7" w:color="auto" w:val="clear"/>
             <w:tcMar>
               <w:top w:type="dxa" w:w="80"/>
               <w:left w:type="dxa" w:w="120"/>
@@ -5277,6 +5335,7 @@
               <w:bottom w:val="single" w:color="D0D7D3" w:sz="4"/>
               <w:right w:val="single" w:color="D0D7D3" w:sz="4"/>
             </w:tcBorders>
+            <w:shd w:fill="F6F8F7" w:color="auto" w:val="clear"/>
             <w:tcMar>
               <w:top w:type="dxa" w:w="80"/>
               <w:left w:type="dxa" w:w="120"/>
@@ -5305,6 +5364,7 @@
               <w:bottom w:val="single" w:color="D0D7D3" w:sz="4"/>
               <w:right w:val="single" w:color="D0D7D3" w:sz="4"/>
             </w:tcBorders>
+            <w:shd w:fill="F6F8F7" w:color="auto" w:val="clear"/>
             <w:tcMar>
               <w:top w:type="dxa" w:w="80"/>
               <w:left w:type="dxa" w:w="120"/>
@@ -5335,7 +5395,6 @@
               <w:bottom w:val="single" w:color="D0D7D3" w:sz="4"/>
               <w:right w:val="single" w:color="D0D7D3" w:sz="4"/>
             </w:tcBorders>
-            <w:shd w:fill="F6F8F7" w:color="auto" w:val="clear"/>
             <w:tcMar>
               <w:top w:type="dxa" w:w="80"/>
               <w:left w:type="dxa" w:w="120"/>
@@ -5364,7 +5423,6 @@
               <w:bottom w:val="single" w:color="D0D7D3" w:sz="4"/>
               <w:right w:val="single" w:color="D0D7D3" w:sz="4"/>
             </w:tcBorders>
-            <w:shd w:fill="F6F8F7" w:color="auto" w:val="clear"/>
             <w:tcMar>
               <w:top w:type="dxa" w:w="80"/>
               <w:left w:type="dxa" w:w="120"/>
@@ -5395,6 +5453,7 @@
               <w:bottom w:val="single" w:color="D0D7D3" w:sz="4"/>
               <w:right w:val="single" w:color="D0D7D3" w:sz="4"/>
             </w:tcBorders>
+            <w:shd w:fill="F6F8F7" w:color="auto" w:val="clear"/>
             <w:tcMar>
               <w:top w:type="dxa" w:w="80"/>
               <w:left w:type="dxa" w:w="120"/>
@@ -5423,6 +5482,7 @@
               <w:bottom w:val="single" w:color="D0D7D3" w:sz="4"/>
               <w:right w:val="single" w:color="D0D7D3" w:sz="4"/>
             </w:tcBorders>
+            <w:shd w:fill="F6F8F7" w:color="auto" w:val="clear"/>
             <w:tcMar>
               <w:top w:type="dxa" w:w="80"/>
               <w:left w:type="dxa" w:w="120"/>
@@ -5453,7 +5513,6 @@
               <w:bottom w:val="single" w:color="D0D7D3" w:sz="4"/>
               <w:right w:val="single" w:color="D0D7D3" w:sz="4"/>
             </w:tcBorders>
-            <w:shd w:fill="F6F8F7" w:color="auto" w:val="clear"/>
             <w:tcMar>
               <w:top w:type="dxa" w:w="80"/>
               <w:left w:type="dxa" w:w="120"/>
@@ -5482,7 +5541,6 @@
               <w:bottom w:val="single" w:color="D0D7D3" w:sz="4"/>
               <w:right w:val="single" w:color="D0D7D3" w:sz="4"/>
             </w:tcBorders>
-            <w:shd w:fill="F6F8F7" w:color="auto" w:val="clear"/>
             <w:tcMar>
               <w:top w:type="dxa" w:w="80"/>
               <w:left w:type="dxa" w:w="120"/>
@@ -5513,6 +5571,7 @@
               <w:bottom w:val="single" w:color="D0D7D3" w:sz="4"/>
               <w:right w:val="single" w:color="D0D7D3" w:sz="4"/>
             </w:tcBorders>
+            <w:shd w:fill="F6F8F7" w:color="auto" w:val="clear"/>
             <w:tcMar>
               <w:top w:type="dxa" w:w="80"/>
               <w:left w:type="dxa" w:w="120"/>
@@ -5541,6 +5600,7 @@
               <w:bottom w:val="single" w:color="D0D7D3" w:sz="4"/>
               <w:right w:val="single" w:color="D0D7D3" w:sz="4"/>
             </w:tcBorders>
+            <w:shd w:fill="F6F8F7" w:color="auto" w:val="clear"/>
             <w:tcMar>
               <w:top w:type="dxa" w:w="80"/>
               <w:left w:type="dxa" w:w="120"/>
@@ -5571,7 +5631,6 @@
               <w:bottom w:val="single" w:color="D0D7D3" w:sz="4"/>
               <w:right w:val="single" w:color="D0D7D3" w:sz="4"/>
             </w:tcBorders>
-            <w:shd w:fill="F6F8F7" w:color="auto" w:val="clear"/>
             <w:tcMar>
               <w:top w:type="dxa" w:w="80"/>
               <w:left w:type="dxa" w:w="120"/>
@@ -5600,7 +5659,6 @@
               <w:bottom w:val="single" w:color="D0D7D3" w:sz="4"/>
               <w:right w:val="single" w:color="D0D7D3" w:sz="4"/>
             </w:tcBorders>
-            <w:shd w:fill="F6F8F7" w:color="auto" w:val="clear"/>
             <w:tcMar>
               <w:top w:type="dxa" w:w="80"/>
               <w:left w:type="dxa" w:w="120"/>
@@ -5631,6 +5689,7 @@
               <w:bottom w:val="single" w:color="D0D7D3" w:sz="4"/>
               <w:right w:val="single" w:color="D0D7D3" w:sz="4"/>
             </w:tcBorders>
+            <w:shd w:fill="F6F8F7" w:color="auto" w:val="clear"/>
             <w:tcMar>
               <w:top w:type="dxa" w:w="80"/>
               <w:left w:type="dxa" w:w="120"/>
@@ -5659,6 +5718,7 @@
               <w:bottom w:val="single" w:color="D0D7D3" w:sz="4"/>
               <w:right w:val="single" w:color="D0D7D3" w:sz="4"/>
             </w:tcBorders>
+            <w:shd w:fill="F6F8F7" w:color="auto" w:val="clear"/>
             <w:tcMar>
               <w:top w:type="dxa" w:w="80"/>
               <w:left w:type="dxa" w:w="120"/>
@@ -5689,7 +5749,6 @@
               <w:bottom w:val="single" w:color="D0D7D3" w:sz="4"/>
               <w:right w:val="single" w:color="D0D7D3" w:sz="4"/>
             </w:tcBorders>
-            <w:shd w:fill="F6F8F7" w:color="auto" w:val="clear"/>
             <w:tcMar>
               <w:top w:type="dxa" w:w="80"/>
               <w:left w:type="dxa" w:w="120"/>
@@ -5718,7 +5777,6 @@
               <w:bottom w:val="single" w:color="D0D7D3" w:sz="4"/>
               <w:right w:val="single" w:color="D0D7D3" w:sz="4"/>
             </w:tcBorders>
-            <w:shd w:fill="F6F8F7" w:color="auto" w:val="clear"/>
             <w:tcMar>
               <w:top w:type="dxa" w:w="80"/>
               <w:left w:type="dxa" w:w="120"/>
@@ -5749,6 +5807,7 @@
               <w:bottom w:val="single" w:color="D0D7D3" w:sz="4"/>
               <w:right w:val="single" w:color="D0D7D3" w:sz="4"/>
             </w:tcBorders>
+            <w:shd w:fill="F6F8F7" w:color="auto" w:val="clear"/>
             <w:tcMar>
               <w:top w:type="dxa" w:w="80"/>
               <w:left w:type="dxa" w:w="120"/>
@@ -5777,6 +5836,7 @@
               <w:bottom w:val="single" w:color="D0D7D3" w:sz="4"/>
               <w:right w:val="single" w:color="D0D7D3" w:sz="4"/>
             </w:tcBorders>
+            <w:shd w:fill="F6F8F7" w:color="auto" w:val="clear"/>
             <w:tcMar>
               <w:top w:type="dxa" w:w="80"/>
               <w:left w:type="dxa" w:w="120"/>
@@ -5807,7 +5867,6 @@
               <w:bottom w:val="single" w:color="D0D7D3" w:sz="4"/>
               <w:right w:val="single" w:color="D0D7D3" w:sz="4"/>
             </w:tcBorders>
-            <w:shd w:fill="F6F8F7" w:color="auto" w:val="clear"/>
             <w:tcMar>
               <w:top w:type="dxa" w:w="80"/>
               <w:left w:type="dxa" w:w="120"/>
@@ -5836,7 +5895,6 @@
               <w:bottom w:val="single" w:color="D0D7D3" w:sz="4"/>
               <w:right w:val="single" w:color="D0D7D3" w:sz="4"/>
             </w:tcBorders>
-            <w:shd w:fill="F6F8F7" w:color="auto" w:val="clear"/>
             <w:tcMar>
               <w:top w:type="dxa" w:w="80"/>
               <w:left w:type="dxa" w:w="120"/>
@@ -5867,6 +5925,7 @@
               <w:bottom w:val="single" w:color="D0D7D3" w:sz="4"/>
               <w:right w:val="single" w:color="D0D7D3" w:sz="4"/>
             </w:tcBorders>
+            <w:shd w:fill="F6F8F7" w:color="auto" w:val="clear"/>
             <w:tcMar>
               <w:top w:type="dxa" w:w="80"/>
               <w:left w:type="dxa" w:w="120"/>
@@ -5895,6 +5954,7 @@
               <w:bottom w:val="single" w:color="D0D7D3" w:sz="4"/>
               <w:right w:val="single" w:color="D0D7D3" w:sz="4"/>
             </w:tcBorders>
+            <w:shd w:fill="F6F8F7" w:color="auto" w:val="clear"/>
             <w:tcMar>
               <w:top w:type="dxa" w:w="80"/>
               <w:left w:type="dxa" w:w="120"/>
@@ -5925,7 +5985,6 @@
               <w:bottom w:val="single" w:color="D0D7D3" w:sz="4"/>
               <w:right w:val="single" w:color="D0D7D3" w:sz="4"/>
             </w:tcBorders>
-            <w:shd w:fill="F6F8F7" w:color="auto" w:val="clear"/>
             <w:tcMar>
               <w:top w:type="dxa" w:w="80"/>
               <w:left w:type="dxa" w:w="120"/>
@@ -5954,7 +6013,6 @@
               <w:bottom w:val="single" w:color="D0D7D3" w:sz="4"/>
               <w:right w:val="single" w:color="D0D7D3" w:sz="4"/>
             </w:tcBorders>
-            <w:shd w:fill="F6F8F7" w:color="auto" w:val="clear"/>
             <w:tcMar>
               <w:top w:type="dxa" w:w="80"/>
               <w:left w:type="dxa" w:w="120"/>
@@ -5985,6 +6043,7 @@
               <w:bottom w:val="single" w:color="D0D7D3" w:sz="4"/>
               <w:right w:val="single" w:color="D0D7D3" w:sz="4"/>
             </w:tcBorders>
+            <w:shd w:fill="F6F8F7" w:color="auto" w:val="clear"/>
             <w:tcMar>
               <w:top w:type="dxa" w:w="80"/>
               <w:left w:type="dxa" w:w="120"/>
@@ -6013,6 +6072,7 @@
               <w:bottom w:val="single" w:color="D0D7D3" w:sz="4"/>
               <w:right w:val="single" w:color="D0D7D3" w:sz="4"/>
             </w:tcBorders>
+            <w:shd w:fill="F6F8F7" w:color="auto" w:val="clear"/>
             <w:tcMar>
               <w:top w:type="dxa" w:w="80"/>
               <w:left w:type="dxa" w:w="120"/>
@@ -6043,7 +6103,6 @@
               <w:bottom w:val="single" w:color="D0D7D3" w:sz="4"/>
               <w:right w:val="single" w:color="D0D7D3" w:sz="4"/>
             </w:tcBorders>
-            <w:shd w:fill="F6F8F7" w:color="auto" w:val="clear"/>
             <w:tcMar>
               <w:top w:type="dxa" w:w="80"/>
               <w:left w:type="dxa" w:w="120"/>
@@ -6072,7 +6131,6 @@
               <w:bottom w:val="single" w:color="D0D7D3" w:sz="4"/>
               <w:right w:val="single" w:color="D0D7D3" w:sz="4"/>
             </w:tcBorders>
-            <w:shd w:fill="F6F8F7" w:color="auto" w:val="clear"/>
             <w:tcMar>
               <w:top w:type="dxa" w:w="80"/>
               <w:left w:type="dxa" w:w="120"/>
@@ -6103,6 +6161,7 @@
               <w:bottom w:val="single" w:color="D0D7D3" w:sz="4"/>
               <w:right w:val="single" w:color="D0D7D3" w:sz="4"/>
             </w:tcBorders>
+            <w:shd w:fill="F6F8F7" w:color="auto" w:val="clear"/>
             <w:tcMar>
               <w:top w:type="dxa" w:w="80"/>
               <w:left w:type="dxa" w:w="120"/>
@@ -6131,6 +6190,7 @@
               <w:bottom w:val="single" w:color="D0D7D3" w:sz="4"/>
               <w:right w:val="single" w:color="D0D7D3" w:sz="4"/>
             </w:tcBorders>
+            <w:shd w:fill="F6F8F7" w:color="auto" w:val="clear"/>
             <w:tcMar>
               <w:top w:type="dxa" w:w="80"/>
               <w:left w:type="dxa" w:w="120"/>
@@ -6161,7 +6221,6 @@
               <w:bottom w:val="single" w:color="D0D7D3" w:sz="4"/>
               <w:right w:val="single" w:color="D0D7D3" w:sz="4"/>
             </w:tcBorders>
-            <w:shd w:fill="F6F8F7" w:color="auto" w:val="clear"/>
             <w:tcMar>
               <w:top w:type="dxa" w:w="80"/>
               <w:left w:type="dxa" w:w="120"/>
@@ -6190,7 +6249,6 @@
               <w:bottom w:val="single" w:color="D0D7D3" w:sz="4"/>
               <w:right w:val="single" w:color="D0D7D3" w:sz="4"/>
             </w:tcBorders>
-            <w:shd w:fill="F6F8F7" w:color="auto" w:val="clear"/>
             <w:tcMar>
               <w:top w:type="dxa" w:w="80"/>
               <w:left w:type="dxa" w:w="120"/>

</xml_diff>

<commit_message>
Suggest the next admission number when adding a pupil
The add-pupil form fills in the next number in the school's own pattern;
staff keep it, edit it or replace it. The school's numbers are grouped by
pattern (DMC/2026/..., DMC/2024/...); the pattern used most recently wins
(the later-sorting one on a tie, as after a spreadsheet import), and the
suggestion is its highest number plus one, keeping the zero padding and
skipping numbers already taken. A school with no numbers yet gets its
initials and the year (Sunrise Academy: SA/2026/0001). One query; the rule
itself is a pure function with its own tests.
</commit_message>
<xml_diff>
--- a/docs/product/ParentPay - what it does.docx
+++ b/docs/product/ParentPay - what it does.docx
@@ -4790,6 +4790,64 @@
                 <w:sz w:val="20"/>
                 <w:szCs w:val="20"/>
               </w:rPr>
+              <w:t xml:space="preserve">Adding a pupil suggests the next admission number in the school’s own pattern; staff can change it</w:t>
+            </w:r>
+          </w:p>
+        </w:tc>
+      </w:tr>
+      <w:tr>
+        <w:tc>
+          <w:tcPr>
+            <w:tcW w:type="dxa" w:w="1800"/>
+            <w:tcBorders>
+              <w:top w:val="single" w:color="D0D7D3" w:sz="4"/>
+              <w:left w:val="single" w:color="D0D7D3" w:sz="4"/>
+              <w:bottom w:val="single" w:color="D0D7D3" w:sz="4"/>
+              <w:right w:val="single" w:color="D0D7D3" w:sz="4"/>
+            </w:tcBorders>
+            <w:tcMar>
+              <w:top w:type="dxa" w:w="80"/>
+              <w:left w:type="dxa" w:w="120"/>
+              <w:bottom w:type="dxa" w:w="80"/>
+              <w:right w:type="dxa" w:w="120"/>
+            </w:tcMar>
+          </w:tcPr>
+          <w:p>
+            <w:r>
+              <w:rPr>
+                <w:b w:val="false"/>
+                <w:bCs w:val="false"/>
+                <w:sz w:val="20"/>
+                <w:szCs w:val="20"/>
+              </w:rPr>
+              <w:t xml:space="preserve">22 Oct 2026</w:t>
+            </w:r>
+          </w:p>
+        </w:tc>
+        <w:tc>
+          <w:tcPr>
+            <w:tcW w:type="dxa" w:w="7838"/>
+            <w:tcBorders>
+              <w:top w:val="single" w:color="D0D7D3" w:sz="4"/>
+              <w:left w:val="single" w:color="D0D7D3" w:sz="4"/>
+              <w:bottom w:val="single" w:color="D0D7D3" w:sz="4"/>
+              <w:right w:val="single" w:color="D0D7D3" w:sz="4"/>
+            </w:tcBorders>
+            <w:tcMar>
+              <w:top w:type="dxa" w:w="80"/>
+              <w:left w:type="dxa" w:w="120"/>
+              <w:bottom w:type="dxa" w:w="80"/>
+              <w:right w:type="dxa" w:w="120"/>
+            </w:tcMar>
+          </w:tcPr>
+          <w:p>
+            <w:r>
+              <w:rPr>
+                <w:b w:val="false"/>
+                <w:bCs w:val="false"/>
+                <w:sz w:val="20"/>
+                <w:szCs w:val="20"/>
+              </w:rPr>
               <w:t xml:space="preserve">Set up a new school step by step: details, school year, classes, fees once per section (Primary, JSS, SSS), pupils and bills</w:t>
             </w:r>
           </w:p>
@@ -4805,6 +4863,7 @@
               <w:bottom w:val="single" w:color="D0D7D3" w:sz="4"/>
               <w:right w:val="single" w:color="D0D7D3" w:sz="4"/>
             </w:tcBorders>
+            <w:shd w:fill="F6F8F7" w:color="auto" w:val="clear"/>
             <w:tcMar>
               <w:top w:type="dxa" w:w="80"/>
               <w:left w:type="dxa" w:w="120"/>
@@ -4833,6 +4892,7 @@
               <w:bottom w:val="single" w:color="D0D7D3" w:sz="4"/>
               <w:right w:val="single" w:color="D0D7D3" w:sz="4"/>
             </w:tcBorders>
+            <w:shd w:fill="F6F8F7" w:color="auto" w:val="clear"/>
             <w:tcMar>
               <w:top w:type="dxa" w:w="80"/>
               <w:left w:type="dxa" w:w="120"/>
@@ -4863,7 +4923,6 @@
               <w:bottom w:val="single" w:color="D0D7D3" w:sz="4"/>
               <w:right w:val="single" w:color="D0D7D3" w:sz="4"/>
             </w:tcBorders>
-            <w:shd w:fill="F6F8F7" w:color="auto" w:val="clear"/>
             <w:tcMar>
               <w:top w:type="dxa" w:w="80"/>
               <w:left w:type="dxa" w:w="120"/>
@@ -4892,7 +4951,6 @@
               <w:bottom w:val="single" w:color="D0D7D3" w:sz="4"/>
               <w:right w:val="single" w:color="D0D7D3" w:sz="4"/>
             </w:tcBorders>
-            <w:shd w:fill="F6F8F7" w:color="auto" w:val="clear"/>
             <w:tcMar>
               <w:top w:type="dxa" w:w="80"/>
               <w:left w:type="dxa" w:w="120"/>
@@ -4923,6 +4981,7 @@
               <w:bottom w:val="single" w:color="D0D7D3" w:sz="4"/>
               <w:right w:val="single" w:color="D0D7D3" w:sz="4"/>
             </w:tcBorders>
+            <w:shd w:fill="F6F8F7" w:color="auto" w:val="clear"/>
             <w:tcMar>
               <w:top w:type="dxa" w:w="80"/>
               <w:left w:type="dxa" w:w="120"/>
@@ -4951,6 +5010,7 @@
               <w:bottom w:val="single" w:color="D0D7D3" w:sz="4"/>
               <w:right w:val="single" w:color="D0D7D3" w:sz="4"/>
             </w:tcBorders>
+            <w:shd w:fill="F6F8F7" w:color="auto" w:val="clear"/>
             <w:tcMar>
               <w:top w:type="dxa" w:w="80"/>
               <w:left w:type="dxa" w:w="120"/>
@@ -4981,7 +5041,6 @@
               <w:bottom w:val="single" w:color="D0D7D3" w:sz="4"/>
               <w:right w:val="single" w:color="D0D7D3" w:sz="4"/>
             </w:tcBorders>
-            <w:shd w:fill="F6F8F7" w:color="auto" w:val="clear"/>
             <w:tcMar>
               <w:top w:type="dxa" w:w="80"/>
               <w:left w:type="dxa" w:w="120"/>
@@ -5010,7 +5069,6 @@
               <w:bottom w:val="single" w:color="D0D7D3" w:sz="4"/>
               <w:right w:val="single" w:color="D0D7D3" w:sz="4"/>
             </w:tcBorders>
-            <w:shd w:fill="F6F8F7" w:color="auto" w:val="clear"/>
             <w:tcMar>
               <w:top w:type="dxa" w:w="80"/>
               <w:left w:type="dxa" w:w="120"/>
@@ -5041,6 +5099,7 @@
               <w:bottom w:val="single" w:color="D0D7D3" w:sz="4"/>
               <w:right w:val="single" w:color="D0D7D3" w:sz="4"/>
             </w:tcBorders>
+            <w:shd w:fill="F6F8F7" w:color="auto" w:val="clear"/>
             <w:tcMar>
               <w:top w:type="dxa" w:w="80"/>
               <w:left w:type="dxa" w:w="120"/>
@@ -5069,6 +5128,7 @@
               <w:bottom w:val="single" w:color="D0D7D3" w:sz="4"/>
               <w:right w:val="single" w:color="D0D7D3" w:sz="4"/>
             </w:tcBorders>
+            <w:shd w:fill="F6F8F7" w:color="auto" w:val="clear"/>
             <w:tcMar>
               <w:top w:type="dxa" w:w="80"/>
               <w:left w:type="dxa" w:w="120"/>
@@ -5099,7 +5159,6 @@
               <w:bottom w:val="single" w:color="D0D7D3" w:sz="4"/>
               <w:right w:val="single" w:color="D0D7D3" w:sz="4"/>
             </w:tcBorders>
-            <w:shd w:fill="F6F8F7" w:color="auto" w:val="clear"/>
             <w:tcMar>
               <w:top w:type="dxa" w:w="80"/>
               <w:left w:type="dxa" w:w="120"/>
@@ -5128,7 +5187,6 @@
               <w:bottom w:val="single" w:color="D0D7D3" w:sz="4"/>
               <w:right w:val="single" w:color="D0D7D3" w:sz="4"/>
             </w:tcBorders>
-            <w:shd w:fill="F6F8F7" w:color="auto" w:val="clear"/>
             <w:tcMar>
               <w:top w:type="dxa" w:w="80"/>
               <w:left w:type="dxa" w:w="120"/>
@@ -5159,6 +5217,7 @@
               <w:bottom w:val="single" w:color="D0D7D3" w:sz="4"/>
               <w:right w:val="single" w:color="D0D7D3" w:sz="4"/>
             </w:tcBorders>
+            <w:shd w:fill="F6F8F7" w:color="auto" w:val="clear"/>
             <w:tcMar>
               <w:top w:type="dxa" w:w="80"/>
               <w:left w:type="dxa" w:w="120"/>
@@ -5187,6 +5246,7 @@
               <w:bottom w:val="single" w:color="D0D7D3" w:sz="4"/>
               <w:right w:val="single" w:color="D0D7D3" w:sz="4"/>
             </w:tcBorders>
+            <w:shd w:fill="F6F8F7" w:color="auto" w:val="clear"/>
             <w:tcMar>
               <w:top w:type="dxa" w:w="80"/>
               <w:left w:type="dxa" w:w="120"/>
@@ -5217,7 +5277,6 @@
               <w:bottom w:val="single" w:color="D0D7D3" w:sz="4"/>
               <w:right w:val="single" w:color="D0D7D3" w:sz="4"/>
             </w:tcBorders>
-            <w:shd w:fill="F6F8F7" w:color="auto" w:val="clear"/>
             <w:tcMar>
               <w:top w:type="dxa" w:w="80"/>
               <w:left w:type="dxa" w:w="120"/>
@@ -5246,7 +5305,6 @@
               <w:bottom w:val="single" w:color="D0D7D3" w:sz="4"/>
               <w:right w:val="single" w:color="D0D7D3" w:sz="4"/>
             </w:tcBorders>
-            <w:shd w:fill="F6F8F7" w:color="auto" w:val="clear"/>
             <w:tcMar>
               <w:top w:type="dxa" w:w="80"/>
               <w:left w:type="dxa" w:w="120"/>
@@ -5277,6 +5335,7 @@
               <w:bottom w:val="single" w:color="D0D7D3" w:sz="4"/>
               <w:right w:val="single" w:color="D0D7D3" w:sz="4"/>
             </w:tcBorders>
+            <w:shd w:fill="F6F8F7" w:color="auto" w:val="clear"/>
             <w:tcMar>
               <w:top w:type="dxa" w:w="80"/>
               <w:left w:type="dxa" w:w="120"/>
@@ -5305,6 +5364,7 @@
               <w:bottom w:val="single" w:color="D0D7D3" w:sz="4"/>
               <w:right w:val="single" w:color="D0D7D3" w:sz="4"/>
             </w:tcBorders>
+            <w:shd w:fill="F6F8F7" w:color="auto" w:val="clear"/>
             <w:tcMar>
               <w:top w:type="dxa" w:w="80"/>
               <w:left w:type="dxa" w:w="120"/>
@@ -5335,7 +5395,6 @@
               <w:bottom w:val="single" w:color="D0D7D3" w:sz="4"/>
               <w:right w:val="single" w:color="D0D7D3" w:sz="4"/>
             </w:tcBorders>
-            <w:shd w:fill="F6F8F7" w:color="auto" w:val="clear"/>
             <w:tcMar>
               <w:top w:type="dxa" w:w="80"/>
               <w:left w:type="dxa" w:w="120"/>
@@ -5364,7 +5423,6 @@
               <w:bottom w:val="single" w:color="D0D7D3" w:sz="4"/>
               <w:right w:val="single" w:color="D0D7D3" w:sz="4"/>
             </w:tcBorders>
-            <w:shd w:fill="F6F8F7" w:color="auto" w:val="clear"/>
             <w:tcMar>
               <w:top w:type="dxa" w:w="80"/>
               <w:left w:type="dxa" w:w="120"/>
@@ -5395,6 +5453,7 @@
               <w:bottom w:val="single" w:color="D0D7D3" w:sz="4"/>
               <w:right w:val="single" w:color="D0D7D3" w:sz="4"/>
             </w:tcBorders>
+            <w:shd w:fill="F6F8F7" w:color="auto" w:val="clear"/>
             <w:tcMar>
               <w:top w:type="dxa" w:w="80"/>
               <w:left w:type="dxa" w:w="120"/>
@@ -5423,6 +5482,7 @@
               <w:bottom w:val="single" w:color="D0D7D3" w:sz="4"/>
               <w:right w:val="single" w:color="D0D7D3" w:sz="4"/>
             </w:tcBorders>
+            <w:shd w:fill="F6F8F7" w:color="auto" w:val="clear"/>
             <w:tcMar>
               <w:top w:type="dxa" w:w="80"/>
               <w:left w:type="dxa" w:w="120"/>
@@ -5453,7 +5513,6 @@
               <w:bottom w:val="single" w:color="D0D7D3" w:sz="4"/>
               <w:right w:val="single" w:color="D0D7D3" w:sz="4"/>
             </w:tcBorders>
-            <w:shd w:fill="F6F8F7" w:color="auto" w:val="clear"/>
             <w:tcMar>
               <w:top w:type="dxa" w:w="80"/>
               <w:left w:type="dxa" w:w="120"/>
@@ -5482,7 +5541,6 @@
               <w:bottom w:val="single" w:color="D0D7D3" w:sz="4"/>
               <w:right w:val="single" w:color="D0D7D3" w:sz="4"/>
             </w:tcBorders>
-            <w:shd w:fill="F6F8F7" w:color="auto" w:val="clear"/>
             <w:tcMar>
               <w:top w:type="dxa" w:w="80"/>
               <w:left w:type="dxa" w:w="120"/>
@@ -5513,6 +5571,7 @@
               <w:bottom w:val="single" w:color="D0D7D3" w:sz="4"/>
               <w:right w:val="single" w:color="D0D7D3" w:sz="4"/>
             </w:tcBorders>
+            <w:shd w:fill="F6F8F7" w:color="auto" w:val="clear"/>
             <w:tcMar>
               <w:top w:type="dxa" w:w="80"/>
               <w:left w:type="dxa" w:w="120"/>
@@ -5541,6 +5600,7 @@
               <w:bottom w:val="single" w:color="D0D7D3" w:sz="4"/>
               <w:right w:val="single" w:color="D0D7D3" w:sz="4"/>
             </w:tcBorders>
+            <w:shd w:fill="F6F8F7" w:color="auto" w:val="clear"/>
             <w:tcMar>
               <w:top w:type="dxa" w:w="80"/>
               <w:left w:type="dxa" w:w="120"/>
@@ -5571,7 +5631,6 @@
               <w:bottom w:val="single" w:color="D0D7D3" w:sz="4"/>
               <w:right w:val="single" w:color="D0D7D3" w:sz="4"/>
             </w:tcBorders>
-            <w:shd w:fill="F6F8F7" w:color="auto" w:val="clear"/>
             <w:tcMar>
               <w:top w:type="dxa" w:w="80"/>
               <w:left w:type="dxa" w:w="120"/>
@@ -5600,7 +5659,6 @@
               <w:bottom w:val="single" w:color="D0D7D3" w:sz="4"/>
               <w:right w:val="single" w:color="D0D7D3" w:sz="4"/>
             </w:tcBorders>
-            <w:shd w:fill="F6F8F7" w:color="auto" w:val="clear"/>
             <w:tcMar>
               <w:top w:type="dxa" w:w="80"/>
               <w:left w:type="dxa" w:w="120"/>
@@ -5631,6 +5689,7 @@
               <w:bottom w:val="single" w:color="D0D7D3" w:sz="4"/>
               <w:right w:val="single" w:color="D0D7D3" w:sz="4"/>
             </w:tcBorders>
+            <w:shd w:fill="F6F8F7" w:color="auto" w:val="clear"/>
             <w:tcMar>
               <w:top w:type="dxa" w:w="80"/>
               <w:left w:type="dxa" w:w="120"/>
@@ -5659,6 +5718,7 @@
               <w:bottom w:val="single" w:color="D0D7D3" w:sz="4"/>
               <w:right w:val="single" w:color="D0D7D3" w:sz="4"/>
             </w:tcBorders>
+            <w:shd w:fill="F6F8F7" w:color="auto" w:val="clear"/>
             <w:tcMar>
               <w:top w:type="dxa" w:w="80"/>
               <w:left w:type="dxa" w:w="120"/>
@@ -5689,7 +5749,6 @@
               <w:bottom w:val="single" w:color="D0D7D3" w:sz="4"/>
               <w:right w:val="single" w:color="D0D7D3" w:sz="4"/>
             </w:tcBorders>
-            <w:shd w:fill="F6F8F7" w:color="auto" w:val="clear"/>
             <w:tcMar>
               <w:top w:type="dxa" w:w="80"/>
               <w:left w:type="dxa" w:w="120"/>
@@ -5718,7 +5777,6 @@
               <w:bottom w:val="single" w:color="D0D7D3" w:sz="4"/>
               <w:right w:val="single" w:color="D0D7D3" w:sz="4"/>
             </w:tcBorders>
-            <w:shd w:fill="F6F8F7" w:color="auto" w:val="clear"/>
             <w:tcMar>
               <w:top w:type="dxa" w:w="80"/>
               <w:left w:type="dxa" w:w="120"/>
@@ -5749,6 +5807,7 @@
               <w:bottom w:val="single" w:color="D0D7D3" w:sz="4"/>
               <w:right w:val="single" w:color="D0D7D3" w:sz="4"/>
             </w:tcBorders>
+            <w:shd w:fill="F6F8F7" w:color="auto" w:val="clear"/>
             <w:tcMar>
               <w:top w:type="dxa" w:w="80"/>
               <w:left w:type="dxa" w:w="120"/>
@@ -5777,6 +5836,7 @@
               <w:bottom w:val="single" w:color="D0D7D3" w:sz="4"/>
               <w:right w:val="single" w:color="D0D7D3" w:sz="4"/>
             </w:tcBorders>
+            <w:shd w:fill="F6F8F7" w:color="auto" w:val="clear"/>
             <w:tcMar>
               <w:top w:type="dxa" w:w="80"/>
               <w:left w:type="dxa" w:w="120"/>
@@ -5807,7 +5867,6 @@
               <w:bottom w:val="single" w:color="D0D7D3" w:sz="4"/>
               <w:right w:val="single" w:color="D0D7D3" w:sz="4"/>
             </w:tcBorders>
-            <w:shd w:fill="F6F8F7" w:color="auto" w:val="clear"/>
             <w:tcMar>
               <w:top w:type="dxa" w:w="80"/>
               <w:left w:type="dxa" w:w="120"/>
@@ -5836,7 +5895,6 @@
               <w:bottom w:val="single" w:color="D0D7D3" w:sz="4"/>
               <w:right w:val="single" w:color="D0D7D3" w:sz="4"/>
             </w:tcBorders>
-            <w:shd w:fill="F6F8F7" w:color="auto" w:val="clear"/>
             <w:tcMar>
               <w:top w:type="dxa" w:w="80"/>
               <w:left w:type="dxa" w:w="120"/>
@@ -5867,6 +5925,7 @@
               <w:bottom w:val="single" w:color="D0D7D3" w:sz="4"/>
               <w:right w:val="single" w:color="D0D7D3" w:sz="4"/>
             </w:tcBorders>
+            <w:shd w:fill="F6F8F7" w:color="auto" w:val="clear"/>
             <w:tcMar>
               <w:top w:type="dxa" w:w="80"/>
               <w:left w:type="dxa" w:w="120"/>
@@ -5895,6 +5954,7 @@
               <w:bottom w:val="single" w:color="D0D7D3" w:sz="4"/>
               <w:right w:val="single" w:color="D0D7D3" w:sz="4"/>
             </w:tcBorders>
+            <w:shd w:fill="F6F8F7" w:color="auto" w:val="clear"/>
             <w:tcMar>
               <w:top w:type="dxa" w:w="80"/>
               <w:left w:type="dxa" w:w="120"/>
@@ -5925,7 +5985,6 @@
               <w:bottom w:val="single" w:color="D0D7D3" w:sz="4"/>
               <w:right w:val="single" w:color="D0D7D3" w:sz="4"/>
             </w:tcBorders>
-            <w:shd w:fill="F6F8F7" w:color="auto" w:val="clear"/>
             <w:tcMar>
               <w:top w:type="dxa" w:w="80"/>
               <w:left w:type="dxa" w:w="120"/>
@@ -5954,7 +6013,6 @@
               <w:bottom w:val="single" w:color="D0D7D3" w:sz="4"/>
               <w:right w:val="single" w:color="D0D7D3" w:sz="4"/>
             </w:tcBorders>
-            <w:shd w:fill="F6F8F7" w:color="auto" w:val="clear"/>
             <w:tcMar>
               <w:top w:type="dxa" w:w="80"/>
               <w:left w:type="dxa" w:w="120"/>
@@ -5985,6 +6043,7 @@
               <w:bottom w:val="single" w:color="D0D7D3" w:sz="4"/>
               <w:right w:val="single" w:color="D0D7D3" w:sz="4"/>
             </w:tcBorders>
+            <w:shd w:fill="F6F8F7" w:color="auto" w:val="clear"/>
             <w:tcMar>
               <w:top w:type="dxa" w:w="80"/>
               <w:left w:type="dxa" w:w="120"/>
@@ -6013,6 +6072,7 @@
               <w:bottom w:val="single" w:color="D0D7D3" w:sz="4"/>
               <w:right w:val="single" w:color="D0D7D3" w:sz="4"/>
             </w:tcBorders>
+            <w:shd w:fill="F6F8F7" w:color="auto" w:val="clear"/>
             <w:tcMar>
               <w:top w:type="dxa" w:w="80"/>
               <w:left w:type="dxa" w:w="120"/>
@@ -6043,7 +6103,6 @@
               <w:bottom w:val="single" w:color="D0D7D3" w:sz="4"/>
               <w:right w:val="single" w:color="D0D7D3" w:sz="4"/>
             </w:tcBorders>
-            <w:shd w:fill="F6F8F7" w:color="auto" w:val="clear"/>
             <w:tcMar>
               <w:top w:type="dxa" w:w="80"/>
               <w:left w:type="dxa" w:w="120"/>
@@ -6072,7 +6131,6 @@
               <w:bottom w:val="single" w:color="D0D7D3" w:sz="4"/>
               <w:right w:val="single" w:color="D0D7D3" w:sz="4"/>
             </w:tcBorders>
-            <w:shd w:fill="F6F8F7" w:color="auto" w:val="clear"/>
             <w:tcMar>
               <w:top w:type="dxa" w:w="80"/>
               <w:left w:type="dxa" w:w="120"/>
@@ -6103,6 +6161,7 @@
               <w:bottom w:val="single" w:color="D0D7D3" w:sz="4"/>
               <w:right w:val="single" w:color="D0D7D3" w:sz="4"/>
             </w:tcBorders>
+            <w:shd w:fill="F6F8F7" w:color="auto" w:val="clear"/>
             <w:tcMar>
               <w:top w:type="dxa" w:w="80"/>
               <w:left w:type="dxa" w:w="120"/>
@@ -6131,6 +6190,7 @@
               <w:bottom w:val="single" w:color="D0D7D3" w:sz="4"/>
               <w:right w:val="single" w:color="D0D7D3" w:sz="4"/>
             </w:tcBorders>
+            <w:shd w:fill="F6F8F7" w:color="auto" w:val="clear"/>
             <w:tcMar>
               <w:top w:type="dxa" w:w="80"/>
               <w:left w:type="dxa" w:w="120"/>
@@ -6161,7 +6221,6 @@
               <w:bottom w:val="single" w:color="D0D7D3" w:sz="4"/>
               <w:right w:val="single" w:color="D0D7D3" w:sz="4"/>
             </w:tcBorders>
-            <w:shd w:fill="F6F8F7" w:color="auto" w:val="clear"/>
             <w:tcMar>
               <w:top w:type="dxa" w:w="80"/>
               <w:left w:type="dxa" w:w="120"/>
@@ -6190,7 +6249,6 @@
               <w:bottom w:val="single" w:color="D0D7D3" w:sz="4"/>
               <w:right w:val="single" w:color="D0D7D3" w:sz="4"/>
             </w:tcBorders>
-            <w:shd w:fill="F6F8F7" w:color="auto" w:val="clear"/>
             <w:tcMar>
               <w:top w:type="dxa" w:w="80"/>
               <w:left w:type="dxa" w:w="120"/>
@@ -6221,6 +6279,7 @@
               <w:bottom w:val="single" w:color="D0D7D3" w:sz="4"/>
               <w:right w:val="single" w:color="D0D7D3" w:sz="4"/>
             </w:tcBorders>
+            <w:shd w:fill="F6F8F7" w:color="auto" w:val="clear"/>
             <w:tcMar>
               <w:top w:type="dxa" w:w="80"/>
               <w:left w:type="dxa" w:w="120"/>
@@ -6249,6 +6308,7 @@
               <w:bottom w:val="single" w:color="D0D7D3" w:sz="4"/>
               <w:right w:val="single" w:color="D0D7D3" w:sz="4"/>
             </w:tcBorders>
+            <w:shd w:fill="F6F8F7" w:color="auto" w:val="clear"/>
             <w:tcMar>
               <w:top w:type="dxa" w:w="80"/>
               <w:left w:type="dxa" w:w="120"/>

</xml_diff>